<commit_message>
fix: rebalance resume print density
</commit_message>
<xml_diff>
--- a/public/downloads/wyatt-walsh-resume-full.docx
+++ b/public/downloads/wyatt-walsh-resume-full.docx
@@ -7,7 +7,7 @@
         <w:pStyle w:val="Title"/>
         <w:spacing w:after="75"/>
       </w:pPr>
-      <w:hyperlink w:history="1" r:id="rIdtr-ckjh-gieqhkofxpltk">
+      <w:hyperlink w:history="1" r:id="rIdaqaog7rzjzdpg7vfbfcwt">
         <w:r>
           <w:rPr>
             <w:rFonts w:ascii="Arial" w:cs="Arial" w:eastAsia="Arial" w:hAnsi="Arial"/>
@@ -40,7 +40,7 @@
       <w:pPr>
         <w:spacing w:after="100"/>
       </w:pPr>
-      <w:hyperlink w:history="1" r:id="rIdvrkahn8fi_-e9z-pel4ok">
+      <w:hyperlink w:history="1" r:id="rIdguf7m5nodn4xvptslcxb-">
         <w:r>
           <w:rPr>
             <w:rFonts w:ascii="Arial" w:cs="Arial" w:eastAsia="Arial" w:hAnsi="Arial"/>
@@ -61,7 +61,7 @@
         </w:rPr>
         <w:t xml:space="preserve"> | </w:t>
       </w:r>
-      <w:hyperlink w:history="1" r:id="rIdhzxkzpuvqifwvskav8ghd">
+      <w:hyperlink w:history="1" r:id="rIdpzpmm-rh03izgp2a3aark">
         <w:r>
           <w:rPr>
             <w:rFonts w:ascii="Arial" w:cs="Arial" w:eastAsia="Arial" w:hAnsi="Arial"/>
@@ -100,7 +100,7 @@
         </w:rPr>
         <w:t xml:space="preserve"> | </w:t>
       </w:r>
-      <w:hyperlink w:history="1" r:id="rIdkbbp7uld86u5trai5zobu">
+      <w:hyperlink w:history="1" r:id="rIdhurxhkapd_b3q3s2i9kgr">
         <w:r>
           <w:rPr>
             <w:rFonts w:ascii="Arial" w:cs="Arial" w:eastAsia="Arial" w:hAnsi="Arial"/>
@@ -121,7 +121,7 @@
         </w:rPr>
         <w:t xml:space="preserve"> | </w:t>
       </w:r>
-      <w:hyperlink w:history="1" r:id="rIdnj_m8vrqnkbqlssgc3v5a">
+      <w:hyperlink w:history="1" r:id="rIdlvgdilyhvuwxwj14gacce">
         <w:r>
           <w:rPr>
             <w:rFonts w:ascii="Arial" w:cs="Arial" w:eastAsia="Arial" w:hAnsi="Arial"/>
@@ -189,7 +189,7 @@
         </w:rPr>
         <w:t xml:space="preserve"> | </w:t>
       </w:r>
-      <w:hyperlink w:history="1" r:id="rIdh1aox59kkm1tmv3xjutli">
+      <w:hyperlink w:history="1" r:id="rIdqu8-9os-ysu6zjpe99ucs">
         <w:r>
           <w:rPr>
             <w:rFonts w:ascii="Arial" w:cs="Arial" w:eastAsia="Arial" w:hAnsi="Arial"/>
@@ -352,7 +352,7 @@
         </w:rPr>
         <w:t xml:space="preserve"> | </w:t>
       </w:r>
-      <w:hyperlink w:history="1" r:id="rIdsbpxruiu7wxmjkhtsrcco">
+      <w:hyperlink w:history="1" r:id="rIdaoz07ft1ygcekprtnr4w-">
         <w:r>
           <w:rPr>
             <w:rFonts w:ascii="Arial" w:cs="Arial" w:eastAsia="Arial" w:hAnsi="Arial"/>
@@ -750,7 +750,7 @@
         </w:rPr>
         <w:t xml:space="preserve"> | </w:t>
       </w:r>
-      <w:hyperlink w:history="1" r:id="rIdolcwxtttgyp2krbxvmwb8">
+      <w:hyperlink w:history="1" r:id="rIdaemuzc8ppq_7x71qdv3ti">
         <w:r>
           <w:rPr>
             <w:rFonts w:ascii="Arial" w:cs="Arial" w:eastAsia="Arial" w:hAnsi="Arial"/>
@@ -996,7 +996,7 @@
         </w:rPr>
         <w:t xml:space="preserve"> | </w:t>
       </w:r>
-      <w:hyperlink w:history="1" r:id="rIdp3wcm3uzmmtb9osbrtnbi">
+      <w:hyperlink w:history="1" r:id="rIdwxcheplylxdqt36ipqd_c">
         <w:r>
           <w:rPr>
             <w:rFonts w:ascii="Arial" w:cs="Arial" w:eastAsia="Arial" w:hAnsi="Arial"/>
@@ -1085,7 +1085,7 @@
         </w:rPr>
         <w:t xml:space="preserve"> | </w:t>
       </w:r>
-      <w:hyperlink w:history="1" r:id="rIdapx5odmj3ohe5w054t6le">
+      <w:hyperlink w:history="1" r:id="rIdszpqy0fya-uygd7gan545">
         <w:r>
           <w:rPr>
             <w:rFonts w:ascii="Arial" w:cs="Arial" w:eastAsia="Arial" w:hAnsi="Arial"/>
@@ -1174,7 +1174,7 @@
         </w:rPr>
         <w:t xml:space="preserve"> | </w:t>
       </w:r>
-      <w:hyperlink w:history="1" r:id="rIdhder_s-7eb_xu1dkodksr">
+      <w:hyperlink w:history="1" r:id="rIdnozbwu-457wqynhkjgxjn">
         <w:r>
           <w:rPr>
             <w:rFonts w:ascii="Arial" w:cs="Arial" w:eastAsia="Arial" w:hAnsi="Arial"/>
@@ -1244,7 +1244,7 @@
         </w:rPr>
         <w:t xml:space="preserve"> | </w:t>
       </w:r>
-      <w:hyperlink w:history="1" r:id="rIdv5ooqruf4rjlip2vtadfk">
+      <w:hyperlink w:history="1" r:id="rIda45guiaq6umi37vd4wlap">
         <w:r>
           <w:rPr>
             <w:rFonts w:ascii="Arial" w:cs="Arial" w:eastAsia="Arial" w:hAnsi="Arial"/>
@@ -1333,7 +1333,7 @@
         </w:rPr>
         <w:t xml:space="preserve"> | </w:t>
       </w:r>
-      <w:hyperlink w:history="1" r:id="rIdjuhvdros9b45kpnko1rrh">
+      <w:hyperlink w:history="1" r:id="rIdkc1kqf6pdgdowinnhe0ps">
         <w:r>
           <w:rPr>
             <w:rFonts w:ascii="Arial" w:cs="Arial" w:eastAsia="Arial" w:hAnsi="Arial"/>
@@ -1422,7 +1422,7 @@
         </w:rPr>
         <w:t xml:space="preserve"> | </w:t>
       </w:r>
-      <w:hyperlink w:history="1" r:id="rId0mezl6hbgrdegtoukjcgx">
+      <w:hyperlink w:history="1" r:id="rIdwraum7ifblq1m506ruzpz">
         <w:r>
           <w:rPr>
             <w:rFonts w:ascii="Arial" w:cs="Arial" w:eastAsia="Arial" w:hAnsi="Arial"/>
@@ -1511,7 +1511,7 @@
         </w:rPr>
         <w:t xml:space="preserve"> | </w:t>
       </w:r>
-      <w:hyperlink w:history="1" r:id="rIdd0auykkl-6wtu-6lja72v">
+      <w:hyperlink w:history="1" r:id="rIdaaep4ee6w5q_rnhdyly-t">
         <w:r>
           <w:rPr>
             <w:rFonts w:ascii="Arial" w:cs="Arial" w:eastAsia="Arial" w:hAnsi="Arial"/>
@@ -1581,7 +1581,7 @@
         </w:rPr>
         <w:t xml:space="preserve"> | </w:t>
       </w:r>
-      <w:hyperlink w:history="1" r:id="rIdm0aloa7u3lfhqxskkr1s3">
+      <w:hyperlink w:history="1" r:id="rIdigdgmwnrkidcqdjitoelk">
         <w:r>
           <w:rPr>
             <w:rFonts w:ascii="Arial" w:cs="Arial" w:eastAsia="Arial" w:hAnsi="Arial"/>
@@ -1683,7 +1683,7 @@
       <w:pPr>
         <w:spacing w:after="25"/>
       </w:pPr>
-      <w:hyperlink w:history="1" r:id="rId0n200mriiliorv6rjjm9f">
+      <w:hyperlink w:history="1" r:id="rIdwb4do4wge8rlr2txv-wuq">
         <w:r>
           <w:rPr>
             <w:rFonts w:ascii="Arial" w:cs="Arial" w:eastAsia="Arial" w:hAnsi="Arial"/>
@@ -1739,7 +1739,7 @@
       <w:pPr>
         <w:spacing w:after="25"/>
       </w:pPr>
-      <w:hyperlink w:history="1" r:id="rIdhk3jugdedgvtd7vdnq1ns">
+      <w:hyperlink w:history="1" r:id="rIdi9makco44hbf965hh-xqq">
         <w:r>
           <w:rPr>
             <w:rFonts w:ascii="Arial" w:cs="Arial" w:eastAsia="Arial" w:hAnsi="Arial"/>
@@ -1770,7 +1770,7 @@
       <w:pPr>
         <w:spacing w:after="35"/>
       </w:pPr>
-      <w:hyperlink w:history="1" r:id="rIdcy_k9jr6bqx6e2cjd40l6">
+      <w:hyperlink w:history="1" r:id="rIdtrfm7arz6r7fm_zaullyt">
         <w:r>
           <w:rPr>
             <w:rFonts w:ascii="Arial" w:cs="Arial" w:eastAsia="Arial" w:hAnsi="Arial"/>
@@ -1819,7 +1819,7 @@
       <w:pPr>
         <w:spacing w:after="35"/>
       </w:pPr>
-      <w:hyperlink w:history="1" r:id="rId9jvq3ogf1c22odh6lbsdx">
+      <w:hyperlink w:history="1" r:id="rIdef-0op7kmoljft6esslif">
         <w:r>
           <w:rPr>
             <w:rFonts w:ascii="Arial" w:cs="Arial" w:eastAsia="Arial" w:hAnsi="Arial"/>

</xml_diff>

<commit_message>
fix: balance full resume project rhythm
</commit_message>
<xml_diff>
--- a/public/downloads/wyatt-walsh-resume-full.docx
+++ b/public/downloads/wyatt-walsh-resume-full.docx
@@ -7,7 +7,7 @@
         <w:pStyle w:val="Title"/>
         <w:spacing w:after="75"/>
       </w:pPr>
-      <w:hyperlink w:history="1" r:id="rIdaqaog7rzjzdpg7vfbfcwt">
+      <w:hyperlink w:history="1" r:id="rIdia9ihomfyr7jjvjxjcbzn">
         <w:r>
           <w:rPr>
             <w:rFonts w:ascii="Arial" w:cs="Arial" w:eastAsia="Arial" w:hAnsi="Arial"/>
@@ -40,7 +40,7 @@
       <w:pPr>
         <w:spacing w:after="100"/>
       </w:pPr>
-      <w:hyperlink w:history="1" r:id="rIdguf7m5nodn4xvptslcxb-">
+      <w:hyperlink w:history="1" r:id="rId3nhbg-1cjedshr_oks14y">
         <w:r>
           <w:rPr>
             <w:rFonts w:ascii="Arial" w:cs="Arial" w:eastAsia="Arial" w:hAnsi="Arial"/>
@@ -61,7 +61,7 @@
         </w:rPr>
         <w:t xml:space="preserve"> | </w:t>
       </w:r>
-      <w:hyperlink w:history="1" r:id="rIdpzpmm-rh03izgp2a3aark">
+      <w:hyperlink w:history="1" r:id="rIdnlivnggy5ckxsnw3f60yn">
         <w:r>
           <w:rPr>
             <w:rFonts w:ascii="Arial" w:cs="Arial" w:eastAsia="Arial" w:hAnsi="Arial"/>
@@ -100,7 +100,7 @@
         </w:rPr>
         <w:t xml:space="preserve"> | </w:t>
       </w:r>
-      <w:hyperlink w:history="1" r:id="rIdhurxhkapd_b3q3s2i9kgr">
+      <w:hyperlink w:history="1" r:id="rId1vtsvstriojzujqspqukp">
         <w:r>
           <w:rPr>
             <w:rFonts w:ascii="Arial" w:cs="Arial" w:eastAsia="Arial" w:hAnsi="Arial"/>
@@ -121,7 +121,7 @@
         </w:rPr>
         <w:t xml:space="preserve"> | </w:t>
       </w:r>
-      <w:hyperlink w:history="1" r:id="rIdlvgdilyhvuwxwj14gacce">
+      <w:hyperlink w:history="1" r:id="rIdxqon-a7lsjyr-hblpmmrn">
         <w:r>
           <w:rPr>
             <w:rFonts w:ascii="Arial" w:cs="Arial" w:eastAsia="Arial" w:hAnsi="Arial"/>
@@ -189,7 +189,7 @@
         </w:rPr>
         <w:t xml:space="preserve"> | </w:t>
       </w:r>
-      <w:hyperlink w:history="1" r:id="rIdqu8-9os-ysu6zjpe99ucs">
+      <w:hyperlink w:history="1" r:id="rId4nsup-w3k7bbqyat7pcvl">
         <w:r>
           <w:rPr>
             <w:rFonts w:ascii="Arial" w:cs="Arial" w:eastAsia="Arial" w:hAnsi="Arial"/>
@@ -352,7 +352,7 @@
         </w:rPr>
         <w:t xml:space="preserve"> | </w:t>
       </w:r>
-      <w:hyperlink w:history="1" r:id="rIdaoz07ft1ygcekprtnr4w-">
+      <w:hyperlink w:history="1" r:id="rIdlvrznofqrpxmlkv9lbwrv">
         <w:r>
           <w:rPr>
             <w:rFonts w:ascii="Arial" w:cs="Arial" w:eastAsia="Arial" w:hAnsi="Arial"/>
@@ -750,7 +750,7 @@
         </w:rPr>
         <w:t xml:space="preserve"> | </w:t>
       </w:r>
-      <w:hyperlink w:history="1" r:id="rIdaemuzc8ppq_7x71qdv3ti">
+      <w:hyperlink w:history="1" r:id="rIdync2jzxcekl53epmdje2h">
         <w:r>
           <w:rPr>
             <w:rFonts w:ascii="Arial" w:cs="Arial" w:eastAsia="Arial" w:hAnsi="Arial"/>
@@ -996,7 +996,7 @@
         </w:rPr>
         <w:t xml:space="preserve"> | </w:t>
       </w:r>
-      <w:hyperlink w:history="1" r:id="rIdwxcheplylxdqt36ipqd_c">
+      <w:hyperlink w:history="1" r:id="rIdrotzqso00fdxcwwkhecao">
         <w:r>
           <w:rPr>
             <w:rFonts w:ascii="Arial" w:cs="Arial" w:eastAsia="Arial" w:hAnsi="Arial"/>
@@ -1085,7 +1085,7 @@
         </w:rPr>
         <w:t xml:space="preserve"> | </w:t>
       </w:r>
-      <w:hyperlink w:history="1" r:id="rIdszpqy0fya-uygd7gan545">
+      <w:hyperlink w:history="1" r:id="rIdtz2a2odef5zjbgm0rrizr">
         <w:r>
           <w:rPr>
             <w:rFonts w:ascii="Arial" w:cs="Arial" w:eastAsia="Arial" w:hAnsi="Arial"/>
@@ -1174,7 +1174,7 @@
         </w:rPr>
         <w:t xml:space="preserve"> | </w:t>
       </w:r>
-      <w:hyperlink w:history="1" r:id="rIdnozbwu-457wqynhkjgxjn">
+      <w:hyperlink w:history="1" r:id="rIdugbrim9gr1_olungq0bez">
         <w:r>
           <w:rPr>
             <w:rFonts w:ascii="Arial" w:cs="Arial" w:eastAsia="Arial" w:hAnsi="Arial"/>
@@ -1217,7 +1217,26 @@
           <w:sz w:val="20"/>
           <w:szCs w:val="20"/>
         </w:rPr>
-        <w:t xml:space="preserve">Architected a Web Worker processing pipeline with stage-level progress tracking that handles full streaming history datasets in-browser, keeping all personal listening data local.</w:t>
+        <w:t xml:space="preserve">Architected a Web Worker pipeline with stage-level progress tracking for full streaming history datasets in-browser.</w:t>
+      </w:r>
+    </w:p>
+    <w:p>
+      <w:pPr>
+        <w:pStyle w:val="ListParagraph"/>
+        <w:numPr>
+          <w:ilvl w:val="0"/>
+          <w:numId w:val="1"/>
+        </w:numPr>
+        <w:spacing w:after="35"/>
+      </w:pPr>
+      <w:r>
+        <w:rPr>
+          <w:rFonts w:ascii="Arial" w:cs="Arial" w:eastAsia="Arial" w:hAnsi="Arial"/>
+          <w:color w:val="0F172A"/>
+          <w:sz w:val="20"/>
+          <w:szCs w:val="20"/>
+        </w:rPr>
+        <w:t xml:space="preserve">Built a Share Studio with dozen-plus card presets, PNG/ZIP export, themes, and strict performance budgets.</w:t>
       </w:r>
     </w:p>
     <w:p>
@@ -1244,7 +1263,7 @@
         </w:rPr>
         <w:t xml:space="preserve"> | </w:t>
       </w:r>
-      <w:hyperlink w:history="1" r:id="rIda45guiaq6umi37vd4wlap">
+      <w:hyperlink w:history="1" r:id="rIdockywm70o-4dgzhvkseyn">
         <w:r>
           <w:rPr>
             <w:rFonts w:ascii="Arial" w:cs="Arial" w:eastAsia="Arial" w:hAnsi="Arial"/>
@@ -1333,7 +1352,7 @@
         </w:rPr>
         <w:t xml:space="preserve"> | </w:t>
       </w:r>
-      <w:hyperlink w:history="1" r:id="rIdkc1kqf6pdgdowinnhe0ps">
+      <w:hyperlink w:history="1" r:id="rId_jgj7rvufc7ncm7tjuerr">
         <w:r>
           <w:rPr>
             <w:rFonts w:ascii="Arial" w:cs="Arial" w:eastAsia="Arial" w:hAnsi="Arial"/>
@@ -1422,7 +1441,7 @@
         </w:rPr>
         <w:t xml:space="preserve"> | </w:t>
       </w:r>
-      <w:hyperlink w:history="1" r:id="rIdwraum7ifblq1m506ruzpz">
+      <w:hyperlink w:history="1" r:id="rIdmyvunozmugiciyb1sr2lk">
         <w:r>
           <w:rPr>
             <w:rFonts w:ascii="Arial" w:cs="Arial" w:eastAsia="Arial" w:hAnsi="Arial"/>
@@ -1511,7 +1530,7 @@
         </w:rPr>
         <w:t xml:space="preserve"> | </w:t>
       </w:r>
-      <w:hyperlink w:history="1" r:id="rIdaaep4ee6w5q_rnhdyly-t">
+      <w:hyperlink w:history="1" r:id="rIdpeangozcgxovhr4b5tnge">
         <w:r>
           <w:rPr>
             <w:rFonts w:ascii="Arial" w:cs="Arial" w:eastAsia="Arial" w:hAnsi="Arial"/>
@@ -1554,7 +1573,26 @@
           <w:sz w:val="20"/>
           <w:szCs w:val="20"/>
         </w:rPr>
-        <w:t xml:space="preserve">Built a dual-format editor on Electron 39 + CodeMirror 6 with synchronized scroll between source and rendered preview, remark/rehype plugin support, and YAML frontmatter validation.</w:t>
+        <w:t xml:space="preserve">Built a dual-format Electron editor with CodeMirror 6, synchronized MDX preview, and YAML frontmatter validation.</w:t>
+      </w:r>
+    </w:p>
+    <w:p>
+      <w:pPr>
+        <w:pStyle w:val="ListParagraph"/>
+        <w:numPr>
+          <w:ilvl w:val="0"/>
+          <w:numId w:val="1"/>
+        </w:numPr>
+        <w:spacing w:after="35"/>
+      </w:pPr>
+      <w:r>
+        <w:rPr>
+          <w:rFonts w:ascii="Arial" w:cs="Arial" w:eastAsia="Arial" w:hAnsi="Arial"/>
+          <w:color w:val="0F172A"/>
+          <w:sz w:val="20"/>
+          <w:szCs w:val="20"/>
+        </w:rPr>
+        <w:t xml:space="preserve">Integrated multi-provider AI assistance with token/cost tracking and Keychain-backed secret storage.</w:t>
       </w:r>
     </w:p>
     <w:p>
@@ -1581,7 +1619,7 @@
         </w:rPr>
         <w:t xml:space="preserve"> | </w:t>
       </w:r>
-      <w:hyperlink w:history="1" r:id="rIdigdgmwnrkidcqdjitoelk">
+      <w:hyperlink w:history="1" r:id="rIdzqom3qlmkrasca2ovlefy">
         <w:r>
           <w:rPr>
             <w:rFonts w:ascii="Arial" w:cs="Arial" w:eastAsia="Arial" w:hAnsi="Arial"/>
@@ -1683,7 +1721,7 @@
       <w:pPr>
         <w:spacing w:after="25"/>
       </w:pPr>
-      <w:hyperlink w:history="1" r:id="rIdwb4do4wge8rlr2txv-wuq">
+      <w:hyperlink w:history="1" r:id="rIdq0kcmbkz0zjnhwyee9ffn">
         <w:r>
           <w:rPr>
             <w:rFonts w:ascii="Arial" w:cs="Arial" w:eastAsia="Arial" w:hAnsi="Arial"/>
@@ -1739,7 +1777,7 @@
       <w:pPr>
         <w:spacing w:after="25"/>
       </w:pPr>
-      <w:hyperlink w:history="1" r:id="rIdi9makco44hbf965hh-xqq">
+      <w:hyperlink w:history="1" r:id="rIdzhkq0awoa6bjd7amk8bx-">
         <w:r>
           <w:rPr>
             <w:rFonts w:ascii="Arial" w:cs="Arial" w:eastAsia="Arial" w:hAnsi="Arial"/>
@@ -1770,7 +1808,7 @@
       <w:pPr>
         <w:spacing w:after="35"/>
       </w:pPr>
-      <w:hyperlink w:history="1" r:id="rIdtrfm7arz6r7fm_zaullyt">
+      <w:hyperlink w:history="1" r:id="rIdqzdbhoxbwvultyghktxjh">
         <w:r>
           <w:rPr>
             <w:rFonts w:ascii="Arial" w:cs="Arial" w:eastAsia="Arial" w:hAnsi="Arial"/>
@@ -1819,7 +1857,7 @@
       <w:pPr>
         <w:spacing w:after="35"/>
       </w:pPr>
-      <w:hyperlink w:history="1" r:id="rIdef-0op7kmoljft6esslif">
+      <w:hyperlink w:history="1" r:id="rIdgabnbwrqibdd0ftlq5n6z">
         <w:r>
           <w:rPr>
             <w:rFonts w:ascii="Arial" w:cs="Arial" w:eastAsia="Arial" w:hAnsi="Arial"/>

</xml_diff>

<commit_message>
chore: refresh resume download artifacts
Co-authored-by: Copilot <223556219+Copilot@users.noreply.github.com>
</commit_message>
<xml_diff>
--- a/public/downloads/wyatt-walsh-resume-full.docx
+++ b/public/downloads/wyatt-walsh-resume-full.docx
@@ -7,7 +7,7 @@
         <w:pStyle w:val="Title"/>
         <w:spacing w:after="75"/>
       </w:pPr>
-      <w:hyperlink w:history="1" r:id="rIdia9ihomfyr7jjvjxjcbzn">
+      <w:hyperlink w:history="1" r:id="rIdckaefc_szgtplzxhqonam">
         <w:r>
           <w:rPr>
             <w:rFonts w:ascii="Arial" w:cs="Arial" w:eastAsia="Arial" w:hAnsi="Arial"/>
@@ -40,7 +40,7 @@
       <w:pPr>
         <w:spacing w:after="100"/>
       </w:pPr>
-      <w:hyperlink w:history="1" r:id="rId3nhbg-1cjedshr_oks14y">
+      <w:hyperlink w:history="1" r:id="rId420jxr9hm6r4yqpqijwea">
         <w:r>
           <w:rPr>
             <w:rFonts w:ascii="Arial" w:cs="Arial" w:eastAsia="Arial" w:hAnsi="Arial"/>
@@ -61,7 +61,7 @@
         </w:rPr>
         <w:t xml:space="preserve"> | </w:t>
       </w:r>
-      <w:hyperlink w:history="1" r:id="rIdnlivnggy5ckxsnw3f60yn">
+      <w:hyperlink w:history="1" r:id="rIdp0sn9s5i65mtg4ac3mlmf">
         <w:r>
           <w:rPr>
             <w:rFonts w:ascii="Arial" w:cs="Arial" w:eastAsia="Arial" w:hAnsi="Arial"/>
@@ -100,7 +100,7 @@
         </w:rPr>
         <w:t xml:space="preserve"> | </w:t>
       </w:r>
-      <w:hyperlink w:history="1" r:id="rId1vtsvstriojzujqspqukp">
+      <w:hyperlink w:history="1" r:id="rId3aw8h1xwrrfcqtpn7ydhg">
         <w:r>
           <w:rPr>
             <w:rFonts w:ascii="Arial" w:cs="Arial" w:eastAsia="Arial" w:hAnsi="Arial"/>
@@ -121,7 +121,7 @@
         </w:rPr>
         <w:t xml:space="preserve"> | </w:t>
       </w:r>
-      <w:hyperlink w:history="1" r:id="rIdxqon-a7lsjyr-hblpmmrn">
+      <w:hyperlink w:history="1" r:id="rIdxgfiamgpoqgw6ghplz77x">
         <w:r>
           <w:rPr>
             <w:rFonts w:ascii="Arial" w:cs="Arial" w:eastAsia="Arial" w:hAnsi="Arial"/>
@@ -189,7 +189,7 @@
         </w:rPr>
         <w:t xml:space="preserve"> | </w:t>
       </w:r>
-      <w:hyperlink w:history="1" r:id="rId4nsup-w3k7bbqyat7pcvl">
+      <w:hyperlink w:history="1" r:id="rIdtnu6ih7z0a409me1k-j6u">
         <w:r>
           <w:rPr>
             <w:rFonts w:ascii="Arial" w:cs="Arial" w:eastAsia="Arial" w:hAnsi="Arial"/>
@@ -352,7 +352,7 @@
         </w:rPr>
         <w:t xml:space="preserve"> | </w:t>
       </w:r>
-      <w:hyperlink w:history="1" r:id="rIdlvrznofqrpxmlkv9lbwrv">
+      <w:hyperlink w:history="1" r:id="rIdj_s6shhznrlab43xcsobw">
         <w:r>
           <w:rPr>
             <w:rFonts w:ascii="Arial" w:cs="Arial" w:eastAsia="Arial" w:hAnsi="Arial"/>
@@ -750,7 +750,7 @@
         </w:rPr>
         <w:t xml:space="preserve"> | </w:t>
       </w:r>
-      <w:hyperlink w:history="1" r:id="rIdync2jzxcekl53epmdje2h">
+      <w:hyperlink w:history="1" r:id="rIdhtgmvwvgioki-zsoomrlp">
         <w:r>
           <w:rPr>
             <w:rFonts w:ascii="Arial" w:cs="Arial" w:eastAsia="Arial" w:hAnsi="Arial"/>
@@ -996,7 +996,7 @@
         </w:rPr>
         <w:t xml:space="preserve"> | </w:t>
       </w:r>
-      <w:hyperlink w:history="1" r:id="rIdrotzqso00fdxcwwkhecao">
+      <w:hyperlink w:history="1" r:id="rIdm4midocpdfzalo9tljml3">
         <w:r>
           <w:rPr>
             <w:rFonts w:ascii="Arial" w:cs="Arial" w:eastAsia="Arial" w:hAnsi="Arial"/>
@@ -1085,7 +1085,7 @@
         </w:rPr>
         <w:t xml:space="preserve"> | </w:t>
       </w:r>
-      <w:hyperlink w:history="1" r:id="rIdtz2a2odef5zjbgm0rrizr">
+      <w:hyperlink w:history="1" r:id="rIdjotksd4en-l6-ojyvxkmu">
         <w:r>
           <w:rPr>
             <w:rFonts w:ascii="Arial" w:cs="Arial" w:eastAsia="Arial" w:hAnsi="Arial"/>
@@ -1174,7 +1174,7 @@
         </w:rPr>
         <w:t xml:space="preserve"> | </w:t>
       </w:r>
-      <w:hyperlink w:history="1" r:id="rIdugbrim9gr1_olungq0bez">
+      <w:hyperlink w:history="1" r:id="rIdf6oyyawnefdpicvbwf8ew">
         <w:r>
           <w:rPr>
             <w:rFonts w:ascii="Arial" w:cs="Arial" w:eastAsia="Arial" w:hAnsi="Arial"/>
@@ -1263,7 +1263,7 @@
         </w:rPr>
         <w:t xml:space="preserve"> | </w:t>
       </w:r>
-      <w:hyperlink w:history="1" r:id="rIdockywm70o-4dgzhvkseyn">
+      <w:hyperlink w:history="1" r:id="rIdufwpft7khf3y3grk8v-dz">
         <w:r>
           <w:rPr>
             <w:rFonts w:ascii="Arial" w:cs="Arial" w:eastAsia="Arial" w:hAnsi="Arial"/>
@@ -1352,7 +1352,7 @@
         </w:rPr>
         <w:t xml:space="preserve"> | </w:t>
       </w:r>
-      <w:hyperlink w:history="1" r:id="rId_jgj7rvufc7ncm7tjuerr">
+      <w:hyperlink w:history="1" r:id="rIdhgd4tipnt8qymeiqrr-mm">
         <w:r>
           <w:rPr>
             <w:rFonts w:ascii="Arial" w:cs="Arial" w:eastAsia="Arial" w:hAnsi="Arial"/>
@@ -1441,7 +1441,7 @@
         </w:rPr>
         <w:t xml:space="preserve"> | </w:t>
       </w:r>
-      <w:hyperlink w:history="1" r:id="rIdmyvunozmugiciyb1sr2lk">
+      <w:hyperlink w:history="1" r:id="rIdmefy3s8ksswy_1bxsxxnm">
         <w:r>
           <w:rPr>
             <w:rFonts w:ascii="Arial" w:cs="Arial" w:eastAsia="Arial" w:hAnsi="Arial"/>
@@ -1530,7 +1530,7 @@
         </w:rPr>
         <w:t xml:space="preserve"> | </w:t>
       </w:r>
-      <w:hyperlink w:history="1" r:id="rIdpeangozcgxovhr4b5tnge">
+      <w:hyperlink w:history="1" r:id="rIdiigcosflat3gihpowfilz">
         <w:r>
           <w:rPr>
             <w:rFonts w:ascii="Arial" w:cs="Arial" w:eastAsia="Arial" w:hAnsi="Arial"/>
@@ -1619,7 +1619,7 @@
         </w:rPr>
         <w:t xml:space="preserve"> | </w:t>
       </w:r>
-      <w:hyperlink w:history="1" r:id="rIdzqom3qlmkrasca2ovlefy">
+      <w:hyperlink w:history="1" r:id="rIde7esvk0pgadvusfdvhfed">
         <w:r>
           <w:rPr>
             <w:rFonts w:ascii="Arial" w:cs="Arial" w:eastAsia="Arial" w:hAnsi="Arial"/>
@@ -1721,7 +1721,7 @@
       <w:pPr>
         <w:spacing w:after="25"/>
       </w:pPr>
-      <w:hyperlink w:history="1" r:id="rIdq0kcmbkz0zjnhwyee9ffn">
+      <w:hyperlink w:history="1" r:id="rIdnoylfn4mybda8l49-laf5">
         <w:r>
           <w:rPr>
             <w:rFonts w:ascii="Arial" w:cs="Arial" w:eastAsia="Arial" w:hAnsi="Arial"/>
@@ -1777,7 +1777,7 @@
       <w:pPr>
         <w:spacing w:after="25"/>
       </w:pPr>
-      <w:hyperlink w:history="1" r:id="rIdzhkq0awoa6bjd7amk8bx-">
+      <w:hyperlink w:history="1" r:id="rId1ghqb7bn0llhwn1gt8xku">
         <w:r>
           <w:rPr>
             <w:rFonts w:ascii="Arial" w:cs="Arial" w:eastAsia="Arial" w:hAnsi="Arial"/>
@@ -1808,7 +1808,7 @@
       <w:pPr>
         <w:spacing w:after="35"/>
       </w:pPr>
-      <w:hyperlink w:history="1" r:id="rIdqzdbhoxbwvultyghktxjh">
+      <w:hyperlink w:history="1" r:id="rIdhyhnmlfcybq69bqzkjjts">
         <w:r>
           <w:rPr>
             <w:rFonts w:ascii="Arial" w:cs="Arial" w:eastAsia="Arial" w:hAnsi="Arial"/>
@@ -1857,7 +1857,7 @@
       <w:pPr>
         <w:spacing w:after="35"/>
       </w:pPr>
-      <w:hyperlink w:history="1" r:id="rIdgabnbwrqibdd0ftlq5n6z">
+      <w:hyperlink w:history="1" r:id="rId9mhk9458t8emk66dbxpja">
         <w:r>
           <w:rPr>
             <w:rFonts w:ascii="Arial" w:cs="Arial" w:eastAsia="Arial" w:hAnsi="Arial"/>

</xml_diff>

<commit_message>
feat: harden resume artifact workflow
Co-authored-by: Copilot <223556219+Copilot@users.noreply.github.com>
</commit_message>
<xml_diff>
--- a/public/downloads/wyatt-walsh-resume-full.docx
+++ b/public/downloads/wyatt-walsh-resume-full.docx
@@ -7,7 +7,7 @@
         <w:pStyle w:val="Title"/>
         <w:spacing w:after="75"/>
       </w:pPr>
-      <w:hyperlink w:history="1" r:id="rIdckaefc_szgtplzxhqonam">
+      <w:hyperlink w:history="1" r:id="rIdlokzcdelbe-dc_jkjpois">
         <w:r>
           <w:rPr>
             <w:rFonts w:ascii="Arial" w:cs="Arial" w:eastAsia="Arial" w:hAnsi="Arial"/>
@@ -40,7 +40,7 @@
       <w:pPr>
         <w:spacing w:after="100"/>
       </w:pPr>
-      <w:hyperlink w:history="1" r:id="rId420jxr9hm6r4yqpqijwea">
+      <w:hyperlink w:history="1" r:id="rIdveuvrt12otc5szjcnm6w9">
         <w:r>
           <w:rPr>
             <w:rFonts w:ascii="Arial" w:cs="Arial" w:eastAsia="Arial" w:hAnsi="Arial"/>
@@ -61,7 +61,7 @@
         </w:rPr>
         <w:t xml:space="preserve"> | </w:t>
       </w:r>
-      <w:hyperlink w:history="1" r:id="rIdp0sn9s5i65mtg4ac3mlmf">
+      <w:hyperlink w:history="1" r:id="rId_fyuizv6n5d6yiry4tojr">
         <w:r>
           <w:rPr>
             <w:rFonts w:ascii="Arial" w:cs="Arial" w:eastAsia="Arial" w:hAnsi="Arial"/>
@@ -100,7 +100,7 @@
         </w:rPr>
         <w:t xml:space="preserve"> | </w:t>
       </w:r>
-      <w:hyperlink w:history="1" r:id="rId3aw8h1xwrrfcqtpn7ydhg">
+      <w:hyperlink w:history="1" r:id="rIdnay_xw32itxo6a5kdlaxi">
         <w:r>
           <w:rPr>
             <w:rFonts w:ascii="Arial" w:cs="Arial" w:eastAsia="Arial" w:hAnsi="Arial"/>
@@ -121,7 +121,7 @@
         </w:rPr>
         <w:t xml:space="preserve"> | </w:t>
       </w:r>
-      <w:hyperlink w:history="1" r:id="rIdxgfiamgpoqgw6ghplz77x">
+      <w:hyperlink w:history="1" r:id="rIdor4e99ha8uzoy1tjcaoqq">
         <w:r>
           <w:rPr>
             <w:rFonts w:ascii="Arial" w:cs="Arial" w:eastAsia="Arial" w:hAnsi="Arial"/>
@@ -189,7 +189,7 @@
         </w:rPr>
         <w:t xml:space="preserve"> | </w:t>
       </w:r>
-      <w:hyperlink w:history="1" r:id="rIdtnu6ih7z0a409me1k-j6u">
+      <w:hyperlink w:history="1" r:id="rIdydnvnrjvhxc7ogg5nx73i">
         <w:r>
           <w:rPr>
             <w:rFonts w:ascii="Arial" w:cs="Arial" w:eastAsia="Arial" w:hAnsi="Arial"/>
@@ -352,7 +352,7 @@
         </w:rPr>
         <w:t xml:space="preserve"> | </w:t>
       </w:r>
-      <w:hyperlink w:history="1" r:id="rIdj_s6shhznrlab43xcsobw">
+      <w:hyperlink w:history="1" r:id="rId3mrjx1-1aiiaxkpuwxqxn">
         <w:r>
           <w:rPr>
             <w:rFonts w:ascii="Arial" w:cs="Arial" w:eastAsia="Arial" w:hAnsi="Arial"/>
@@ -750,7 +750,7 @@
         </w:rPr>
         <w:t xml:space="preserve"> | </w:t>
       </w:r>
-      <w:hyperlink w:history="1" r:id="rIdhtgmvwvgioki-zsoomrlp">
+      <w:hyperlink w:history="1" r:id="rIdf3ljgk9l5ry74pyefj_ec">
         <w:r>
           <w:rPr>
             <w:rFonts w:ascii="Arial" w:cs="Arial" w:eastAsia="Arial" w:hAnsi="Arial"/>
@@ -996,7 +996,7 @@
         </w:rPr>
         <w:t xml:space="preserve"> | </w:t>
       </w:r>
-      <w:hyperlink w:history="1" r:id="rIdm4midocpdfzalo9tljml3">
+      <w:hyperlink w:history="1" r:id="rIdur-qm0hzq5jhb9teoxak4">
         <w:r>
           <w:rPr>
             <w:rFonts w:ascii="Arial" w:cs="Arial" w:eastAsia="Arial" w:hAnsi="Arial"/>
@@ -1085,7 +1085,7 @@
         </w:rPr>
         <w:t xml:space="preserve"> | </w:t>
       </w:r>
-      <w:hyperlink w:history="1" r:id="rIdjotksd4en-l6-ojyvxkmu">
+      <w:hyperlink w:history="1" r:id="rIdahahfs9bsccsxpblfpnym">
         <w:r>
           <w:rPr>
             <w:rFonts w:ascii="Arial" w:cs="Arial" w:eastAsia="Arial" w:hAnsi="Arial"/>
@@ -1174,7 +1174,7 @@
         </w:rPr>
         <w:t xml:space="preserve"> | </w:t>
       </w:r>
-      <w:hyperlink w:history="1" r:id="rIdf6oyyawnefdpicvbwf8ew">
+      <w:hyperlink w:history="1" r:id="rIdlp1mtqzqmertxixo249sc">
         <w:r>
           <w:rPr>
             <w:rFonts w:ascii="Arial" w:cs="Arial" w:eastAsia="Arial" w:hAnsi="Arial"/>
@@ -1263,7 +1263,7 @@
         </w:rPr>
         <w:t xml:space="preserve"> | </w:t>
       </w:r>
-      <w:hyperlink w:history="1" r:id="rIdufwpft7khf3y3grk8v-dz">
+      <w:hyperlink w:history="1" r:id="rIdoi9u8wdisupk3ymrek8kp">
         <w:r>
           <w:rPr>
             <w:rFonts w:ascii="Arial" w:cs="Arial" w:eastAsia="Arial" w:hAnsi="Arial"/>
@@ -1352,7 +1352,7 @@
         </w:rPr>
         <w:t xml:space="preserve"> | </w:t>
       </w:r>
-      <w:hyperlink w:history="1" r:id="rIdhgd4tipnt8qymeiqrr-mm">
+      <w:hyperlink w:history="1" r:id="rIdqf9idu1m_4wccew7jfoaq">
         <w:r>
           <w:rPr>
             <w:rFonts w:ascii="Arial" w:cs="Arial" w:eastAsia="Arial" w:hAnsi="Arial"/>
@@ -1441,7 +1441,7 @@
         </w:rPr>
         <w:t xml:space="preserve"> | </w:t>
       </w:r>
-      <w:hyperlink w:history="1" r:id="rIdmefy3s8ksswy_1bxsxxnm">
+      <w:hyperlink w:history="1" r:id="rIduie6fer_rkiufw_dp7yi8">
         <w:r>
           <w:rPr>
             <w:rFonts w:ascii="Arial" w:cs="Arial" w:eastAsia="Arial" w:hAnsi="Arial"/>
@@ -1530,7 +1530,7 @@
         </w:rPr>
         <w:t xml:space="preserve"> | </w:t>
       </w:r>
-      <w:hyperlink w:history="1" r:id="rIdiigcosflat3gihpowfilz">
+      <w:hyperlink w:history="1" r:id="rId_cdi5ixwpqzaxcchoabgm">
         <w:r>
           <w:rPr>
             <w:rFonts w:ascii="Arial" w:cs="Arial" w:eastAsia="Arial" w:hAnsi="Arial"/>
@@ -1619,7 +1619,7 @@
         </w:rPr>
         <w:t xml:space="preserve"> | </w:t>
       </w:r>
-      <w:hyperlink w:history="1" r:id="rIde7esvk0pgadvusfdvhfed">
+      <w:hyperlink w:history="1" r:id="rId5j-luxseveqxk_wcguhoh">
         <w:r>
           <w:rPr>
             <w:rFonts w:ascii="Arial" w:cs="Arial" w:eastAsia="Arial" w:hAnsi="Arial"/>
@@ -1721,7 +1721,7 @@
       <w:pPr>
         <w:spacing w:after="25"/>
       </w:pPr>
-      <w:hyperlink w:history="1" r:id="rIdnoylfn4mybda8l49-laf5">
+      <w:hyperlink w:history="1" r:id="rIdt0-ppcsmiyd7unrtww_a8">
         <w:r>
           <w:rPr>
             <w:rFonts w:ascii="Arial" w:cs="Arial" w:eastAsia="Arial" w:hAnsi="Arial"/>
@@ -1777,7 +1777,7 @@
       <w:pPr>
         <w:spacing w:after="25"/>
       </w:pPr>
-      <w:hyperlink w:history="1" r:id="rId1ghqb7bn0llhwn1gt8xku">
+      <w:hyperlink w:history="1" r:id="rIdcmwpkyehqt_uldoeby6z2">
         <w:r>
           <w:rPr>
             <w:rFonts w:ascii="Arial" w:cs="Arial" w:eastAsia="Arial" w:hAnsi="Arial"/>
@@ -1808,7 +1808,7 @@
       <w:pPr>
         <w:spacing w:after="35"/>
       </w:pPr>
-      <w:hyperlink w:history="1" r:id="rIdhyhnmlfcybq69bqzkjjts">
+      <w:hyperlink w:history="1" r:id="rIdrxusn0dxlth8cq8wgxcms">
         <w:r>
           <w:rPr>
             <w:rFonts w:ascii="Arial" w:cs="Arial" w:eastAsia="Arial" w:hAnsi="Arial"/>
@@ -1857,7 +1857,7 @@
       <w:pPr>
         <w:spacing w:after="35"/>
       </w:pPr>
-      <w:hyperlink w:history="1" r:id="rId9mhk9458t8emk66dbxpja">
+      <w:hyperlink w:history="1" r:id="rIdhlzj0xmtt5ahwbmuaztct">
         <w:r>
           <w:rPr>
             <w:rFonts w:ascii="Arial" w:cs="Arial" w:eastAsia="Arial" w:hAnsi="Arial"/>

</xml_diff>

<commit_message>
refine full resume project layout
Co-authored-by: Copilot <223556219+Copilot@users.noreply.github.com>
</commit_message>
<xml_diff>
--- a/public/downloads/wyatt-walsh-resume-full.docx
+++ b/public/downloads/wyatt-walsh-resume-full.docx
@@ -7,7 +7,7 @@
         <w:pStyle w:val="Title"/>
         <w:spacing w:after="75"/>
       </w:pPr>
-      <w:hyperlink w:history="1" r:id="rIdlokzcdelbe-dc_jkjpois">
+      <w:hyperlink w:history="1" r:id="rIdlpywkgcuve1ivsq5rt3g-">
         <w:r>
           <w:rPr>
             <w:rFonts w:ascii="Arial" w:cs="Arial" w:eastAsia="Arial" w:hAnsi="Arial"/>
@@ -40,7 +40,7 @@
       <w:pPr>
         <w:spacing w:after="100"/>
       </w:pPr>
-      <w:hyperlink w:history="1" r:id="rIdveuvrt12otc5szjcnm6w9">
+      <w:hyperlink w:history="1" r:id="rIdgjdlzempnkzischxpmi59">
         <w:r>
           <w:rPr>
             <w:rFonts w:ascii="Arial" w:cs="Arial" w:eastAsia="Arial" w:hAnsi="Arial"/>
@@ -61,7 +61,7 @@
         </w:rPr>
         <w:t xml:space="preserve"> | </w:t>
       </w:r>
-      <w:hyperlink w:history="1" r:id="rId_fyuizv6n5d6yiry4tojr">
+      <w:hyperlink w:history="1" r:id="rId3z9tyieudefqbqrytwpm2">
         <w:r>
           <w:rPr>
             <w:rFonts w:ascii="Arial" w:cs="Arial" w:eastAsia="Arial" w:hAnsi="Arial"/>
@@ -100,7 +100,7 @@
         </w:rPr>
         <w:t xml:space="preserve"> | </w:t>
       </w:r>
-      <w:hyperlink w:history="1" r:id="rIdnay_xw32itxo6a5kdlaxi">
+      <w:hyperlink w:history="1" r:id="rIdjdmkj6pv6hucc9nsaeix2">
         <w:r>
           <w:rPr>
             <w:rFonts w:ascii="Arial" w:cs="Arial" w:eastAsia="Arial" w:hAnsi="Arial"/>
@@ -121,7 +121,7 @@
         </w:rPr>
         <w:t xml:space="preserve"> | </w:t>
       </w:r>
-      <w:hyperlink w:history="1" r:id="rIdor4e99ha8uzoy1tjcaoqq">
+      <w:hyperlink w:history="1" r:id="rIdeh0bqghfqekgch94uk46v">
         <w:r>
           <w:rPr>
             <w:rFonts w:ascii="Arial" w:cs="Arial" w:eastAsia="Arial" w:hAnsi="Arial"/>
@@ -189,7 +189,7 @@
         </w:rPr>
         <w:t xml:space="preserve"> | </w:t>
       </w:r>
-      <w:hyperlink w:history="1" r:id="rIdydnvnrjvhxc7ogg5nx73i">
+      <w:hyperlink w:history="1" r:id="rIdlrowrw6135kwmu_wntwnn">
         <w:r>
           <w:rPr>
             <w:rFonts w:ascii="Arial" w:cs="Arial" w:eastAsia="Arial" w:hAnsi="Arial"/>
@@ -352,7 +352,7 @@
         </w:rPr>
         <w:t xml:space="preserve"> | </w:t>
       </w:r>
-      <w:hyperlink w:history="1" r:id="rId3mrjx1-1aiiaxkpuwxqxn">
+      <w:hyperlink w:history="1" r:id="rIdbo21rk8rp3ebllq87v_o2">
         <w:r>
           <w:rPr>
             <w:rFonts w:ascii="Arial" w:cs="Arial" w:eastAsia="Arial" w:hAnsi="Arial"/>
@@ -750,7 +750,7 @@
         </w:rPr>
         <w:t xml:space="preserve"> | </w:t>
       </w:r>
-      <w:hyperlink w:history="1" r:id="rIdf3ljgk9l5ry74pyefj_ec">
+      <w:hyperlink w:history="1" r:id="rIdrezdzj9amxkxuh5iavdag">
         <w:r>
           <w:rPr>
             <w:rFonts w:ascii="Arial" w:cs="Arial" w:eastAsia="Arial" w:hAnsi="Arial"/>
@@ -996,7 +996,7 @@
         </w:rPr>
         <w:t xml:space="preserve"> | </w:t>
       </w:r>
-      <w:hyperlink w:history="1" r:id="rIdur-qm0hzq5jhb9teoxak4">
+      <w:hyperlink w:history="1" r:id="rId2s92cq7og139fpf_wllr6">
         <w:r>
           <w:rPr>
             <w:rFonts w:ascii="Arial" w:cs="Arial" w:eastAsia="Arial" w:hAnsi="Arial"/>
@@ -1085,7 +1085,7 @@
         </w:rPr>
         <w:t xml:space="preserve"> | </w:t>
       </w:r>
-      <w:hyperlink w:history="1" r:id="rIdahahfs9bsccsxpblfpnym">
+      <w:hyperlink w:history="1" r:id="rId91h9qdxykarzw4na5zjws">
         <w:r>
           <w:rPr>
             <w:rFonts w:ascii="Arial" w:cs="Arial" w:eastAsia="Arial" w:hAnsi="Arial"/>
@@ -1163,95 +1163,6 @@
           <w:sz w:val="21"/>
           <w:szCs w:val="21"/>
         </w:rPr>
-        <w:t xml:space="preserve">Listentropy</w:t>
-      </w:r>
-      <w:r>
-        <w:rPr>
-          <w:rFonts w:ascii="Arial" w:cs="Arial" w:eastAsia="Arial" w:hAnsi="Arial"/>
-          <w:color w:val="475569"/>
-          <w:sz w:val="18"/>
-          <w:szCs w:val="18"/>
-        </w:rPr>
-        <w:t xml:space="preserve"> | </w:t>
-      </w:r>
-      <w:hyperlink w:history="1" r:id="rIdlp1mtqzqmertxixo249sc">
-        <w:r>
-          <w:rPr>
-            <w:rFonts w:ascii="Arial" w:cs="Arial" w:eastAsia="Arial" w:hAnsi="Arial"/>
-            <w:color w:val="2563EB"/>
-            <w:sz w:val="20"/>
-            <w:szCs w:val="20"/>
-            <w:u w:val="single" w:color="2563EB"/>
-          </w:rPr>
-          <w:t xml:space="preserve">github.com/wyattowalsh/listentropy</w:t>
-        </w:r>
-      </w:hyperlink>
-    </w:p>
-    <w:p>
-      <w:pPr>
-        <w:spacing w:after="45"/>
-      </w:pPr>
-      <w:r>
-        <w:rPr>
-          <w:rFonts w:ascii="Arial" w:cs="Arial" w:eastAsia="Arial" w:hAnsi="Arial"/>
-          <w:color w:val="0F172A"/>
-          <w:sz w:val="20"/>
-          <w:szCs w:val="20"/>
-        </w:rPr>
-        <w:t xml:space="preserve">TypeScript/React listening-analytics app using Web Workers, Canvas exports, and Vercel to process private Spotify history in-browser.</w:t>
-      </w:r>
-    </w:p>
-    <w:p>
-      <w:pPr>
-        <w:pStyle w:val="ListParagraph"/>
-        <w:numPr>
-          <w:ilvl w:val="0"/>
-          <w:numId w:val="1"/>
-        </w:numPr>
-        <w:spacing w:after="35"/>
-      </w:pPr>
-      <w:r>
-        <w:rPr>
-          <w:rFonts w:ascii="Arial" w:cs="Arial" w:eastAsia="Arial" w:hAnsi="Arial"/>
-          <w:color w:val="0F172A"/>
-          <w:sz w:val="20"/>
-          <w:szCs w:val="20"/>
-        </w:rPr>
-        <w:t xml:space="preserve">Architected a Web Worker pipeline with stage-level progress tracking for full streaming history datasets in-browser.</w:t>
-      </w:r>
-    </w:p>
-    <w:p>
-      <w:pPr>
-        <w:pStyle w:val="ListParagraph"/>
-        <w:numPr>
-          <w:ilvl w:val="0"/>
-          <w:numId w:val="1"/>
-        </w:numPr>
-        <w:spacing w:after="35"/>
-      </w:pPr>
-      <w:r>
-        <w:rPr>
-          <w:rFonts w:ascii="Arial" w:cs="Arial" w:eastAsia="Arial" w:hAnsi="Arial"/>
-          <w:color w:val="0F172A"/>
-          <w:sz w:val="20"/>
-          <w:szCs w:val="20"/>
-        </w:rPr>
-        <w:t xml:space="preserve">Built a Share Studio with dozen-plus card presets, PNG/ZIP export, themes, and strict performance budgets.</w:t>
-      </w:r>
-    </w:p>
-    <w:p>
-      <w:pPr>
-        <w:spacing w:after="45"/>
-      </w:pPr>
-      <w:r>
-        <w:rPr>
-          <w:rFonts w:ascii="Arial" w:cs="Arial" w:eastAsia="Arial" w:hAnsi="Arial"/>
-          <w:b/>
-          <w:bCs/>
-          <w:color w:val="0F172A"/>
-          <w:sz w:val="21"/>
-          <w:szCs w:val="21"/>
-        </w:rPr>
         <w:t xml:space="preserve">ProxyWhirl</w:t>
       </w:r>
       <w:r>
@@ -1263,7 +1174,7 @@
         </w:rPr>
         <w:t xml:space="preserve"> | </w:t>
       </w:r>
-      <w:hyperlink w:history="1" r:id="rIdoi9u8wdisupk3ymrek8kp">
+      <w:hyperlink w:history="1" r:id="rId7dv1jbfqzsqig7cx3-gft">
         <w:r>
           <w:rPr>
             <w:rFonts w:ascii="Arial" w:cs="Arial" w:eastAsia="Arial" w:hAnsi="Arial"/>
@@ -1352,7 +1263,7 @@
         </w:rPr>
         <w:t xml:space="preserve"> | </w:t>
       </w:r>
-      <w:hyperlink w:history="1" r:id="rIdqf9idu1m_4wccew7jfoaq">
+      <w:hyperlink w:history="1" r:id="rIdjyzejg9thyh2fj-ga3if2">
         <w:r>
           <w:rPr>
             <w:rFonts w:ascii="Arial" w:cs="Arial" w:eastAsia="Arial" w:hAnsi="Arial"/>
@@ -1441,7 +1352,7 @@
         </w:rPr>
         <w:t xml:space="preserve"> | </w:t>
       </w:r>
-      <w:hyperlink w:history="1" r:id="rIduie6fer_rkiufw_dp7yi8">
+      <w:hyperlink w:history="1" r:id="rIdgb4clgpak2ibjltc9qhpz">
         <w:r>
           <w:rPr>
             <w:rFonts w:ascii="Arial" w:cs="Arial" w:eastAsia="Arial" w:hAnsi="Arial"/>
@@ -1519,95 +1430,6 @@
           <w:sz w:val="21"/>
           <w:szCs w:val="21"/>
         </w:rPr>
-        <w:t xml:space="preserve">MDXPad</w:t>
-      </w:r>
-      <w:r>
-        <w:rPr>
-          <w:rFonts w:ascii="Arial" w:cs="Arial" w:eastAsia="Arial" w:hAnsi="Arial"/>
-          <w:color w:val="475569"/>
-          <w:sz w:val="18"/>
-          <w:szCs w:val="18"/>
-        </w:rPr>
-        <w:t xml:space="preserve"> | </w:t>
-      </w:r>
-      <w:hyperlink w:history="1" r:id="rId_cdi5ixwpqzaxcchoabgm">
-        <w:r>
-          <w:rPr>
-            <w:rFonts w:ascii="Arial" w:cs="Arial" w:eastAsia="Arial" w:hAnsi="Arial"/>
-            <w:color w:val="2563EB"/>
-            <w:sz w:val="20"/>
-            <w:szCs w:val="20"/>
-            <w:u w:val="single" w:color="2563EB"/>
-          </w:rPr>
-          <w:t xml:space="preserve">github.com/wyattowalsh/mdxpad</w:t>
-        </w:r>
-      </w:hyperlink>
-    </w:p>
-    <w:p>
-      <w:pPr>
-        <w:spacing w:after="45"/>
-      </w:pPr>
-      <w:r>
-        <w:rPr>
-          <w:rFonts w:ascii="Arial" w:cs="Arial" w:eastAsia="Arial" w:hAnsi="Arial"/>
-          <w:color w:val="0F172A"/>
-          <w:sz w:val="20"/>
-          <w:szCs w:val="20"/>
-        </w:rPr>
-        <w:t xml:space="preserve">Electron/React/TypeScript macOS editor with CodeMirror, Vercel AI SDK assistance, synchronized MDX preview, and Keychain credentials.</w:t>
-      </w:r>
-    </w:p>
-    <w:p>
-      <w:pPr>
-        <w:pStyle w:val="ListParagraph"/>
-        <w:numPr>
-          <w:ilvl w:val="0"/>
-          <w:numId w:val="1"/>
-        </w:numPr>
-        <w:spacing w:after="35"/>
-      </w:pPr>
-      <w:r>
-        <w:rPr>
-          <w:rFonts w:ascii="Arial" w:cs="Arial" w:eastAsia="Arial" w:hAnsi="Arial"/>
-          <w:color w:val="0F172A"/>
-          <w:sz w:val="20"/>
-          <w:szCs w:val="20"/>
-        </w:rPr>
-        <w:t xml:space="preserve">Built a dual-format Electron editor with CodeMirror 6, synchronized MDX preview, and YAML frontmatter validation.</w:t>
-      </w:r>
-    </w:p>
-    <w:p>
-      <w:pPr>
-        <w:pStyle w:val="ListParagraph"/>
-        <w:numPr>
-          <w:ilvl w:val="0"/>
-          <w:numId w:val="1"/>
-        </w:numPr>
-        <w:spacing w:after="35"/>
-      </w:pPr>
-      <w:r>
-        <w:rPr>
-          <w:rFonts w:ascii="Arial" w:cs="Arial" w:eastAsia="Arial" w:hAnsi="Arial"/>
-          <w:color w:val="0F172A"/>
-          <w:sz w:val="20"/>
-          <w:szCs w:val="20"/>
-        </w:rPr>
-        <w:t xml:space="preserve">Integrated multi-provider AI assistance with token/cost tracking and Keychain-backed secret storage.</w:t>
-      </w:r>
-    </w:p>
-    <w:p>
-      <w:pPr>
-        <w:spacing w:after="45"/>
-      </w:pPr>
-      <w:r>
-        <w:rPr>
-          <w:rFonts w:ascii="Arial" w:cs="Arial" w:eastAsia="Arial" w:hAnsi="Arial"/>
-          <w:b/>
-          <w:bCs/>
-          <w:color w:val="0F172A"/>
-          <w:sz w:val="21"/>
-          <w:szCs w:val="21"/>
-        </w:rPr>
         <w:t xml:space="preserve">Personal Website: w4w.dev</w:t>
       </w:r>
       <w:r>
@@ -1619,7 +1441,7 @@
         </w:rPr>
         <w:t xml:space="preserve"> | </w:t>
       </w:r>
-      <w:hyperlink w:history="1" r:id="rId5j-luxseveqxk_wcguhoh">
+      <w:hyperlink w:history="1" r:id="rIdrjwe1y3puaoh766lrlguq">
         <w:r>
           <w:rPr>
             <w:rFonts w:ascii="Arial" w:cs="Arial" w:eastAsia="Arial" w:hAnsi="Arial"/>
@@ -1721,7 +1543,7 @@
       <w:pPr>
         <w:spacing w:after="25"/>
       </w:pPr>
-      <w:hyperlink w:history="1" r:id="rIdt0-ppcsmiyd7unrtww_a8">
+      <w:hyperlink w:history="1" r:id="rIdd_re2pl7jkwfbmmew-uwm">
         <w:r>
           <w:rPr>
             <w:rFonts w:ascii="Arial" w:cs="Arial" w:eastAsia="Arial" w:hAnsi="Arial"/>
@@ -1777,7 +1599,7 @@
       <w:pPr>
         <w:spacing w:after="25"/>
       </w:pPr>
-      <w:hyperlink w:history="1" r:id="rIdcmwpkyehqt_uldoeby6z2">
+      <w:hyperlink w:history="1" r:id="rIde3siejhsso7p_euu5awmc">
         <w:r>
           <w:rPr>
             <w:rFonts w:ascii="Arial" w:cs="Arial" w:eastAsia="Arial" w:hAnsi="Arial"/>
@@ -1808,7 +1630,7 @@
       <w:pPr>
         <w:spacing w:after="35"/>
       </w:pPr>
-      <w:hyperlink w:history="1" r:id="rIdrxusn0dxlth8cq8wgxcms">
+      <w:hyperlink w:history="1" r:id="rId8rk2rkihtovcdhk7bkv7q">
         <w:r>
           <w:rPr>
             <w:rFonts w:ascii="Arial" w:cs="Arial" w:eastAsia="Arial" w:hAnsi="Arial"/>
@@ -1857,7 +1679,7 @@
       <w:pPr>
         <w:spacing w:after="35"/>
       </w:pPr>
-      <w:hyperlink w:history="1" r:id="rIdhlzj0xmtt5ahwbmuaztct">
+      <w:hyperlink w:history="1" r:id="rIdn0a8ya5etvpyuvpjuwzls">
         <w:r>
           <w:rPr>
             <w:rFonts w:ascii="Arial" w:cs="Arial" w:eastAsia="Arial" w:hAnsi="Arial"/>

</xml_diff>

<commit_message>
polish full resume page balance
Co-authored-by: Copilot <223556219+Copilot@users.noreply.github.com>
</commit_message>
<xml_diff>
--- a/public/downloads/wyatt-walsh-resume-full.docx
+++ b/public/downloads/wyatt-walsh-resume-full.docx
@@ -7,7 +7,7 @@
         <w:pStyle w:val="Title"/>
         <w:spacing w:after="75"/>
       </w:pPr>
-      <w:hyperlink w:history="1" r:id="rIdlpywkgcuve1ivsq5rt3g-">
+      <w:hyperlink w:history="1" r:id="rIdxulmo_knxmlq1nhocyzu6">
         <w:r>
           <w:rPr>
             <w:rFonts w:ascii="Arial" w:cs="Arial" w:eastAsia="Arial" w:hAnsi="Arial"/>
@@ -40,7 +40,7 @@
       <w:pPr>
         <w:spacing w:after="100"/>
       </w:pPr>
-      <w:hyperlink w:history="1" r:id="rIdgjdlzempnkzischxpmi59">
+      <w:hyperlink w:history="1" r:id="rId6gvnknrjxbhfevqkxqhie">
         <w:r>
           <w:rPr>
             <w:rFonts w:ascii="Arial" w:cs="Arial" w:eastAsia="Arial" w:hAnsi="Arial"/>
@@ -61,7 +61,7 @@
         </w:rPr>
         <w:t xml:space="preserve"> | </w:t>
       </w:r>
-      <w:hyperlink w:history="1" r:id="rId3z9tyieudefqbqrytwpm2">
+      <w:hyperlink w:history="1" r:id="rIdtbpmockybn8ghvtlcfjsv">
         <w:r>
           <w:rPr>
             <w:rFonts w:ascii="Arial" w:cs="Arial" w:eastAsia="Arial" w:hAnsi="Arial"/>
@@ -100,7 +100,7 @@
         </w:rPr>
         <w:t xml:space="preserve"> | </w:t>
       </w:r>
-      <w:hyperlink w:history="1" r:id="rIdjdmkj6pv6hucc9nsaeix2">
+      <w:hyperlink w:history="1" r:id="rIdznwyh077mzapw4nbaoj5s">
         <w:r>
           <w:rPr>
             <w:rFonts w:ascii="Arial" w:cs="Arial" w:eastAsia="Arial" w:hAnsi="Arial"/>
@@ -121,7 +121,7 @@
         </w:rPr>
         <w:t xml:space="preserve"> | </w:t>
       </w:r>
-      <w:hyperlink w:history="1" r:id="rIdeh0bqghfqekgch94uk46v">
+      <w:hyperlink w:history="1" r:id="rIdkrcbtn-n3cf81fju1a5he">
         <w:r>
           <w:rPr>
             <w:rFonts w:ascii="Arial" w:cs="Arial" w:eastAsia="Arial" w:hAnsi="Arial"/>
@@ -189,7 +189,7 @@
         </w:rPr>
         <w:t xml:space="preserve"> | </w:t>
       </w:r>
-      <w:hyperlink w:history="1" r:id="rIdlrowrw6135kwmu_wntwnn">
+      <w:hyperlink w:history="1" r:id="rIdfvyimzogr8tcotejclnmd">
         <w:r>
           <w:rPr>
             <w:rFonts w:ascii="Arial" w:cs="Arial" w:eastAsia="Arial" w:hAnsi="Arial"/>
@@ -352,7 +352,7 @@
         </w:rPr>
         <w:t xml:space="preserve"> | </w:t>
       </w:r>
-      <w:hyperlink w:history="1" r:id="rIdbo21rk8rp3ebllq87v_o2">
+      <w:hyperlink w:history="1" r:id="rIdlmk5yfoghlqa6matyopux">
         <w:r>
           <w:rPr>
             <w:rFonts w:ascii="Arial" w:cs="Arial" w:eastAsia="Arial" w:hAnsi="Arial"/>
@@ -750,7 +750,7 @@
         </w:rPr>
         <w:t xml:space="preserve"> | </w:t>
       </w:r>
-      <w:hyperlink w:history="1" r:id="rIdrezdzj9amxkxuh5iavdag">
+      <w:hyperlink w:history="1" r:id="rIdftnkpllb46-mbajsmslgq">
         <w:r>
           <w:rPr>
             <w:rFonts w:ascii="Arial" w:cs="Arial" w:eastAsia="Arial" w:hAnsi="Arial"/>
@@ -996,7 +996,7 @@
         </w:rPr>
         <w:t xml:space="preserve"> | </w:t>
       </w:r>
-      <w:hyperlink w:history="1" r:id="rId2s92cq7og139fpf_wllr6">
+      <w:hyperlink w:history="1" r:id="rIdx410ocjyu1uv7soqhnjo3">
         <w:r>
           <w:rPr>
             <w:rFonts w:ascii="Arial" w:cs="Arial" w:eastAsia="Arial" w:hAnsi="Arial"/>
@@ -1020,7 +1020,7 @@
           <w:sz w:val="20"/>
           <w:szCs w:val="20"/>
         </w:rPr>
-        <w:t xml:space="preserve">Python/TypeScript MCP developer-workflow catalog with 40+ reusable skills, FastMCP configs, shared instructions, and cross-runtime agent automation.</w:t>
+        <w:t xml:space="preserve">Open-source agent tooling catalog and docs portal packaging 40+ reusable skills, shared instructions, MCP-ready configs, and cross-runtime workflows for Claude Code, Codex, Copilot, Cursor, and related agents.</w:t>
       </w:r>
     </w:p>
     <w:p>
@@ -1085,7 +1085,7 @@
         </w:rPr>
         <w:t xml:space="preserve"> | </w:t>
       </w:r>
-      <w:hyperlink w:history="1" r:id="rId91h9qdxykarzw4na5zjws">
+      <w:hyperlink w:history="1" r:id="rIdar7d6ei2fny1ri9rggbav">
         <w:r>
           <w:rPr>
             <w:rFonts w:ascii="Arial" w:cs="Arial" w:eastAsia="Arial" w:hAnsi="Arial"/>
@@ -1109,7 +1109,7 @@
           <w:sz w:val="20"/>
           <w:szCs w:val="20"/>
         </w:rPr>
-        <w:t xml:space="preserve">Python warehouse using Pandas, Polars, SQLAlchemy, DuckDB, and Pandera over 65K+ NBA games, 13M+ events, Parquet exports, docs, and CLI.</w:t>
+        <w:t xml:space="preserve">Open-source star-schema NBA analytics warehouse spanning 65K+ games and 13M+ play-by-play events, with validated ETL, docs, CLI, DuckDB/SQLite/Parquet/CSV exports, and Kaggle distribution.</w:t>
       </w:r>
     </w:p>
     <w:p>
@@ -1174,7 +1174,7 @@
         </w:rPr>
         <w:t xml:space="preserve"> | </w:t>
       </w:r>
-      <w:hyperlink w:history="1" r:id="rId7dv1jbfqzsqig7cx3-gft">
+      <w:hyperlink w:history="1" r:id="rIdhj4ituaxhgo3iwrgnbkai">
         <w:r>
           <w:rPr>
             <w:rFonts w:ascii="Arial" w:cs="Arial" w:eastAsia="Arial" w:hAnsi="Arial"/>
@@ -1198,7 +1198,7 @@
           <w:sz w:val="20"/>
           <w:szCs w:val="20"/>
         </w:rPr>
-        <w:t xml:space="preserve">Python/SQLite/PyPI data-collection toolkit with nine rotation strategies, 100+ auto-validated sources, and self-healing proxy health checks.</w:t>
+        <w:t xml:space="preserve">Released rotating proxy toolkit with 9 selection strategies, 100+ auto-validated sources, and self-healing health checks for resilient scraping and data-collection workflows.</w:t>
       </w:r>
     </w:p>
     <w:p>
@@ -1263,7 +1263,7 @@
         </w:rPr>
         <w:t xml:space="preserve"> | </w:t>
       </w:r>
-      <w:hyperlink w:history="1" r:id="rIdjyzejg9thyh2fj-ga3if2">
+      <w:hyperlink w:history="1" r:id="rId3rf2iz0oh5v4jmfx23gs5">
         <w:r>
           <w:rPr>
             <w:rFonts w:ascii="Arial" w:cs="Arial" w:eastAsia="Arial" w:hAnsi="Arial"/>
@@ -1287,7 +1287,7 @@
           <w:sz w:val="20"/>
           <w:szCs w:val="20"/>
         </w:rPr>
-        <w:t xml:space="preserve">Python source-discovery platform with Pydantic, SQLModel, YAML feeds, Fumadocs docs, Vercel deploys, HTTP/RSS validation, and OPML exports.</w:t>
+        <w:t xml:space="preserve">Built a curated AI and ML feed platform with typed schemas, HTTP/RSS validation, contributor submission workflows, OPML exports, and docs-backed browse/download surfaces.</w:t>
       </w:r>
     </w:p>
     <w:p>
@@ -1352,7 +1352,7 @@
         </w:rPr>
         <w:t xml:space="preserve"> | </w:t>
       </w:r>
-      <w:hyperlink w:history="1" r:id="rIdgb4clgpak2ibjltc9qhpz">
+      <w:hyperlink w:history="1" r:id="rId1pzopwku1bxpt5rd1lgvk">
         <w:r>
           <w:rPr>
             <w:rFonts w:ascii="Arial" w:cs="Arial" w:eastAsia="Arial" w:hAnsi="Arial"/>
@@ -1376,7 +1376,7 @@
           <w:sz w:val="20"/>
           <w:szCs w:val="20"/>
         </w:rPr>
-        <w:t xml:space="preserve">Python/FastMCP server using Crawl4AI, Playwright, and Docker so AI agents can crawl, extract, and return structured web content over stdio/HTTP.</w:t>
+        <w:t xml:space="preserve">Released FastMCP server wrapping Crawl4AI so AI agents can crawl and extract web content through four focused tools, agent-friendly outputs, tagged releases, and documented stdio/HTTP integration paths.</w:t>
       </w:r>
     </w:p>
     <w:p>
@@ -1441,7 +1441,7 @@
         </w:rPr>
         <w:t xml:space="preserve"> | </w:t>
       </w:r>
-      <w:hyperlink w:history="1" r:id="rIdrjwe1y3puaoh766lrlguq">
+      <w:hyperlink w:history="1" r:id="rId5at3yme-c8krzlg097rj0">
         <w:r>
           <w:rPr>
             <w:rFonts w:ascii="Arial" w:cs="Arial" w:eastAsia="Arial" w:hAnsi="Arial"/>
@@ -1465,7 +1465,7 @@
           <w:sz w:val="20"/>
           <w:szCs w:val="20"/>
         </w:rPr>
-        <w:t xml:space="preserve">Next.js/React/TypeScript personal web app using Tailwind CSS and MDX for durable content, SEO, polished UI, and authoring workflows.</w:t>
+        <w:t xml:space="preserve">Long-running personal web app and MDX publishing system built with Next.js, combining a polished public-facing frontend with a richly tooled technical blog, strong SEO, and durable content workflows.</w:t>
       </w:r>
     </w:p>
     <w:p>
@@ -1543,7 +1543,7 @@
       <w:pPr>
         <w:spacing w:after="25"/>
       </w:pPr>
-      <w:hyperlink w:history="1" r:id="rIdd_re2pl7jkwfbmmew-uwm">
+      <w:hyperlink w:history="1" r:id="rIdczgi1bsgpfcnvnuknrj1v">
         <w:r>
           <w:rPr>
             <w:rFonts w:ascii="Arial" w:cs="Arial" w:eastAsia="Arial" w:hAnsi="Arial"/>
@@ -1599,7 +1599,7 @@
       <w:pPr>
         <w:spacing w:after="25"/>
       </w:pPr>
-      <w:hyperlink w:history="1" r:id="rIde3siejhsso7p_euu5awmc">
+      <w:hyperlink w:history="1" r:id="rIdynygypgrlwbili8-5nw45">
         <w:r>
           <w:rPr>
             <w:rFonts w:ascii="Arial" w:cs="Arial" w:eastAsia="Arial" w:hAnsi="Arial"/>
@@ -1630,7 +1630,7 @@
       <w:pPr>
         <w:spacing w:after="35"/>
       </w:pPr>
-      <w:hyperlink w:history="1" r:id="rId8rk2rkihtovcdhk7bkv7q">
+      <w:hyperlink w:history="1" r:id="rIdp1bjtoswkvmroxyqp83lx">
         <w:r>
           <w:rPr>
             <w:rFonts w:ascii="Arial" w:cs="Arial" w:eastAsia="Arial" w:hAnsi="Arial"/>
@@ -1679,7 +1679,7 @@
       <w:pPr>
         <w:spacing w:after="35"/>
       </w:pPr>
-      <w:hyperlink w:history="1" r:id="rIdn0a8ya5etvpyuvpjuwzls">
+      <w:hyperlink w:history="1" r:id="rIdjlctizb1ooatocs5k-vt7">
         <w:r>
           <w:rPr>
             <w:rFonts w:ascii="Arial" w:cs="Arial" w:eastAsia="Arial" w:hAnsi="Arial"/>

</xml_diff>

<commit_message>
fix: include NBA DB Kaggle stats in resume artifacts
</commit_message>
<xml_diff>
--- a/public/downloads/wyatt-walsh-resume-full.docx
+++ b/public/downloads/wyatt-walsh-resume-full.docx
@@ -7,7 +7,7 @@
         <w:pStyle w:val="Title"/>
         <w:spacing w:after="75"/>
       </w:pPr>
-      <w:hyperlink w:history="1" r:id="rIdxulmo_knxmlq1nhocyzu6">
+      <w:hyperlink w:history="1" r:id="rIdqnsz69ma0_0sbhsfgall5">
         <w:r>
           <w:rPr>
             <w:rFonts w:ascii="Arial" w:cs="Arial" w:eastAsia="Arial" w:hAnsi="Arial"/>
@@ -40,7 +40,7 @@
       <w:pPr>
         <w:spacing w:after="100"/>
       </w:pPr>
-      <w:hyperlink w:history="1" r:id="rId6gvnknrjxbhfevqkxqhie">
+      <w:hyperlink w:history="1" r:id="rId7mdykundybfiwkn_bkoyg">
         <w:r>
           <w:rPr>
             <w:rFonts w:ascii="Arial" w:cs="Arial" w:eastAsia="Arial" w:hAnsi="Arial"/>
@@ -61,7 +61,7 @@
         </w:rPr>
         <w:t xml:space="preserve"> | </w:t>
       </w:r>
-      <w:hyperlink w:history="1" r:id="rIdtbpmockybn8ghvtlcfjsv">
+      <w:hyperlink w:history="1" r:id="rIdb74blaujfte_q-g8f5xdd">
         <w:r>
           <w:rPr>
             <w:rFonts w:ascii="Arial" w:cs="Arial" w:eastAsia="Arial" w:hAnsi="Arial"/>
@@ -100,7 +100,7 @@
         </w:rPr>
         <w:t xml:space="preserve"> | </w:t>
       </w:r>
-      <w:hyperlink w:history="1" r:id="rIdznwyh077mzapw4nbaoj5s">
+      <w:hyperlink w:history="1" r:id="rId3oafs5ylyoo3bixdkfjml">
         <w:r>
           <w:rPr>
             <w:rFonts w:ascii="Arial" w:cs="Arial" w:eastAsia="Arial" w:hAnsi="Arial"/>
@@ -121,7 +121,7 @@
         </w:rPr>
         <w:t xml:space="preserve"> | </w:t>
       </w:r>
-      <w:hyperlink w:history="1" r:id="rIdkrcbtn-n3cf81fju1a5he">
+      <w:hyperlink w:history="1" r:id="rId5q_aqu1swidfggfckj8bw">
         <w:r>
           <w:rPr>
             <w:rFonts w:ascii="Arial" w:cs="Arial" w:eastAsia="Arial" w:hAnsi="Arial"/>
@@ -189,7 +189,7 @@
         </w:rPr>
         <w:t xml:space="preserve"> | </w:t>
       </w:r>
-      <w:hyperlink w:history="1" r:id="rIdfvyimzogr8tcotejclnmd">
+      <w:hyperlink w:history="1" r:id="rIdv5ix0xlznkazwxebbiajx">
         <w:r>
           <w:rPr>
             <w:rFonts w:ascii="Arial" w:cs="Arial" w:eastAsia="Arial" w:hAnsi="Arial"/>
@@ -352,7 +352,7 @@
         </w:rPr>
         <w:t xml:space="preserve"> | </w:t>
       </w:r>
-      <w:hyperlink w:history="1" r:id="rIdlmk5yfoghlqa6matyopux">
+      <w:hyperlink w:history="1" r:id="rIdjrppaavibfxpwa3rhancc">
         <w:r>
           <w:rPr>
             <w:rFonts w:ascii="Arial" w:cs="Arial" w:eastAsia="Arial" w:hAnsi="Arial"/>
@@ -750,7 +750,7 @@
         </w:rPr>
         <w:t xml:space="preserve"> | </w:t>
       </w:r>
-      <w:hyperlink w:history="1" r:id="rIdftnkpllb46-mbajsmslgq">
+      <w:hyperlink w:history="1" r:id="rIdibjkb70tcubq5g44fvbpf">
         <w:r>
           <w:rPr>
             <w:rFonts w:ascii="Arial" w:cs="Arial" w:eastAsia="Arial" w:hAnsi="Arial"/>
@@ -996,7 +996,7 @@
         </w:rPr>
         <w:t xml:space="preserve"> | </w:t>
       </w:r>
-      <w:hyperlink w:history="1" r:id="rIdx410ocjyu1uv7soqhnjo3">
+      <w:hyperlink w:history="1" r:id="rIddc2pluyfmte5rn9axssdw">
         <w:r>
           <w:rPr>
             <w:rFonts w:ascii="Arial" w:cs="Arial" w:eastAsia="Arial" w:hAnsi="Arial"/>
@@ -1020,45 +1020,45 @@
           <w:sz w:val="20"/>
           <w:szCs w:val="20"/>
         </w:rPr>
-        <w:t xml:space="preserve">Open-source agent tooling catalog and docs portal packaging 40+ reusable skills, shared instructions, MCP-ready configs, and cross-runtime workflows for Claude Code, Codex, Copilot, Cursor, and related agents.</w:t>
-      </w:r>
-    </w:p>
-    <w:p>
-      <w:pPr>
-        <w:pStyle w:val="ListParagraph"/>
-        <w:numPr>
-          <w:ilvl w:val="0"/>
-          <w:numId w:val="1"/>
-        </w:numPr>
-        <w:spacing w:after="35"/>
-      </w:pPr>
-      <w:r>
-        <w:rPr>
-          <w:rFonts w:ascii="Arial" w:cs="Arial" w:eastAsia="Arial" w:hAnsi="Arial"/>
-          <w:color w:val="0F172A"/>
-          <w:sz w:val="20"/>
-          <w:szCs w:val="20"/>
-        </w:rPr>
-        <w:t xml:space="preserve">Built 40+ instruction and skill packs plus harness configs across Claude Code, Codex, GitHub Copilot, Cursor, and related IDE agents.</w:t>
-      </w:r>
-    </w:p>
-    <w:p>
-      <w:pPr>
-        <w:pStyle w:val="ListParagraph"/>
-        <w:numPr>
-          <w:ilvl w:val="0"/>
-          <w:numId w:val="1"/>
-        </w:numPr>
-        <w:spacing w:after="35"/>
-      </w:pPr>
-      <w:r>
-        <w:rPr>
-          <w:rFonts w:ascii="Arial" w:cs="Arial" w:eastAsia="Arial" w:hAnsi="Arial"/>
-          <w:color w:val="0F172A"/>
-          <w:sz w:val="20"/>
-          <w:szCs w:val="20"/>
-        </w:rPr>
-        <w:t xml:space="preserve">Shipped generated docs, install flows, and portable tool and MCP presets for code review, security, infrastructure, research, and workflow automation.</w:t>
+        <w:t xml:space="preserve">Open-source agent tooling catalog and docs portal packaging 112 portable skills, 8 reusable agents, 30 MCP tools, and cross-runtime workflows for Claude Code, Codex, Copilot, Cursor, and related coding assistants.</w:t>
+      </w:r>
+    </w:p>
+    <w:p>
+      <w:pPr>
+        <w:pStyle w:val="ListParagraph"/>
+        <w:numPr>
+          <w:ilvl w:val="0"/>
+          <w:numId w:val="1"/>
+        </w:numPr>
+        <w:spacing w:after="35"/>
+      </w:pPr>
+      <w:r>
+        <w:rPr>
+          <w:rFonts w:ascii="Arial" w:cs="Arial" w:eastAsia="Arial" w:hAnsi="Arial"/>
+          <w:color w:val="0F172A"/>
+          <w:sz w:val="20"/>
+          <w:szCs w:val="20"/>
+        </w:rPr>
+        <w:t xml:space="preserve">Built and organized 112 portable skills plus reusable agent definitions across Claude Code, Codex, GitHub Copilot, Cursor, OpenCode, and related IDE agents.</w:t>
+      </w:r>
+    </w:p>
+    <w:p>
+      <w:pPr>
+        <w:pStyle w:val="ListParagraph"/>
+        <w:numPr>
+          <w:ilvl w:val="0"/>
+          <w:numId w:val="1"/>
+        </w:numPr>
+        <w:spacing w:after="35"/>
+      </w:pPr>
+      <w:r>
+        <w:rPr>
+          <w:rFonts w:ascii="Arial" w:cs="Arial" w:eastAsia="Arial" w:hAnsi="Arial"/>
+          <w:color w:val="0F172A"/>
+          <w:sz w:val="20"/>
+          <w:szCs w:val="20"/>
+        </w:rPr>
+        <w:t xml:space="preserve">Shipped generated docs, install flows, and 30 MCP-ready tool presets spanning code review, security, infrastructure, research, and workflow automation.</w:t>
       </w:r>
     </w:p>
     <w:p>
@@ -1085,7 +1085,7 @@
         </w:rPr>
         <w:t xml:space="preserve"> | </w:t>
       </w:r>
-      <w:hyperlink w:history="1" r:id="rIdar7d6ei2fny1ri9rggbav">
+      <w:hyperlink w:history="1" r:id="rIdgf3q3pnnrzktwr_fxlbm0">
         <w:r>
           <w:rPr>
             <w:rFonts w:ascii="Arial" w:cs="Arial" w:eastAsia="Arial" w:hAnsi="Arial"/>
@@ -1109,45 +1109,45 @@
           <w:sz w:val="20"/>
           <w:szCs w:val="20"/>
         </w:rPr>
-        <w:t xml:space="preserve">Open-source star-schema NBA analytics warehouse spanning 65K+ games and 13M+ play-by-play events, with validated ETL, docs, CLI, DuckDB/SQLite/Parquet/CSV exports, and Kaggle distribution.</w:t>
-      </w:r>
-    </w:p>
-    <w:p>
-      <w:pPr>
-        <w:pStyle w:val="ListParagraph"/>
-        <w:numPr>
-          <w:ilvl w:val="0"/>
-          <w:numId w:val="1"/>
-        </w:numPr>
-        <w:spacing w:after="35"/>
-      </w:pPr>
-      <w:r>
-        <w:rPr>
-          <w:rFonts w:ascii="Arial" w:cs="Arial" w:eastAsia="Arial" w:hAnsi="Arial"/>
-          <w:color w:val="0F172A"/>
-          <w:sz w:val="20"/>
-          <w:szCs w:val="20"/>
-        </w:rPr>
-        <w:t xml:space="preserve">Implemented Pandera-validated NBA API ETL with daily warehouse updates plus DuckDB, SQLite, Parquet, and CSV exports.</w:t>
-      </w:r>
-    </w:p>
-    <w:p>
-      <w:pPr>
-        <w:pStyle w:val="ListParagraph"/>
-        <w:numPr>
-          <w:ilvl w:val="0"/>
-          <w:numId w:val="1"/>
-        </w:numPr>
-        <w:spacing w:after="35"/>
-      </w:pPr>
-      <w:r>
-        <w:rPr>
-          <w:rFonts w:ascii="Arial" w:cs="Arial" w:eastAsia="Arial" w:hAnsi="Arial"/>
-          <w:color w:val="0F172A"/>
-          <w:sz w:val="20"/>
-          <w:szCs w:val="20"/>
-        </w:rPr>
-        <w:t xml:space="preserve">Built docs, schema references, release workflows, and Kaggle distribution for a 180+ table public warehouse spanning 130+ stats.nba.com endpoint classes.</w:t>
+        <w:t xml:space="preserve">Open-source NBA warehouse with 65K+ games, 13M+ plays, validated ETL, multi-format exports, and Kaggle distribution reaching 425K+ views and 60K+ downloads.</w:t>
+      </w:r>
+    </w:p>
+    <w:p>
+      <w:pPr>
+        <w:pStyle w:val="ListParagraph"/>
+        <w:numPr>
+          <w:ilvl w:val="0"/>
+          <w:numId w:val="1"/>
+        </w:numPr>
+        <w:spacing w:after="35"/>
+      </w:pPr>
+      <w:r>
+        <w:rPr>
+          <w:rFonts w:ascii="Arial" w:cs="Arial" w:eastAsia="Arial" w:hAnsi="Arial"/>
+          <w:color w:val="0F172A"/>
+          <w:sz w:val="20"/>
+          <w:szCs w:val="20"/>
+        </w:rPr>
+        <w:t xml:space="preserve">Implemented daily Pandera-validated NBA ETL plus DuckDB, SQLite, Parquet, and CSV exports.</w:t>
+      </w:r>
+    </w:p>
+    <w:p>
+      <w:pPr>
+        <w:pStyle w:val="ListParagraph"/>
+        <w:numPr>
+          <w:ilvl w:val="0"/>
+          <w:numId w:val="1"/>
+        </w:numPr>
+        <w:spacing w:after="35"/>
+      </w:pPr>
+      <w:r>
+        <w:rPr>
+          <w:rFonts w:ascii="Arial" w:cs="Arial" w:eastAsia="Arial" w:hAnsi="Arial"/>
+          <w:color w:val="0F172A"/>
+          <w:sz w:val="20"/>
+          <w:szCs w:val="20"/>
+        </w:rPr>
+        <w:t xml:space="preserve">Published a 180+ table Kaggle warehouse reaching 425K+ views and 60K+ downloads.</w:t>
       </w:r>
     </w:p>
     <w:p>
@@ -1174,7 +1174,7 @@
         </w:rPr>
         <w:t xml:space="preserve"> | </w:t>
       </w:r>
-      <w:hyperlink w:history="1" r:id="rIdhj4ituaxhgo3iwrgnbkai">
+      <w:hyperlink w:history="1" r:id="rId32aali6qept3j_wxg0es-">
         <w:r>
           <w:rPr>
             <w:rFonts w:ascii="Arial" w:cs="Arial" w:eastAsia="Arial" w:hAnsi="Arial"/>
@@ -1198,7 +1198,7 @@
           <w:sz w:val="20"/>
           <w:szCs w:val="20"/>
         </w:rPr>
-        <w:t xml:space="preserve">Released rotating proxy toolkit with 9 selection strategies, 100+ auto-validated sources, and self-healing health checks for resilient scraping and data-collection workflows.</w:t>
+        <w:t xml:space="preserve">Released rotating proxy toolkit with 9 selection strategies, 100+ auto-fetched sources, self-healing circuit breakers, and five interfaces for resilient scraping and data-collection workflows.</w:t>
       </w:r>
     </w:p>
     <w:p>
@@ -1236,7 +1236,7 @@
           <w:sz w:val="20"/>
           <w:szCs w:val="20"/>
         </w:rPr>
-        <w:t xml:space="preserve">Built self-healing validation for 100+ proxy sources with circuit breakers, auto-ejection, and recovery promotion.</w:t>
+        <w:t xml:space="preserve">Built self-healing validation across 100+ proxy sources with circuit breakers, auto-ejection, recovery promotion, and five interfaces for different scraping workflows.</w:t>
       </w:r>
     </w:p>
     <w:p>
@@ -1263,7 +1263,7 @@
         </w:rPr>
         <w:t xml:space="preserve"> | </w:t>
       </w:r>
-      <w:hyperlink w:history="1" r:id="rId3rf2iz0oh5v4jmfx23gs5">
+      <w:hyperlink w:history="1" r:id="rIdfmtdgc6uy2lhyze-hc3jv">
         <w:r>
           <w:rPr>
             <w:rFonts w:ascii="Arial" w:cs="Arial" w:eastAsia="Arial" w:hAnsi="Arial"/>
@@ -1325,7 +1325,7 @@
           <w:sz w:val="20"/>
           <w:szCs w:val="20"/>
         </w:rPr>
-        <w:t xml:space="preserve">Shipped helper scripts, CI checks, scheduled validation jobs, and live docs for reliable community feed review.</w:t>
+        <w:t xml:space="preserve">Shipped helper scripts, CI checks, scheduled validation jobs, and a docs-backed submission/review flow for reliable community feed curation.</w:t>
       </w:r>
     </w:p>
     <w:p>
@@ -1352,7 +1352,7 @@
         </w:rPr>
         <w:t xml:space="preserve"> | </w:t>
       </w:r>
-      <w:hyperlink w:history="1" r:id="rId1pzopwku1bxpt5rd1lgvk">
+      <w:hyperlink w:history="1" r:id="rId5l0fwst0pemp9cqnwdtqt">
         <w:r>
           <w:rPr>
             <w:rFonts w:ascii="Arial" w:cs="Arial" w:eastAsia="Arial" w:hAnsi="Arial"/>
@@ -1376,7 +1376,7 @@
           <w:sz w:val="20"/>
           <w:szCs w:val="20"/>
         </w:rPr>
-        <w:t xml:space="preserve">Released FastMCP server wrapping Crawl4AI so AI agents can crawl and extract web content through four focused tools, agent-friendly outputs, tagged releases, and documented stdio/HTTP integration paths.</w:t>
+        <w:t xml:space="preserve">Released FastMCP server wrapping Crawl4AI so AI agents can scrape, crawl, manage sessions, and retrieve artifacts through a focused MCP surface with documented stdio and HTTP integration paths.</w:t>
       </w:r>
     </w:p>
     <w:p>
@@ -1414,7 +1414,7 @@
           <w:sz w:val="20"/>
           <w:szCs w:val="20"/>
         </w:rPr>
-        <w:t xml:space="preserve">Exposed stdio/HTTP tools, resources, and prompt templates with docs, tests, and release-tagged MCP install flows.</w:t>
+        <w:t xml:space="preserve">Exposed scrape, crawl, session, and artifact-retrieval workflows with docs, tests, and release-tagged MCP install flows.</w:t>
       </w:r>
     </w:p>
     <w:p>
@@ -1441,7 +1441,7 @@
         </w:rPr>
         <w:t xml:space="preserve"> | </w:t>
       </w:r>
-      <w:hyperlink w:history="1" r:id="rId5at3yme-c8krzlg097rj0">
+      <w:hyperlink w:history="1" r:id="rIdbz8nbhdfu1wiqw8ztqkfj">
         <w:r>
           <w:rPr>
             <w:rFonts w:ascii="Arial" w:cs="Arial" w:eastAsia="Arial" w:hAnsi="Arial"/>
@@ -1465,7 +1465,7 @@
           <w:sz w:val="20"/>
           <w:szCs w:val="20"/>
         </w:rPr>
-        <w:t xml:space="preserve">Long-running personal web app and MDX publishing system built with Next.js, combining a polished public-facing frontend with a richly tooled technical blog, strong SEO, and durable content workflows.</w:t>
+        <w:t xml:space="preserve">Long-running personal web app and MDX publishing system built with Next.js, pairing a polished public-facing frontend, a richly tooled technical blog, strong SEO, and durable content workflows.</w:t>
       </w:r>
     </w:p>
     <w:p>
@@ -1543,7 +1543,7 @@
       <w:pPr>
         <w:spacing w:after="25"/>
       </w:pPr>
-      <w:hyperlink w:history="1" r:id="rIdczgi1bsgpfcnvnuknrj1v">
+      <w:hyperlink w:history="1" r:id="rIdaqjhijjq7luialy7-l5ds">
         <w:r>
           <w:rPr>
             <w:rFonts w:ascii="Arial" w:cs="Arial" w:eastAsia="Arial" w:hAnsi="Arial"/>
@@ -1599,7 +1599,7 @@
       <w:pPr>
         <w:spacing w:after="25"/>
       </w:pPr>
-      <w:hyperlink w:history="1" r:id="rIdynygypgrlwbili8-5nw45">
+      <w:hyperlink w:history="1" r:id="rIdaw_lhis8bwj1wdz0mrlkr">
         <w:r>
           <w:rPr>
             <w:rFonts w:ascii="Arial" w:cs="Arial" w:eastAsia="Arial" w:hAnsi="Arial"/>
@@ -1630,7 +1630,7 @@
       <w:pPr>
         <w:spacing w:after="35"/>
       </w:pPr>
-      <w:hyperlink w:history="1" r:id="rIdp1bjtoswkvmroxyqp83lx">
+      <w:hyperlink w:history="1" r:id="rIdcv2lzcbb_couxc4uxcxfa">
         <w:r>
           <w:rPr>
             <w:rFonts w:ascii="Arial" w:cs="Arial" w:eastAsia="Arial" w:hAnsi="Arial"/>
@@ -1679,7 +1679,7 @@
       <w:pPr>
         <w:spacing w:after="35"/>
       </w:pPr>
-      <w:hyperlink w:history="1" r:id="rIdjlctizb1ooatocs5k-vt7">
+      <w:hyperlink w:history="1" r:id="rIdvhzz5tr3uzqhhcc0pwya4">
         <w:r>
           <w:rPr>
             <w:rFonts w:ascii="Arial" w:cs="Arial" w:eastAsia="Arial" w:hAnsi="Arial"/>

</xml_diff>

<commit_message>
ci: disable remote smoke check
</commit_message>
<xml_diff>
--- a/public/downloads/wyatt-walsh-resume-full.docx
+++ b/public/downloads/wyatt-walsh-resume-full.docx
@@ -7,7 +7,7 @@
         <w:pStyle w:val="Title"/>
         <w:spacing w:after="75"/>
       </w:pPr>
-      <w:hyperlink w:history="1" r:id="rIdqnsz69ma0_0sbhsfgall5">
+      <w:hyperlink w:history="1" r:id="rIdtkud8fits7vp_chxz1iux">
         <w:r>
           <w:rPr>
             <w:rFonts w:ascii="Arial" w:cs="Arial" w:eastAsia="Arial" w:hAnsi="Arial"/>
@@ -40,7 +40,7 @@
       <w:pPr>
         <w:spacing w:after="100"/>
       </w:pPr>
-      <w:hyperlink w:history="1" r:id="rId7mdykundybfiwkn_bkoyg">
+      <w:hyperlink w:history="1" r:id="rIdlrxbrnp1ezethwjiv460c">
         <w:r>
           <w:rPr>
             <w:rFonts w:ascii="Arial" w:cs="Arial" w:eastAsia="Arial" w:hAnsi="Arial"/>
@@ -61,7 +61,7 @@
         </w:rPr>
         <w:t xml:space="preserve"> | </w:t>
       </w:r>
-      <w:hyperlink w:history="1" r:id="rIdb74blaujfte_q-g8f5xdd">
+      <w:hyperlink w:history="1" r:id="rIdnaf7epxcctjmejgmffb-o">
         <w:r>
           <w:rPr>
             <w:rFonts w:ascii="Arial" w:cs="Arial" w:eastAsia="Arial" w:hAnsi="Arial"/>
@@ -100,7 +100,7 @@
         </w:rPr>
         <w:t xml:space="preserve"> | </w:t>
       </w:r>
-      <w:hyperlink w:history="1" r:id="rId3oafs5ylyoo3bixdkfjml">
+      <w:hyperlink w:history="1" r:id="rIdeeyi93jkorho6gisvbmu0">
         <w:r>
           <w:rPr>
             <w:rFonts w:ascii="Arial" w:cs="Arial" w:eastAsia="Arial" w:hAnsi="Arial"/>
@@ -121,7 +121,7 @@
         </w:rPr>
         <w:t xml:space="preserve"> | </w:t>
       </w:r>
-      <w:hyperlink w:history="1" r:id="rId5q_aqu1swidfggfckj8bw">
+      <w:hyperlink w:history="1" r:id="rIdnjiklpiivz753jdgjcypq">
         <w:r>
           <w:rPr>
             <w:rFonts w:ascii="Arial" w:cs="Arial" w:eastAsia="Arial" w:hAnsi="Arial"/>
@@ -189,7 +189,7 @@
         </w:rPr>
         <w:t xml:space="preserve"> | </w:t>
       </w:r>
-      <w:hyperlink w:history="1" r:id="rIdv5ix0xlznkazwxebbiajx">
+      <w:hyperlink w:history="1" r:id="rId7xgpgo2bcxfxwyu0050bj">
         <w:r>
           <w:rPr>
             <w:rFonts w:ascii="Arial" w:cs="Arial" w:eastAsia="Arial" w:hAnsi="Arial"/>
@@ -352,7 +352,7 @@
         </w:rPr>
         <w:t xml:space="preserve"> | </w:t>
       </w:r>
-      <w:hyperlink w:history="1" r:id="rIdjrppaavibfxpwa3rhancc">
+      <w:hyperlink w:history="1" r:id="rIdil_kplytno-7lvmla7epr">
         <w:r>
           <w:rPr>
             <w:rFonts w:ascii="Arial" w:cs="Arial" w:eastAsia="Arial" w:hAnsi="Arial"/>
@@ -750,7 +750,7 @@
         </w:rPr>
         <w:t xml:space="preserve"> | </w:t>
       </w:r>
-      <w:hyperlink w:history="1" r:id="rIdibjkb70tcubq5g44fvbpf">
+      <w:hyperlink w:history="1" r:id="rIdysxpx8beibmrenoul1zoo">
         <w:r>
           <w:rPr>
             <w:rFonts w:ascii="Arial" w:cs="Arial" w:eastAsia="Arial" w:hAnsi="Arial"/>
@@ -996,7 +996,7 @@
         </w:rPr>
         <w:t xml:space="preserve"> | </w:t>
       </w:r>
-      <w:hyperlink w:history="1" r:id="rIddc2pluyfmte5rn9axssdw">
+      <w:hyperlink w:history="1" r:id="rIdyqtcqvd2t3nbdxatjeimm">
         <w:r>
           <w:rPr>
             <w:rFonts w:ascii="Arial" w:cs="Arial" w:eastAsia="Arial" w:hAnsi="Arial"/>
@@ -1085,7 +1085,7 @@
         </w:rPr>
         <w:t xml:space="preserve"> | </w:t>
       </w:r>
-      <w:hyperlink w:history="1" r:id="rIdgf3q3pnnrzktwr_fxlbm0">
+      <w:hyperlink w:history="1" r:id="rIdylarhkxnas7qbmtmvm2rx">
         <w:r>
           <w:rPr>
             <w:rFonts w:ascii="Arial" w:cs="Arial" w:eastAsia="Arial" w:hAnsi="Arial"/>
@@ -1174,7 +1174,7 @@
         </w:rPr>
         <w:t xml:space="preserve"> | </w:t>
       </w:r>
-      <w:hyperlink w:history="1" r:id="rId32aali6qept3j_wxg0es-">
+      <w:hyperlink w:history="1" r:id="rId7vk2e-lsarzi9stkt_fq_">
         <w:r>
           <w:rPr>
             <w:rFonts w:ascii="Arial" w:cs="Arial" w:eastAsia="Arial" w:hAnsi="Arial"/>
@@ -1263,7 +1263,7 @@
         </w:rPr>
         <w:t xml:space="preserve"> | </w:t>
       </w:r>
-      <w:hyperlink w:history="1" r:id="rIdfmtdgc6uy2lhyze-hc3jv">
+      <w:hyperlink w:history="1" r:id="rId9ajkcn5vnpocbueyelxtg">
         <w:r>
           <w:rPr>
             <w:rFonts w:ascii="Arial" w:cs="Arial" w:eastAsia="Arial" w:hAnsi="Arial"/>
@@ -1352,7 +1352,7 @@
         </w:rPr>
         <w:t xml:space="preserve"> | </w:t>
       </w:r>
-      <w:hyperlink w:history="1" r:id="rId5l0fwst0pemp9cqnwdtqt">
+      <w:hyperlink w:history="1" r:id="rIdshjnaftgzc3dts-tsgndz">
         <w:r>
           <w:rPr>
             <w:rFonts w:ascii="Arial" w:cs="Arial" w:eastAsia="Arial" w:hAnsi="Arial"/>
@@ -1441,7 +1441,7 @@
         </w:rPr>
         <w:t xml:space="preserve"> | </w:t>
       </w:r>
-      <w:hyperlink w:history="1" r:id="rIdbz8nbhdfu1wiqw8ztqkfj">
+      <w:hyperlink w:history="1" r:id="rIdircc3nqjornkpno7duerb">
         <w:r>
           <w:rPr>
             <w:rFonts w:ascii="Arial" w:cs="Arial" w:eastAsia="Arial" w:hAnsi="Arial"/>
@@ -1543,7 +1543,7 @@
       <w:pPr>
         <w:spacing w:after="25"/>
       </w:pPr>
-      <w:hyperlink w:history="1" r:id="rIdaqjhijjq7luialy7-l5ds">
+      <w:hyperlink w:history="1" r:id="rId6wp4wjs1gyiqyi1-69njl">
         <w:r>
           <w:rPr>
             <w:rFonts w:ascii="Arial" w:cs="Arial" w:eastAsia="Arial" w:hAnsi="Arial"/>
@@ -1599,7 +1599,7 @@
       <w:pPr>
         <w:spacing w:after="25"/>
       </w:pPr>
-      <w:hyperlink w:history="1" r:id="rIdaw_lhis8bwj1wdz0mrlkr">
+      <w:hyperlink w:history="1" r:id="rIdfy_yxr-5biylldxz-ym2n">
         <w:r>
           <w:rPr>
             <w:rFonts w:ascii="Arial" w:cs="Arial" w:eastAsia="Arial" w:hAnsi="Arial"/>
@@ -1630,7 +1630,7 @@
       <w:pPr>
         <w:spacing w:after="35"/>
       </w:pPr>
-      <w:hyperlink w:history="1" r:id="rIdcv2lzcbb_couxc4uxcxfa">
+      <w:hyperlink w:history="1" r:id="rId75uin4r_f5cwjyxr8rupl">
         <w:r>
           <w:rPr>
             <w:rFonts w:ascii="Arial" w:cs="Arial" w:eastAsia="Arial" w:hAnsi="Arial"/>
@@ -1679,7 +1679,7 @@
       <w:pPr>
         <w:spacing w:after="35"/>
       </w:pPr>
-      <w:hyperlink w:history="1" r:id="rIdvhzz5tr3uzqhhcc0pwya4">
+      <w:hyperlink w:history="1" r:id="rIdnykru_vinagdndpu9qcgg">
         <w:r>
           <w:rPr>
             <w:rFonts w:ascii="Arial" w:cs="Arial" w:eastAsia="Arial" w:hAnsi="Arial"/>

</xml_diff>

<commit_message>
fix: refresh resume artifacts and checks
</commit_message>
<xml_diff>
--- a/public/downloads/wyatt-walsh-resume-full.docx
+++ b/public/downloads/wyatt-walsh-resume-full.docx
@@ -7,7 +7,7 @@
         <w:pStyle w:val="Title"/>
         <w:spacing w:after="75"/>
       </w:pPr>
-      <w:hyperlink w:history="1" r:id="rIdtkud8fits7vp_chxz1iux">
+      <w:hyperlink w:history="1" r:id="rIdnigig8dcepqs0uvenawk-">
         <w:r>
           <w:rPr>
             <w:rFonts w:ascii="Arial" w:cs="Arial" w:eastAsia="Arial" w:hAnsi="Arial"/>
@@ -40,7 +40,7 @@
       <w:pPr>
         <w:spacing w:after="100"/>
       </w:pPr>
-      <w:hyperlink w:history="1" r:id="rIdlrxbrnp1ezethwjiv460c">
+      <w:hyperlink w:history="1" r:id="rIdd_zw8djpo9rggnllx2u3l">
         <w:r>
           <w:rPr>
             <w:rFonts w:ascii="Arial" w:cs="Arial" w:eastAsia="Arial" w:hAnsi="Arial"/>
@@ -61,7 +61,7 @@
         </w:rPr>
         <w:t xml:space="preserve"> | </w:t>
       </w:r>
-      <w:hyperlink w:history="1" r:id="rIdnaf7epxcctjmejgmffb-o">
+      <w:hyperlink w:history="1" r:id="rId_fnggekqxcjt9qfcuv1zc">
         <w:r>
           <w:rPr>
             <w:rFonts w:ascii="Arial" w:cs="Arial" w:eastAsia="Arial" w:hAnsi="Arial"/>
@@ -100,7 +100,7 @@
         </w:rPr>
         <w:t xml:space="preserve"> | </w:t>
       </w:r>
-      <w:hyperlink w:history="1" r:id="rIdeeyi93jkorho6gisvbmu0">
+      <w:hyperlink w:history="1" r:id="rId40m6wpew6filqkirbcahu">
         <w:r>
           <w:rPr>
             <w:rFonts w:ascii="Arial" w:cs="Arial" w:eastAsia="Arial" w:hAnsi="Arial"/>
@@ -121,7 +121,7 @@
         </w:rPr>
         <w:t xml:space="preserve"> | </w:t>
       </w:r>
-      <w:hyperlink w:history="1" r:id="rIdnjiklpiivz753jdgjcypq">
+      <w:hyperlink w:history="1" r:id="rIdl9xks8ona3up4ic_ojl5l">
         <w:r>
           <w:rPr>
             <w:rFonts w:ascii="Arial" w:cs="Arial" w:eastAsia="Arial" w:hAnsi="Arial"/>
@@ -189,7 +189,7 @@
         </w:rPr>
         <w:t xml:space="preserve"> | </w:t>
       </w:r>
-      <w:hyperlink w:history="1" r:id="rId7xgpgo2bcxfxwyu0050bj">
+      <w:hyperlink w:history="1" r:id="rIdkpasu1huzcgz2b-ijg8sp">
         <w:r>
           <w:rPr>
             <w:rFonts w:ascii="Arial" w:cs="Arial" w:eastAsia="Arial" w:hAnsi="Arial"/>
@@ -249,7 +249,7 @@
           <w:sz w:val="20"/>
           <w:szCs w:val="20"/>
         </w:rPr>
-        <w:t xml:space="preserve">Delivered production agentic AI document intelligence, human-in-the-loop review, and multimodal compliance screening for high risk merchant onboarding.</w:t>
+        <w:t xml:space="preserve">Delivered production agentic AI document intelligence, human-in-the-loop review, and multimodal compliance screening for high-risk merchant onboarding.</w:t>
       </w:r>
     </w:p>
     <w:p>
@@ -352,7 +352,7 @@
         </w:rPr>
         <w:t xml:space="preserve"> | </w:t>
       </w:r>
-      <w:hyperlink w:history="1" r:id="rIdil_kplytno-7lvmla7epr">
+      <w:hyperlink w:history="1" r:id="rId3wnq2xjunj-zmerb19dhv">
         <w:r>
           <w:rPr>
             <w:rFonts w:ascii="Arial" w:cs="Arial" w:eastAsia="Arial" w:hAnsi="Arial"/>
@@ -750,7 +750,7 @@
         </w:rPr>
         <w:t xml:space="preserve"> | </w:t>
       </w:r>
-      <w:hyperlink w:history="1" r:id="rIdysxpx8beibmrenoul1zoo">
+      <w:hyperlink w:history="1" r:id="rIdyetfskpkwq8f4o26ggz9e">
         <w:r>
           <w:rPr>
             <w:rFonts w:ascii="Arial" w:cs="Arial" w:eastAsia="Arial" w:hAnsi="Arial"/>
@@ -996,7 +996,7 @@
         </w:rPr>
         <w:t xml:space="preserve"> | </w:t>
       </w:r>
-      <w:hyperlink w:history="1" r:id="rIdyqtcqvd2t3nbdxatjeimm">
+      <w:hyperlink w:history="1" r:id="rIdme7jboowfssd1lriznbpq">
         <w:r>
           <w:rPr>
             <w:rFonts w:ascii="Arial" w:cs="Arial" w:eastAsia="Arial" w:hAnsi="Arial"/>
@@ -1039,7 +1039,7 @@
           <w:sz w:val="20"/>
           <w:szCs w:val="20"/>
         </w:rPr>
-        <w:t xml:space="preserve">Built and organized 112 portable skills plus reusable agent definitions across Claude Code, Codex, GitHub Copilot, Cursor, OpenCode, and related IDE agents.</w:t>
+        <w:t xml:space="preserve">Standardized reusable agent definitions across Claude Code, Codex, GitHub Copilot, Cursor, OpenCode, and related IDE agents.</w:t>
       </w:r>
     </w:p>
     <w:p>
@@ -1085,7 +1085,7 @@
         </w:rPr>
         <w:t xml:space="preserve"> | </w:t>
       </w:r>
-      <w:hyperlink w:history="1" r:id="rIdylarhkxnas7qbmtmvm2rx">
+      <w:hyperlink w:history="1" r:id="rIdricygxfo2gq0ryh7xgi3i">
         <w:r>
           <w:rPr>
             <w:rFonts w:ascii="Arial" w:cs="Arial" w:eastAsia="Arial" w:hAnsi="Arial"/>
@@ -1109,7 +1109,7 @@
           <w:sz w:val="20"/>
           <w:szCs w:val="20"/>
         </w:rPr>
-        <w:t xml:space="preserve">Open-source NBA warehouse with 65K+ games, 13M+ plays, validated ETL, multi-format exports, and Kaggle distribution reaching 425K+ views and 60K+ downloads.</w:t>
+        <w:t xml:space="preserve">Public NBA Kaggle dataset and repo covering 65K+ games and 13M+ plays; reached 425K+ views and 60K+ downloads before freezing at the 2023-07-06 update.</w:t>
       </w:r>
     </w:p>
     <w:p>
@@ -1147,7 +1147,7 @@
           <w:sz w:val="20"/>
           <w:szCs w:val="20"/>
         </w:rPr>
-        <w:t xml:space="preserve">Published a 180+ table Kaggle warehouse reaching 425K+ views and 60K+ downloads.</w:t>
+        <w:t xml:space="preserve">Building the next-generation nbadb rebuild with 152 extractor wrappers and 204 generated public star-schema outputs.</w:t>
       </w:r>
     </w:p>
     <w:p>
@@ -1174,7 +1174,7 @@
         </w:rPr>
         <w:t xml:space="preserve"> | </w:t>
       </w:r>
-      <w:hyperlink w:history="1" r:id="rId7vk2e-lsarzi9stkt_fq_">
+      <w:hyperlink w:history="1" r:id="rIdkihtcjzbbkacrfcj8rp3h">
         <w:r>
           <w:rPr>
             <w:rFonts w:ascii="Arial" w:cs="Arial" w:eastAsia="Arial" w:hAnsi="Arial"/>
@@ -1263,7 +1263,7 @@
         </w:rPr>
         <w:t xml:space="preserve"> | </w:t>
       </w:r>
-      <w:hyperlink w:history="1" r:id="rId9ajkcn5vnpocbueyelxtg">
+      <w:hyperlink w:history="1" r:id="rIdyju6tyck4uw8ylqllc3fj">
         <w:r>
           <w:rPr>
             <w:rFonts w:ascii="Arial" w:cs="Arial" w:eastAsia="Arial" w:hAnsi="Arial"/>
@@ -1287,7 +1287,7 @@
           <w:sz w:val="20"/>
           <w:szCs w:val="20"/>
         </w:rPr>
-        <w:t xml:space="preserve">Built a curated AI and ML feed platform with typed schemas, HTTP/RSS validation, contributor submission workflows, OPML exports, and docs-backed browse/download surfaces.</w:t>
+        <w:t xml:space="preserve">Built a curated AI and ML feed platform with typed schemas, HTTP/RSS validation, contributor submission workflows, OPML exports, and documented browse/download surfaces.</w:t>
       </w:r>
     </w:p>
     <w:p>
@@ -1352,7 +1352,7 @@
         </w:rPr>
         <w:t xml:space="preserve"> | </w:t>
       </w:r>
-      <w:hyperlink w:history="1" r:id="rIdshjnaftgzc3dts-tsgndz">
+      <w:hyperlink w:history="1" r:id="rIdaywkolz2plinvc4hgl8fd">
         <w:r>
           <w:rPr>
             <w:rFonts w:ascii="Arial" w:cs="Arial" w:eastAsia="Arial" w:hAnsi="Arial"/>
@@ -1441,7 +1441,7 @@
         </w:rPr>
         <w:t xml:space="preserve"> | </w:t>
       </w:r>
-      <w:hyperlink w:history="1" r:id="rIdircc3nqjornkpno7duerb">
+      <w:hyperlink w:history="1" r:id="rId7p_1m9ht4aoraertlzw18">
         <w:r>
           <w:rPr>
             <w:rFonts w:ascii="Arial" w:cs="Arial" w:eastAsia="Arial" w:hAnsi="Arial"/>
@@ -1543,7 +1543,7 @@
       <w:pPr>
         <w:spacing w:after="25"/>
       </w:pPr>
-      <w:hyperlink w:history="1" r:id="rId6wp4wjs1gyiqyi1-69njl">
+      <w:hyperlink w:history="1" r:id="rIdoultavggnlnpgamqd46p_">
         <w:r>
           <w:rPr>
             <w:rFonts w:ascii="Arial" w:cs="Arial" w:eastAsia="Arial" w:hAnsi="Arial"/>
@@ -1599,7 +1599,7 @@
       <w:pPr>
         <w:spacing w:after="25"/>
       </w:pPr>
-      <w:hyperlink w:history="1" r:id="rIdfy_yxr-5biylldxz-ym2n">
+      <w:hyperlink w:history="1" r:id="rIdefjbrw7xdtpz9krx1cno5">
         <w:r>
           <w:rPr>
             <w:rFonts w:ascii="Arial" w:cs="Arial" w:eastAsia="Arial" w:hAnsi="Arial"/>
@@ -1630,7 +1630,7 @@
       <w:pPr>
         <w:spacing w:after="35"/>
       </w:pPr>
-      <w:hyperlink w:history="1" r:id="rId75uin4r_f5cwjyxr8rupl">
+      <w:hyperlink w:history="1" r:id="rIdqemkls8kpijxagami10nh">
         <w:r>
           <w:rPr>
             <w:rFonts w:ascii="Arial" w:cs="Arial" w:eastAsia="Arial" w:hAnsi="Arial"/>
@@ -1679,7 +1679,7 @@
       <w:pPr>
         <w:spacing w:after="35"/>
       </w:pPr>
-      <w:hyperlink w:history="1" r:id="rIdnykru_vinagdndpu9qcgg">
+      <w:hyperlink w:history="1" r:id="rIdnelot2-_sdfw_lyslrwvk">
         <w:r>
           <w:rPr>
             <w:rFonts w:ascii="Arial" w:cs="Arial" w:eastAsia="Arial" w:hAnsi="Arial"/>

</xml_diff>

<commit_message>
feat: refresh interactive resume artifacts
</commit_message>
<xml_diff>
--- a/public/downloads/wyatt-walsh-resume-full.docx
+++ b/public/downloads/wyatt-walsh-resume-full.docx
@@ -7,7 +7,7 @@
         <w:pStyle w:val="Title"/>
         <w:spacing w:after="75"/>
       </w:pPr>
-      <w:hyperlink w:history="1" r:id="rIdnigig8dcepqs0uvenawk-">
+      <w:hyperlink w:history="1" r:id="rIdoekfcvjrvz3mniyb9yka8">
         <w:r>
           <w:rPr>
             <w:rFonts w:ascii="Arial" w:cs="Arial" w:eastAsia="Arial" w:hAnsi="Arial"/>
@@ -40,7 +40,7 @@
       <w:pPr>
         <w:spacing w:after="100"/>
       </w:pPr>
-      <w:hyperlink w:history="1" r:id="rIdd_zw8djpo9rggnllx2u3l">
+      <w:hyperlink w:history="1" r:id="rIdpfq7yzjrtctw13urat81b">
         <w:r>
           <w:rPr>
             <w:rFonts w:ascii="Arial" w:cs="Arial" w:eastAsia="Arial" w:hAnsi="Arial"/>
@@ -61,7 +61,7 @@
         </w:rPr>
         <w:t xml:space="preserve"> | </w:t>
       </w:r>
-      <w:hyperlink w:history="1" r:id="rId_fnggekqxcjt9qfcuv1zc">
+      <w:hyperlink w:history="1" r:id="rIdkxx9ouvbvpsxiurxhjz7_">
         <w:r>
           <w:rPr>
             <w:rFonts w:ascii="Arial" w:cs="Arial" w:eastAsia="Arial" w:hAnsi="Arial"/>
@@ -100,7 +100,7 @@
         </w:rPr>
         <w:t xml:space="preserve"> | </w:t>
       </w:r>
-      <w:hyperlink w:history="1" r:id="rId40m6wpew6filqkirbcahu">
+      <w:hyperlink w:history="1" r:id="rIdoxvioifkc9eyzbpx4fhti">
         <w:r>
           <w:rPr>
             <w:rFonts w:ascii="Arial" w:cs="Arial" w:eastAsia="Arial" w:hAnsi="Arial"/>
@@ -121,7 +121,7 @@
         </w:rPr>
         <w:t xml:space="preserve"> | </w:t>
       </w:r>
-      <w:hyperlink w:history="1" r:id="rIdl9xks8ona3up4ic_ojl5l">
+      <w:hyperlink w:history="1" r:id="rId5scvhwixn-ojqfrfus4wc">
         <w:r>
           <w:rPr>
             <w:rFonts w:ascii="Arial" w:cs="Arial" w:eastAsia="Arial" w:hAnsi="Arial"/>
@@ -189,7 +189,7 @@
         </w:rPr>
         <w:t xml:space="preserve"> | </w:t>
       </w:r>
-      <w:hyperlink w:history="1" r:id="rIdkpasu1huzcgz2b-ijg8sp">
+      <w:hyperlink w:history="1" r:id="rIddqrgagrfrpt7_uayvtsu8">
         <w:r>
           <w:rPr>
             <w:rFonts w:ascii="Arial" w:cs="Arial" w:eastAsia="Arial" w:hAnsi="Arial"/>
@@ -352,7 +352,7 @@
         </w:rPr>
         <w:t xml:space="preserve"> | </w:t>
       </w:r>
-      <w:hyperlink w:history="1" r:id="rId3wnq2xjunj-zmerb19dhv">
+      <w:hyperlink w:history="1" r:id="rIdz_zjj5pk8nm17oulh3dbs">
         <w:r>
           <w:rPr>
             <w:rFonts w:ascii="Arial" w:cs="Arial" w:eastAsia="Arial" w:hAnsi="Arial"/>
@@ -750,7 +750,7 @@
         </w:rPr>
         <w:t xml:space="preserve"> | </w:t>
       </w:r>
-      <w:hyperlink w:history="1" r:id="rIdyetfskpkwq8f4o26ggz9e">
+      <w:hyperlink w:history="1" r:id="rId4c2oujthrekqgtopctzly">
         <w:r>
           <w:rPr>
             <w:rFonts w:ascii="Arial" w:cs="Arial" w:eastAsia="Arial" w:hAnsi="Arial"/>
@@ -867,91 +867,116 @@
           <w:sz w:val="20"/>
           <w:szCs w:val="20"/>
         </w:rPr>
-        <w:t xml:space="preserve">Machine Learning and Generative AI: </w:t>
-      </w:r>
-      <w:r>
-        <w:rPr>
-          <w:rFonts w:ascii="Arial" w:cs="Arial" w:eastAsia="Arial" w:hAnsi="Arial"/>
-          <w:color w:val="0F172A"/>
-          <w:sz w:val="20"/>
-          <w:szCs w:val="20"/>
-        </w:rPr>
-        <w:t xml:space="preserve">scikit-learn, Hugging Face Transformers, OpenAI API, LangChain, LangGraph, Model Context Protocol (MCP), Retrieval Augmented Generation (RAG), Prompt Engineering, PydanticAI, Amazon Bedrock, Claude, GitHub Copilot, Document AI, AI Guardrails</w:t>
-      </w:r>
-    </w:p>
-    <w:p>
-      <w:pPr>
-        <w:spacing w:after="45"/>
-      </w:pPr>
-      <w:r>
-        <w:rPr>
-          <w:rFonts w:ascii="Arial" w:cs="Arial" w:eastAsia="Arial" w:hAnsi="Arial"/>
-          <w:b/>
-          <w:bCs/>
-          <w:color w:val="0F172A"/>
-          <w:sz w:val="20"/>
-          <w:szCs w:val="20"/>
-        </w:rPr>
-        <w:t xml:space="preserve">Data Engineering and Analytics: </w:t>
-      </w:r>
-      <w:r>
-        <w:rPr>
-          <w:rFonts w:ascii="Arial" w:cs="Arial" w:eastAsia="Arial" w:hAnsi="Arial"/>
-          <w:color w:val="0F172A"/>
-          <w:sz w:val="20"/>
-          <w:szCs w:val="20"/>
-        </w:rPr>
-        <w:t xml:space="preserve">Pandas, NumPy, SQLAlchemy, Pydantic, Pandera, Apache Spark, AWS Glue, KDB+, PostgreSQL, DynamoDB, ETL, DuckDB, Polars, Parquet</w:t>
-      </w:r>
-    </w:p>
-    <w:p>
-      <w:pPr>
-        <w:spacing w:after="45"/>
-      </w:pPr>
-      <w:r>
-        <w:rPr>
-          <w:rFonts w:ascii="Arial" w:cs="Arial" w:eastAsia="Arial" w:hAnsi="Arial"/>
-          <w:b/>
-          <w:bCs/>
-          <w:color w:val="0F172A"/>
-          <w:sz w:val="20"/>
-          <w:szCs w:val="20"/>
-        </w:rPr>
-        <w:t xml:space="preserve">Programming &amp; Scripting Languages: </w:t>
-      </w:r>
-      <w:r>
-        <w:rPr>
-          <w:rFonts w:ascii="Arial" w:cs="Arial" w:eastAsia="Arial" w:hAnsi="Arial"/>
-          <w:color w:val="0F172A"/>
-          <w:sz w:val="20"/>
-          <w:szCs w:val="20"/>
-        </w:rPr>
-        <w:t xml:space="preserve">Python, SQL, TypeScript, JavaScript, Go, Rust, Bash</w:t>
-      </w:r>
-    </w:p>
-    <w:p>
-      <w:pPr>
-        <w:spacing w:after="45"/>
-      </w:pPr>
-      <w:r>
-        <w:rPr>
-          <w:rFonts w:ascii="Arial" w:cs="Arial" w:eastAsia="Arial" w:hAnsi="Arial"/>
-          <w:b/>
-          <w:bCs/>
-          <w:color w:val="0F172A"/>
-          <w:sz w:val="20"/>
-          <w:szCs w:val="20"/>
-        </w:rPr>
-        <w:t xml:space="preserve">Cloud Infrastructure and DevOps: </w:t>
-      </w:r>
-      <w:r>
-        <w:rPr>
-          <w:rFonts w:ascii="Arial" w:cs="Arial" w:eastAsia="Arial" w:hAnsi="Arial"/>
-          <w:color w:val="0F172A"/>
-          <w:sz w:val="20"/>
-          <w:szCs w:val="20"/>
-        </w:rPr>
-        <w:t xml:space="preserve">AWS, Docker, Kubernetes, Terraform, GitHub Actions, AWS Lambda, Google Cloud Functions, ECS, EKS</w:t>
+        <w:t xml:space="preserve">AI, LLM &amp; Agent Engineering: </w:t>
+      </w:r>
+      <w:r>
+        <w:rPr>
+          <w:rFonts w:ascii="Arial" w:cs="Arial" w:eastAsia="Arial" w:hAnsi="Arial"/>
+          <w:color w:val="0F172A"/>
+          <w:sz w:val="20"/>
+          <w:szCs w:val="20"/>
+        </w:rPr>
+        <w:t xml:space="preserve">OpenAI API, Anthropic Claude API, Amazon Bedrock, LangChain, LangGraph, DeepAgents, PydanticAI, Model Context Protocol (MCP), AI Agent Skills, Guardrails AI, Retrieval Augmented Generation (RAG), Prompt Engineering, Context Engineering, LLM Evaluation</w:t>
+      </w:r>
+    </w:p>
+    <w:p>
+      <w:pPr>
+        <w:spacing w:after="45"/>
+      </w:pPr>
+      <w:r>
+        <w:rPr>
+          <w:rFonts w:ascii="Arial" w:cs="Arial" w:eastAsia="Arial" w:hAnsi="Arial"/>
+          <w:b/>
+          <w:bCs/>
+          <w:color w:val="0F172A"/>
+          <w:sz w:val="20"/>
+          <w:szCs w:val="20"/>
+        </w:rPr>
+        <w:t xml:space="preserve">Data Engineering, Databases &amp; Analytics: </w:t>
+      </w:r>
+      <w:r>
+        <w:rPr>
+          <w:rFonts w:ascii="Arial" w:cs="Arial" w:eastAsia="Arial" w:hAnsi="Arial"/>
+          <w:color w:val="0F172A"/>
+          <w:sz w:val="20"/>
+          <w:szCs w:val="20"/>
+        </w:rPr>
+        <w:t xml:space="preserve">PostgreSQL, KDB+, qPython, DuckDB, BigQuery, AWS Athena, Apache Spark, AWS Glue, Apache Airflow, Prefect, Polars, SQLAlchemy, Pydantic, Pandera, Parquet, ETL, Data Validation</w:t>
+      </w:r>
+    </w:p>
+    <w:p>
+      <w:pPr>
+        <w:spacing w:after="45"/>
+      </w:pPr>
+      <w:r>
+        <w:rPr>
+          <w:rFonts w:ascii="Arial" w:cs="Arial" w:eastAsia="Arial" w:hAnsi="Arial"/>
+          <w:b/>
+          <w:bCs/>
+          <w:color w:val="0F172A"/>
+          <w:sz w:val="20"/>
+          <w:szCs w:val="20"/>
+        </w:rPr>
+        <w:t xml:space="preserve">Streaming, Messaging &amp; Capital Markets Systems: </w:t>
+      </w:r>
+      <w:r>
+        <w:rPr>
+          <w:rFonts w:ascii="Arial" w:cs="Arial" w:eastAsia="Arial" w:hAnsi="Arial"/>
+          <w:color w:val="0F172A"/>
+          <w:sz w:val="20"/>
+          <w:szCs w:val="20"/>
+        </w:rPr>
+        <w:t xml:space="preserve">Publish/Subscribe Architecture, AMPS, Apache Kafka, Amazon Kinesis, Google Cloud Pub/Sub, Event-Driven Architecture, Market Data Systems, Low-Latency Messaging</w:t>
+      </w:r>
+    </w:p>
+    <w:p>
+      <w:pPr>
+        <w:spacing w:after="45"/>
+      </w:pPr>
+      <w:r>
+        <w:rPr>
+          <w:rFonts w:ascii="Arial" w:cs="Arial" w:eastAsia="Arial" w:hAnsi="Arial"/>
+          <w:b/>
+          <w:bCs/>
+          <w:color w:val="0F172A"/>
+          <w:sz w:val="20"/>
+          <w:szCs w:val="20"/>
+        </w:rPr>
+        <w:t xml:space="preserve">Cloud, DevOps &amp; Observability: </w:t>
+      </w:r>
+      <w:r>
+        <w:rPr>
+          <w:rFonts w:ascii="Arial" w:cs="Arial" w:eastAsia="Arial" w:hAnsi="Arial"/>
+          <w:color w:val="0F172A"/>
+          <w:sz w:val="20"/>
+          <w:szCs w:val="20"/>
+        </w:rPr>
+        <w:t xml:space="preserve">AWS, GCP, Docker, Kubernetes, Terraform, GitHub Actions, AWS Lambda, Vercel, Prometheus, Monitoring, CI/CD</w:t>
+      </w:r>
+    </w:p>
+    <w:p>
+      <w:pPr>
+        <w:spacing w:after="45"/>
+      </w:pPr>
+      <w:r>
+        <w:rPr>
+          <w:rFonts w:ascii="Arial" w:cs="Arial" w:eastAsia="Arial" w:hAnsi="Arial"/>
+          <w:b/>
+          <w:bCs/>
+          <w:color w:val="0F172A"/>
+          <w:sz w:val="20"/>
+          <w:szCs w:val="20"/>
+        </w:rPr>
+        <w:t xml:space="preserve">Languages &amp; Authoring: </w:t>
+      </w:r>
+      <w:r>
+        <w:rPr>
+          <w:rFonts w:ascii="Arial" w:cs="Arial" w:eastAsia="Arial" w:hAnsi="Arial"/>
+          <w:color w:val="0F172A"/>
+          <w:sz w:val="20"/>
+          <w:szCs w:val="20"/>
+        </w:rPr>
+        <w:t xml:space="preserve">Python, SQL, TypeScript, Go, Rust, q, Bash</w:t>
       </w:r>
     </w:p>
     <w:p>
@@ -996,7 +1021,7 @@
         </w:rPr>
         <w:t xml:space="preserve"> | </w:t>
       </w:r>
-      <w:hyperlink w:history="1" r:id="rIdme7jboowfssd1lriznbpq">
+      <w:hyperlink w:history="1" r:id="rIdd5ud0yndvvl0jr2vu0lky">
         <w:r>
           <w:rPr>
             <w:rFonts w:ascii="Arial" w:cs="Arial" w:eastAsia="Arial" w:hAnsi="Arial"/>
@@ -1025,6 +1050,20 @@
     </w:p>
     <w:p>
       <w:pPr>
+        <w:spacing w:after="35"/>
+      </w:pPr>
+      <w:r>
+        <w:rPr>
+          <w:rFonts w:ascii="Arial" w:cs="Arial" w:eastAsia="Arial" w:hAnsi="Arial"/>
+          <w:color w:val="475569"/>
+          <w:sz w:val="20"/>
+          <w:szCs w:val="20"/>
+        </w:rPr>
+        <w:t xml:space="preserve">Stack: Python, TypeScript, MCP, FastMCP</w:t>
+      </w:r>
+    </w:p>
+    <w:p>
+      <w:pPr>
         <w:pStyle w:val="ListParagraph"/>
         <w:numPr>
           <w:ilvl w:val="0"/>
@@ -1085,7 +1124,7 @@
         </w:rPr>
         <w:t xml:space="preserve"> | </w:t>
       </w:r>
-      <w:hyperlink w:history="1" r:id="rIdricygxfo2gq0ryh7xgi3i">
+      <w:hyperlink w:history="1" r:id="rIdjrbatctgdcuks3cbwgxjp">
         <w:r>
           <w:rPr>
             <w:rFonts w:ascii="Arial" w:cs="Arial" w:eastAsia="Arial" w:hAnsi="Arial"/>
@@ -1114,6 +1153,20 @@
     </w:p>
     <w:p>
       <w:pPr>
+        <w:spacing w:after="35"/>
+      </w:pPr>
+      <w:r>
+        <w:rPr>
+          <w:rFonts w:ascii="Arial" w:cs="Arial" w:eastAsia="Arial" w:hAnsi="Arial"/>
+          <w:color w:val="475569"/>
+          <w:sz w:val="20"/>
+          <w:szCs w:val="20"/>
+        </w:rPr>
+        <w:t xml:space="preserve">Stack: Python, Pandas, Polars, SQLAlchemy, DuckDB, Pandera</w:t>
+      </w:r>
+    </w:p>
+    <w:p>
+      <w:pPr>
         <w:pStyle w:val="ListParagraph"/>
         <w:numPr>
           <w:ilvl w:val="0"/>
@@ -1174,7 +1227,7 @@
         </w:rPr>
         <w:t xml:space="preserve"> | </w:t>
       </w:r>
-      <w:hyperlink w:history="1" r:id="rIdkihtcjzbbkacrfcj8rp3h">
+      <w:hyperlink w:history="1" r:id="rIdoemetojuh_hisww2js1hw">
         <w:r>
           <w:rPr>
             <w:rFonts w:ascii="Arial" w:cs="Arial" w:eastAsia="Arial" w:hAnsi="Arial"/>
@@ -1203,6 +1256,20 @@
     </w:p>
     <w:p>
       <w:pPr>
+        <w:spacing w:after="35"/>
+      </w:pPr>
+      <w:r>
+        <w:rPr>
+          <w:rFonts w:ascii="Arial" w:cs="Arial" w:eastAsia="Arial" w:hAnsi="Arial"/>
+          <w:color w:val="475569"/>
+          <w:sz w:val="20"/>
+          <w:szCs w:val="20"/>
+        </w:rPr>
+        <w:t xml:space="preserve">Stack: Python, SQLite, PyPI</w:t>
+      </w:r>
+    </w:p>
+    <w:p>
+      <w:pPr>
         <w:pStyle w:val="ListParagraph"/>
         <w:numPr>
           <w:ilvl w:val="0"/>
@@ -1263,7 +1330,7 @@
         </w:rPr>
         <w:t xml:space="preserve"> | </w:t>
       </w:r>
-      <w:hyperlink w:history="1" r:id="rIdyju6tyck4uw8ylqllc3fj">
+      <w:hyperlink w:history="1" r:id="rId_sxoxn7ix3xbsil2xi4nw">
         <w:r>
           <w:rPr>
             <w:rFonts w:ascii="Arial" w:cs="Arial" w:eastAsia="Arial" w:hAnsi="Arial"/>
@@ -1292,6 +1359,20 @@
     </w:p>
     <w:p>
       <w:pPr>
+        <w:spacing w:after="35"/>
+      </w:pPr>
+      <w:r>
+        <w:rPr>
+          <w:rFonts w:ascii="Arial" w:cs="Arial" w:eastAsia="Arial" w:hAnsi="Arial"/>
+          <w:color w:val="475569"/>
+          <w:sz w:val="20"/>
+          <w:szCs w:val="20"/>
+        </w:rPr>
+        <w:t xml:space="preserve">Stack: Python, Pydantic, SQLModel, YAML, Fumadocs, Vercel</w:t>
+      </w:r>
+    </w:p>
+    <w:p>
+      <w:pPr>
         <w:pStyle w:val="ListParagraph"/>
         <w:numPr>
           <w:ilvl w:val="0"/>
@@ -1352,7 +1433,7 @@
         </w:rPr>
         <w:t xml:space="preserve"> | </w:t>
       </w:r>
-      <w:hyperlink w:history="1" r:id="rIdaywkolz2plinvc4hgl8fd">
+      <w:hyperlink w:history="1" r:id="rIdv272h3jyb0xwsih8mbidv">
         <w:r>
           <w:rPr>
             <w:rFonts w:ascii="Arial" w:cs="Arial" w:eastAsia="Arial" w:hAnsi="Arial"/>
@@ -1381,6 +1462,20 @@
     </w:p>
     <w:p>
       <w:pPr>
+        <w:spacing w:after="35"/>
+      </w:pPr>
+      <w:r>
+        <w:rPr>
+          <w:rFonts w:ascii="Arial" w:cs="Arial" w:eastAsia="Arial" w:hAnsi="Arial"/>
+          <w:color w:val="475569"/>
+          <w:sz w:val="20"/>
+          <w:szCs w:val="20"/>
+        </w:rPr>
+        <w:t xml:space="preserve">Stack: Python, FastMCP, Crawl4AI, Playwright, Docker</w:t>
+      </w:r>
+    </w:p>
+    <w:p>
+      <w:pPr>
         <w:pStyle w:val="ListParagraph"/>
         <w:numPr>
           <w:ilvl w:val="0"/>
@@ -1441,7 +1536,7 @@
         </w:rPr>
         <w:t xml:space="preserve"> | </w:t>
       </w:r>
-      <w:hyperlink w:history="1" r:id="rId7p_1m9ht4aoraertlzw18">
+      <w:hyperlink w:history="1" r:id="rIds1npxj4riw9l-yp4epfc6">
         <w:r>
           <w:rPr>
             <w:rFonts w:ascii="Arial" w:cs="Arial" w:eastAsia="Arial" w:hAnsi="Arial"/>
@@ -1470,6 +1565,20 @@
     </w:p>
     <w:p>
       <w:pPr>
+        <w:spacing w:after="35"/>
+      </w:pPr>
+      <w:r>
+        <w:rPr>
+          <w:rFonts w:ascii="Arial" w:cs="Arial" w:eastAsia="Arial" w:hAnsi="Arial"/>
+          <w:color w:val="475569"/>
+          <w:sz w:val="20"/>
+          <w:szCs w:val="20"/>
+        </w:rPr>
+        <w:t xml:space="preserve">Stack: Next.js, React, TypeScript, Tailwind CSS, MDX</w:t>
+      </w:r>
+    </w:p>
+    <w:p>
+      <w:pPr>
         <w:pStyle w:val="ListParagraph"/>
         <w:numPr>
           <w:ilvl w:val="0"/>
@@ -1543,7 +1652,7 @@
       <w:pPr>
         <w:spacing w:after="25"/>
       </w:pPr>
-      <w:hyperlink w:history="1" r:id="rIdoultavggnlnpgamqd46p_">
+      <w:hyperlink w:history="1" r:id="rIdt4-cmknrfy5q5u13nq8sq">
         <w:r>
           <w:rPr>
             <w:rFonts w:ascii="Arial" w:cs="Arial" w:eastAsia="Arial" w:hAnsi="Arial"/>
@@ -1599,7 +1708,7 @@
       <w:pPr>
         <w:spacing w:after="25"/>
       </w:pPr>
-      <w:hyperlink w:history="1" r:id="rIdefjbrw7xdtpz9krx1cno5">
+      <w:hyperlink w:history="1" r:id="rId-3duaepcuipdk99yj-loe">
         <w:r>
           <w:rPr>
             <w:rFonts w:ascii="Arial" w:cs="Arial" w:eastAsia="Arial" w:hAnsi="Arial"/>
@@ -1630,7 +1739,7 @@
       <w:pPr>
         <w:spacing w:after="35"/>
       </w:pPr>
-      <w:hyperlink w:history="1" r:id="rIdqemkls8kpijxagami10nh">
+      <w:hyperlink w:history="1" r:id="rIdpuu8u3u0r1pbzaycgis8g">
         <w:r>
           <w:rPr>
             <w:rFonts w:ascii="Arial" w:cs="Arial" w:eastAsia="Arial" w:hAnsi="Arial"/>
@@ -1679,7 +1788,7 @@
       <w:pPr>
         <w:spacing w:after="35"/>
       </w:pPr>
-      <w:hyperlink w:history="1" r:id="rIdnelot2-_sdfw_lyslrwvk">
+      <w:hyperlink w:history="1" r:id="rIdllotdpahx19fwuasech_l">
         <w:r>
           <w:rPr>
             <w:rFonts w:ascii="Arial" w:cs="Arial" w:eastAsia="Arial" w:hAnsi="Arial"/>

</xml_diff>

<commit_message>
feat: harden resume site and docs
</commit_message>
<xml_diff>
--- a/public/downloads/wyatt-walsh-resume-full.docx
+++ b/public/downloads/wyatt-walsh-resume-full.docx
@@ -7,7 +7,7 @@
         <w:pStyle w:val="Title"/>
         <w:spacing w:after="75"/>
       </w:pPr>
-      <w:hyperlink w:history="1" r:id="rIdoekfcvjrvz3mniyb9yka8">
+      <w:hyperlink w:history="1" r:id="rIde9rmiiksk1twqgtnjerk4">
         <w:r>
           <w:rPr>
             <w:rFonts w:ascii="Arial" w:cs="Arial" w:eastAsia="Arial" w:hAnsi="Arial"/>
@@ -40,7 +40,7 @@
       <w:pPr>
         <w:spacing w:after="100"/>
       </w:pPr>
-      <w:hyperlink w:history="1" r:id="rIdpfq7yzjrtctw13urat81b">
+      <w:hyperlink w:history="1" r:id="rId6hngryemut8euqn8wcxgr">
         <w:r>
           <w:rPr>
             <w:rFonts w:ascii="Arial" w:cs="Arial" w:eastAsia="Arial" w:hAnsi="Arial"/>
@@ -61,7 +61,7 @@
         </w:rPr>
         <w:t xml:space="preserve"> | </w:t>
       </w:r>
-      <w:hyperlink w:history="1" r:id="rIdkxx9ouvbvpsxiurxhjz7_">
+      <w:hyperlink w:history="1" r:id="rIdlkhs_wnqbzyxder7nkzsw">
         <w:r>
           <w:rPr>
             <w:rFonts w:ascii="Arial" w:cs="Arial" w:eastAsia="Arial" w:hAnsi="Arial"/>
@@ -100,7 +100,7 @@
         </w:rPr>
         <w:t xml:space="preserve"> | </w:t>
       </w:r>
-      <w:hyperlink w:history="1" r:id="rIdoxvioifkc9eyzbpx4fhti">
+      <w:hyperlink w:history="1" r:id="rId1wcolovdt6ho0jjj2gqda">
         <w:r>
           <w:rPr>
             <w:rFonts w:ascii="Arial" w:cs="Arial" w:eastAsia="Arial" w:hAnsi="Arial"/>
@@ -121,7 +121,7 @@
         </w:rPr>
         <w:t xml:space="preserve"> | </w:t>
       </w:r>
-      <w:hyperlink w:history="1" r:id="rId5scvhwixn-ojqfrfus4wc">
+      <w:hyperlink w:history="1" r:id="rIdlpcrsifup7nk_uzrek9wp">
         <w:r>
           <w:rPr>
             <w:rFonts w:ascii="Arial" w:cs="Arial" w:eastAsia="Arial" w:hAnsi="Arial"/>
@@ -189,7 +189,7 @@
         </w:rPr>
         <w:t xml:space="preserve"> | </w:t>
       </w:r>
-      <w:hyperlink w:history="1" r:id="rIddqrgagrfrpt7_uayvtsu8">
+      <w:hyperlink w:history="1" r:id="rIdftv7qlwgytbe3sw1konbs">
         <w:r>
           <w:rPr>
             <w:rFonts w:ascii="Arial" w:cs="Arial" w:eastAsia="Arial" w:hAnsi="Arial"/>
@@ -352,7 +352,7 @@
         </w:rPr>
         <w:t xml:space="preserve"> | </w:t>
       </w:r>
-      <w:hyperlink w:history="1" r:id="rIdz_zjj5pk8nm17oulh3dbs">
+      <w:hyperlink w:history="1" r:id="rIdrdi_sz3yostlimrso6xfs">
         <w:r>
           <w:rPr>
             <w:rFonts w:ascii="Arial" w:cs="Arial" w:eastAsia="Arial" w:hAnsi="Arial"/>
@@ -750,7 +750,7 @@
         </w:rPr>
         <w:t xml:space="preserve"> | </w:t>
       </w:r>
-      <w:hyperlink w:history="1" r:id="rId4c2oujthrekqgtopctzly">
+      <w:hyperlink w:history="1" r:id="rIdlk4klbxmzztuyseijatok">
         <w:r>
           <w:rPr>
             <w:rFonts w:ascii="Arial" w:cs="Arial" w:eastAsia="Arial" w:hAnsi="Arial"/>
@@ -1021,7 +1021,7 @@
         </w:rPr>
         <w:t xml:space="preserve"> | </w:t>
       </w:r>
-      <w:hyperlink w:history="1" r:id="rIdd5ud0yndvvl0jr2vu0lky">
+      <w:hyperlink w:history="1" r:id="rIddrv_0zzu9f887rnmsmcmq">
         <w:r>
           <w:rPr>
             <w:rFonts w:ascii="Arial" w:cs="Arial" w:eastAsia="Arial" w:hAnsi="Arial"/>
@@ -1124,7 +1124,49 @@
         </w:rPr>
         <w:t xml:space="preserve"> | </w:t>
       </w:r>
-      <w:hyperlink w:history="1" r:id="rIdjrbatctgdcuks3cbwgxjp">
+      <w:hyperlink w:history="1" r:id="rIdyh7kbqcbp82zkk7a7-fxm">
+        <w:r>
+          <w:rPr>
+            <w:rFonts w:ascii="Arial" w:cs="Arial" w:eastAsia="Arial" w:hAnsi="Arial"/>
+            <w:color w:val="2563EB"/>
+            <w:sz w:val="20"/>
+            <w:szCs w:val="20"/>
+            <w:u w:val="single" w:color="2563EB"/>
+          </w:rPr>
+          <w:t xml:space="preserve">Docs</w:t>
+        </w:r>
+      </w:hyperlink>
+      <w:r>
+        <w:rPr>
+          <w:rFonts w:ascii="Arial" w:cs="Arial" w:eastAsia="Arial" w:hAnsi="Arial"/>
+          <w:color w:val="475569"/>
+          <w:sz w:val="18"/>
+          <w:szCs w:val="18"/>
+        </w:rPr>
+        <w:t xml:space="preserve"> | </w:t>
+      </w:r>
+      <w:hyperlink w:history="1" r:id="rId0y5nvdo927oz89sg6-7am">
+        <w:r>
+          <w:rPr>
+            <w:rFonts w:ascii="Arial" w:cs="Arial" w:eastAsia="Arial" w:hAnsi="Arial"/>
+            <w:color w:val="2563EB"/>
+            <w:sz w:val="20"/>
+            <w:szCs w:val="20"/>
+            <w:u w:val="single" w:color="2563EB"/>
+          </w:rPr>
+          <w:t xml:space="preserve">Kaggle</w:t>
+        </w:r>
+      </w:hyperlink>
+      <w:r>
+        <w:rPr>
+          <w:rFonts w:ascii="Arial" w:cs="Arial" w:eastAsia="Arial" w:hAnsi="Arial"/>
+          <w:color w:val="475569"/>
+          <w:sz w:val="18"/>
+          <w:szCs w:val="18"/>
+        </w:rPr>
+        <w:t xml:space="preserve"> | </w:t>
+      </w:r>
+      <w:hyperlink w:history="1" r:id="rIdiztyzr_v1azouwhdpch-a">
         <w:r>
           <w:rPr>
             <w:rFonts w:ascii="Arial" w:cs="Arial" w:eastAsia="Arial" w:hAnsi="Arial"/>
@@ -1227,7 +1269,7 @@
         </w:rPr>
         <w:t xml:space="preserve"> | </w:t>
       </w:r>
-      <w:hyperlink w:history="1" r:id="rIdoemetojuh_hisww2js1hw">
+      <w:hyperlink w:history="1" r:id="rIdoq4jimyzbcrsheaoipkiw">
         <w:r>
           <w:rPr>
             <w:rFonts w:ascii="Arial" w:cs="Arial" w:eastAsia="Arial" w:hAnsi="Arial"/>
@@ -1330,7 +1372,7 @@
         </w:rPr>
         <w:t xml:space="preserve"> | </w:t>
       </w:r>
-      <w:hyperlink w:history="1" r:id="rId_sxoxn7ix3xbsil2xi4nw">
+      <w:hyperlink w:history="1" r:id="rIdty-vfah3yyb8matoi_hrv">
         <w:r>
           <w:rPr>
             <w:rFonts w:ascii="Arial" w:cs="Arial" w:eastAsia="Arial" w:hAnsi="Arial"/>
@@ -1433,7 +1475,7 @@
         </w:rPr>
         <w:t xml:space="preserve"> | </w:t>
       </w:r>
-      <w:hyperlink w:history="1" r:id="rIdv272h3jyb0xwsih8mbidv">
+      <w:hyperlink w:history="1" r:id="rIdbvpdy6x-juk7bnesantrt">
         <w:r>
           <w:rPr>
             <w:rFonts w:ascii="Arial" w:cs="Arial" w:eastAsia="Arial" w:hAnsi="Arial"/>
@@ -1536,7 +1578,7 @@
         </w:rPr>
         <w:t xml:space="preserve"> | </w:t>
       </w:r>
-      <w:hyperlink w:history="1" r:id="rIds1npxj4riw9l-yp4epfc6">
+      <w:hyperlink w:history="1" r:id="rIdhu4q5cinygzpflp3dxlxy">
         <w:r>
           <w:rPr>
             <w:rFonts w:ascii="Arial" w:cs="Arial" w:eastAsia="Arial" w:hAnsi="Arial"/>
@@ -1652,7 +1694,7 @@
       <w:pPr>
         <w:spacing w:after="25"/>
       </w:pPr>
-      <w:hyperlink w:history="1" r:id="rIdt4-cmknrfy5q5u13nq8sq">
+      <w:hyperlink w:history="1" r:id="rId1gc3ynweb4ykmtaixgbac">
         <w:r>
           <w:rPr>
             <w:rFonts w:ascii="Arial" w:cs="Arial" w:eastAsia="Arial" w:hAnsi="Arial"/>
@@ -1708,7 +1750,7 @@
       <w:pPr>
         <w:spacing w:after="25"/>
       </w:pPr>
-      <w:hyperlink w:history="1" r:id="rId-3duaepcuipdk99yj-loe">
+      <w:hyperlink w:history="1" r:id="rIdnkqyqcq0ysyueacelpjr-">
         <w:r>
           <w:rPr>
             <w:rFonts w:ascii="Arial" w:cs="Arial" w:eastAsia="Arial" w:hAnsi="Arial"/>
@@ -1739,7 +1781,7 @@
       <w:pPr>
         <w:spacing w:after="35"/>
       </w:pPr>
-      <w:hyperlink w:history="1" r:id="rIdpuu8u3u0r1pbzaycgis8g">
+      <w:hyperlink w:history="1" r:id="rId1ufmchxnr9istaxprqv8a">
         <w:r>
           <w:rPr>
             <w:rFonts w:ascii="Arial" w:cs="Arial" w:eastAsia="Arial" w:hAnsi="Arial"/>
@@ -1788,7 +1830,7 @@
       <w:pPr>
         <w:spacing w:after="35"/>
       </w:pPr>
-      <w:hyperlink w:history="1" r:id="rIdllotdpahx19fwuasech_l">
+      <w:hyperlink w:history="1" r:id="rIdcvo5ti97x3hstz_crp0jo">
         <w:r>
           <w:rPr>
             <w:rFonts w:ascii="Arial" w:cs="Arial" w:eastAsia="Arial" w:hAnsi="Arial"/>

</xml_diff>

<commit_message>
feat: improve resume artifacts and skill popovers
</commit_message>
<xml_diff>
--- a/public/downloads/wyatt-walsh-resume-full.docx
+++ b/public/downloads/wyatt-walsh-resume-full.docx
@@ -7,7 +7,7 @@
         <w:pStyle w:val="Title"/>
         <w:spacing w:after="75"/>
       </w:pPr>
-      <w:hyperlink w:history="1" r:id="rIde9rmiiksk1twqgtnjerk4">
+      <w:hyperlink w:history="1" r:id="rIdj6r-f_e3elcm23p6gsoou">
         <w:r>
           <w:rPr>
             <w:rFonts w:ascii="Arial" w:cs="Arial" w:eastAsia="Arial" w:hAnsi="Arial"/>
@@ -40,7 +40,7 @@
       <w:pPr>
         <w:spacing w:after="100"/>
       </w:pPr>
-      <w:hyperlink w:history="1" r:id="rId6hngryemut8euqn8wcxgr">
+      <w:hyperlink w:history="1" r:id="rIdoniqan3a6i1shvp8cpm5-">
         <w:r>
           <w:rPr>
             <w:rFonts w:ascii="Arial" w:cs="Arial" w:eastAsia="Arial" w:hAnsi="Arial"/>
@@ -61,7 +61,7 @@
         </w:rPr>
         <w:t xml:space="preserve"> | </w:t>
       </w:r>
-      <w:hyperlink w:history="1" r:id="rIdlkhs_wnqbzyxder7nkzsw">
+      <w:hyperlink w:history="1" r:id="rIdcjrm-xmlh4qgfwgbhecou">
         <w:r>
           <w:rPr>
             <w:rFonts w:ascii="Arial" w:cs="Arial" w:eastAsia="Arial" w:hAnsi="Arial"/>
@@ -100,7 +100,7 @@
         </w:rPr>
         <w:t xml:space="preserve"> | </w:t>
       </w:r>
-      <w:hyperlink w:history="1" r:id="rId1wcolovdt6ho0jjj2gqda">
+      <w:hyperlink w:history="1" r:id="rIdvjg2lcz77grw95okzg8bk">
         <w:r>
           <w:rPr>
             <w:rFonts w:ascii="Arial" w:cs="Arial" w:eastAsia="Arial" w:hAnsi="Arial"/>
@@ -121,7 +121,7 @@
         </w:rPr>
         <w:t xml:space="preserve"> | </w:t>
       </w:r>
-      <w:hyperlink w:history="1" r:id="rIdlpcrsifup7nk_uzrek9wp">
+      <w:hyperlink w:history="1" r:id="rIdyn9y7pq8y8mldtfwiyevv">
         <w:r>
           <w:rPr>
             <w:rFonts w:ascii="Arial" w:cs="Arial" w:eastAsia="Arial" w:hAnsi="Arial"/>
@@ -189,7 +189,7 @@
         </w:rPr>
         <w:t xml:space="preserve"> | </w:t>
       </w:r>
-      <w:hyperlink w:history="1" r:id="rIdftv7qlwgytbe3sw1konbs">
+      <w:hyperlink w:history="1" r:id="rIdd59xwfcckalmd6t_nemtz">
         <w:r>
           <w:rPr>
             <w:rFonts w:ascii="Arial" w:cs="Arial" w:eastAsia="Arial" w:hAnsi="Arial"/>
@@ -352,7 +352,7 @@
         </w:rPr>
         <w:t xml:space="preserve"> | </w:t>
       </w:r>
-      <w:hyperlink w:history="1" r:id="rIdrdi_sz3yostlimrso6xfs">
+      <w:hyperlink w:history="1" r:id="rId3ezbyfvchvustulkywbvh">
         <w:r>
           <w:rPr>
             <w:rFonts w:ascii="Arial" w:cs="Arial" w:eastAsia="Arial" w:hAnsi="Arial"/>
@@ -750,7 +750,7 @@
         </w:rPr>
         <w:t xml:space="preserve"> | </w:t>
       </w:r>
-      <w:hyperlink w:history="1" r:id="rIdlk4klbxmzztuyseijatok">
+      <w:hyperlink w:history="1" r:id="rIdk9ktadup-e1ao4izdrfsw">
         <w:r>
           <w:rPr>
             <w:rFonts w:ascii="Arial" w:cs="Arial" w:eastAsia="Arial" w:hAnsi="Arial"/>
@@ -1021,7 +1021,28 @@
         </w:rPr>
         <w:t xml:space="preserve"> | </w:t>
       </w:r>
-      <w:hyperlink w:history="1" r:id="rIddrv_0zzu9f887rnmsmcmq">
+      <w:hyperlink w:history="1" r:id="rId3zaqe24-vvo_zluqvhzdt">
+        <w:r>
+          <w:rPr>
+            <w:rFonts w:ascii="Arial" w:cs="Arial" w:eastAsia="Arial" w:hAnsi="Arial"/>
+            <w:color w:val="2563EB"/>
+            <w:sz w:val="20"/>
+            <w:szCs w:val="20"/>
+            <w:u w:val="single" w:color="2563EB"/>
+          </w:rPr>
+          <w:t xml:space="preserve">Live site</w:t>
+        </w:r>
+      </w:hyperlink>
+      <w:r>
+        <w:rPr>
+          <w:rFonts w:ascii="Arial" w:cs="Arial" w:eastAsia="Arial" w:hAnsi="Arial"/>
+          <w:color w:val="475569"/>
+          <w:sz w:val="18"/>
+          <w:szCs w:val="18"/>
+        </w:rPr>
+        <w:t xml:space="preserve"> | </w:t>
+      </w:r>
+      <w:hyperlink w:history="1" r:id="rIdd8tsv0sy9pathh4kco6jb">
         <w:r>
           <w:rPr>
             <w:rFonts w:ascii="Arial" w:cs="Arial" w:eastAsia="Arial" w:hAnsi="Arial"/>
@@ -1102,6 +1123,25 @@
     </w:p>
     <w:p>
       <w:pPr>
+        <w:pStyle w:val="ListParagraph"/>
+        <w:numPr>
+          <w:ilvl w:val="0"/>
+          <w:numId w:val="1"/>
+        </w:numPr>
+        <w:spacing w:after="35"/>
+      </w:pPr>
+      <w:r>
+        <w:rPr>
+          <w:rFonts w:ascii="Arial" w:cs="Arial" w:eastAsia="Arial" w:hAnsi="Arial"/>
+          <w:color w:val="0F172A"/>
+          <w:sz w:val="20"/>
+          <w:szCs w:val="20"/>
+        </w:rPr>
+        <w:t xml:space="preserve">Packaged 112 portable skills and 8 reusable agents into a cross-runtime workflow system for AI-assisted software development.</w:t>
+      </w:r>
+    </w:p>
+    <w:p>
+      <w:pPr>
         <w:spacing w:after="45"/>
       </w:pPr>
       <w:r>
@@ -1124,7 +1164,7 @@
         </w:rPr>
         <w:t xml:space="preserve"> | </w:t>
       </w:r>
-      <w:hyperlink w:history="1" r:id="rIdyh7kbqcbp82zkk7a7-fxm">
+      <w:hyperlink w:history="1" r:id="rIdtnmk-3lvwlyyjji-rrqnu">
         <w:r>
           <w:rPr>
             <w:rFonts w:ascii="Arial" w:cs="Arial" w:eastAsia="Arial" w:hAnsi="Arial"/>
@@ -1145,7 +1185,7 @@
         </w:rPr>
         <w:t xml:space="preserve"> | </w:t>
       </w:r>
-      <w:hyperlink w:history="1" r:id="rId0y5nvdo927oz89sg6-7am">
+      <w:hyperlink w:history="1" r:id="rIddspfwiwhwlll9ahjjy5fj">
         <w:r>
           <w:rPr>
             <w:rFonts w:ascii="Arial" w:cs="Arial" w:eastAsia="Arial" w:hAnsi="Arial"/>
@@ -1166,7 +1206,7 @@
         </w:rPr>
         <w:t xml:space="preserve"> | </w:t>
       </w:r>
-      <w:hyperlink w:history="1" r:id="rIdiztyzr_v1azouwhdpch-a">
+      <w:hyperlink w:history="1" r:id="rIdnbjqghves1lyxdwbjhy-b">
         <w:r>
           <w:rPr>
             <w:rFonts w:ascii="Arial" w:cs="Arial" w:eastAsia="Arial" w:hAnsi="Arial"/>
@@ -1190,7 +1230,7 @@
           <w:sz w:val="20"/>
           <w:szCs w:val="20"/>
         </w:rPr>
-        <w:t xml:space="preserve">Public NBA Kaggle dataset and repo covering 65K+ games and 13M+ plays; reached 425K+ views and 60K+ downloads before freezing at the 2023-07-06 update.</w:t>
+        <w:t xml:space="preserve">Public NBA Kaggle dataset and repo covering 65K+ games and 13M+ plays; reached 425K+ views and 60K+ downloads before freezing at the 2023-07-06 update for reproducible sports analytics workflows.</w:t>
       </w:r>
     </w:p>
     <w:p>
@@ -1243,6 +1283,25 @@
           <w:szCs w:val="20"/>
         </w:rPr>
         <w:t xml:space="preserve">Building the next-generation nbadb rebuild with 152 extractor wrappers and 204 generated public star-schema outputs.</w:t>
+      </w:r>
+    </w:p>
+    <w:p>
+      <w:pPr>
+        <w:pStyle w:val="ListParagraph"/>
+        <w:numPr>
+          <w:ilvl w:val="0"/>
+          <w:numId w:val="1"/>
+        </w:numPr>
+        <w:spacing w:after="35"/>
+      </w:pPr>
+      <w:r>
+        <w:rPr>
+          <w:rFonts w:ascii="Arial" w:cs="Arial" w:eastAsia="Arial" w:hAnsi="Arial"/>
+          <w:color w:val="0F172A"/>
+          <w:sz w:val="20"/>
+          <w:szCs w:val="20"/>
+        </w:rPr>
+        <w:t xml:space="preserve">Published a public sports analytics dataset with 65K+ games and 13M+ play-by-play events across multiple warehouse formats.</w:t>
       </w:r>
     </w:p>
     <w:p>
@@ -1269,7 +1328,28 @@
         </w:rPr>
         <w:t xml:space="preserve"> | </w:t>
       </w:r>
-      <w:hyperlink w:history="1" r:id="rIdoq4jimyzbcrsheaoipkiw">
+      <w:hyperlink w:history="1" r:id="rIdteptibd97pfqmxzremml0">
+        <w:r>
+          <w:rPr>
+            <w:rFonts w:ascii="Arial" w:cs="Arial" w:eastAsia="Arial" w:hAnsi="Arial"/>
+            <w:color w:val="2563EB"/>
+            <w:sz w:val="20"/>
+            <w:szCs w:val="20"/>
+            <w:u w:val="single" w:color="2563EB"/>
+          </w:rPr>
+          <w:t xml:space="preserve">Live site</w:t>
+        </w:r>
+      </w:hyperlink>
+      <w:r>
+        <w:rPr>
+          <w:rFonts w:ascii="Arial" w:cs="Arial" w:eastAsia="Arial" w:hAnsi="Arial"/>
+          <w:color w:val="475569"/>
+          <w:sz w:val="18"/>
+          <w:szCs w:val="18"/>
+        </w:rPr>
+        <w:t xml:space="preserve"> | </w:t>
+      </w:r>
+      <w:hyperlink w:history="1" r:id="rIddbclh7eu6iwg9dqbdxtb0">
         <w:r>
           <w:rPr>
             <w:rFonts w:ascii="Arial" w:cs="Arial" w:eastAsia="Arial" w:hAnsi="Arial"/>
@@ -1293,7 +1373,7 @@
           <w:sz w:val="20"/>
           <w:szCs w:val="20"/>
         </w:rPr>
-        <w:t xml:space="preserve">Released rotating proxy toolkit with 9 selection strategies, 100+ auto-fetched sources, self-healing circuit breakers, and five interfaces for resilient scraping and data-collection workflows.</w:t>
+        <w:t xml:space="preserve">Released rotating proxy toolkit with 9 strategies, 100+ auto-fetched sources, self-healing circuit breakers, and five interfaces for scraping/data workflows.</w:t>
       </w:r>
     </w:p>
     <w:p>
@@ -1345,7 +1425,26 @@
           <w:sz w:val="20"/>
           <w:szCs w:val="20"/>
         </w:rPr>
-        <w:t xml:space="preserve">Built self-healing validation across 100+ proxy sources with circuit breakers, auto-ejection, recovery promotion, and five interfaces for different scraping workflows.</w:t>
+        <w:t xml:space="preserve">Built self-healing validation across 100+ proxy sources with circuit breakers, auto-ejection, recovery promotion, and workflow-specific health scoring.</w:t>
+      </w:r>
+    </w:p>
+    <w:p>
+      <w:pPr>
+        <w:pStyle w:val="ListParagraph"/>
+        <w:numPr>
+          <w:ilvl w:val="0"/>
+          <w:numId w:val="1"/>
+        </w:numPr>
+        <w:spacing w:after="35"/>
+      </w:pPr>
+      <w:r>
+        <w:rPr>
+          <w:rFonts w:ascii="Arial" w:cs="Arial" w:eastAsia="Arial" w:hAnsi="Arial"/>
+          <w:color w:val="0F172A"/>
+          <w:sz w:val="20"/>
+          <w:szCs w:val="20"/>
+        </w:rPr>
+        <w:t xml:space="preserve">Released the toolkit for resilient scraping and data-collection workflows with SQLite-backed state and PyPI distribution.</w:t>
       </w:r>
     </w:p>
     <w:p>
@@ -1372,7 +1471,28 @@
         </w:rPr>
         <w:t xml:space="preserve"> | </w:t>
       </w:r>
-      <w:hyperlink w:history="1" r:id="rIdty-vfah3yyb8matoi_hrv">
+      <w:hyperlink w:history="1" r:id="rId8fsuu7bb-kttkvj5k0vgb">
+        <w:r>
+          <w:rPr>
+            <w:rFonts w:ascii="Arial" w:cs="Arial" w:eastAsia="Arial" w:hAnsi="Arial"/>
+            <w:color w:val="2563EB"/>
+            <w:sz w:val="20"/>
+            <w:szCs w:val="20"/>
+            <w:u w:val="single" w:color="2563EB"/>
+          </w:rPr>
+          <w:t xml:space="preserve">Live site</w:t>
+        </w:r>
+      </w:hyperlink>
+      <w:r>
+        <w:rPr>
+          <w:rFonts w:ascii="Arial" w:cs="Arial" w:eastAsia="Arial" w:hAnsi="Arial"/>
+          <w:color w:val="475569"/>
+          <w:sz w:val="18"/>
+          <w:szCs w:val="18"/>
+        </w:rPr>
+        <w:t xml:space="preserve"> | </w:t>
+      </w:r>
+      <w:hyperlink w:history="1" r:id="rIda0t6tavgf_l0rot3l4zyz">
         <w:r>
           <w:rPr>
             <w:rFonts w:ascii="Arial" w:cs="Arial" w:eastAsia="Arial" w:hAnsi="Arial"/>
@@ -1396,7 +1516,7 @@
           <w:sz w:val="20"/>
           <w:szCs w:val="20"/>
         </w:rPr>
-        <w:t xml:space="preserve">Built a curated AI and ML feed platform with typed schemas, HTTP/RSS validation, contributor submission workflows, OPML exports, and documented browse/download surfaces.</w:t>
+        <w:t xml:space="preserve">Built a curated AI and ML feed platform with typed schemas, HTTP/RSS validation, contributor submission workflows, OPML exports, and documented browse/download surfaces for research discovery.</w:t>
       </w:r>
     </w:p>
     <w:p>
@@ -1449,6 +1569,25 @@
           <w:szCs w:val="20"/>
         </w:rPr>
         <w:t xml:space="preserve">Shipped helper scripts, CI checks, scheduled validation jobs, and a docs-backed submission/review flow for reliable community feed curation.</w:t>
+      </w:r>
+    </w:p>
+    <w:p>
+      <w:pPr>
+        <w:pStyle w:val="ListParagraph"/>
+        <w:numPr>
+          <w:ilvl w:val="0"/>
+          <w:numId w:val="1"/>
+        </w:numPr>
+        <w:spacing w:after="35"/>
+      </w:pPr>
+      <w:r>
+        <w:rPr>
+          <w:rFonts w:ascii="Arial" w:cs="Arial" w:eastAsia="Arial" w:hAnsi="Arial"/>
+          <w:color w:val="0F172A"/>
+          <w:sz w:val="20"/>
+          <w:szCs w:val="20"/>
+        </w:rPr>
+        <w:t xml:space="preserve">Published OPML exports and documented browse/download surfaces for AI and ML research feeds, downstream readers, and offline subscription managers.</w:t>
       </w:r>
     </w:p>
     <w:p>
@@ -1475,7 +1614,28 @@
         </w:rPr>
         <w:t xml:space="preserve"> | </w:t>
       </w:r>
-      <w:hyperlink w:history="1" r:id="rIdbvpdy6x-juk7bnesantrt">
+      <w:hyperlink w:history="1" r:id="rIdn_wgqqhueyecmvooxk5w3">
+        <w:r>
+          <w:rPr>
+            <w:rFonts w:ascii="Arial" w:cs="Arial" w:eastAsia="Arial" w:hAnsi="Arial"/>
+            <w:color w:val="2563EB"/>
+            <w:sz w:val="20"/>
+            <w:szCs w:val="20"/>
+            <w:u w:val="single" w:color="2563EB"/>
+          </w:rPr>
+          <w:t xml:space="preserve">Live site</w:t>
+        </w:r>
+      </w:hyperlink>
+      <w:r>
+        <w:rPr>
+          <w:rFonts w:ascii="Arial" w:cs="Arial" w:eastAsia="Arial" w:hAnsi="Arial"/>
+          <w:color w:val="475569"/>
+          <w:sz w:val="18"/>
+          <w:szCs w:val="18"/>
+        </w:rPr>
+        <w:t xml:space="preserve"> | </w:t>
+      </w:r>
+      <w:hyperlink w:history="1" r:id="rIdma0oki1slkjvxuywyvrdz">
         <w:r>
           <w:rPr>
             <w:rFonts w:ascii="Arial" w:cs="Arial" w:eastAsia="Arial" w:hAnsi="Arial"/>
@@ -1556,6 +1716,25 @@
     </w:p>
     <w:p>
       <w:pPr>
+        <w:pStyle w:val="ListParagraph"/>
+        <w:numPr>
+          <w:ilvl w:val="0"/>
+          <w:numId w:val="1"/>
+        </w:numPr>
+        <w:spacing w:after="35"/>
+      </w:pPr>
+      <w:r>
+        <w:rPr>
+          <w:rFonts w:ascii="Arial" w:cs="Arial" w:eastAsia="Arial" w:hAnsi="Arial"/>
+          <w:color w:val="0F172A"/>
+          <w:sz w:val="20"/>
+          <w:szCs w:val="20"/>
+        </w:rPr>
+        <w:t xml:space="preserve">Documented stdio and HTTP integration paths so AI agents can use web crawling through a focused MCP surface.</w:t>
+      </w:r>
+    </w:p>
+    <w:p>
+      <w:pPr>
         <w:spacing w:after="45"/>
       </w:pPr>
       <w:r>
@@ -1578,7 +1757,28 @@
         </w:rPr>
         <w:t xml:space="preserve"> | </w:t>
       </w:r>
-      <w:hyperlink w:history="1" r:id="rIdhu4q5cinygzpflp3dxlxy">
+      <w:hyperlink w:history="1" r:id="rIdfav-bro8dzbljwc7vtobg">
+        <w:r>
+          <w:rPr>
+            <w:rFonts w:ascii="Arial" w:cs="Arial" w:eastAsia="Arial" w:hAnsi="Arial"/>
+            <w:color w:val="2563EB"/>
+            <w:sz w:val="20"/>
+            <w:szCs w:val="20"/>
+            <w:u w:val="single" w:color="2563EB"/>
+          </w:rPr>
+          <w:t xml:space="preserve">Live site</w:t>
+        </w:r>
+      </w:hyperlink>
+      <w:r>
+        <w:rPr>
+          <w:rFonts w:ascii="Arial" w:cs="Arial" w:eastAsia="Arial" w:hAnsi="Arial"/>
+          <w:color w:val="475569"/>
+          <w:sz w:val="18"/>
+          <w:szCs w:val="18"/>
+        </w:rPr>
+        <w:t xml:space="preserve"> | </w:t>
+      </w:r>
+      <w:hyperlink w:history="1" r:id="rIdeyrxbptmsc8hojqdjrlob">
         <w:r>
           <w:rPr>
             <w:rFonts w:ascii="Arial" w:cs="Arial" w:eastAsia="Arial" w:hAnsi="Arial"/>
@@ -1659,6 +1859,25 @@
     </w:p>
     <w:p>
       <w:pPr>
+        <w:pStyle w:val="ListParagraph"/>
+        <w:numPr>
+          <w:ilvl w:val="0"/>
+          <w:numId w:val="1"/>
+        </w:numPr>
+        <w:spacing w:after="35"/>
+      </w:pPr>
+      <w:r>
+        <w:rPr>
+          <w:rFonts w:ascii="Arial" w:cs="Arial" w:eastAsia="Arial" w:hAnsi="Arial"/>
+          <w:color w:val="0F172A"/>
+          <w:sz w:val="20"/>
+          <w:szCs w:val="20"/>
+        </w:rPr>
+        <w:t xml:space="preserve">Sustained a polished public-facing frontend with strong SEO and durable content workflows.</w:t>
+      </w:r>
+    </w:p>
+    <w:p>
+      <w:pPr>
         <w:pStyle w:val="Heading2"/>
         <w:spacing w:after="120" w:before="170"/>
       </w:pPr>
@@ -1694,7 +1913,7 @@
       <w:pPr>
         <w:spacing w:after="25"/>
       </w:pPr>
-      <w:hyperlink w:history="1" r:id="rId1gc3ynweb4ykmtaixgbac">
+      <w:hyperlink w:history="1" r:id="rIdkzzch6oj4xjofpu8qgcte">
         <w:r>
           <w:rPr>
             <w:rFonts w:ascii="Arial" w:cs="Arial" w:eastAsia="Arial" w:hAnsi="Arial"/>
@@ -1750,7 +1969,7 @@
       <w:pPr>
         <w:spacing w:after="25"/>
       </w:pPr>
-      <w:hyperlink w:history="1" r:id="rIdnkqyqcq0ysyueacelpjr-">
+      <w:hyperlink w:history="1" r:id="rIdytkn94zflsuif0jk4xrkw">
         <w:r>
           <w:rPr>
             <w:rFonts w:ascii="Arial" w:cs="Arial" w:eastAsia="Arial" w:hAnsi="Arial"/>
@@ -1781,7 +2000,7 @@
       <w:pPr>
         <w:spacing w:after="35"/>
       </w:pPr>
-      <w:hyperlink w:history="1" r:id="rId1ufmchxnr9istaxprqv8a">
+      <w:hyperlink w:history="1" r:id="rIdlbjo4_u0zgti8gh1edixg">
         <w:r>
           <w:rPr>
             <w:rFonts w:ascii="Arial" w:cs="Arial" w:eastAsia="Arial" w:hAnsi="Arial"/>
@@ -1830,7 +2049,7 @@
       <w:pPr>
         <w:spacing w:after="35"/>
       </w:pPr>
-      <w:hyperlink w:history="1" r:id="rIdcvo5ti97x3hstz_crp0jo">
+      <w:hyperlink w:history="1" r:id="rIdyp_v_u3jq116u3fwjgvdt">
         <w:r>
           <w:rPr>
             <w:rFonts w:ascii="Arial" w:cs="Arial" w:eastAsia="Arial" w:hAnsi="Arial"/>

</xml_diff>

<commit_message>
fix: enforce synced resume artifacts
</commit_message>
<xml_diff>
--- a/public/downloads/wyatt-walsh-resume-full.docx
+++ b/public/downloads/wyatt-walsh-resume-full.docx
@@ -7,7 +7,7 @@
         <w:pStyle w:val="Title"/>
         <w:spacing w:after="75"/>
       </w:pPr>
-      <w:hyperlink w:history="1" r:id="rIdj6r-f_e3elcm23p6gsoou">
+      <w:hyperlink w:history="1" r:id="rId885yfdnxulqhuzhutqxzd">
         <w:r>
           <w:rPr>
             <w:rFonts w:ascii="Arial" w:cs="Arial" w:eastAsia="Arial" w:hAnsi="Arial"/>
@@ -40,7 +40,7 @@
       <w:pPr>
         <w:spacing w:after="100"/>
       </w:pPr>
-      <w:hyperlink w:history="1" r:id="rIdoniqan3a6i1shvp8cpm5-">
+      <w:hyperlink w:history="1" r:id="rIdeuaqaoyycueylmejgzpzl">
         <w:r>
           <w:rPr>
             <w:rFonts w:ascii="Arial" w:cs="Arial" w:eastAsia="Arial" w:hAnsi="Arial"/>
@@ -61,7 +61,7 @@
         </w:rPr>
         <w:t xml:space="preserve"> | </w:t>
       </w:r>
-      <w:hyperlink w:history="1" r:id="rIdcjrm-xmlh4qgfwgbhecou">
+      <w:hyperlink w:history="1" r:id="rIdm0d7zbeoyanhho6xqgvab">
         <w:r>
           <w:rPr>
             <w:rFonts w:ascii="Arial" w:cs="Arial" w:eastAsia="Arial" w:hAnsi="Arial"/>
@@ -100,7 +100,7 @@
         </w:rPr>
         <w:t xml:space="preserve"> | </w:t>
       </w:r>
-      <w:hyperlink w:history="1" r:id="rIdvjg2lcz77grw95okzg8bk">
+      <w:hyperlink w:history="1" r:id="rId6opbsljvqd519tpkb3d1b">
         <w:r>
           <w:rPr>
             <w:rFonts w:ascii="Arial" w:cs="Arial" w:eastAsia="Arial" w:hAnsi="Arial"/>
@@ -121,7 +121,7 @@
         </w:rPr>
         <w:t xml:space="preserve"> | </w:t>
       </w:r>
-      <w:hyperlink w:history="1" r:id="rIdyn9y7pq8y8mldtfwiyevv">
+      <w:hyperlink w:history="1" r:id="rIdwxwdiu3gaos37pjji5gbc">
         <w:r>
           <w:rPr>
             <w:rFonts w:ascii="Arial" w:cs="Arial" w:eastAsia="Arial" w:hAnsi="Arial"/>
@@ -189,7 +189,7 @@
         </w:rPr>
         <w:t xml:space="preserve"> | </w:t>
       </w:r>
-      <w:hyperlink w:history="1" r:id="rIdd59xwfcckalmd6t_nemtz">
+      <w:hyperlink w:history="1" r:id="rIdzpy2wfstoh6ksohvn-bzg">
         <w:r>
           <w:rPr>
             <w:rFonts w:ascii="Arial" w:cs="Arial" w:eastAsia="Arial" w:hAnsi="Arial"/>
@@ -352,7 +352,7 @@
         </w:rPr>
         <w:t xml:space="preserve"> | </w:t>
       </w:r>
-      <w:hyperlink w:history="1" r:id="rId3ezbyfvchvustulkywbvh">
+      <w:hyperlink w:history="1" r:id="rIdszzz-zgnuqisfvdzkbxiz">
         <w:r>
           <w:rPr>
             <w:rFonts w:ascii="Arial" w:cs="Arial" w:eastAsia="Arial" w:hAnsi="Arial"/>
@@ -750,7 +750,7 @@
         </w:rPr>
         <w:t xml:space="preserve"> | </w:t>
       </w:r>
-      <w:hyperlink w:history="1" r:id="rIdk9ktadup-e1ao4izdrfsw">
+      <w:hyperlink w:history="1" r:id="rIdonnhpon6w2ifjuvwsckha">
         <w:r>
           <w:rPr>
             <w:rFonts w:ascii="Arial" w:cs="Arial" w:eastAsia="Arial" w:hAnsi="Arial"/>
@@ -1021,7 +1021,7 @@
         </w:rPr>
         <w:t xml:space="preserve"> | </w:t>
       </w:r>
-      <w:hyperlink w:history="1" r:id="rId3zaqe24-vvo_zluqvhzdt">
+      <w:hyperlink w:history="1" r:id="rIdglh_pyinyf0b3qkwunj0q">
         <w:r>
           <w:rPr>
             <w:rFonts w:ascii="Arial" w:cs="Arial" w:eastAsia="Arial" w:hAnsi="Arial"/>
@@ -1042,7 +1042,7 @@
         </w:rPr>
         <w:t xml:space="preserve"> | </w:t>
       </w:r>
-      <w:hyperlink w:history="1" r:id="rIdd8tsv0sy9pathh4kco6jb">
+      <w:hyperlink w:history="1" r:id="rIdvglipaewsecdvve_0ok_a">
         <w:r>
           <w:rPr>
             <w:rFonts w:ascii="Arial" w:cs="Arial" w:eastAsia="Arial" w:hAnsi="Arial"/>
@@ -1164,7 +1164,7 @@
         </w:rPr>
         <w:t xml:space="preserve"> | </w:t>
       </w:r>
-      <w:hyperlink w:history="1" r:id="rIdtnmk-3lvwlyyjji-rrqnu">
+      <w:hyperlink w:history="1" r:id="rIdwsmpvetsnm25j3lskpthz">
         <w:r>
           <w:rPr>
             <w:rFonts w:ascii="Arial" w:cs="Arial" w:eastAsia="Arial" w:hAnsi="Arial"/>
@@ -1185,7 +1185,7 @@
         </w:rPr>
         <w:t xml:space="preserve"> | </w:t>
       </w:r>
-      <w:hyperlink w:history="1" r:id="rIddspfwiwhwlll9ahjjy5fj">
+      <w:hyperlink w:history="1" r:id="rIdvqziot5xtbzzrode2kncn">
         <w:r>
           <w:rPr>
             <w:rFonts w:ascii="Arial" w:cs="Arial" w:eastAsia="Arial" w:hAnsi="Arial"/>
@@ -1206,7 +1206,7 @@
         </w:rPr>
         <w:t xml:space="preserve"> | </w:t>
       </w:r>
-      <w:hyperlink w:history="1" r:id="rIdnbjqghves1lyxdwbjhy-b">
+      <w:hyperlink w:history="1" r:id="rIdvwc3ktwatorpe1ijgmnh4">
         <w:r>
           <w:rPr>
             <w:rFonts w:ascii="Arial" w:cs="Arial" w:eastAsia="Arial" w:hAnsi="Arial"/>
@@ -1263,26 +1263,26 @@
           <w:sz w:val="20"/>
           <w:szCs w:val="20"/>
         </w:rPr>
-        <w:t xml:space="preserve">Implemented daily Pandera-validated NBA ETL plus DuckDB, SQLite, Parquet, and CSV exports.</w:t>
-      </w:r>
-    </w:p>
-    <w:p>
-      <w:pPr>
-        <w:pStyle w:val="ListParagraph"/>
-        <w:numPr>
-          <w:ilvl w:val="0"/>
-          <w:numId w:val="1"/>
-        </w:numPr>
-        <w:spacing w:after="35"/>
-      </w:pPr>
-      <w:r>
-        <w:rPr>
-          <w:rFonts w:ascii="Arial" w:cs="Arial" w:eastAsia="Arial" w:hAnsi="Arial"/>
-          <w:color w:val="0F172A"/>
-          <w:sz w:val="20"/>
-          <w:szCs w:val="20"/>
-        </w:rPr>
-        <w:t xml:space="preserve">Building the next-generation nbadb rebuild with 152 extractor wrappers and 204 generated public star-schema outputs.</w:t>
+        <w:t xml:space="preserve">Implemented Pandera-validated NBA API ETL with daily warehouse updates plus DuckDB, SQLite, Parquet, and CSV exports.</w:t>
+      </w:r>
+    </w:p>
+    <w:p>
+      <w:pPr>
+        <w:pStyle w:val="ListParagraph"/>
+        <w:numPr>
+          <w:ilvl w:val="0"/>
+          <w:numId w:val="1"/>
+        </w:numPr>
+        <w:spacing w:after="35"/>
+      </w:pPr>
+      <w:r>
+        <w:rPr>
+          <w:rFonts w:ascii="Arial" w:cs="Arial" w:eastAsia="Arial" w:hAnsi="Arial"/>
+          <w:color w:val="0F172A"/>
+          <w:sz w:val="20"/>
+          <w:szCs w:val="20"/>
+        </w:rPr>
+        <w:t xml:space="preserve">Building the next-generation nbadb rebuild with 152 extractor wrappers and 204 generated public star-schema outputs across docs, schema references, and release workflows.</w:t>
       </w:r>
     </w:p>
     <w:p>
@@ -1328,7 +1328,7 @@
         </w:rPr>
         <w:t xml:space="preserve"> | </w:t>
       </w:r>
-      <w:hyperlink w:history="1" r:id="rIdteptibd97pfqmxzremml0">
+      <w:hyperlink w:history="1" r:id="rIdi1ri9guvciluaqh_uamx8">
         <w:r>
           <w:rPr>
             <w:rFonts w:ascii="Arial" w:cs="Arial" w:eastAsia="Arial" w:hAnsi="Arial"/>
@@ -1349,7 +1349,7 @@
         </w:rPr>
         <w:t xml:space="preserve"> | </w:t>
       </w:r>
-      <w:hyperlink w:history="1" r:id="rIddbclh7eu6iwg9dqbdxtb0">
+      <w:hyperlink w:history="1" r:id="rIdks7sxjs-oheswvbroy5eg">
         <w:r>
           <w:rPr>
             <w:rFonts w:ascii="Arial" w:cs="Arial" w:eastAsia="Arial" w:hAnsi="Arial"/>
@@ -1425,7 +1425,7 @@
           <w:sz w:val="20"/>
           <w:szCs w:val="20"/>
         </w:rPr>
-        <w:t xml:space="preserve">Built self-healing validation across 100+ proxy sources with circuit breakers, auto-ejection, recovery promotion, and workflow-specific health scoring.</w:t>
+        <w:t xml:space="preserve">Built self-healing validation across 100+ proxy sources with circuit breakers, auto-ejection, recovery promotion, and five interfaces for different scraping workflows.</w:t>
       </w:r>
     </w:p>
     <w:p>
@@ -1471,7 +1471,7 @@
         </w:rPr>
         <w:t xml:space="preserve"> | </w:t>
       </w:r>
-      <w:hyperlink w:history="1" r:id="rId8fsuu7bb-kttkvj5k0vgb">
+      <w:hyperlink w:history="1" r:id="rIdbvazky-ir-rvt0cwe133b">
         <w:r>
           <w:rPr>
             <w:rFonts w:ascii="Arial" w:cs="Arial" w:eastAsia="Arial" w:hAnsi="Arial"/>
@@ -1492,7 +1492,7 @@
         </w:rPr>
         <w:t xml:space="preserve"> | </w:t>
       </w:r>
-      <w:hyperlink w:history="1" r:id="rIda0t6tavgf_l0rot3l4zyz">
+      <w:hyperlink w:history="1" r:id="rIdps8ilfpv9m7axhwaedpfh">
         <w:r>
           <w:rPr>
             <w:rFonts w:ascii="Arial" w:cs="Arial" w:eastAsia="Arial" w:hAnsi="Arial"/>
@@ -1614,7 +1614,7 @@
         </w:rPr>
         <w:t xml:space="preserve"> | </w:t>
       </w:r>
-      <w:hyperlink w:history="1" r:id="rIdn_wgqqhueyecmvooxk5w3">
+      <w:hyperlink w:history="1" r:id="rIdahxha3zhqsyewqhv0diyi">
         <w:r>
           <w:rPr>
             <w:rFonts w:ascii="Arial" w:cs="Arial" w:eastAsia="Arial" w:hAnsi="Arial"/>
@@ -1635,7 +1635,7 @@
         </w:rPr>
         <w:t xml:space="preserve"> | </w:t>
       </w:r>
-      <w:hyperlink w:history="1" r:id="rIdma0oki1slkjvxuywyvrdz">
+      <w:hyperlink w:history="1" r:id="rIdzv_ftl5yzvvmw-sb2xfyv">
         <w:r>
           <w:rPr>
             <w:rFonts w:ascii="Arial" w:cs="Arial" w:eastAsia="Arial" w:hAnsi="Arial"/>
@@ -1757,7 +1757,7 @@
         </w:rPr>
         <w:t xml:space="preserve"> | </w:t>
       </w:r>
-      <w:hyperlink w:history="1" r:id="rIdfav-bro8dzbljwc7vtobg">
+      <w:hyperlink w:history="1" r:id="rIdfa4g5w9kxyyp0w9r7hu4c">
         <w:r>
           <w:rPr>
             <w:rFonts w:ascii="Arial" w:cs="Arial" w:eastAsia="Arial" w:hAnsi="Arial"/>
@@ -1778,7 +1778,7 @@
         </w:rPr>
         <w:t xml:space="preserve"> | </w:t>
       </w:r>
-      <w:hyperlink w:history="1" r:id="rIdeyrxbptmsc8hojqdjrlob">
+      <w:hyperlink w:history="1" r:id="rIdmpwjslw-zzhr8vcw9owyy">
         <w:r>
           <w:rPr>
             <w:rFonts w:ascii="Arial" w:cs="Arial" w:eastAsia="Arial" w:hAnsi="Arial"/>
@@ -1913,7 +1913,7 @@
       <w:pPr>
         <w:spacing w:after="25"/>
       </w:pPr>
-      <w:hyperlink w:history="1" r:id="rIdkzzch6oj4xjofpu8qgcte">
+      <w:hyperlink w:history="1" r:id="rIddhmvz1efb03ycb6bwez1y">
         <w:r>
           <w:rPr>
             <w:rFonts w:ascii="Arial" w:cs="Arial" w:eastAsia="Arial" w:hAnsi="Arial"/>
@@ -1969,7 +1969,7 @@
       <w:pPr>
         <w:spacing w:after="25"/>
       </w:pPr>
-      <w:hyperlink w:history="1" r:id="rIdytkn94zflsuif0jk4xrkw">
+      <w:hyperlink w:history="1" r:id="rIde3fhqgfhsmpoyzopi8euo">
         <w:r>
           <w:rPr>
             <w:rFonts w:ascii="Arial" w:cs="Arial" w:eastAsia="Arial" w:hAnsi="Arial"/>
@@ -2000,7 +2000,7 @@
       <w:pPr>
         <w:spacing w:after="35"/>
       </w:pPr>
-      <w:hyperlink w:history="1" r:id="rIdlbjo4_u0zgti8gh1edixg">
+      <w:hyperlink w:history="1" r:id="rIdm0xqrake-qt89bhogbazj">
         <w:r>
           <w:rPr>
             <w:rFonts w:ascii="Arial" w:cs="Arial" w:eastAsia="Arial" w:hAnsi="Arial"/>
@@ -2049,7 +2049,7 @@
       <w:pPr>
         <w:spacing w:after="35"/>
       </w:pPr>
-      <w:hyperlink w:history="1" r:id="rIdyp_v_u3jq116u3fwjgvdt">
+      <w:hyperlink w:history="1" r:id="rId3z5ze0f4p-4sr-fakzjnj">
         <w:r>
           <w:rPr>
             <w:rFonts w:ascii="Arial" w:cs="Arial" w:eastAsia="Arial" w:hAnsi="Arial"/>

</xml_diff>

<commit_message>
fix: scope artifact cleanliness check
</commit_message>
<xml_diff>
--- a/public/downloads/wyatt-walsh-resume-full.docx
+++ b/public/downloads/wyatt-walsh-resume-full.docx
@@ -7,7 +7,7 @@
         <w:pStyle w:val="Title"/>
         <w:spacing w:after="75"/>
       </w:pPr>
-      <w:hyperlink w:history="1" r:id="rId885yfdnxulqhuzhutqxzd">
+      <w:hyperlink w:history="1" r:id="rIdykwnm4ct0mi2-lch8hcpx">
         <w:r>
           <w:rPr>
             <w:rFonts w:ascii="Arial" w:cs="Arial" w:eastAsia="Arial" w:hAnsi="Arial"/>
@@ -40,7 +40,7 @@
       <w:pPr>
         <w:spacing w:after="100"/>
       </w:pPr>
-      <w:hyperlink w:history="1" r:id="rIdeuaqaoyycueylmejgzpzl">
+      <w:hyperlink w:history="1" r:id="rIdhwosb4bhza-1mirfmodu-">
         <w:r>
           <w:rPr>
             <w:rFonts w:ascii="Arial" w:cs="Arial" w:eastAsia="Arial" w:hAnsi="Arial"/>
@@ -61,7 +61,7 @@
         </w:rPr>
         <w:t xml:space="preserve"> | </w:t>
       </w:r>
-      <w:hyperlink w:history="1" r:id="rIdm0d7zbeoyanhho6xqgvab">
+      <w:hyperlink w:history="1" r:id="rIdg3jggfmq8unlewypm9oxo">
         <w:r>
           <w:rPr>
             <w:rFonts w:ascii="Arial" w:cs="Arial" w:eastAsia="Arial" w:hAnsi="Arial"/>
@@ -100,7 +100,7 @@
         </w:rPr>
         <w:t xml:space="preserve"> | </w:t>
       </w:r>
-      <w:hyperlink w:history="1" r:id="rId6opbsljvqd519tpkb3d1b">
+      <w:hyperlink w:history="1" r:id="rIdjrk9xi7swgrueb9rrevd3">
         <w:r>
           <w:rPr>
             <w:rFonts w:ascii="Arial" w:cs="Arial" w:eastAsia="Arial" w:hAnsi="Arial"/>
@@ -121,7 +121,7 @@
         </w:rPr>
         <w:t xml:space="preserve"> | </w:t>
       </w:r>
-      <w:hyperlink w:history="1" r:id="rIdwxwdiu3gaos37pjji5gbc">
+      <w:hyperlink w:history="1" r:id="rIdqm1cu5jpif_r-g0momrso">
         <w:r>
           <w:rPr>
             <w:rFonts w:ascii="Arial" w:cs="Arial" w:eastAsia="Arial" w:hAnsi="Arial"/>
@@ -189,7 +189,7 @@
         </w:rPr>
         <w:t xml:space="preserve"> | </w:t>
       </w:r>
-      <w:hyperlink w:history="1" r:id="rIdzpy2wfstoh6ksohvn-bzg">
+      <w:hyperlink w:history="1" r:id="rIdyceczro3d2opeliobov4j">
         <w:r>
           <w:rPr>
             <w:rFonts w:ascii="Arial" w:cs="Arial" w:eastAsia="Arial" w:hAnsi="Arial"/>
@@ -352,7 +352,7 @@
         </w:rPr>
         <w:t xml:space="preserve"> | </w:t>
       </w:r>
-      <w:hyperlink w:history="1" r:id="rIdszzz-zgnuqisfvdzkbxiz">
+      <w:hyperlink w:history="1" r:id="rIdb6z_8dfsleyd0xddybr7r">
         <w:r>
           <w:rPr>
             <w:rFonts w:ascii="Arial" w:cs="Arial" w:eastAsia="Arial" w:hAnsi="Arial"/>
@@ -750,7 +750,7 @@
         </w:rPr>
         <w:t xml:space="preserve"> | </w:t>
       </w:r>
-      <w:hyperlink w:history="1" r:id="rIdonnhpon6w2ifjuvwsckha">
+      <w:hyperlink w:history="1" r:id="rIdhxzy4mfzsxwci2jlu-z76">
         <w:r>
           <w:rPr>
             <w:rFonts w:ascii="Arial" w:cs="Arial" w:eastAsia="Arial" w:hAnsi="Arial"/>
@@ -1021,7 +1021,7 @@
         </w:rPr>
         <w:t xml:space="preserve"> | </w:t>
       </w:r>
-      <w:hyperlink w:history="1" r:id="rIdglh_pyinyf0b3qkwunj0q">
+      <w:hyperlink w:history="1" r:id="rIdmg87x1-iddhmi9ffa9vpe">
         <w:r>
           <w:rPr>
             <w:rFonts w:ascii="Arial" w:cs="Arial" w:eastAsia="Arial" w:hAnsi="Arial"/>
@@ -1042,7 +1042,7 @@
         </w:rPr>
         <w:t xml:space="preserve"> | </w:t>
       </w:r>
-      <w:hyperlink w:history="1" r:id="rIdvglipaewsecdvve_0ok_a">
+      <w:hyperlink w:history="1" r:id="rIddwmk9f2i9jq66xdtkxpmp">
         <w:r>
           <w:rPr>
             <w:rFonts w:ascii="Arial" w:cs="Arial" w:eastAsia="Arial" w:hAnsi="Arial"/>
@@ -1164,7 +1164,7 @@
         </w:rPr>
         <w:t xml:space="preserve"> | </w:t>
       </w:r>
-      <w:hyperlink w:history="1" r:id="rIdwsmpvetsnm25j3lskpthz">
+      <w:hyperlink w:history="1" r:id="rIde47wve6irvhcoitc5chhr">
         <w:r>
           <w:rPr>
             <w:rFonts w:ascii="Arial" w:cs="Arial" w:eastAsia="Arial" w:hAnsi="Arial"/>
@@ -1185,7 +1185,7 @@
         </w:rPr>
         <w:t xml:space="preserve"> | </w:t>
       </w:r>
-      <w:hyperlink w:history="1" r:id="rIdvqziot5xtbzzrode2kncn">
+      <w:hyperlink w:history="1" r:id="rIdkqnh1r8jwtscypezomi5f">
         <w:r>
           <w:rPr>
             <w:rFonts w:ascii="Arial" w:cs="Arial" w:eastAsia="Arial" w:hAnsi="Arial"/>
@@ -1206,7 +1206,7 @@
         </w:rPr>
         <w:t xml:space="preserve"> | </w:t>
       </w:r>
-      <w:hyperlink w:history="1" r:id="rIdvwc3ktwatorpe1ijgmnh4">
+      <w:hyperlink w:history="1" r:id="rId3tazmjegubpy3wq8densn">
         <w:r>
           <w:rPr>
             <w:rFonts w:ascii="Arial" w:cs="Arial" w:eastAsia="Arial" w:hAnsi="Arial"/>
@@ -1328,7 +1328,7 @@
         </w:rPr>
         <w:t xml:space="preserve"> | </w:t>
       </w:r>
-      <w:hyperlink w:history="1" r:id="rIdi1ri9guvciluaqh_uamx8">
+      <w:hyperlink w:history="1" r:id="rIdpndlqh89e1ct0d6ndzj1d">
         <w:r>
           <w:rPr>
             <w:rFonts w:ascii="Arial" w:cs="Arial" w:eastAsia="Arial" w:hAnsi="Arial"/>
@@ -1349,7 +1349,7 @@
         </w:rPr>
         <w:t xml:space="preserve"> | </w:t>
       </w:r>
-      <w:hyperlink w:history="1" r:id="rIdks7sxjs-oheswvbroy5eg">
+      <w:hyperlink w:history="1" r:id="rIdokllrmdoizck7vlwjnpyk">
         <w:r>
           <w:rPr>
             <w:rFonts w:ascii="Arial" w:cs="Arial" w:eastAsia="Arial" w:hAnsi="Arial"/>
@@ -1471,7 +1471,7 @@
         </w:rPr>
         <w:t xml:space="preserve"> | </w:t>
       </w:r>
-      <w:hyperlink w:history="1" r:id="rIdbvazky-ir-rvt0cwe133b">
+      <w:hyperlink w:history="1" r:id="rIdurakyjhlg3anrpjpd0o04">
         <w:r>
           <w:rPr>
             <w:rFonts w:ascii="Arial" w:cs="Arial" w:eastAsia="Arial" w:hAnsi="Arial"/>
@@ -1492,7 +1492,7 @@
         </w:rPr>
         <w:t xml:space="preserve"> | </w:t>
       </w:r>
-      <w:hyperlink w:history="1" r:id="rIdps8ilfpv9m7axhwaedpfh">
+      <w:hyperlink w:history="1" r:id="rIdy4we-qbunpsvn0qaazxef">
         <w:r>
           <w:rPr>
             <w:rFonts w:ascii="Arial" w:cs="Arial" w:eastAsia="Arial" w:hAnsi="Arial"/>
@@ -1614,7 +1614,7 @@
         </w:rPr>
         <w:t xml:space="preserve"> | </w:t>
       </w:r>
-      <w:hyperlink w:history="1" r:id="rIdahxha3zhqsyewqhv0diyi">
+      <w:hyperlink w:history="1" r:id="rIdw8pb_udjwfmh1oy7nzgak">
         <w:r>
           <w:rPr>
             <w:rFonts w:ascii="Arial" w:cs="Arial" w:eastAsia="Arial" w:hAnsi="Arial"/>
@@ -1635,7 +1635,7 @@
         </w:rPr>
         <w:t xml:space="preserve"> | </w:t>
       </w:r>
-      <w:hyperlink w:history="1" r:id="rIdzv_ftl5yzvvmw-sb2xfyv">
+      <w:hyperlink w:history="1" r:id="rId43px9ctatodgf18zqgdep">
         <w:r>
           <w:rPr>
             <w:rFonts w:ascii="Arial" w:cs="Arial" w:eastAsia="Arial" w:hAnsi="Arial"/>
@@ -1757,7 +1757,7 @@
         </w:rPr>
         <w:t xml:space="preserve"> | </w:t>
       </w:r>
-      <w:hyperlink w:history="1" r:id="rIdfa4g5w9kxyyp0w9r7hu4c">
+      <w:hyperlink w:history="1" r:id="rIdt8rr7o0hol9agyd5n7kq0">
         <w:r>
           <w:rPr>
             <w:rFonts w:ascii="Arial" w:cs="Arial" w:eastAsia="Arial" w:hAnsi="Arial"/>
@@ -1778,7 +1778,7 @@
         </w:rPr>
         <w:t xml:space="preserve"> | </w:t>
       </w:r>
-      <w:hyperlink w:history="1" r:id="rIdmpwjslw-zzhr8vcw9owyy">
+      <w:hyperlink w:history="1" r:id="rIdu3ot3xfa2gnuonqastkmp">
         <w:r>
           <w:rPr>
             <w:rFonts w:ascii="Arial" w:cs="Arial" w:eastAsia="Arial" w:hAnsi="Arial"/>
@@ -1913,7 +1913,7 @@
       <w:pPr>
         <w:spacing w:after="25"/>
       </w:pPr>
-      <w:hyperlink w:history="1" r:id="rIddhmvz1efb03ycb6bwez1y">
+      <w:hyperlink w:history="1" r:id="rIdmcxml9wkupb0ulwo8xo_q">
         <w:r>
           <w:rPr>
             <w:rFonts w:ascii="Arial" w:cs="Arial" w:eastAsia="Arial" w:hAnsi="Arial"/>
@@ -1969,7 +1969,7 @@
       <w:pPr>
         <w:spacing w:after="25"/>
       </w:pPr>
-      <w:hyperlink w:history="1" r:id="rIde3fhqgfhsmpoyzopi8euo">
+      <w:hyperlink w:history="1" r:id="rId9rwtv2k8ouluct2r_o9xd">
         <w:r>
           <w:rPr>
             <w:rFonts w:ascii="Arial" w:cs="Arial" w:eastAsia="Arial" w:hAnsi="Arial"/>
@@ -2000,7 +2000,7 @@
       <w:pPr>
         <w:spacing w:after="35"/>
       </w:pPr>
-      <w:hyperlink w:history="1" r:id="rIdm0xqrake-qt89bhogbazj">
+      <w:hyperlink w:history="1" r:id="rIdckozktlvzyw_gkxofty4u">
         <w:r>
           <w:rPr>
             <w:rFonts w:ascii="Arial" w:cs="Arial" w:eastAsia="Arial" w:hAnsi="Arial"/>
@@ -2049,7 +2049,7 @@
       <w:pPr>
         <w:spacing w:after="35"/>
       </w:pPr>
-      <w:hyperlink w:history="1" r:id="rId3z5ze0f4p-4sr-fakzjnj">
+      <w:hyperlink w:history="1" r:id="rIduzjjswkhvolh_eeqass39">
         <w:r>
           <w:rPr>
             <w:rFonts w:ascii="Arial" w:cs="Arial" w:eastAsia="Arial" w:hAnsi="Arial"/>

</xml_diff>

<commit_message>
chore: sync resume download artifacts
</commit_message>
<xml_diff>
--- a/public/downloads/wyatt-walsh-resume-full.docx
+++ b/public/downloads/wyatt-walsh-resume-full.docx
@@ -7,7 +7,7 @@
         <w:pStyle w:val="Title"/>
         <w:spacing w:after="75"/>
       </w:pPr>
-      <w:hyperlink w:history="1" r:id="rIdykwnm4ct0mi2-lch8hcpx">
+      <w:hyperlink w:history="1" r:id="rIdtoycu1ezxjtlxrptqkshg">
         <w:r>
           <w:rPr>
             <w:rFonts w:ascii="Arial" w:cs="Arial" w:eastAsia="Arial" w:hAnsi="Arial"/>
@@ -40,7 +40,7 @@
       <w:pPr>
         <w:spacing w:after="100"/>
       </w:pPr>
-      <w:hyperlink w:history="1" r:id="rIdhwosb4bhza-1mirfmodu-">
+      <w:hyperlink w:history="1" r:id="rIdvpumwfho5uynz8tc9igo6">
         <w:r>
           <w:rPr>
             <w:rFonts w:ascii="Arial" w:cs="Arial" w:eastAsia="Arial" w:hAnsi="Arial"/>
@@ -61,7 +61,7 @@
         </w:rPr>
         <w:t xml:space="preserve"> | </w:t>
       </w:r>
-      <w:hyperlink w:history="1" r:id="rIdg3jggfmq8unlewypm9oxo">
+      <w:hyperlink w:history="1" r:id="rIdrz7ynibyekj-s1dxqrftv">
         <w:r>
           <w:rPr>
             <w:rFonts w:ascii="Arial" w:cs="Arial" w:eastAsia="Arial" w:hAnsi="Arial"/>
@@ -100,7 +100,7 @@
         </w:rPr>
         <w:t xml:space="preserve"> | </w:t>
       </w:r>
-      <w:hyperlink w:history="1" r:id="rIdjrk9xi7swgrueb9rrevd3">
+      <w:hyperlink w:history="1" r:id="rId7nhy-rrydmkn-mdc9qs-x">
         <w:r>
           <w:rPr>
             <w:rFonts w:ascii="Arial" w:cs="Arial" w:eastAsia="Arial" w:hAnsi="Arial"/>
@@ -121,7 +121,7 @@
         </w:rPr>
         <w:t xml:space="preserve"> | </w:t>
       </w:r>
-      <w:hyperlink w:history="1" r:id="rIdqm1cu5jpif_r-g0momrso">
+      <w:hyperlink w:history="1" r:id="rIdozrqhru5cjeogqdx-sy74">
         <w:r>
           <w:rPr>
             <w:rFonts w:ascii="Arial" w:cs="Arial" w:eastAsia="Arial" w:hAnsi="Arial"/>
@@ -189,7 +189,7 @@
         </w:rPr>
         <w:t xml:space="preserve"> | </w:t>
       </w:r>
-      <w:hyperlink w:history="1" r:id="rIdyceczro3d2opeliobov4j">
+      <w:hyperlink w:history="1" r:id="rIdityd9p2pflccfigs_rxfp">
         <w:r>
           <w:rPr>
             <w:rFonts w:ascii="Arial" w:cs="Arial" w:eastAsia="Arial" w:hAnsi="Arial"/>
@@ -352,7 +352,7 @@
         </w:rPr>
         <w:t xml:space="preserve"> | </w:t>
       </w:r>
-      <w:hyperlink w:history="1" r:id="rIdb6z_8dfsleyd0xddybr7r">
+      <w:hyperlink w:history="1" r:id="rId41t6hhqcu6wc7oa4-8gdm">
         <w:r>
           <w:rPr>
             <w:rFonts w:ascii="Arial" w:cs="Arial" w:eastAsia="Arial" w:hAnsi="Arial"/>
@@ -750,7 +750,7 @@
         </w:rPr>
         <w:t xml:space="preserve"> | </w:t>
       </w:r>
-      <w:hyperlink w:history="1" r:id="rIdhxzy4mfzsxwci2jlu-z76">
+      <w:hyperlink w:history="1" r:id="rId_vr3ykv2ni8kclqdrzliv">
         <w:r>
           <w:rPr>
             <w:rFonts w:ascii="Arial" w:cs="Arial" w:eastAsia="Arial" w:hAnsi="Arial"/>
@@ -1021,7 +1021,7 @@
         </w:rPr>
         <w:t xml:space="preserve"> | </w:t>
       </w:r>
-      <w:hyperlink w:history="1" r:id="rIdmg87x1-iddhmi9ffa9vpe">
+      <w:hyperlink w:history="1" r:id="rIddy_xglijjflkwe9a5e49d">
         <w:r>
           <w:rPr>
             <w:rFonts w:ascii="Arial" w:cs="Arial" w:eastAsia="Arial" w:hAnsi="Arial"/>
@@ -1042,7 +1042,7 @@
         </w:rPr>
         <w:t xml:space="preserve"> | </w:t>
       </w:r>
-      <w:hyperlink w:history="1" r:id="rIddwmk9f2i9jq66xdtkxpmp">
+      <w:hyperlink w:history="1" r:id="rIdm_afuiruoqczf8kzj4g-j">
         <w:r>
           <w:rPr>
             <w:rFonts w:ascii="Arial" w:cs="Arial" w:eastAsia="Arial" w:hAnsi="Arial"/>
@@ -1164,7 +1164,7 @@
         </w:rPr>
         <w:t xml:space="preserve"> | </w:t>
       </w:r>
-      <w:hyperlink w:history="1" r:id="rIde47wve6irvhcoitc5chhr">
+      <w:hyperlink w:history="1" r:id="rIdc69r3sxhzoxcnki2pw-ch">
         <w:r>
           <w:rPr>
             <w:rFonts w:ascii="Arial" w:cs="Arial" w:eastAsia="Arial" w:hAnsi="Arial"/>
@@ -1185,7 +1185,7 @@
         </w:rPr>
         <w:t xml:space="preserve"> | </w:t>
       </w:r>
-      <w:hyperlink w:history="1" r:id="rIdkqnh1r8jwtscypezomi5f">
+      <w:hyperlink w:history="1" r:id="rIdkvixhykpyxnvh7u6dt6gj">
         <w:r>
           <w:rPr>
             <w:rFonts w:ascii="Arial" w:cs="Arial" w:eastAsia="Arial" w:hAnsi="Arial"/>
@@ -1206,7 +1206,7 @@
         </w:rPr>
         <w:t xml:space="preserve"> | </w:t>
       </w:r>
-      <w:hyperlink w:history="1" r:id="rId3tazmjegubpy3wq8densn">
+      <w:hyperlink w:history="1" r:id="rIdpjwezcwgort-jmr9v78ec">
         <w:r>
           <w:rPr>
             <w:rFonts w:ascii="Arial" w:cs="Arial" w:eastAsia="Arial" w:hAnsi="Arial"/>
@@ -1328,7 +1328,7 @@
         </w:rPr>
         <w:t xml:space="preserve"> | </w:t>
       </w:r>
-      <w:hyperlink w:history="1" r:id="rIdpndlqh89e1ct0d6ndzj1d">
+      <w:hyperlink w:history="1" r:id="rIdp8a9o571lvvbjch0u9c7b">
         <w:r>
           <w:rPr>
             <w:rFonts w:ascii="Arial" w:cs="Arial" w:eastAsia="Arial" w:hAnsi="Arial"/>
@@ -1349,7 +1349,7 @@
         </w:rPr>
         <w:t xml:space="preserve"> | </w:t>
       </w:r>
-      <w:hyperlink w:history="1" r:id="rIdokllrmdoizck7vlwjnpyk">
+      <w:hyperlink w:history="1" r:id="rIdb8mdi_kc7gez0kauma7rt">
         <w:r>
           <w:rPr>
             <w:rFonts w:ascii="Arial" w:cs="Arial" w:eastAsia="Arial" w:hAnsi="Arial"/>
@@ -1471,7 +1471,7 @@
         </w:rPr>
         <w:t xml:space="preserve"> | </w:t>
       </w:r>
-      <w:hyperlink w:history="1" r:id="rIdurakyjhlg3anrpjpd0o04">
+      <w:hyperlink w:history="1" r:id="rId8ntnlci_gy1riu2tv2r-o">
         <w:r>
           <w:rPr>
             <w:rFonts w:ascii="Arial" w:cs="Arial" w:eastAsia="Arial" w:hAnsi="Arial"/>
@@ -1492,7 +1492,7 @@
         </w:rPr>
         <w:t xml:space="preserve"> | </w:t>
       </w:r>
-      <w:hyperlink w:history="1" r:id="rIdy4we-qbunpsvn0qaazxef">
+      <w:hyperlink w:history="1" r:id="rIdy5r932nulokrybaufp-8b">
         <w:r>
           <w:rPr>
             <w:rFonts w:ascii="Arial" w:cs="Arial" w:eastAsia="Arial" w:hAnsi="Arial"/>
@@ -1614,7 +1614,7 @@
         </w:rPr>
         <w:t xml:space="preserve"> | </w:t>
       </w:r>
-      <w:hyperlink w:history="1" r:id="rIdw8pb_udjwfmh1oy7nzgak">
+      <w:hyperlink w:history="1" r:id="rIdxn3ou_zy4vj3sambvodwu">
         <w:r>
           <w:rPr>
             <w:rFonts w:ascii="Arial" w:cs="Arial" w:eastAsia="Arial" w:hAnsi="Arial"/>
@@ -1635,7 +1635,7 @@
         </w:rPr>
         <w:t xml:space="preserve"> | </w:t>
       </w:r>
-      <w:hyperlink w:history="1" r:id="rId43px9ctatodgf18zqgdep">
+      <w:hyperlink w:history="1" r:id="rIddgkepaau9xu2p7je8yr56">
         <w:r>
           <w:rPr>
             <w:rFonts w:ascii="Arial" w:cs="Arial" w:eastAsia="Arial" w:hAnsi="Arial"/>
@@ -1757,7 +1757,7 @@
         </w:rPr>
         <w:t xml:space="preserve"> | </w:t>
       </w:r>
-      <w:hyperlink w:history="1" r:id="rIdt8rr7o0hol9agyd5n7kq0">
+      <w:hyperlink w:history="1" r:id="rIdiiz-yldl35khnhi-rozl1">
         <w:r>
           <w:rPr>
             <w:rFonts w:ascii="Arial" w:cs="Arial" w:eastAsia="Arial" w:hAnsi="Arial"/>
@@ -1778,7 +1778,7 @@
         </w:rPr>
         <w:t xml:space="preserve"> | </w:t>
       </w:r>
-      <w:hyperlink w:history="1" r:id="rIdu3ot3xfa2gnuonqastkmp">
+      <w:hyperlink w:history="1" r:id="rIdp-vpezwtwp-6qygbc4xsa">
         <w:r>
           <w:rPr>
             <w:rFonts w:ascii="Arial" w:cs="Arial" w:eastAsia="Arial" w:hAnsi="Arial"/>
@@ -1913,7 +1913,7 @@
       <w:pPr>
         <w:spacing w:after="25"/>
       </w:pPr>
-      <w:hyperlink w:history="1" r:id="rIdmcxml9wkupb0ulwo8xo_q">
+      <w:hyperlink w:history="1" r:id="rIdwxemcv-s1hoqgtekyq82w">
         <w:r>
           <w:rPr>
             <w:rFonts w:ascii="Arial" w:cs="Arial" w:eastAsia="Arial" w:hAnsi="Arial"/>
@@ -1969,7 +1969,7 @@
       <w:pPr>
         <w:spacing w:after="25"/>
       </w:pPr>
-      <w:hyperlink w:history="1" r:id="rId9rwtv2k8ouluct2r_o9xd">
+      <w:hyperlink w:history="1" r:id="rIdunfl3bnaqaoghmhlvnnh4">
         <w:r>
           <w:rPr>
             <w:rFonts w:ascii="Arial" w:cs="Arial" w:eastAsia="Arial" w:hAnsi="Arial"/>
@@ -2000,7 +2000,7 @@
       <w:pPr>
         <w:spacing w:after="35"/>
       </w:pPr>
-      <w:hyperlink w:history="1" r:id="rIdckozktlvzyw_gkxofty4u">
+      <w:hyperlink w:history="1" r:id="rIdnv1afg7ylyumbibospwsb">
         <w:r>
           <w:rPr>
             <w:rFonts w:ascii="Arial" w:cs="Arial" w:eastAsia="Arial" w:hAnsi="Arial"/>
@@ -2049,7 +2049,7 @@
       <w:pPr>
         <w:spacing w:after="35"/>
       </w:pPr>
-      <w:hyperlink w:history="1" r:id="rIduzjjswkhvolh_eeqass39">
+      <w:hyperlink w:history="1" r:id="rIdyloce3my0t4bjxpmr9i-t">
         <w:r>
           <w:rPr>
             <w:rFonts w:ascii="Arial" w:cs="Arial" w:eastAsia="Arial" w:hAnsi="Arial"/>

</xml_diff>

<commit_message>
fix: refine skill popover copy
</commit_message>
<xml_diff>
--- a/public/downloads/wyatt-walsh-resume-full.docx
+++ b/public/downloads/wyatt-walsh-resume-full.docx
@@ -7,7 +7,7 @@
         <w:pStyle w:val="Title"/>
         <w:spacing w:after="75"/>
       </w:pPr>
-      <w:hyperlink w:history="1" r:id="rIdtoycu1ezxjtlxrptqkshg">
+      <w:hyperlink w:history="1" r:id="rIdz7pcx_ht3iwtqlplcyzee">
         <w:r>
           <w:rPr>
             <w:rFonts w:ascii="Arial" w:cs="Arial" w:eastAsia="Arial" w:hAnsi="Arial"/>
@@ -40,7 +40,7 @@
       <w:pPr>
         <w:spacing w:after="100"/>
       </w:pPr>
-      <w:hyperlink w:history="1" r:id="rIdvpumwfho5uynz8tc9igo6">
+      <w:hyperlink w:history="1" r:id="rId3jl3sjdfwaghpmcuirb3n">
         <w:r>
           <w:rPr>
             <w:rFonts w:ascii="Arial" w:cs="Arial" w:eastAsia="Arial" w:hAnsi="Arial"/>
@@ -61,7 +61,7 @@
         </w:rPr>
         <w:t xml:space="preserve"> | </w:t>
       </w:r>
-      <w:hyperlink w:history="1" r:id="rIdrz7ynibyekj-s1dxqrftv">
+      <w:hyperlink w:history="1" r:id="rIdflqujnsynoap6unnwvljq">
         <w:r>
           <w:rPr>
             <w:rFonts w:ascii="Arial" w:cs="Arial" w:eastAsia="Arial" w:hAnsi="Arial"/>
@@ -100,7 +100,7 @@
         </w:rPr>
         <w:t xml:space="preserve"> | </w:t>
       </w:r>
-      <w:hyperlink w:history="1" r:id="rId7nhy-rrydmkn-mdc9qs-x">
+      <w:hyperlink w:history="1" r:id="rIdh278liu7viuldqwwpyy1u">
         <w:r>
           <w:rPr>
             <w:rFonts w:ascii="Arial" w:cs="Arial" w:eastAsia="Arial" w:hAnsi="Arial"/>
@@ -121,7 +121,7 @@
         </w:rPr>
         <w:t xml:space="preserve"> | </w:t>
       </w:r>
-      <w:hyperlink w:history="1" r:id="rIdozrqhru5cjeogqdx-sy74">
+      <w:hyperlink w:history="1" r:id="rIdegoiopihjl7ja31fouhni">
         <w:r>
           <w:rPr>
             <w:rFonts w:ascii="Arial" w:cs="Arial" w:eastAsia="Arial" w:hAnsi="Arial"/>
@@ -189,7 +189,7 @@
         </w:rPr>
         <w:t xml:space="preserve"> | </w:t>
       </w:r>
-      <w:hyperlink w:history="1" r:id="rIdityd9p2pflccfigs_rxfp">
+      <w:hyperlink w:history="1" r:id="rIdjrwipikfvvqku0ytxh3sn">
         <w:r>
           <w:rPr>
             <w:rFonts w:ascii="Arial" w:cs="Arial" w:eastAsia="Arial" w:hAnsi="Arial"/>
@@ -352,7 +352,7 @@
         </w:rPr>
         <w:t xml:space="preserve"> | </w:t>
       </w:r>
-      <w:hyperlink w:history="1" r:id="rId41t6hhqcu6wc7oa4-8gdm">
+      <w:hyperlink w:history="1" r:id="rIdvbdpltv4qebx3e_hz2zf2">
         <w:r>
           <w:rPr>
             <w:rFonts w:ascii="Arial" w:cs="Arial" w:eastAsia="Arial" w:hAnsi="Arial"/>
@@ -750,7 +750,7 @@
         </w:rPr>
         <w:t xml:space="preserve"> | </w:t>
       </w:r>
-      <w:hyperlink w:history="1" r:id="rId_vr3ykv2ni8kclqdrzliv">
+      <w:hyperlink w:history="1" r:id="rIdgxm3noep3uehnkosmwf2c">
         <w:r>
           <w:rPr>
             <w:rFonts w:ascii="Arial" w:cs="Arial" w:eastAsia="Arial" w:hAnsi="Arial"/>
@@ -1021,7 +1021,7 @@
         </w:rPr>
         <w:t xml:space="preserve"> | </w:t>
       </w:r>
-      <w:hyperlink w:history="1" r:id="rIddy_xglijjflkwe9a5e49d">
+      <w:hyperlink w:history="1" r:id="rIdosnxqioz3gl5jrl4pqwfj">
         <w:r>
           <w:rPr>
             <w:rFonts w:ascii="Arial" w:cs="Arial" w:eastAsia="Arial" w:hAnsi="Arial"/>
@@ -1042,7 +1042,7 @@
         </w:rPr>
         <w:t xml:space="preserve"> | </w:t>
       </w:r>
-      <w:hyperlink w:history="1" r:id="rIdm_afuiruoqczf8kzj4g-j">
+      <w:hyperlink w:history="1" r:id="rIdbatujvda-c_v7fvvndcvi">
         <w:r>
           <w:rPr>
             <w:rFonts w:ascii="Arial" w:cs="Arial" w:eastAsia="Arial" w:hAnsi="Arial"/>
@@ -1164,7 +1164,7 @@
         </w:rPr>
         <w:t xml:space="preserve"> | </w:t>
       </w:r>
-      <w:hyperlink w:history="1" r:id="rIdc69r3sxhzoxcnki2pw-ch">
+      <w:hyperlink w:history="1" r:id="rIdyr6vrorhjmvn0k2octyio">
         <w:r>
           <w:rPr>
             <w:rFonts w:ascii="Arial" w:cs="Arial" w:eastAsia="Arial" w:hAnsi="Arial"/>
@@ -1185,7 +1185,7 @@
         </w:rPr>
         <w:t xml:space="preserve"> | </w:t>
       </w:r>
-      <w:hyperlink w:history="1" r:id="rIdkvixhykpyxnvh7u6dt6gj">
+      <w:hyperlink w:history="1" r:id="rIdwfvt8e4jxaynh2puzhzsl">
         <w:r>
           <w:rPr>
             <w:rFonts w:ascii="Arial" w:cs="Arial" w:eastAsia="Arial" w:hAnsi="Arial"/>
@@ -1206,7 +1206,7 @@
         </w:rPr>
         <w:t xml:space="preserve"> | </w:t>
       </w:r>
-      <w:hyperlink w:history="1" r:id="rIdpjwezcwgort-jmr9v78ec">
+      <w:hyperlink w:history="1" r:id="rIdsy1-04a2wk9zht90pt3qv">
         <w:r>
           <w:rPr>
             <w:rFonts w:ascii="Arial" w:cs="Arial" w:eastAsia="Arial" w:hAnsi="Arial"/>
@@ -1328,7 +1328,7 @@
         </w:rPr>
         <w:t xml:space="preserve"> | </w:t>
       </w:r>
-      <w:hyperlink w:history="1" r:id="rIdp8a9o571lvvbjch0u9c7b">
+      <w:hyperlink w:history="1" r:id="rIdw5aps5ly9cpichxldmqbc">
         <w:r>
           <w:rPr>
             <w:rFonts w:ascii="Arial" w:cs="Arial" w:eastAsia="Arial" w:hAnsi="Arial"/>
@@ -1349,7 +1349,7 @@
         </w:rPr>
         <w:t xml:space="preserve"> | </w:t>
       </w:r>
-      <w:hyperlink w:history="1" r:id="rIdb8mdi_kc7gez0kauma7rt">
+      <w:hyperlink w:history="1" r:id="rIdxpdy0-tyvxpum8yt7ps5k">
         <w:r>
           <w:rPr>
             <w:rFonts w:ascii="Arial" w:cs="Arial" w:eastAsia="Arial" w:hAnsi="Arial"/>
@@ -1471,7 +1471,7 @@
         </w:rPr>
         <w:t xml:space="preserve"> | </w:t>
       </w:r>
-      <w:hyperlink w:history="1" r:id="rId8ntnlci_gy1riu2tv2r-o">
+      <w:hyperlink w:history="1" r:id="rIddldhjnyzr7f3b59nnx2ql">
         <w:r>
           <w:rPr>
             <w:rFonts w:ascii="Arial" w:cs="Arial" w:eastAsia="Arial" w:hAnsi="Arial"/>
@@ -1492,7 +1492,7 @@
         </w:rPr>
         <w:t xml:space="preserve"> | </w:t>
       </w:r>
-      <w:hyperlink w:history="1" r:id="rIdy5r932nulokrybaufp-8b">
+      <w:hyperlink w:history="1" r:id="rIdzq7aux5nriklv0f9wal8z">
         <w:r>
           <w:rPr>
             <w:rFonts w:ascii="Arial" w:cs="Arial" w:eastAsia="Arial" w:hAnsi="Arial"/>
@@ -1614,7 +1614,7 @@
         </w:rPr>
         <w:t xml:space="preserve"> | </w:t>
       </w:r>
-      <w:hyperlink w:history="1" r:id="rIdxn3ou_zy4vj3sambvodwu">
+      <w:hyperlink w:history="1" r:id="rIdznegsc0nfm8pvfylskyat">
         <w:r>
           <w:rPr>
             <w:rFonts w:ascii="Arial" w:cs="Arial" w:eastAsia="Arial" w:hAnsi="Arial"/>
@@ -1635,7 +1635,7 @@
         </w:rPr>
         <w:t xml:space="preserve"> | </w:t>
       </w:r>
-      <w:hyperlink w:history="1" r:id="rIddgkepaau9xu2p7je8yr56">
+      <w:hyperlink w:history="1" r:id="rIdmrnbiojetvjz_1hyjw4yn">
         <w:r>
           <w:rPr>
             <w:rFonts w:ascii="Arial" w:cs="Arial" w:eastAsia="Arial" w:hAnsi="Arial"/>
@@ -1757,7 +1757,7 @@
         </w:rPr>
         <w:t xml:space="preserve"> | </w:t>
       </w:r>
-      <w:hyperlink w:history="1" r:id="rIdiiz-yldl35khnhi-rozl1">
+      <w:hyperlink w:history="1" r:id="rIdexaqcefpxzwknfqp2fhcl">
         <w:r>
           <w:rPr>
             <w:rFonts w:ascii="Arial" w:cs="Arial" w:eastAsia="Arial" w:hAnsi="Arial"/>
@@ -1778,7 +1778,7 @@
         </w:rPr>
         <w:t xml:space="preserve"> | </w:t>
       </w:r>
-      <w:hyperlink w:history="1" r:id="rIdp-vpezwtwp-6qygbc4xsa">
+      <w:hyperlink w:history="1" r:id="rIdlcsymbpgo5mjuilvxakfq">
         <w:r>
           <w:rPr>
             <w:rFonts w:ascii="Arial" w:cs="Arial" w:eastAsia="Arial" w:hAnsi="Arial"/>
@@ -1913,7 +1913,7 @@
       <w:pPr>
         <w:spacing w:after="25"/>
       </w:pPr>
-      <w:hyperlink w:history="1" r:id="rIdwxemcv-s1hoqgtekyq82w">
+      <w:hyperlink w:history="1" r:id="rIdtgq6i4h6fjlcjjbq4tuxh">
         <w:r>
           <w:rPr>
             <w:rFonts w:ascii="Arial" w:cs="Arial" w:eastAsia="Arial" w:hAnsi="Arial"/>
@@ -1969,7 +1969,7 @@
       <w:pPr>
         <w:spacing w:after="25"/>
       </w:pPr>
-      <w:hyperlink w:history="1" r:id="rIdunfl3bnaqaoghmhlvnnh4">
+      <w:hyperlink w:history="1" r:id="rIdqfib6yiccpfjys9ievgxi">
         <w:r>
           <w:rPr>
             <w:rFonts w:ascii="Arial" w:cs="Arial" w:eastAsia="Arial" w:hAnsi="Arial"/>
@@ -2000,7 +2000,7 @@
       <w:pPr>
         <w:spacing w:after="35"/>
       </w:pPr>
-      <w:hyperlink w:history="1" r:id="rIdnv1afg7ylyumbibospwsb">
+      <w:hyperlink w:history="1" r:id="rId6ai04puo42yvnkewiu8sr">
         <w:r>
           <w:rPr>
             <w:rFonts w:ascii="Arial" w:cs="Arial" w:eastAsia="Arial" w:hAnsi="Arial"/>
@@ -2049,7 +2049,7 @@
       <w:pPr>
         <w:spacing w:after="35"/>
       </w:pPr>
-      <w:hyperlink w:history="1" r:id="rIdyloce3my0t4bjxpmr9i-t">
+      <w:hyperlink w:history="1" r:id="rIdpci1-zz6nhxqm9aepgojk">
         <w:r>
           <w:rPr>
             <w:rFonts w:ascii="Arial" w:cs="Arial" w:eastAsia="Arial" w:hAnsi="Arial"/>

</xml_diff>

<commit_message>
fix: correct project link labels
</commit_message>
<xml_diff>
--- a/public/downloads/wyatt-walsh-resume-full.docx
+++ b/public/downloads/wyatt-walsh-resume-full.docx
@@ -7,7 +7,7 @@
         <w:pStyle w:val="Title"/>
         <w:spacing w:after="75"/>
       </w:pPr>
-      <w:hyperlink w:history="1" r:id="rIdz7pcx_ht3iwtqlplcyzee">
+      <w:hyperlink w:history="1" r:id="rId8wl3e_ih0uh1dtah96cc9">
         <w:r>
           <w:rPr>
             <w:rFonts w:ascii="Arial" w:cs="Arial" w:eastAsia="Arial" w:hAnsi="Arial"/>
@@ -40,7 +40,7 @@
       <w:pPr>
         <w:spacing w:after="100"/>
       </w:pPr>
-      <w:hyperlink w:history="1" r:id="rId3jl3sjdfwaghpmcuirb3n">
+      <w:hyperlink w:history="1" r:id="rIddyb-ueozfgtk_bcjnis0s">
         <w:r>
           <w:rPr>
             <w:rFonts w:ascii="Arial" w:cs="Arial" w:eastAsia="Arial" w:hAnsi="Arial"/>
@@ -61,7 +61,7 @@
         </w:rPr>
         <w:t xml:space="preserve"> | </w:t>
       </w:r>
-      <w:hyperlink w:history="1" r:id="rIdflqujnsynoap6unnwvljq">
+      <w:hyperlink w:history="1" r:id="rIdrtk9g43ltyxswtdrv1eqd">
         <w:r>
           <w:rPr>
             <w:rFonts w:ascii="Arial" w:cs="Arial" w:eastAsia="Arial" w:hAnsi="Arial"/>
@@ -100,7 +100,7 @@
         </w:rPr>
         <w:t xml:space="preserve"> | </w:t>
       </w:r>
-      <w:hyperlink w:history="1" r:id="rIdh278liu7viuldqwwpyy1u">
+      <w:hyperlink w:history="1" r:id="rIdpo3sazr1i2tf3xhxbxbze">
         <w:r>
           <w:rPr>
             <w:rFonts w:ascii="Arial" w:cs="Arial" w:eastAsia="Arial" w:hAnsi="Arial"/>
@@ -121,7 +121,7 @@
         </w:rPr>
         <w:t xml:space="preserve"> | </w:t>
       </w:r>
-      <w:hyperlink w:history="1" r:id="rIdegoiopihjl7ja31fouhni">
+      <w:hyperlink w:history="1" r:id="rIdjuhwgjbpcuzhygdt3doqu">
         <w:r>
           <w:rPr>
             <w:rFonts w:ascii="Arial" w:cs="Arial" w:eastAsia="Arial" w:hAnsi="Arial"/>
@@ -189,7 +189,7 @@
         </w:rPr>
         <w:t xml:space="preserve"> | </w:t>
       </w:r>
-      <w:hyperlink w:history="1" r:id="rIdjrwipikfvvqku0ytxh3sn">
+      <w:hyperlink w:history="1" r:id="rIdsjys-5-e4okglwcsvtjvl">
         <w:r>
           <w:rPr>
             <w:rFonts w:ascii="Arial" w:cs="Arial" w:eastAsia="Arial" w:hAnsi="Arial"/>
@@ -352,7 +352,7 @@
         </w:rPr>
         <w:t xml:space="preserve"> | </w:t>
       </w:r>
-      <w:hyperlink w:history="1" r:id="rIdvbdpltv4qebx3e_hz2zf2">
+      <w:hyperlink w:history="1" r:id="rIdlit7kfxmviiwaeubklgok">
         <w:r>
           <w:rPr>
             <w:rFonts w:ascii="Arial" w:cs="Arial" w:eastAsia="Arial" w:hAnsi="Arial"/>
@@ -750,7 +750,7 @@
         </w:rPr>
         <w:t xml:space="preserve"> | </w:t>
       </w:r>
-      <w:hyperlink w:history="1" r:id="rIdgxm3noep3uehnkosmwf2c">
+      <w:hyperlink w:history="1" r:id="rIdw9stg0wuyvgoykpgpmzzf">
         <w:r>
           <w:rPr>
             <w:rFonts w:ascii="Arial" w:cs="Arial" w:eastAsia="Arial" w:hAnsi="Arial"/>
@@ -1021,7 +1021,743 @@
         </w:rPr>
         <w:t xml:space="preserve"> | </w:t>
       </w:r>
-      <w:hyperlink w:history="1" r:id="rIdosnxqioz3gl5jrl4pqwfj">
+      <w:hyperlink w:history="1" r:id="rId6fald0wahxvaisxxym3dd">
+        <w:r>
+          <w:rPr>
+            <w:rFonts w:ascii="Arial" w:cs="Arial" w:eastAsia="Arial" w:hAnsi="Arial"/>
+            <w:color w:val="2563EB"/>
+            <w:sz w:val="20"/>
+            <w:szCs w:val="20"/>
+            <w:u w:val="single" w:color="2563EB"/>
+          </w:rPr>
+          <w:t xml:space="preserve">Docs</w:t>
+        </w:r>
+      </w:hyperlink>
+      <w:r>
+        <w:rPr>
+          <w:rFonts w:ascii="Arial" w:cs="Arial" w:eastAsia="Arial" w:hAnsi="Arial"/>
+          <w:color w:val="475569"/>
+          <w:sz w:val="18"/>
+          <w:szCs w:val="18"/>
+        </w:rPr>
+        <w:t xml:space="preserve"> | </w:t>
+      </w:r>
+      <w:hyperlink w:history="1" r:id="rIdqzvckmdjl8pcgeekgzwqn">
+        <w:r>
+          <w:rPr>
+            <w:rFonts w:ascii="Arial" w:cs="Arial" w:eastAsia="Arial" w:hAnsi="Arial"/>
+            <w:color w:val="2563EB"/>
+            <w:sz w:val="20"/>
+            <w:szCs w:val="20"/>
+            <w:u w:val="single" w:color="2563EB"/>
+          </w:rPr>
+          <w:t xml:space="preserve">github.com/wyattowalsh/agents</w:t>
+        </w:r>
+      </w:hyperlink>
+    </w:p>
+    <w:p>
+      <w:pPr>
+        <w:spacing w:after="45"/>
+      </w:pPr>
+      <w:r>
+        <w:rPr>
+          <w:rFonts w:ascii="Arial" w:cs="Arial" w:eastAsia="Arial" w:hAnsi="Arial"/>
+          <w:color w:val="0F172A"/>
+          <w:sz w:val="20"/>
+          <w:szCs w:val="20"/>
+        </w:rPr>
+        <w:t xml:space="preserve">Open-source agent tooling catalog and docs portal packaging 112 portable skills, 8 reusable agents, 30 MCP tools, and cross-runtime workflows for Claude Code, Codex, Copilot, Cursor, and related coding assistants.</w:t>
+      </w:r>
+    </w:p>
+    <w:p>
+      <w:pPr>
+        <w:spacing w:after="35"/>
+      </w:pPr>
+      <w:r>
+        <w:rPr>
+          <w:rFonts w:ascii="Arial" w:cs="Arial" w:eastAsia="Arial" w:hAnsi="Arial"/>
+          <w:color w:val="475569"/>
+          <w:sz w:val="20"/>
+          <w:szCs w:val="20"/>
+        </w:rPr>
+        <w:t xml:space="preserve">Stack: Python, TypeScript, MCP, FastMCP</w:t>
+      </w:r>
+    </w:p>
+    <w:p>
+      <w:pPr>
+        <w:pStyle w:val="ListParagraph"/>
+        <w:numPr>
+          <w:ilvl w:val="0"/>
+          <w:numId w:val="1"/>
+        </w:numPr>
+        <w:spacing w:after="35"/>
+      </w:pPr>
+      <w:r>
+        <w:rPr>
+          <w:rFonts w:ascii="Arial" w:cs="Arial" w:eastAsia="Arial" w:hAnsi="Arial"/>
+          <w:color w:val="0F172A"/>
+          <w:sz w:val="20"/>
+          <w:szCs w:val="20"/>
+        </w:rPr>
+        <w:t xml:space="preserve">Standardized reusable agent definitions across Claude Code, Codex, GitHub Copilot, Cursor, OpenCode, and related IDE agents.</w:t>
+      </w:r>
+    </w:p>
+    <w:p>
+      <w:pPr>
+        <w:pStyle w:val="ListParagraph"/>
+        <w:numPr>
+          <w:ilvl w:val="0"/>
+          <w:numId w:val="1"/>
+        </w:numPr>
+        <w:spacing w:after="35"/>
+      </w:pPr>
+      <w:r>
+        <w:rPr>
+          <w:rFonts w:ascii="Arial" w:cs="Arial" w:eastAsia="Arial" w:hAnsi="Arial"/>
+          <w:color w:val="0F172A"/>
+          <w:sz w:val="20"/>
+          <w:szCs w:val="20"/>
+        </w:rPr>
+        <w:t xml:space="preserve">Shipped generated docs, install flows, and 30 MCP-ready tool presets spanning code review, security, infrastructure, research, and workflow automation.</w:t>
+      </w:r>
+    </w:p>
+    <w:p>
+      <w:pPr>
+        <w:pStyle w:val="ListParagraph"/>
+        <w:numPr>
+          <w:ilvl w:val="0"/>
+          <w:numId w:val="1"/>
+        </w:numPr>
+        <w:spacing w:after="35"/>
+      </w:pPr>
+      <w:r>
+        <w:rPr>
+          <w:rFonts w:ascii="Arial" w:cs="Arial" w:eastAsia="Arial" w:hAnsi="Arial"/>
+          <w:color w:val="0F172A"/>
+          <w:sz w:val="20"/>
+          <w:szCs w:val="20"/>
+        </w:rPr>
+        <w:t xml:space="preserve">Packaged 112 portable skills and 8 reusable agents into a cross-runtime workflow system for AI-assisted software development.</w:t>
+      </w:r>
+    </w:p>
+    <w:p>
+      <w:pPr>
+        <w:spacing w:after="45"/>
+      </w:pPr>
+      <w:r>
+        <w:rPr>
+          <w:rFonts w:ascii="Arial" w:cs="Arial" w:eastAsia="Arial" w:hAnsi="Arial"/>
+          <w:b/>
+          <w:bCs/>
+          <w:color w:val="0F172A"/>
+          <w:sz w:val="21"/>
+          <w:szCs w:val="21"/>
+        </w:rPr>
+        <w:t xml:space="preserve">NBA Basketball Database</w:t>
+      </w:r>
+      <w:r>
+        <w:rPr>
+          <w:rFonts w:ascii="Arial" w:cs="Arial" w:eastAsia="Arial" w:hAnsi="Arial"/>
+          <w:color w:val="475569"/>
+          <w:sz w:val="18"/>
+          <w:szCs w:val="18"/>
+        </w:rPr>
+        <w:t xml:space="preserve"> | </w:t>
+      </w:r>
+      <w:hyperlink w:history="1" r:id="rId0h_oqq3yfcusd1lqltb1g">
+        <w:r>
+          <w:rPr>
+            <w:rFonts w:ascii="Arial" w:cs="Arial" w:eastAsia="Arial" w:hAnsi="Arial"/>
+            <w:color w:val="2563EB"/>
+            <w:sz w:val="20"/>
+            <w:szCs w:val="20"/>
+            <w:u w:val="single" w:color="2563EB"/>
+          </w:rPr>
+          <w:t xml:space="preserve">Docs</w:t>
+        </w:r>
+      </w:hyperlink>
+      <w:r>
+        <w:rPr>
+          <w:rFonts w:ascii="Arial" w:cs="Arial" w:eastAsia="Arial" w:hAnsi="Arial"/>
+          <w:color w:val="475569"/>
+          <w:sz w:val="18"/>
+          <w:szCs w:val="18"/>
+        </w:rPr>
+        <w:t xml:space="preserve"> | </w:t>
+      </w:r>
+      <w:hyperlink w:history="1" r:id="rIddotbtdmtvvcmf-rne6prl">
+        <w:r>
+          <w:rPr>
+            <w:rFonts w:ascii="Arial" w:cs="Arial" w:eastAsia="Arial" w:hAnsi="Arial"/>
+            <w:color w:val="2563EB"/>
+            <w:sz w:val="20"/>
+            <w:szCs w:val="20"/>
+            <w:u w:val="single" w:color="2563EB"/>
+          </w:rPr>
+          <w:t xml:space="preserve">Kaggle</w:t>
+        </w:r>
+      </w:hyperlink>
+      <w:r>
+        <w:rPr>
+          <w:rFonts w:ascii="Arial" w:cs="Arial" w:eastAsia="Arial" w:hAnsi="Arial"/>
+          <w:color w:val="475569"/>
+          <w:sz w:val="18"/>
+          <w:szCs w:val="18"/>
+        </w:rPr>
+        <w:t xml:space="preserve"> | </w:t>
+      </w:r>
+      <w:hyperlink w:history="1" r:id="rIdopze_fokiprlbyxgwba49">
+        <w:r>
+          <w:rPr>
+            <w:rFonts w:ascii="Arial" w:cs="Arial" w:eastAsia="Arial" w:hAnsi="Arial"/>
+            <w:color w:val="2563EB"/>
+            <w:sz w:val="20"/>
+            <w:szCs w:val="20"/>
+            <w:u w:val="single" w:color="2563EB"/>
+          </w:rPr>
+          <w:t xml:space="preserve">github.com/wyattowalsh/nbadb</w:t>
+        </w:r>
+      </w:hyperlink>
+    </w:p>
+    <w:p>
+      <w:pPr>
+        <w:spacing w:after="45"/>
+      </w:pPr>
+      <w:r>
+        <w:rPr>
+          <w:rFonts w:ascii="Arial" w:cs="Arial" w:eastAsia="Arial" w:hAnsi="Arial"/>
+          <w:color w:val="0F172A"/>
+          <w:sz w:val="20"/>
+          <w:szCs w:val="20"/>
+        </w:rPr>
+        <w:t xml:space="preserve">Public NBA Kaggle dataset and repo covering 65K+ games and 13M+ plays; reached 425K+ views and 60K+ downloads before freezing at the 2023-07-06 update for reproducible sports analytics workflows.</w:t>
+      </w:r>
+    </w:p>
+    <w:p>
+      <w:pPr>
+        <w:spacing w:after="35"/>
+      </w:pPr>
+      <w:r>
+        <w:rPr>
+          <w:rFonts w:ascii="Arial" w:cs="Arial" w:eastAsia="Arial" w:hAnsi="Arial"/>
+          <w:color w:val="475569"/>
+          <w:sz w:val="20"/>
+          <w:szCs w:val="20"/>
+        </w:rPr>
+        <w:t xml:space="preserve">Stack: Python, Pandas, Polars, SQLAlchemy, DuckDB, Pandera</w:t>
+      </w:r>
+    </w:p>
+    <w:p>
+      <w:pPr>
+        <w:pStyle w:val="ListParagraph"/>
+        <w:numPr>
+          <w:ilvl w:val="0"/>
+          <w:numId w:val="1"/>
+        </w:numPr>
+        <w:spacing w:after="35"/>
+      </w:pPr>
+      <w:r>
+        <w:rPr>
+          <w:rFonts w:ascii="Arial" w:cs="Arial" w:eastAsia="Arial" w:hAnsi="Arial"/>
+          <w:color w:val="0F172A"/>
+          <w:sz w:val="20"/>
+          <w:szCs w:val="20"/>
+        </w:rPr>
+        <w:t xml:space="preserve">Implemented Pandera-validated NBA API ETL with daily warehouse updates plus DuckDB, SQLite, Parquet, and CSV exports.</w:t>
+      </w:r>
+    </w:p>
+    <w:p>
+      <w:pPr>
+        <w:pStyle w:val="ListParagraph"/>
+        <w:numPr>
+          <w:ilvl w:val="0"/>
+          <w:numId w:val="1"/>
+        </w:numPr>
+        <w:spacing w:after="35"/>
+      </w:pPr>
+      <w:r>
+        <w:rPr>
+          <w:rFonts w:ascii="Arial" w:cs="Arial" w:eastAsia="Arial" w:hAnsi="Arial"/>
+          <w:color w:val="0F172A"/>
+          <w:sz w:val="20"/>
+          <w:szCs w:val="20"/>
+        </w:rPr>
+        <w:t xml:space="preserve">Building the next-generation nbadb rebuild with 152 extractor wrappers and 204 generated public star-schema outputs across docs, schema references, and release workflows.</w:t>
+      </w:r>
+    </w:p>
+    <w:p>
+      <w:pPr>
+        <w:pStyle w:val="ListParagraph"/>
+        <w:numPr>
+          <w:ilvl w:val="0"/>
+          <w:numId w:val="1"/>
+        </w:numPr>
+        <w:spacing w:after="35"/>
+      </w:pPr>
+      <w:r>
+        <w:rPr>
+          <w:rFonts w:ascii="Arial" w:cs="Arial" w:eastAsia="Arial" w:hAnsi="Arial"/>
+          <w:color w:val="0F172A"/>
+          <w:sz w:val="20"/>
+          <w:szCs w:val="20"/>
+        </w:rPr>
+        <w:t xml:space="preserve">Published a public sports analytics dataset with 65K+ games and 13M+ play-by-play events across multiple warehouse formats.</w:t>
+      </w:r>
+    </w:p>
+    <w:p>
+      <w:pPr>
+        <w:spacing w:after="45"/>
+      </w:pPr>
+      <w:r>
+        <w:rPr>
+          <w:rFonts w:ascii="Arial" w:cs="Arial" w:eastAsia="Arial" w:hAnsi="Arial"/>
+          <w:b/>
+          <w:bCs/>
+          <w:color w:val="0F172A"/>
+          <w:sz w:val="21"/>
+          <w:szCs w:val="21"/>
+        </w:rPr>
+        <w:t xml:space="preserve">ProxyWhirl</w:t>
+      </w:r>
+      <w:r>
+        <w:rPr>
+          <w:rFonts w:ascii="Arial" w:cs="Arial" w:eastAsia="Arial" w:hAnsi="Arial"/>
+          <w:color w:val="475569"/>
+          <w:sz w:val="18"/>
+          <w:szCs w:val="18"/>
+        </w:rPr>
+        <w:t xml:space="preserve"> | </w:t>
+      </w:r>
+      <w:hyperlink w:history="1" r:id="rIdedae7fsesdwvgplkwgvvw">
+        <w:r>
+          <w:rPr>
+            <w:rFonts w:ascii="Arial" w:cs="Arial" w:eastAsia="Arial" w:hAnsi="Arial"/>
+            <w:color w:val="2563EB"/>
+            <w:sz w:val="20"/>
+            <w:szCs w:val="20"/>
+            <w:u w:val="single" w:color="2563EB"/>
+          </w:rPr>
+          <w:t xml:space="preserve">Docs</w:t>
+        </w:r>
+      </w:hyperlink>
+      <w:r>
+        <w:rPr>
+          <w:rFonts w:ascii="Arial" w:cs="Arial" w:eastAsia="Arial" w:hAnsi="Arial"/>
+          <w:color w:val="475569"/>
+          <w:sz w:val="18"/>
+          <w:szCs w:val="18"/>
+        </w:rPr>
+        <w:t xml:space="preserve"> | </w:t>
+      </w:r>
+      <w:hyperlink w:history="1" r:id="rIdfkqtjwf8eidby5nrakhzv">
+        <w:r>
+          <w:rPr>
+            <w:rFonts w:ascii="Arial" w:cs="Arial" w:eastAsia="Arial" w:hAnsi="Arial"/>
+            <w:color w:val="2563EB"/>
+            <w:sz w:val="20"/>
+            <w:szCs w:val="20"/>
+            <w:u w:val="single" w:color="2563EB"/>
+          </w:rPr>
+          <w:t xml:space="preserve">github.com/wyattowalsh/proxywhirl</w:t>
+        </w:r>
+      </w:hyperlink>
+    </w:p>
+    <w:p>
+      <w:pPr>
+        <w:spacing w:after="45"/>
+      </w:pPr>
+      <w:r>
+        <w:rPr>
+          <w:rFonts w:ascii="Arial" w:cs="Arial" w:eastAsia="Arial" w:hAnsi="Arial"/>
+          <w:color w:val="0F172A"/>
+          <w:sz w:val="20"/>
+          <w:szCs w:val="20"/>
+        </w:rPr>
+        <w:t xml:space="preserve">Released rotating proxy toolkit with 9 strategies, 100+ auto-fetched sources, self-healing circuit breakers, and five interfaces for scraping/data workflows.</w:t>
+      </w:r>
+    </w:p>
+    <w:p>
+      <w:pPr>
+        <w:spacing w:after="35"/>
+      </w:pPr>
+      <w:r>
+        <w:rPr>
+          <w:rFonts w:ascii="Arial" w:cs="Arial" w:eastAsia="Arial" w:hAnsi="Arial"/>
+          <w:color w:val="475569"/>
+          <w:sz w:val="20"/>
+          <w:szCs w:val="20"/>
+        </w:rPr>
+        <w:t xml:space="preserve">Stack: Python, SQLite, PyPI</w:t>
+      </w:r>
+    </w:p>
+    <w:p>
+      <w:pPr>
+        <w:pStyle w:val="ListParagraph"/>
+        <w:numPr>
+          <w:ilvl w:val="0"/>
+          <w:numId w:val="1"/>
+        </w:numPr>
+        <w:spacing w:after="35"/>
+      </w:pPr>
+      <w:r>
+        <w:rPr>
+          <w:rFonts w:ascii="Arial" w:cs="Arial" w:eastAsia="Arial" w:hAnsi="Arial"/>
+          <w:color w:val="0F172A"/>
+          <w:sz w:val="20"/>
+          <w:szCs w:val="20"/>
+        </w:rPr>
+        <w:t xml:space="preserve">Implemented 9 proxy rotation strategies with configurable fallback chains, per-source scoring, and performance-based selection.</w:t>
+      </w:r>
+    </w:p>
+    <w:p>
+      <w:pPr>
+        <w:pStyle w:val="ListParagraph"/>
+        <w:numPr>
+          <w:ilvl w:val="0"/>
+          <w:numId w:val="1"/>
+        </w:numPr>
+        <w:spacing w:after="35"/>
+      </w:pPr>
+      <w:r>
+        <w:rPr>
+          <w:rFonts w:ascii="Arial" w:cs="Arial" w:eastAsia="Arial" w:hAnsi="Arial"/>
+          <w:color w:val="0F172A"/>
+          <w:sz w:val="20"/>
+          <w:szCs w:val="20"/>
+        </w:rPr>
+        <w:t xml:space="preserve">Built self-healing validation across 100+ proxy sources with circuit breakers, auto-ejection, recovery promotion, and five interfaces for different scraping workflows.</w:t>
+      </w:r>
+    </w:p>
+    <w:p>
+      <w:pPr>
+        <w:pStyle w:val="ListParagraph"/>
+        <w:numPr>
+          <w:ilvl w:val="0"/>
+          <w:numId w:val="1"/>
+        </w:numPr>
+        <w:spacing w:after="35"/>
+      </w:pPr>
+      <w:r>
+        <w:rPr>
+          <w:rFonts w:ascii="Arial" w:cs="Arial" w:eastAsia="Arial" w:hAnsi="Arial"/>
+          <w:color w:val="0F172A"/>
+          <w:sz w:val="20"/>
+          <w:szCs w:val="20"/>
+        </w:rPr>
+        <w:t xml:space="preserve">Released the toolkit for resilient scraping and data-collection workflows with SQLite-backed state and PyPI distribution.</w:t>
+      </w:r>
+    </w:p>
+    <w:p>
+      <w:pPr>
+        <w:spacing w:after="45"/>
+      </w:pPr>
+      <w:r>
+        <w:rPr>
+          <w:rFonts w:ascii="Arial" w:cs="Arial" w:eastAsia="Arial" w:hAnsi="Arial"/>
+          <w:b/>
+          <w:bCs/>
+          <w:color w:val="0F172A"/>
+          <w:sz w:val="21"/>
+          <w:szCs w:val="21"/>
+        </w:rPr>
+        <w:t xml:space="preserve">AI/ML Web Feeds</w:t>
+      </w:r>
+      <w:r>
+        <w:rPr>
+          <w:rFonts w:ascii="Arial" w:cs="Arial" w:eastAsia="Arial" w:hAnsi="Arial"/>
+          <w:color w:val="475569"/>
+          <w:sz w:val="18"/>
+          <w:szCs w:val="18"/>
+        </w:rPr>
+        <w:t xml:space="preserve"> | </w:t>
+      </w:r>
+      <w:hyperlink w:history="1" r:id="rIdo9s3d5yv1ggfdsmme-3eh">
+        <w:r>
+          <w:rPr>
+            <w:rFonts w:ascii="Arial" w:cs="Arial" w:eastAsia="Arial" w:hAnsi="Arial"/>
+            <w:color w:val="2563EB"/>
+            <w:sz w:val="20"/>
+            <w:szCs w:val="20"/>
+            <w:u w:val="single" w:color="2563EB"/>
+          </w:rPr>
+          <w:t xml:space="preserve">Docs</w:t>
+        </w:r>
+      </w:hyperlink>
+      <w:r>
+        <w:rPr>
+          <w:rFonts w:ascii="Arial" w:cs="Arial" w:eastAsia="Arial" w:hAnsi="Arial"/>
+          <w:color w:val="475569"/>
+          <w:sz w:val="18"/>
+          <w:szCs w:val="18"/>
+        </w:rPr>
+        <w:t xml:space="preserve"> | </w:t>
+      </w:r>
+      <w:hyperlink w:history="1" r:id="rIdau-lwnrchgdajtevytjgq">
+        <w:r>
+          <w:rPr>
+            <w:rFonts w:ascii="Arial" w:cs="Arial" w:eastAsia="Arial" w:hAnsi="Arial"/>
+            <w:color w:val="2563EB"/>
+            <w:sz w:val="20"/>
+            <w:szCs w:val="20"/>
+            <w:u w:val="single" w:color="2563EB"/>
+          </w:rPr>
+          <w:t xml:space="preserve">github.com/wyattowalsh/ai-web-feeds</w:t>
+        </w:r>
+      </w:hyperlink>
+    </w:p>
+    <w:p>
+      <w:pPr>
+        <w:spacing w:after="45"/>
+      </w:pPr>
+      <w:r>
+        <w:rPr>
+          <w:rFonts w:ascii="Arial" w:cs="Arial" w:eastAsia="Arial" w:hAnsi="Arial"/>
+          <w:color w:val="0F172A"/>
+          <w:sz w:val="20"/>
+          <w:szCs w:val="20"/>
+        </w:rPr>
+        <w:t xml:space="preserve">Built a curated AI and ML feed platform with typed schemas, HTTP/RSS validation, contributor submission workflows, OPML exports, and documented browse/download surfaces for research discovery.</w:t>
+      </w:r>
+    </w:p>
+    <w:p>
+      <w:pPr>
+        <w:spacing w:after="35"/>
+      </w:pPr>
+      <w:r>
+        <w:rPr>
+          <w:rFonts w:ascii="Arial" w:cs="Arial" w:eastAsia="Arial" w:hAnsi="Arial"/>
+          <w:color w:val="475569"/>
+          <w:sz w:val="20"/>
+          <w:szCs w:val="20"/>
+        </w:rPr>
+        <w:t xml:space="preserve">Stack: Python, Pydantic, SQLModel, YAML, Fumadocs, Vercel</w:t>
+      </w:r>
+    </w:p>
+    <w:p>
+      <w:pPr>
+        <w:pStyle w:val="ListParagraph"/>
+        <w:numPr>
+          <w:ilvl w:val="0"/>
+          <w:numId w:val="1"/>
+        </w:numPr>
+        <w:spacing w:after="35"/>
+      </w:pPr>
+      <w:r>
+        <w:rPr>
+          <w:rFonts w:ascii="Arial" w:cs="Arial" w:eastAsia="Arial" w:hAnsi="Arial"/>
+          <w:color w:val="0F172A"/>
+          <w:sz w:val="20"/>
+          <w:szCs w:val="20"/>
+        </w:rPr>
+        <w:t xml:space="preserve">Defined YAML feed schemas with topic and source-type validation across blogs, papers, and newsletters for reliable feed quality.</w:t>
+      </w:r>
+    </w:p>
+    <w:p>
+      <w:pPr>
+        <w:pStyle w:val="ListParagraph"/>
+        <w:numPr>
+          <w:ilvl w:val="0"/>
+          <w:numId w:val="1"/>
+        </w:numPr>
+        <w:spacing w:after="35"/>
+      </w:pPr>
+      <w:r>
+        <w:rPr>
+          <w:rFonts w:ascii="Arial" w:cs="Arial" w:eastAsia="Arial" w:hAnsi="Arial"/>
+          <w:color w:val="0F172A"/>
+          <w:sz w:val="20"/>
+          <w:szCs w:val="20"/>
+        </w:rPr>
+        <w:t xml:space="preserve">Shipped helper scripts, CI checks, scheduled validation jobs, and a docs-backed submission/review flow for reliable community feed curation.</w:t>
+      </w:r>
+    </w:p>
+    <w:p>
+      <w:pPr>
+        <w:pStyle w:val="ListParagraph"/>
+        <w:numPr>
+          <w:ilvl w:val="0"/>
+          <w:numId w:val="1"/>
+        </w:numPr>
+        <w:spacing w:after="35"/>
+      </w:pPr>
+      <w:r>
+        <w:rPr>
+          <w:rFonts w:ascii="Arial" w:cs="Arial" w:eastAsia="Arial" w:hAnsi="Arial"/>
+          <w:color w:val="0F172A"/>
+          <w:sz w:val="20"/>
+          <w:szCs w:val="20"/>
+        </w:rPr>
+        <w:t xml:space="preserve">Published OPML exports and documented browse/download surfaces for AI and ML research feeds, downstream readers, and offline subscription managers.</w:t>
+      </w:r>
+    </w:p>
+    <w:p>
+      <w:pPr>
+        <w:spacing w:after="45"/>
+      </w:pPr>
+      <w:r>
+        <w:rPr>
+          <w:rFonts w:ascii="Arial" w:cs="Arial" w:eastAsia="Arial" w:hAnsi="Arial"/>
+          <w:b/>
+          <w:bCs/>
+          <w:color w:val="0F172A"/>
+          <w:sz w:val="21"/>
+          <w:szCs w:val="21"/>
+        </w:rPr>
+        <w:t xml:space="preserve">MCP-Crawl4AI</w:t>
+      </w:r>
+      <w:r>
+        <w:rPr>
+          <w:rFonts w:ascii="Arial" w:cs="Arial" w:eastAsia="Arial" w:hAnsi="Arial"/>
+          <w:color w:val="475569"/>
+          <w:sz w:val="18"/>
+          <w:szCs w:val="18"/>
+        </w:rPr>
+        <w:t xml:space="preserve"> | </w:t>
+      </w:r>
+      <w:hyperlink w:history="1" r:id="rIdotgcctix0ps_zmzoewk7y">
+        <w:r>
+          <w:rPr>
+            <w:rFonts w:ascii="Arial" w:cs="Arial" w:eastAsia="Arial" w:hAnsi="Arial"/>
+            <w:color w:val="2563EB"/>
+            <w:sz w:val="20"/>
+            <w:szCs w:val="20"/>
+            <w:u w:val="single" w:color="2563EB"/>
+          </w:rPr>
+          <w:t xml:space="preserve">Docs</w:t>
+        </w:r>
+      </w:hyperlink>
+      <w:r>
+        <w:rPr>
+          <w:rFonts w:ascii="Arial" w:cs="Arial" w:eastAsia="Arial" w:hAnsi="Arial"/>
+          <w:color w:val="475569"/>
+          <w:sz w:val="18"/>
+          <w:szCs w:val="18"/>
+        </w:rPr>
+        <w:t xml:space="preserve"> | </w:t>
+      </w:r>
+      <w:hyperlink w:history="1" r:id="rIdjwrqrapqnfz6ji0pjlgui">
+        <w:r>
+          <w:rPr>
+            <w:rFonts w:ascii="Arial" w:cs="Arial" w:eastAsia="Arial" w:hAnsi="Arial"/>
+            <w:color w:val="2563EB"/>
+            <w:sz w:val="20"/>
+            <w:szCs w:val="20"/>
+            <w:u w:val="single" w:color="2563EB"/>
+          </w:rPr>
+          <w:t xml:space="preserve">github.com/wyattowalsh/mcp-crawl4ai</w:t>
+        </w:r>
+      </w:hyperlink>
+    </w:p>
+    <w:p>
+      <w:pPr>
+        <w:spacing w:after="45"/>
+      </w:pPr>
+      <w:r>
+        <w:rPr>
+          <w:rFonts w:ascii="Arial" w:cs="Arial" w:eastAsia="Arial" w:hAnsi="Arial"/>
+          <w:color w:val="0F172A"/>
+          <w:sz w:val="20"/>
+          <w:szCs w:val="20"/>
+        </w:rPr>
+        <w:t xml:space="preserve">Released FastMCP server wrapping Crawl4AI so AI agents can scrape, crawl, manage sessions, and retrieve artifacts through a focused MCP surface with documented stdio and HTTP integration paths.</w:t>
+      </w:r>
+    </w:p>
+    <w:p>
+      <w:pPr>
+        <w:spacing w:after="35"/>
+      </w:pPr>
+      <w:r>
+        <w:rPr>
+          <w:rFonts w:ascii="Arial" w:cs="Arial" w:eastAsia="Arial" w:hAnsi="Arial"/>
+          <w:color w:val="475569"/>
+          <w:sz w:val="20"/>
+          <w:szCs w:val="20"/>
+        </w:rPr>
+        <w:t xml:space="preserve">Stack: Python, FastMCP, Crawl4AI, Playwright, Docker</w:t>
+      </w:r>
+    </w:p>
+    <w:p>
+      <w:pPr>
+        <w:pStyle w:val="ListParagraph"/>
+        <w:numPr>
+          <w:ilvl w:val="0"/>
+          <w:numId w:val="1"/>
+        </w:numPr>
+        <w:spacing w:after="35"/>
+      </w:pPr>
+      <w:r>
+        <w:rPr>
+          <w:rFonts w:ascii="Arial" w:cs="Arial" w:eastAsia="Arial" w:hAnsi="Arial"/>
+          <w:color w:val="0F172A"/>
+          <w:sz w:val="20"/>
+          <w:szCs w:val="20"/>
+        </w:rPr>
+        <w:t xml:space="preserve">Built a FastMCP v3 server with managed headless Chromium, session-aware crawling, and automatic Playwright setup using two runtime dependencies.</w:t>
+      </w:r>
+    </w:p>
+    <w:p>
+      <w:pPr>
+        <w:pStyle w:val="ListParagraph"/>
+        <w:numPr>
+          <w:ilvl w:val="0"/>
+          <w:numId w:val="1"/>
+        </w:numPr>
+        <w:spacing w:after="35"/>
+      </w:pPr>
+      <w:r>
+        <w:rPr>
+          <w:rFonts w:ascii="Arial" w:cs="Arial" w:eastAsia="Arial" w:hAnsi="Arial"/>
+          <w:color w:val="0F172A"/>
+          <w:sz w:val="20"/>
+          <w:szCs w:val="20"/>
+        </w:rPr>
+        <w:t xml:space="preserve">Exposed scrape, crawl, session, and artifact-retrieval workflows with docs, tests, and release-tagged MCP install flows.</w:t>
+      </w:r>
+    </w:p>
+    <w:p>
+      <w:pPr>
+        <w:pStyle w:val="ListParagraph"/>
+        <w:numPr>
+          <w:ilvl w:val="0"/>
+          <w:numId w:val="1"/>
+        </w:numPr>
+        <w:spacing w:after="35"/>
+      </w:pPr>
+      <w:r>
+        <w:rPr>
+          <w:rFonts w:ascii="Arial" w:cs="Arial" w:eastAsia="Arial" w:hAnsi="Arial"/>
+          <w:color w:val="0F172A"/>
+          <w:sz w:val="20"/>
+          <w:szCs w:val="20"/>
+        </w:rPr>
+        <w:t xml:space="preserve">Documented stdio and HTTP integration paths so AI agents can use web crawling through a focused MCP surface.</w:t>
+      </w:r>
+    </w:p>
+    <w:p>
+      <w:pPr>
+        <w:spacing w:after="45"/>
+      </w:pPr>
+      <w:r>
+        <w:rPr>
+          <w:rFonts w:ascii="Arial" w:cs="Arial" w:eastAsia="Arial" w:hAnsi="Arial"/>
+          <w:b/>
+          <w:bCs/>
+          <w:color w:val="0F172A"/>
+          <w:sz w:val="21"/>
+          <w:szCs w:val="21"/>
+        </w:rPr>
+        <w:t xml:space="preserve">Personal Website: w4w.dev</w:t>
+      </w:r>
+      <w:r>
+        <w:rPr>
+          <w:rFonts w:ascii="Arial" w:cs="Arial" w:eastAsia="Arial" w:hAnsi="Arial"/>
+          <w:color w:val="475569"/>
+          <w:sz w:val="18"/>
+          <w:szCs w:val="18"/>
+        </w:rPr>
+        <w:t xml:space="preserve"> | </w:t>
+      </w:r>
+      <w:hyperlink w:history="1" r:id="rIde4bws6apmfhlrat2_y2zh">
         <w:r>
           <w:rPr>
             <w:rFonts w:ascii="Arial" w:cs="Arial" w:eastAsia="Arial" w:hAnsi="Arial"/>
@@ -1042,743 +1778,7 @@
         </w:rPr>
         <w:t xml:space="preserve"> | </w:t>
       </w:r>
-      <w:hyperlink w:history="1" r:id="rIdbatujvda-c_v7fvvndcvi">
-        <w:r>
-          <w:rPr>
-            <w:rFonts w:ascii="Arial" w:cs="Arial" w:eastAsia="Arial" w:hAnsi="Arial"/>
-            <w:color w:val="2563EB"/>
-            <w:sz w:val="20"/>
-            <w:szCs w:val="20"/>
-            <w:u w:val="single" w:color="2563EB"/>
-          </w:rPr>
-          <w:t xml:space="preserve">github.com/wyattowalsh/agents</w:t>
-        </w:r>
-      </w:hyperlink>
-    </w:p>
-    <w:p>
-      <w:pPr>
-        <w:spacing w:after="45"/>
-      </w:pPr>
-      <w:r>
-        <w:rPr>
-          <w:rFonts w:ascii="Arial" w:cs="Arial" w:eastAsia="Arial" w:hAnsi="Arial"/>
-          <w:color w:val="0F172A"/>
-          <w:sz w:val="20"/>
-          <w:szCs w:val="20"/>
-        </w:rPr>
-        <w:t xml:space="preserve">Open-source agent tooling catalog and docs portal packaging 112 portable skills, 8 reusable agents, 30 MCP tools, and cross-runtime workflows for Claude Code, Codex, Copilot, Cursor, and related coding assistants.</w:t>
-      </w:r>
-    </w:p>
-    <w:p>
-      <w:pPr>
-        <w:spacing w:after="35"/>
-      </w:pPr>
-      <w:r>
-        <w:rPr>
-          <w:rFonts w:ascii="Arial" w:cs="Arial" w:eastAsia="Arial" w:hAnsi="Arial"/>
-          <w:color w:val="475569"/>
-          <w:sz w:val="20"/>
-          <w:szCs w:val="20"/>
-        </w:rPr>
-        <w:t xml:space="preserve">Stack: Python, TypeScript, MCP, FastMCP</w:t>
-      </w:r>
-    </w:p>
-    <w:p>
-      <w:pPr>
-        <w:pStyle w:val="ListParagraph"/>
-        <w:numPr>
-          <w:ilvl w:val="0"/>
-          <w:numId w:val="1"/>
-        </w:numPr>
-        <w:spacing w:after="35"/>
-      </w:pPr>
-      <w:r>
-        <w:rPr>
-          <w:rFonts w:ascii="Arial" w:cs="Arial" w:eastAsia="Arial" w:hAnsi="Arial"/>
-          <w:color w:val="0F172A"/>
-          <w:sz w:val="20"/>
-          <w:szCs w:val="20"/>
-        </w:rPr>
-        <w:t xml:space="preserve">Standardized reusable agent definitions across Claude Code, Codex, GitHub Copilot, Cursor, OpenCode, and related IDE agents.</w:t>
-      </w:r>
-    </w:p>
-    <w:p>
-      <w:pPr>
-        <w:pStyle w:val="ListParagraph"/>
-        <w:numPr>
-          <w:ilvl w:val="0"/>
-          <w:numId w:val="1"/>
-        </w:numPr>
-        <w:spacing w:after="35"/>
-      </w:pPr>
-      <w:r>
-        <w:rPr>
-          <w:rFonts w:ascii="Arial" w:cs="Arial" w:eastAsia="Arial" w:hAnsi="Arial"/>
-          <w:color w:val="0F172A"/>
-          <w:sz w:val="20"/>
-          <w:szCs w:val="20"/>
-        </w:rPr>
-        <w:t xml:space="preserve">Shipped generated docs, install flows, and 30 MCP-ready tool presets spanning code review, security, infrastructure, research, and workflow automation.</w:t>
-      </w:r>
-    </w:p>
-    <w:p>
-      <w:pPr>
-        <w:pStyle w:val="ListParagraph"/>
-        <w:numPr>
-          <w:ilvl w:val="0"/>
-          <w:numId w:val="1"/>
-        </w:numPr>
-        <w:spacing w:after="35"/>
-      </w:pPr>
-      <w:r>
-        <w:rPr>
-          <w:rFonts w:ascii="Arial" w:cs="Arial" w:eastAsia="Arial" w:hAnsi="Arial"/>
-          <w:color w:val="0F172A"/>
-          <w:sz w:val="20"/>
-          <w:szCs w:val="20"/>
-        </w:rPr>
-        <w:t xml:space="preserve">Packaged 112 portable skills and 8 reusable agents into a cross-runtime workflow system for AI-assisted software development.</w:t>
-      </w:r>
-    </w:p>
-    <w:p>
-      <w:pPr>
-        <w:spacing w:after="45"/>
-      </w:pPr>
-      <w:r>
-        <w:rPr>
-          <w:rFonts w:ascii="Arial" w:cs="Arial" w:eastAsia="Arial" w:hAnsi="Arial"/>
-          <w:b/>
-          <w:bCs/>
-          <w:color w:val="0F172A"/>
-          <w:sz w:val="21"/>
-          <w:szCs w:val="21"/>
-        </w:rPr>
-        <w:t xml:space="preserve">NBA Basketball Database</w:t>
-      </w:r>
-      <w:r>
-        <w:rPr>
-          <w:rFonts w:ascii="Arial" w:cs="Arial" w:eastAsia="Arial" w:hAnsi="Arial"/>
-          <w:color w:val="475569"/>
-          <w:sz w:val="18"/>
-          <w:szCs w:val="18"/>
-        </w:rPr>
-        <w:t xml:space="preserve"> | </w:t>
-      </w:r>
-      <w:hyperlink w:history="1" r:id="rIdyr6vrorhjmvn0k2octyio">
-        <w:r>
-          <w:rPr>
-            <w:rFonts w:ascii="Arial" w:cs="Arial" w:eastAsia="Arial" w:hAnsi="Arial"/>
-            <w:color w:val="2563EB"/>
-            <w:sz w:val="20"/>
-            <w:szCs w:val="20"/>
-            <w:u w:val="single" w:color="2563EB"/>
-          </w:rPr>
-          <w:t xml:space="preserve">Docs</w:t>
-        </w:r>
-      </w:hyperlink>
-      <w:r>
-        <w:rPr>
-          <w:rFonts w:ascii="Arial" w:cs="Arial" w:eastAsia="Arial" w:hAnsi="Arial"/>
-          <w:color w:val="475569"/>
-          <w:sz w:val="18"/>
-          <w:szCs w:val="18"/>
-        </w:rPr>
-        <w:t xml:space="preserve"> | </w:t>
-      </w:r>
-      <w:hyperlink w:history="1" r:id="rIdwfvt8e4jxaynh2puzhzsl">
-        <w:r>
-          <w:rPr>
-            <w:rFonts w:ascii="Arial" w:cs="Arial" w:eastAsia="Arial" w:hAnsi="Arial"/>
-            <w:color w:val="2563EB"/>
-            <w:sz w:val="20"/>
-            <w:szCs w:val="20"/>
-            <w:u w:val="single" w:color="2563EB"/>
-          </w:rPr>
-          <w:t xml:space="preserve">Kaggle</w:t>
-        </w:r>
-      </w:hyperlink>
-      <w:r>
-        <w:rPr>
-          <w:rFonts w:ascii="Arial" w:cs="Arial" w:eastAsia="Arial" w:hAnsi="Arial"/>
-          <w:color w:val="475569"/>
-          <w:sz w:val="18"/>
-          <w:szCs w:val="18"/>
-        </w:rPr>
-        <w:t xml:space="preserve"> | </w:t>
-      </w:r>
-      <w:hyperlink w:history="1" r:id="rIdsy1-04a2wk9zht90pt3qv">
-        <w:r>
-          <w:rPr>
-            <w:rFonts w:ascii="Arial" w:cs="Arial" w:eastAsia="Arial" w:hAnsi="Arial"/>
-            <w:color w:val="2563EB"/>
-            <w:sz w:val="20"/>
-            <w:szCs w:val="20"/>
-            <w:u w:val="single" w:color="2563EB"/>
-          </w:rPr>
-          <w:t xml:space="preserve">github.com/wyattowalsh/nbadb</w:t>
-        </w:r>
-      </w:hyperlink>
-    </w:p>
-    <w:p>
-      <w:pPr>
-        <w:spacing w:after="45"/>
-      </w:pPr>
-      <w:r>
-        <w:rPr>
-          <w:rFonts w:ascii="Arial" w:cs="Arial" w:eastAsia="Arial" w:hAnsi="Arial"/>
-          <w:color w:val="0F172A"/>
-          <w:sz w:val="20"/>
-          <w:szCs w:val="20"/>
-        </w:rPr>
-        <w:t xml:space="preserve">Public NBA Kaggle dataset and repo covering 65K+ games and 13M+ plays; reached 425K+ views and 60K+ downloads before freezing at the 2023-07-06 update for reproducible sports analytics workflows.</w:t>
-      </w:r>
-    </w:p>
-    <w:p>
-      <w:pPr>
-        <w:spacing w:after="35"/>
-      </w:pPr>
-      <w:r>
-        <w:rPr>
-          <w:rFonts w:ascii="Arial" w:cs="Arial" w:eastAsia="Arial" w:hAnsi="Arial"/>
-          <w:color w:val="475569"/>
-          <w:sz w:val="20"/>
-          <w:szCs w:val="20"/>
-        </w:rPr>
-        <w:t xml:space="preserve">Stack: Python, Pandas, Polars, SQLAlchemy, DuckDB, Pandera</w:t>
-      </w:r>
-    </w:p>
-    <w:p>
-      <w:pPr>
-        <w:pStyle w:val="ListParagraph"/>
-        <w:numPr>
-          <w:ilvl w:val="0"/>
-          <w:numId w:val="1"/>
-        </w:numPr>
-        <w:spacing w:after="35"/>
-      </w:pPr>
-      <w:r>
-        <w:rPr>
-          <w:rFonts w:ascii="Arial" w:cs="Arial" w:eastAsia="Arial" w:hAnsi="Arial"/>
-          <w:color w:val="0F172A"/>
-          <w:sz w:val="20"/>
-          <w:szCs w:val="20"/>
-        </w:rPr>
-        <w:t xml:space="preserve">Implemented Pandera-validated NBA API ETL with daily warehouse updates plus DuckDB, SQLite, Parquet, and CSV exports.</w:t>
-      </w:r>
-    </w:p>
-    <w:p>
-      <w:pPr>
-        <w:pStyle w:val="ListParagraph"/>
-        <w:numPr>
-          <w:ilvl w:val="0"/>
-          <w:numId w:val="1"/>
-        </w:numPr>
-        <w:spacing w:after="35"/>
-      </w:pPr>
-      <w:r>
-        <w:rPr>
-          <w:rFonts w:ascii="Arial" w:cs="Arial" w:eastAsia="Arial" w:hAnsi="Arial"/>
-          <w:color w:val="0F172A"/>
-          <w:sz w:val="20"/>
-          <w:szCs w:val="20"/>
-        </w:rPr>
-        <w:t xml:space="preserve">Building the next-generation nbadb rebuild with 152 extractor wrappers and 204 generated public star-schema outputs across docs, schema references, and release workflows.</w:t>
-      </w:r>
-    </w:p>
-    <w:p>
-      <w:pPr>
-        <w:pStyle w:val="ListParagraph"/>
-        <w:numPr>
-          <w:ilvl w:val="0"/>
-          <w:numId w:val="1"/>
-        </w:numPr>
-        <w:spacing w:after="35"/>
-      </w:pPr>
-      <w:r>
-        <w:rPr>
-          <w:rFonts w:ascii="Arial" w:cs="Arial" w:eastAsia="Arial" w:hAnsi="Arial"/>
-          <w:color w:val="0F172A"/>
-          <w:sz w:val="20"/>
-          <w:szCs w:val="20"/>
-        </w:rPr>
-        <w:t xml:space="preserve">Published a public sports analytics dataset with 65K+ games and 13M+ play-by-play events across multiple warehouse formats.</w:t>
-      </w:r>
-    </w:p>
-    <w:p>
-      <w:pPr>
-        <w:spacing w:after="45"/>
-      </w:pPr>
-      <w:r>
-        <w:rPr>
-          <w:rFonts w:ascii="Arial" w:cs="Arial" w:eastAsia="Arial" w:hAnsi="Arial"/>
-          <w:b/>
-          <w:bCs/>
-          <w:color w:val="0F172A"/>
-          <w:sz w:val="21"/>
-          <w:szCs w:val="21"/>
-        </w:rPr>
-        <w:t xml:space="preserve">ProxyWhirl</w:t>
-      </w:r>
-      <w:r>
-        <w:rPr>
-          <w:rFonts w:ascii="Arial" w:cs="Arial" w:eastAsia="Arial" w:hAnsi="Arial"/>
-          <w:color w:val="475569"/>
-          <w:sz w:val="18"/>
-          <w:szCs w:val="18"/>
-        </w:rPr>
-        <w:t xml:space="preserve"> | </w:t>
-      </w:r>
-      <w:hyperlink w:history="1" r:id="rIdw5aps5ly9cpichxldmqbc">
-        <w:r>
-          <w:rPr>
-            <w:rFonts w:ascii="Arial" w:cs="Arial" w:eastAsia="Arial" w:hAnsi="Arial"/>
-            <w:color w:val="2563EB"/>
-            <w:sz w:val="20"/>
-            <w:szCs w:val="20"/>
-            <w:u w:val="single" w:color="2563EB"/>
-          </w:rPr>
-          <w:t xml:space="preserve">Live site</w:t>
-        </w:r>
-      </w:hyperlink>
-      <w:r>
-        <w:rPr>
-          <w:rFonts w:ascii="Arial" w:cs="Arial" w:eastAsia="Arial" w:hAnsi="Arial"/>
-          <w:color w:val="475569"/>
-          <w:sz w:val="18"/>
-          <w:szCs w:val="18"/>
-        </w:rPr>
-        <w:t xml:space="preserve"> | </w:t>
-      </w:r>
-      <w:hyperlink w:history="1" r:id="rIdxpdy0-tyvxpum8yt7ps5k">
-        <w:r>
-          <w:rPr>
-            <w:rFonts w:ascii="Arial" w:cs="Arial" w:eastAsia="Arial" w:hAnsi="Arial"/>
-            <w:color w:val="2563EB"/>
-            <w:sz w:val="20"/>
-            <w:szCs w:val="20"/>
-            <w:u w:val="single" w:color="2563EB"/>
-          </w:rPr>
-          <w:t xml:space="preserve">github.com/wyattowalsh/proxywhirl</w:t>
-        </w:r>
-      </w:hyperlink>
-    </w:p>
-    <w:p>
-      <w:pPr>
-        <w:spacing w:after="45"/>
-      </w:pPr>
-      <w:r>
-        <w:rPr>
-          <w:rFonts w:ascii="Arial" w:cs="Arial" w:eastAsia="Arial" w:hAnsi="Arial"/>
-          <w:color w:val="0F172A"/>
-          <w:sz w:val="20"/>
-          <w:szCs w:val="20"/>
-        </w:rPr>
-        <w:t xml:space="preserve">Released rotating proxy toolkit with 9 strategies, 100+ auto-fetched sources, self-healing circuit breakers, and five interfaces for scraping/data workflows.</w:t>
-      </w:r>
-    </w:p>
-    <w:p>
-      <w:pPr>
-        <w:spacing w:after="35"/>
-      </w:pPr>
-      <w:r>
-        <w:rPr>
-          <w:rFonts w:ascii="Arial" w:cs="Arial" w:eastAsia="Arial" w:hAnsi="Arial"/>
-          <w:color w:val="475569"/>
-          <w:sz w:val="20"/>
-          <w:szCs w:val="20"/>
-        </w:rPr>
-        <w:t xml:space="preserve">Stack: Python, SQLite, PyPI</w:t>
-      </w:r>
-    </w:p>
-    <w:p>
-      <w:pPr>
-        <w:pStyle w:val="ListParagraph"/>
-        <w:numPr>
-          <w:ilvl w:val="0"/>
-          <w:numId w:val="1"/>
-        </w:numPr>
-        <w:spacing w:after="35"/>
-      </w:pPr>
-      <w:r>
-        <w:rPr>
-          <w:rFonts w:ascii="Arial" w:cs="Arial" w:eastAsia="Arial" w:hAnsi="Arial"/>
-          <w:color w:val="0F172A"/>
-          <w:sz w:val="20"/>
-          <w:szCs w:val="20"/>
-        </w:rPr>
-        <w:t xml:space="preserve">Implemented 9 proxy rotation strategies with configurable fallback chains, per-source scoring, and performance-based selection.</w:t>
-      </w:r>
-    </w:p>
-    <w:p>
-      <w:pPr>
-        <w:pStyle w:val="ListParagraph"/>
-        <w:numPr>
-          <w:ilvl w:val="0"/>
-          <w:numId w:val="1"/>
-        </w:numPr>
-        <w:spacing w:after="35"/>
-      </w:pPr>
-      <w:r>
-        <w:rPr>
-          <w:rFonts w:ascii="Arial" w:cs="Arial" w:eastAsia="Arial" w:hAnsi="Arial"/>
-          <w:color w:val="0F172A"/>
-          <w:sz w:val="20"/>
-          <w:szCs w:val="20"/>
-        </w:rPr>
-        <w:t xml:space="preserve">Built self-healing validation across 100+ proxy sources with circuit breakers, auto-ejection, recovery promotion, and five interfaces for different scraping workflows.</w:t>
-      </w:r>
-    </w:p>
-    <w:p>
-      <w:pPr>
-        <w:pStyle w:val="ListParagraph"/>
-        <w:numPr>
-          <w:ilvl w:val="0"/>
-          <w:numId w:val="1"/>
-        </w:numPr>
-        <w:spacing w:after="35"/>
-      </w:pPr>
-      <w:r>
-        <w:rPr>
-          <w:rFonts w:ascii="Arial" w:cs="Arial" w:eastAsia="Arial" w:hAnsi="Arial"/>
-          <w:color w:val="0F172A"/>
-          <w:sz w:val="20"/>
-          <w:szCs w:val="20"/>
-        </w:rPr>
-        <w:t xml:space="preserve">Released the toolkit for resilient scraping and data-collection workflows with SQLite-backed state and PyPI distribution.</w:t>
-      </w:r>
-    </w:p>
-    <w:p>
-      <w:pPr>
-        <w:spacing w:after="45"/>
-      </w:pPr>
-      <w:r>
-        <w:rPr>
-          <w:rFonts w:ascii="Arial" w:cs="Arial" w:eastAsia="Arial" w:hAnsi="Arial"/>
-          <w:b/>
-          <w:bCs/>
-          <w:color w:val="0F172A"/>
-          <w:sz w:val="21"/>
-          <w:szCs w:val="21"/>
-        </w:rPr>
-        <w:t xml:space="preserve">AI/ML Web Feeds</w:t>
-      </w:r>
-      <w:r>
-        <w:rPr>
-          <w:rFonts w:ascii="Arial" w:cs="Arial" w:eastAsia="Arial" w:hAnsi="Arial"/>
-          <w:color w:val="475569"/>
-          <w:sz w:val="18"/>
-          <w:szCs w:val="18"/>
-        </w:rPr>
-        <w:t xml:space="preserve"> | </w:t>
-      </w:r>
-      <w:hyperlink w:history="1" r:id="rIddldhjnyzr7f3b59nnx2ql">
-        <w:r>
-          <w:rPr>
-            <w:rFonts w:ascii="Arial" w:cs="Arial" w:eastAsia="Arial" w:hAnsi="Arial"/>
-            <w:color w:val="2563EB"/>
-            <w:sz w:val="20"/>
-            <w:szCs w:val="20"/>
-            <w:u w:val="single" w:color="2563EB"/>
-          </w:rPr>
-          <w:t xml:space="preserve">Live site</w:t>
-        </w:r>
-      </w:hyperlink>
-      <w:r>
-        <w:rPr>
-          <w:rFonts w:ascii="Arial" w:cs="Arial" w:eastAsia="Arial" w:hAnsi="Arial"/>
-          <w:color w:val="475569"/>
-          <w:sz w:val="18"/>
-          <w:szCs w:val="18"/>
-        </w:rPr>
-        <w:t xml:space="preserve"> | </w:t>
-      </w:r>
-      <w:hyperlink w:history="1" r:id="rIdzq7aux5nriklv0f9wal8z">
-        <w:r>
-          <w:rPr>
-            <w:rFonts w:ascii="Arial" w:cs="Arial" w:eastAsia="Arial" w:hAnsi="Arial"/>
-            <w:color w:val="2563EB"/>
-            <w:sz w:val="20"/>
-            <w:szCs w:val="20"/>
-            <w:u w:val="single" w:color="2563EB"/>
-          </w:rPr>
-          <w:t xml:space="preserve">github.com/wyattowalsh/ai-web-feeds</w:t>
-        </w:r>
-      </w:hyperlink>
-    </w:p>
-    <w:p>
-      <w:pPr>
-        <w:spacing w:after="45"/>
-      </w:pPr>
-      <w:r>
-        <w:rPr>
-          <w:rFonts w:ascii="Arial" w:cs="Arial" w:eastAsia="Arial" w:hAnsi="Arial"/>
-          <w:color w:val="0F172A"/>
-          <w:sz w:val="20"/>
-          <w:szCs w:val="20"/>
-        </w:rPr>
-        <w:t xml:space="preserve">Built a curated AI and ML feed platform with typed schemas, HTTP/RSS validation, contributor submission workflows, OPML exports, and documented browse/download surfaces for research discovery.</w:t>
-      </w:r>
-    </w:p>
-    <w:p>
-      <w:pPr>
-        <w:spacing w:after="35"/>
-      </w:pPr>
-      <w:r>
-        <w:rPr>
-          <w:rFonts w:ascii="Arial" w:cs="Arial" w:eastAsia="Arial" w:hAnsi="Arial"/>
-          <w:color w:val="475569"/>
-          <w:sz w:val="20"/>
-          <w:szCs w:val="20"/>
-        </w:rPr>
-        <w:t xml:space="preserve">Stack: Python, Pydantic, SQLModel, YAML, Fumadocs, Vercel</w:t>
-      </w:r>
-    </w:p>
-    <w:p>
-      <w:pPr>
-        <w:pStyle w:val="ListParagraph"/>
-        <w:numPr>
-          <w:ilvl w:val="0"/>
-          <w:numId w:val="1"/>
-        </w:numPr>
-        <w:spacing w:after="35"/>
-      </w:pPr>
-      <w:r>
-        <w:rPr>
-          <w:rFonts w:ascii="Arial" w:cs="Arial" w:eastAsia="Arial" w:hAnsi="Arial"/>
-          <w:color w:val="0F172A"/>
-          <w:sz w:val="20"/>
-          <w:szCs w:val="20"/>
-        </w:rPr>
-        <w:t xml:space="preserve">Defined YAML feed schemas with topic and source-type validation across blogs, papers, and newsletters for reliable feed quality.</w:t>
-      </w:r>
-    </w:p>
-    <w:p>
-      <w:pPr>
-        <w:pStyle w:val="ListParagraph"/>
-        <w:numPr>
-          <w:ilvl w:val="0"/>
-          <w:numId w:val="1"/>
-        </w:numPr>
-        <w:spacing w:after="35"/>
-      </w:pPr>
-      <w:r>
-        <w:rPr>
-          <w:rFonts w:ascii="Arial" w:cs="Arial" w:eastAsia="Arial" w:hAnsi="Arial"/>
-          <w:color w:val="0F172A"/>
-          <w:sz w:val="20"/>
-          <w:szCs w:val="20"/>
-        </w:rPr>
-        <w:t xml:space="preserve">Shipped helper scripts, CI checks, scheduled validation jobs, and a docs-backed submission/review flow for reliable community feed curation.</w:t>
-      </w:r>
-    </w:p>
-    <w:p>
-      <w:pPr>
-        <w:pStyle w:val="ListParagraph"/>
-        <w:numPr>
-          <w:ilvl w:val="0"/>
-          <w:numId w:val="1"/>
-        </w:numPr>
-        <w:spacing w:after="35"/>
-      </w:pPr>
-      <w:r>
-        <w:rPr>
-          <w:rFonts w:ascii="Arial" w:cs="Arial" w:eastAsia="Arial" w:hAnsi="Arial"/>
-          <w:color w:val="0F172A"/>
-          <w:sz w:val="20"/>
-          <w:szCs w:val="20"/>
-        </w:rPr>
-        <w:t xml:space="preserve">Published OPML exports and documented browse/download surfaces for AI and ML research feeds, downstream readers, and offline subscription managers.</w:t>
-      </w:r>
-    </w:p>
-    <w:p>
-      <w:pPr>
-        <w:spacing w:after="45"/>
-      </w:pPr>
-      <w:r>
-        <w:rPr>
-          <w:rFonts w:ascii="Arial" w:cs="Arial" w:eastAsia="Arial" w:hAnsi="Arial"/>
-          <w:b/>
-          <w:bCs/>
-          <w:color w:val="0F172A"/>
-          <w:sz w:val="21"/>
-          <w:szCs w:val="21"/>
-        </w:rPr>
-        <w:t xml:space="preserve">MCP-Crawl4AI</w:t>
-      </w:r>
-      <w:r>
-        <w:rPr>
-          <w:rFonts w:ascii="Arial" w:cs="Arial" w:eastAsia="Arial" w:hAnsi="Arial"/>
-          <w:color w:val="475569"/>
-          <w:sz w:val="18"/>
-          <w:szCs w:val="18"/>
-        </w:rPr>
-        <w:t xml:space="preserve"> | </w:t>
-      </w:r>
-      <w:hyperlink w:history="1" r:id="rIdznegsc0nfm8pvfylskyat">
-        <w:r>
-          <w:rPr>
-            <w:rFonts w:ascii="Arial" w:cs="Arial" w:eastAsia="Arial" w:hAnsi="Arial"/>
-            <w:color w:val="2563EB"/>
-            <w:sz w:val="20"/>
-            <w:szCs w:val="20"/>
-            <w:u w:val="single" w:color="2563EB"/>
-          </w:rPr>
-          <w:t xml:space="preserve">Live site</w:t>
-        </w:r>
-      </w:hyperlink>
-      <w:r>
-        <w:rPr>
-          <w:rFonts w:ascii="Arial" w:cs="Arial" w:eastAsia="Arial" w:hAnsi="Arial"/>
-          <w:color w:val="475569"/>
-          <w:sz w:val="18"/>
-          <w:szCs w:val="18"/>
-        </w:rPr>
-        <w:t xml:space="preserve"> | </w:t>
-      </w:r>
-      <w:hyperlink w:history="1" r:id="rIdmrnbiojetvjz_1hyjw4yn">
-        <w:r>
-          <w:rPr>
-            <w:rFonts w:ascii="Arial" w:cs="Arial" w:eastAsia="Arial" w:hAnsi="Arial"/>
-            <w:color w:val="2563EB"/>
-            <w:sz w:val="20"/>
-            <w:szCs w:val="20"/>
-            <w:u w:val="single" w:color="2563EB"/>
-          </w:rPr>
-          <w:t xml:space="preserve">github.com/wyattowalsh/mcp-crawl4ai</w:t>
-        </w:r>
-      </w:hyperlink>
-    </w:p>
-    <w:p>
-      <w:pPr>
-        <w:spacing w:after="45"/>
-      </w:pPr>
-      <w:r>
-        <w:rPr>
-          <w:rFonts w:ascii="Arial" w:cs="Arial" w:eastAsia="Arial" w:hAnsi="Arial"/>
-          <w:color w:val="0F172A"/>
-          <w:sz w:val="20"/>
-          <w:szCs w:val="20"/>
-        </w:rPr>
-        <w:t xml:space="preserve">Released FastMCP server wrapping Crawl4AI so AI agents can scrape, crawl, manage sessions, and retrieve artifacts through a focused MCP surface with documented stdio and HTTP integration paths.</w:t>
-      </w:r>
-    </w:p>
-    <w:p>
-      <w:pPr>
-        <w:spacing w:after="35"/>
-      </w:pPr>
-      <w:r>
-        <w:rPr>
-          <w:rFonts w:ascii="Arial" w:cs="Arial" w:eastAsia="Arial" w:hAnsi="Arial"/>
-          <w:color w:val="475569"/>
-          <w:sz w:val="20"/>
-          <w:szCs w:val="20"/>
-        </w:rPr>
-        <w:t xml:space="preserve">Stack: Python, FastMCP, Crawl4AI, Playwright, Docker</w:t>
-      </w:r>
-    </w:p>
-    <w:p>
-      <w:pPr>
-        <w:pStyle w:val="ListParagraph"/>
-        <w:numPr>
-          <w:ilvl w:val="0"/>
-          <w:numId w:val="1"/>
-        </w:numPr>
-        <w:spacing w:after="35"/>
-      </w:pPr>
-      <w:r>
-        <w:rPr>
-          <w:rFonts w:ascii="Arial" w:cs="Arial" w:eastAsia="Arial" w:hAnsi="Arial"/>
-          <w:color w:val="0F172A"/>
-          <w:sz w:val="20"/>
-          <w:szCs w:val="20"/>
-        </w:rPr>
-        <w:t xml:space="preserve">Built a FastMCP v3 server with managed headless Chromium, session-aware crawling, and automatic Playwright setup using two runtime dependencies.</w:t>
-      </w:r>
-    </w:p>
-    <w:p>
-      <w:pPr>
-        <w:pStyle w:val="ListParagraph"/>
-        <w:numPr>
-          <w:ilvl w:val="0"/>
-          <w:numId w:val="1"/>
-        </w:numPr>
-        <w:spacing w:after="35"/>
-      </w:pPr>
-      <w:r>
-        <w:rPr>
-          <w:rFonts w:ascii="Arial" w:cs="Arial" w:eastAsia="Arial" w:hAnsi="Arial"/>
-          <w:color w:val="0F172A"/>
-          <w:sz w:val="20"/>
-          <w:szCs w:val="20"/>
-        </w:rPr>
-        <w:t xml:space="preserve">Exposed scrape, crawl, session, and artifact-retrieval workflows with docs, tests, and release-tagged MCP install flows.</w:t>
-      </w:r>
-    </w:p>
-    <w:p>
-      <w:pPr>
-        <w:pStyle w:val="ListParagraph"/>
-        <w:numPr>
-          <w:ilvl w:val="0"/>
-          <w:numId w:val="1"/>
-        </w:numPr>
-        <w:spacing w:after="35"/>
-      </w:pPr>
-      <w:r>
-        <w:rPr>
-          <w:rFonts w:ascii="Arial" w:cs="Arial" w:eastAsia="Arial" w:hAnsi="Arial"/>
-          <w:color w:val="0F172A"/>
-          <w:sz w:val="20"/>
-          <w:szCs w:val="20"/>
-        </w:rPr>
-        <w:t xml:space="preserve">Documented stdio and HTTP integration paths so AI agents can use web crawling through a focused MCP surface.</w:t>
-      </w:r>
-    </w:p>
-    <w:p>
-      <w:pPr>
-        <w:spacing w:after="45"/>
-      </w:pPr>
-      <w:r>
-        <w:rPr>
-          <w:rFonts w:ascii="Arial" w:cs="Arial" w:eastAsia="Arial" w:hAnsi="Arial"/>
-          <w:b/>
-          <w:bCs/>
-          <w:color w:val="0F172A"/>
-          <w:sz w:val="21"/>
-          <w:szCs w:val="21"/>
-        </w:rPr>
-        <w:t xml:space="preserve">Personal Website: w4w.dev</w:t>
-      </w:r>
-      <w:r>
-        <w:rPr>
-          <w:rFonts w:ascii="Arial" w:cs="Arial" w:eastAsia="Arial" w:hAnsi="Arial"/>
-          <w:color w:val="475569"/>
-          <w:sz w:val="18"/>
-          <w:szCs w:val="18"/>
-        </w:rPr>
-        <w:t xml:space="preserve"> | </w:t>
-      </w:r>
-      <w:hyperlink w:history="1" r:id="rIdexaqcefpxzwknfqp2fhcl">
-        <w:r>
-          <w:rPr>
-            <w:rFonts w:ascii="Arial" w:cs="Arial" w:eastAsia="Arial" w:hAnsi="Arial"/>
-            <w:color w:val="2563EB"/>
-            <w:sz w:val="20"/>
-            <w:szCs w:val="20"/>
-            <w:u w:val="single" w:color="2563EB"/>
-          </w:rPr>
-          <w:t xml:space="preserve">Live site</w:t>
-        </w:r>
-      </w:hyperlink>
-      <w:r>
-        <w:rPr>
-          <w:rFonts w:ascii="Arial" w:cs="Arial" w:eastAsia="Arial" w:hAnsi="Arial"/>
-          <w:color w:val="475569"/>
-          <w:sz w:val="18"/>
-          <w:szCs w:val="18"/>
-        </w:rPr>
-        <w:t xml:space="preserve"> | </w:t>
-      </w:r>
-      <w:hyperlink w:history="1" r:id="rIdlcsymbpgo5mjuilvxakfq">
+      <w:hyperlink w:history="1" r:id="rId_rtbomiidfvlc-cdd-l1b">
         <w:r>
           <w:rPr>
             <w:rFonts w:ascii="Arial" w:cs="Arial" w:eastAsia="Arial" w:hAnsi="Arial"/>
@@ -1913,7 +1913,7 @@
       <w:pPr>
         <w:spacing w:after="25"/>
       </w:pPr>
-      <w:hyperlink w:history="1" r:id="rIdtgq6i4h6fjlcjjbq4tuxh">
+      <w:hyperlink w:history="1" r:id="rId5bb2dk9sb5yfh_kk0a4zl">
         <w:r>
           <w:rPr>
             <w:rFonts w:ascii="Arial" w:cs="Arial" w:eastAsia="Arial" w:hAnsi="Arial"/>
@@ -1969,7 +1969,7 @@
       <w:pPr>
         <w:spacing w:after="25"/>
       </w:pPr>
-      <w:hyperlink w:history="1" r:id="rIdqfib6yiccpfjys9ievgxi">
+      <w:hyperlink w:history="1" r:id="rIdyuilkkmz7o-ekq1wt0kkb">
         <w:r>
           <w:rPr>
             <w:rFonts w:ascii="Arial" w:cs="Arial" w:eastAsia="Arial" w:hAnsi="Arial"/>
@@ -2000,7 +2000,7 @@
       <w:pPr>
         <w:spacing w:after="35"/>
       </w:pPr>
-      <w:hyperlink w:history="1" r:id="rId6ai04puo42yvnkewiu8sr">
+      <w:hyperlink w:history="1" r:id="rId_epsfzqamf6sx37bwdpg4">
         <w:r>
           <w:rPr>
             <w:rFonts w:ascii="Arial" w:cs="Arial" w:eastAsia="Arial" w:hAnsi="Arial"/>
@@ -2049,7 +2049,7 @@
       <w:pPr>
         <w:spacing w:after="35"/>
       </w:pPr>
-      <w:hyperlink w:history="1" r:id="rIdpci1-zz6nhxqm9aepgojk">
+      <w:hyperlink w:history="1" r:id="rId7hom2mrx4hujuhluqwoss">
         <w:r>
           <w:rPr>
             <w:rFonts w:ascii="Arial" w:cs="Arial" w:eastAsia="Arial" w:hAnsi="Arial"/>

</xml_diff>

<commit_message>
feat: exhaustive skill popover copy refinement and icon pipeline fixes
- Rewrite 165 resumeContext fields with natural, skill-specific, evidence-backed copy
- Add 17 missing evidence entries to ensure every named project/work has a chip
- Remove generic category-bookkeeping frames and block template phrases in tests
- Replace Python icon with first-party SVG from docs.python.org
- Fix q icon source to proper SVG from code.kx.com
- Fix pandera and python-sdks icons: PNG -> WEBP via byte-signature detection
- Add byte-signature extension detection in sync-skill-icons.ts
- Harden skill-details.test.ts with generic phrase blocking, evidence alignment,
  and icon extension/byte integrity checks
- Update SkillPopover.test.tsx expectations for new AMPS and Gemini copy
- Regenerate public download artifacts
</commit_message>
<xml_diff>
--- a/public/downloads/wyatt-walsh-resume-full.docx
+++ b/public/downloads/wyatt-walsh-resume-full.docx
@@ -7,7 +7,7 @@
         <w:pStyle w:val="Title"/>
         <w:spacing w:after="75"/>
       </w:pPr>
-      <w:hyperlink w:history="1" r:id="rId8wl3e_ih0uh1dtah96cc9">
+      <w:hyperlink w:history="1" r:id="rIdfzq51xyqvxewmf3vwn1y7">
         <w:r>
           <w:rPr>
             <w:rFonts w:ascii="Arial" w:cs="Arial" w:eastAsia="Arial" w:hAnsi="Arial"/>
@@ -40,7 +40,7 @@
       <w:pPr>
         <w:spacing w:after="100"/>
       </w:pPr>
-      <w:hyperlink w:history="1" r:id="rIddyb-ueozfgtk_bcjnis0s">
+      <w:hyperlink w:history="1" r:id="rIddcaefh2ivocte6dwfmv_j">
         <w:r>
           <w:rPr>
             <w:rFonts w:ascii="Arial" w:cs="Arial" w:eastAsia="Arial" w:hAnsi="Arial"/>
@@ -61,7 +61,7 @@
         </w:rPr>
         <w:t xml:space="preserve"> | </w:t>
       </w:r>
-      <w:hyperlink w:history="1" r:id="rIdrtk9g43ltyxswtdrv1eqd">
+      <w:hyperlink w:history="1" r:id="rIdh2gmohlcm_vwgmzxzityf">
         <w:r>
           <w:rPr>
             <w:rFonts w:ascii="Arial" w:cs="Arial" w:eastAsia="Arial" w:hAnsi="Arial"/>
@@ -100,7 +100,7 @@
         </w:rPr>
         <w:t xml:space="preserve"> | </w:t>
       </w:r>
-      <w:hyperlink w:history="1" r:id="rIdpo3sazr1i2tf3xhxbxbze">
+      <w:hyperlink w:history="1" r:id="rIdhhw3bpzffrtredlwqt6kj">
         <w:r>
           <w:rPr>
             <w:rFonts w:ascii="Arial" w:cs="Arial" w:eastAsia="Arial" w:hAnsi="Arial"/>
@@ -121,7 +121,7 @@
         </w:rPr>
         <w:t xml:space="preserve"> | </w:t>
       </w:r>
-      <w:hyperlink w:history="1" r:id="rIdjuhwgjbpcuzhygdt3doqu">
+      <w:hyperlink w:history="1" r:id="rIdmtxw1i97gkuvj689eonfi">
         <w:r>
           <w:rPr>
             <w:rFonts w:ascii="Arial" w:cs="Arial" w:eastAsia="Arial" w:hAnsi="Arial"/>
@@ -189,7 +189,7 @@
         </w:rPr>
         <w:t xml:space="preserve"> | </w:t>
       </w:r>
-      <w:hyperlink w:history="1" r:id="rIdsjys-5-e4okglwcsvtjvl">
+      <w:hyperlink w:history="1" r:id="rIdvy05iwg-ywpmbpxkps9le">
         <w:r>
           <w:rPr>
             <w:rFonts w:ascii="Arial" w:cs="Arial" w:eastAsia="Arial" w:hAnsi="Arial"/>
@@ -352,7 +352,7 @@
         </w:rPr>
         <w:t xml:space="preserve"> | </w:t>
       </w:r>
-      <w:hyperlink w:history="1" r:id="rIdlit7kfxmviiwaeubklgok">
+      <w:hyperlink w:history="1" r:id="rIdkz35rs4r0bwmulmg_3ecc">
         <w:r>
           <w:rPr>
             <w:rFonts w:ascii="Arial" w:cs="Arial" w:eastAsia="Arial" w:hAnsi="Arial"/>
@@ -750,7 +750,7 @@
         </w:rPr>
         <w:t xml:space="preserve"> | </w:t>
       </w:r>
-      <w:hyperlink w:history="1" r:id="rIdw9stg0wuyvgoykpgpmzzf">
+      <w:hyperlink w:history="1" r:id="rId3wsdswmb_z9h_dt7qhwgq">
         <w:r>
           <w:rPr>
             <w:rFonts w:ascii="Arial" w:cs="Arial" w:eastAsia="Arial" w:hAnsi="Arial"/>
@@ -1021,7 +1021,7 @@
         </w:rPr>
         <w:t xml:space="preserve"> | </w:t>
       </w:r>
-      <w:hyperlink w:history="1" r:id="rId6fald0wahxvaisxxym3dd">
+      <w:hyperlink w:history="1" r:id="rIdn2uyvc703qyjr27nuecb_">
         <w:r>
           <w:rPr>
             <w:rFonts w:ascii="Arial" w:cs="Arial" w:eastAsia="Arial" w:hAnsi="Arial"/>
@@ -1042,7 +1042,7 @@
         </w:rPr>
         <w:t xml:space="preserve"> | </w:t>
       </w:r>
-      <w:hyperlink w:history="1" r:id="rIdqzvckmdjl8pcgeekgzwqn">
+      <w:hyperlink w:history="1" r:id="rIdcpbn5xjzdvwyuq0xreugk">
         <w:r>
           <w:rPr>
             <w:rFonts w:ascii="Arial" w:cs="Arial" w:eastAsia="Arial" w:hAnsi="Arial"/>
@@ -1164,7 +1164,7 @@
         </w:rPr>
         <w:t xml:space="preserve"> | </w:t>
       </w:r>
-      <w:hyperlink w:history="1" r:id="rId0h_oqq3yfcusd1lqltb1g">
+      <w:hyperlink w:history="1" r:id="rId7zljzyyemyrz1vutdpuca">
         <w:r>
           <w:rPr>
             <w:rFonts w:ascii="Arial" w:cs="Arial" w:eastAsia="Arial" w:hAnsi="Arial"/>
@@ -1185,7 +1185,7 @@
         </w:rPr>
         <w:t xml:space="preserve"> | </w:t>
       </w:r>
-      <w:hyperlink w:history="1" r:id="rIddotbtdmtvvcmf-rne6prl">
+      <w:hyperlink w:history="1" r:id="rIdpo3l8mtxmulrud79xo-sq">
         <w:r>
           <w:rPr>
             <w:rFonts w:ascii="Arial" w:cs="Arial" w:eastAsia="Arial" w:hAnsi="Arial"/>
@@ -1206,7 +1206,7 @@
         </w:rPr>
         <w:t xml:space="preserve"> | </w:t>
       </w:r>
-      <w:hyperlink w:history="1" r:id="rIdopze_fokiprlbyxgwba49">
+      <w:hyperlink w:history="1" r:id="rIdtsk54-pwbpvwmd5-j0sv5">
         <w:r>
           <w:rPr>
             <w:rFonts w:ascii="Arial" w:cs="Arial" w:eastAsia="Arial" w:hAnsi="Arial"/>
@@ -1328,7 +1328,7 @@
         </w:rPr>
         <w:t xml:space="preserve"> | </w:t>
       </w:r>
-      <w:hyperlink w:history="1" r:id="rIdedae7fsesdwvgplkwgvvw">
+      <w:hyperlink w:history="1" r:id="rId13ailndqekbkg1wj-8or0">
         <w:r>
           <w:rPr>
             <w:rFonts w:ascii="Arial" w:cs="Arial" w:eastAsia="Arial" w:hAnsi="Arial"/>
@@ -1349,7 +1349,7 @@
         </w:rPr>
         <w:t xml:space="preserve"> | </w:t>
       </w:r>
-      <w:hyperlink w:history="1" r:id="rIdfkqtjwf8eidby5nrakhzv">
+      <w:hyperlink w:history="1" r:id="rIdfup-nw9gcyru2nnuedssk">
         <w:r>
           <w:rPr>
             <w:rFonts w:ascii="Arial" w:cs="Arial" w:eastAsia="Arial" w:hAnsi="Arial"/>
@@ -1471,7 +1471,7 @@
         </w:rPr>
         <w:t xml:space="preserve"> | </w:t>
       </w:r>
-      <w:hyperlink w:history="1" r:id="rIdo9s3d5yv1ggfdsmme-3eh">
+      <w:hyperlink w:history="1" r:id="rIdjkxy41ox5qng_z7lgplk_">
         <w:r>
           <w:rPr>
             <w:rFonts w:ascii="Arial" w:cs="Arial" w:eastAsia="Arial" w:hAnsi="Arial"/>
@@ -1492,7 +1492,7 @@
         </w:rPr>
         <w:t xml:space="preserve"> | </w:t>
       </w:r>
-      <w:hyperlink w:history="1" r:id="rIdau-lwnrchgdajtevytjgq">
+      <w:hyperlink w:history="1" r:id="rIdrywpgpw1ojkntmkzyvpag">
         <w:r>
           <w:rPr>
             <w:rFonts w:ascii="Arial" w:cs="Arial" w:eastAsia="Arial" w:hAnsi="Arial"/>
@@ -1614,7 +1614,7 @@
         </w:rPr>
         <w:t xml:space="preserve"> | </w:t>
       </w:r>
-      <w:hyperlink w:history="1" r:id="rIdotgcctix0ps_zmzoewk7y">
+      <w:hyperlink w:history="1" r:id="rIdjyhri17fg9kp-zz0cc0tm">
         <w:r>
           <w:rPr>
             <w:rFonts w:ascii="Arial" w:cs="Arial" w:eastAsia="Arial" w:hAnsi="Arial"/>
@@ -1635,7 +1635,7 @@
         </w:rPr>
         <w:t xml:space="preserve"> | </w:t>
       </w:r>
-      <w:hyperlink w:history="1" r:id="rIdjwrqrapqnfz6ji0pjlgui">
+      <w:hyperlink w:history="1" r:id="rIdkoahajmv-rnlgkcldyr_z">
         <w:r>
           <w:rPr>
             <w:rFonts w:ascii="Arial" w:cs="Arial" w:eastAsia="Arial" w:hAnsi="Arial"/>
@@ -1757,7 +1757,7 @@
         </w:rPr>
         <w:t xml:space="preserve"> | </w:t>
       </w:r>
-      <w:hyperlink w:history="1" r:id="rIde4bws6apmfhlrat2_y2zh">
+      <w:hyperlink w:history="1" r:id="rIdhhaf0cnb8wricbj9bepp8">
         <w:r>
           <w:rPr>
             <w:rFonts w:ascii="Arial" w:cs="Arial" w:eastAsia="Arial" w:hAnsi="Arial"/>
@@ -1778,7 +1778,7 @@
         </w:rPr>
         <w:t xml:space="preserve"> | </w:t>
       </w:r>
-      <w:hyperlink w:history="1" r:id="rId_rtbomiidfvlc-cdd-l1b">
+      <w:hyperlink w:history="1" r:id="rId0n0i1w1cji623ljyncrv7">
         <w:r>
           <w:rPr>
             <w:rFonts w:ascii="Arial" w:cs="Arial" w:eastAsia="Arial" w:hAnsi="Arial"/>
@@ -1913,7 +1913,7 @@
       <w:pPr>
         <w:spacing w:after="25"/>
       </w:pPr>
-      <w:hyperlink w:history="1" r:id="rId5bb2dk9sb5yfh_kk0a4zl">
+      <w:hyperlink w:history="1" r:id="rIdnqdkrzh9todbybr16ve3w">
         <w:r>
           <w:rPr>
             <w:rFonts w:ascii="Arial" w:cs="Arial" w:eastAsia="Arial" w:hAnsi="Arial"/>
@@ -1969,7 +1969,7 @@
       <w:pPr>
         <w:spacing w:after="25"/>
       </w:pPr>
-      <w:hyperlink w:history="1" r:id="rIdyuilkkmz7o-ekq1wt0kkb">
+      <w:hyperlink w:history="1" r:id="rIdp3-ksqla77w4odtkn-fnb">
         <w:r>
           <w:rPr>
             <w:rFonts w:ascii="Arial" w:cs="Arial" w:eastAsia="Arial" w:hAnsi="Arial"/>
@@ -2000,7 +2000,7 @@
       <w:pPr>
         <w:spacing w:after="35"/>
       </w:pPr>
-      <w:hyperlink w:history="1" r:id="rId_epsfzqamf6sx37bwdpg4">
+      <w:hyperlink w:history="1" r:id="rIddf5derge9wtff2jchphdk">
         <w:r>
           <w:rPr>
             <w:rFonts w:ascii="Arial" w:cs="Arial" w:eastAsia="Arial" w:hAnsi="Arial"/>
@@ -2049,7 +2049,7 @@
       <w:pPr>
         <w:spacing w:after="35"/>
       </w:pPr>
-      <w:hyperlink w:history="1" r:id="rId7hom2mrx4hujuhluqwoss">
+      <w:hyperlink w:history="1" r:id="rIdlmrsw8ci6blvclppkwkhz">
         <w:r>
           <w:rPr>
             <w:rFonts w:ascii="Arial" w:cs="Arial" w:eastAsia="Arial" w:hAnsi="Arial"/>

</xml_diff>

<commit_message>
fix: tighten skill icon assets
</commit_message>
<xml_diff>
--- a/public/downloads/wyatt-walsh-resume-full.docx
+++ b/public/downloads/wyatt-walsh-resume-full.docx
@@ -7,7 +7,7 @@
         <w:pStyle w:val="Title"/>
         <w:spacing w:after="75"/>
       </w:pPr>
-      <w:hyperlink w:history="1" r:id="rIdfzq51xyqvxewmf3vwn1y7">
+      <w:hyperlink w:history="1" r:id="rIdip-y2hujb_dnw9lv4yzmm">
         <w:r>
           <w:rPr>
             <w:rFonts w:ascii="Arial" w:cs="Arial" w:eastAsia="Arial" w:hAnsi="Arial"/>
@@ -40,7 +40,7 @@
       <w:pPr>
         <w:spacing w:after="100"/>
       </w:pPr>
-      <w:hyperlink w:history="1" r:id="rIddcaefh2ivocte6dwfmv_j">
+      <w:hyperlink w:history="1" r:id="rIdhtpypzsvyunf8awovsyrp">
         <w:r>
           <w:rPr>
             <w:rFonts w:ascii="Arial" w:cs="Arial" w:eastAsia="Arial" w:hAnsi="Arial"/>
@@ -61,7 +61,7 @@
         </w:rPr>
         <w:t xml:space="preserve"> | </w:t>
       </w:r>
-      <w:hyperlink w:history="1" r:id="rIdh2gmohlcm_vwgmzxzityf">
+      <w:hyperlink w:history="1" r:id="rIdz4v9fctlswodcfsgxaa2p">
         <w:r>
           <w:rPr>
             <w:rFonts w:ascii="Arial" w:cs="Arial" w:eastAsia="Arial" w:hAnsi="Arial"/>
@@ -100,7 +100,7 @@
         </w:rPr>
         <w:t xml:space="preserve"> | </w:t>
       </w:r>
-      <w:hyperlink w:history="1" r:id="rIdhhw3bpzffrtredlwqt6kj">
+      <w:hyperlink w:history="1" r:id="rIdgrd66runx1vruev3gkpgh">
         <w:r>
           <w:rPr>
             <w:rFonts w:ascii="Arial" w:cs="Arial" w:eastAsia="Arial" w:hAnsi="Arial"/>
@@ -121,7 +121,7 @@
         </w:rPr>
         <w:t xml:space="preserve"> | </w:t>
       </w:r>
-      <w:hyperlink w:history="1" r:id="rIdmtxw1i97gkuvj689eonfi">
+      <w:hyperlink w:history="1" r:id="rIdlrqexecc-1wmje396a0ar">
         <w:r>
           <w:rPr>
             <w:rFonts w:ascii="Arial" w:cs="Arial" w:eastAsia="Arial" w:hAnsi="Arial"/>
@@ -189,7 +189,7 @@
         </w:rPr>
         <w:t xml:space="preserve"> | </w:t>
       </w:r>
-      <w:hyperlink w:history="1" r:id="rIdvy05iwg-ywpmbpxkps9le">
+      <w:hyperlink w:history="1" r:id="rIdnkakuglcdvdfflrpawpsb">
         <w:r>
           <w:rPr>
             <w:rFonts w:ascii="Arial" w:cs="Arial" w:eastAsia="Arial" w:hAnsi="Arial"/>
@@ -352,7 +352,7 @@
         </w:rPr>
         <w:t xml:space="preserve"> | </w:t>
       </w:r>
-      <w:hyperlink w:history="1" r:id="rIdkz35rs4r0bwmulmg_3ecc">
+      <w:hyperlink w:history="1" r:id="rIdqwile8jllcwsvfodplrqg">
         <w:r>
           <w:rPr>
             <w:rFonts w:ascii="Arial" w:cs="Arial" w:eastAsia="Arial" w:hAnsi="Arial"/>
@@ -750,7 +750,7 @@
         </w:rPr>
         <w:t xml:space="preserve"> | </w:t>
       </w:r>
-      <w:hyperlink w:history="1" r:id="rId3wsdswmb_z9h_dt7qhwgq">
+      <w:hyperlink w:history="1" r:id="rIdruvaaaz8aezjxbo1eki7r">
         <w:r>
           <w:rPr>
             <w:rFonts w:ascii="Arial" w:cs="Arial" w:eastAsia="Arial" w:hAnsi="Arial"/>
@@ -1021,7 +1021,7 @@
         </w:rPr>
         <w:t xml:space="preserve"> | </w:t>
       </w:r>
-      <w:hyperlink w:history="1" r:id="rIdn2uyvc703qyjr27nuecb_">
+      <w:hyperlink w:history="1" r:id="rIdxnprjylp6baq7mnham7hn">
         <w:r>
           <w:rPr>
             <w:rFonts w:ascii="Arial" w:cs="Arial" w:eastAsia="Arial" w:hAnsi="Arial"/>
@@ -1042,7 +1042,7 @@
         </w:rPr>
         <w:t xml:space="preserve"> | </w:t>
       </w:r>
-      <w:hyperlink w:history="1" r:id="rIdcpbn5xjzdvwyuq0xreugk">
+      <w:hyperlink w:history="1" r:id="rIdjbljqusl8beulmbeo-rdk">
         <w:r>
           <w:rPr>
             <w:rFonts w:ascii="Arial" w:cs="Arial" w:eastAsia="Arial" w:hAnsi="Arial"/>
@@ -1164,7 +1164,7 @@
         </w:rPr>
         <w:t xml:space="preserve"> | </w:t>
       </w:r>
-      <w:hyperlink w:history="1" r:id="rId7zljzyyemyrz1vutdpuca">
+      <w:hyperlink w:history="1" r:id="rIdti7f1ghnwvkhwzft5sagy">
         <w:r>
           <w:rPr>
             <w:rFonts w:ascii="Arial" w:cs="Arial" w:eastAsia="Arial" w:hAnsi="Arial"/>
@@ -1185,7 +1185,7 @@
         </w:rPr>
         <w:t xml:space="preserve"> | </w:t>
       </w:r>
-      <w:hyperlink w:history="1" r:id="rIdpo3l8mtxmulrud79xo-sq">
+      <w:hyperlink w:history="1" r:id="rIdv_qxtqliopasp12t3m5sh">
         <w:r>
           <w:rPr>
             <w:rFonts w:ascii="Arial" w:cs="Arial" w:eastAsia="Arial" w:hAnsi="Arial"/>
@@ -1206,7 +1206,7 @@
         </w:rPr>
         <w:t xml:space="preserve"> | </w:t>
       </w:r>
-      <w:hyperlink w:history="1" r:id="rIdtsk54-pwbpvwmd5-j0sv5">
+      <w:hyperlink w:history="1" r:id="rIddpg1j8avwccvtjuut98tm">
         <w:r>
           <w:rPr>
             <w:rFonts w:ascii="Arial" w:cs="Arial" w:eastAsia="Arial" w:hAnsi="Arial"/>
@@ -1328,7 +1328,7 @@
         </w:rPr>
         <w:t xml:space="preserve"> | </w:t>
       </w:r>
-      <w:hyperlink w:history="1" r:id="rId13ailndqekbkg1wj-8or0">
+      <w:hyperlink w:history="1" r:id="rIdbiehsxo-i_3a8chp3e7so">
         <w:r>
           <w:rPr>
             <w:rFonts w:ascii="Arial" w:cs="Arial" w:eastAsia="Arial" w:hAnsi="Arial"/>
@@ -1349,7 +1349,7 @@
         </w:rPr>
         <w:t xml:space="preserve"> | </w:t>
       </w:r>
-      <w:hyperlink w:history="1" r:id="rIdfup-nw9gcyru2nnuedssk">
+      <w:hyperlink w:history="1" r:id="rIdzsa2aowdxnamddxlqiwfu">
         <w:r>
           <w:rPr>
             <w:rFonts w:ascii="Arial" w:cs="Arial" w:eastAsia="Arial" w:hAnsi="Arial"/>
@@ -1471,7 +1471,7 @@
         </w:rPr>
         <w:t xml:space="preserve"> | </w:t>
       </w:r>
-      <w:hyperlink w:history="1" r:id="rIdjkxy41ox5qng_z7lgplk_">
+      <w:hyperlink w:history="1" r:id="rId9t30rf_ttavbsntlw7o89">
         <w:r>
           <w:rPr>
             <w:rFonts w:ascii="Arial" w:cs="Arial" w:eastAsia="Arial" w:hAnsi="Arial"/>
@@ -1492,7 +1492,7 @@
         </w:rPr>
         <w:t xml:space="preserve"> | </w:t>
       </w:r>
-      <w:hyperlink w:history="1" r:id="rIdrywpgpw1ojkntmkzyvpag">
+      <w:hyperlink w:history="1" r:id="rIdafzpw6wo3jen90whdvlw_">
         <w:r>
           <w:rPr>
             <w:rFonts w:ascii="Arial" w:cs="Arial" w:eastAsia="Arial" w:hAnsi="Arial"/>
@@ -1614,7 +1614,7 @@
         </w:rPr>
         <w:t xml:space="preserve"> | </w:t>
       </w:r>
-      <w:hyperlink w:history="1" r:id="rIdjyhri17fg9kp-zz0cc0tm">
+      <w:hyperlink w:history="1" r:id="rIddqc6r25xhhsh51ed2vk7m">
         <w:r>
           <w:rPr>
             <w:rFonts w:ascii="Arial" w:cs="Arial" w:eastAsia="Arial" w:hAnsi="Arial"/>
@@ -1635,7 +1635,7 @@
         </w:rPr>
         <w:t xml:space="preserve"> | </w:t>
       </w:r>
-      <w:hyperlink w:history="1" r:id="rIdkoahajmv-rnlgkcldyr_z">
+      <w:hyperlink w:history="1" r:id="rIdi5udihgay-hwj_gqvwnnu">
         <w:r>
           <w:rPr>
             <w:rFonts w:ascii="Arial" w:cs="Arial" w:eastAsia="Arial" w:hAnsi="Arial"/>
@@ -1757,7 +1757,7 @@
         </w:rPr>
         <w:t xml:space="preserve"> | </w:t>
       </w:r>
-      <w:hyperlink w:history="1" r:id="rIdhhaf0cnb8wricbj9bepp8">
+      <w:hyperlink w:history="1" r:id="rIdxm-vdr1nhigubiidjsldl">
         <w:r>
           <w:rPr>
             <w:rFonts w:ascii="Arial" w:cs="Arial" w:eastAsia="Arial" w:hAnsi="Arial"/>
@@ -1778,7 +1778,7 @@
         </w:rPr>
         <w:t xml:space="preserve"> | </w:t>
       </w:r>
-      <w:hyperlink w:history="1" r:id="rId0n0i1w1cji623ljyncrv7">
+      <w:hyperlink w:history="1" r:id="rIdclvlm5cnwt13di2hidkku">
         <w:r>
           <w:rPr>
             <w:rFonts w:ascii="Arial" w:cs="Arial" w:eastAsia="Arial" w:hAnsi="Arial"/>
@@ -1913,7 +1913,7 @@
       <w:pPr>
         <w:spacing w:after="25"/>
       </w:pPr>
-      <w:hyperlink w:history="1" r:id="rIdnqdkrzh9todbybr16ve3w">
+      <w:hyperlink w:history="1" r:id="rIdnqovqwo2ewg1u65ute37v">
         <w:r>
           <w:rPr>
             <w:rFonts w:ascii="Arial" w:cs="Arial" w:eastAsia="Arial" w:hAnsi="Arial"/>
@@ -1969,7 +1969,7 @@
       <w:pPr>
         <w:spacing w:after="25"/>
       </w:pPr>
-      <w:hyperlink w:history="1" r:id="rIdp3-ksqla77w4odtkn-fnb">
+      <w:hyperlink w:history="1" r:id="rIdzvzg8910fb8bpvygsz9qn">
         <w:r>
           <w:rPr>
             <w:rFonts w:ascii="Arial" w:cs="Arial" w:eastAsia="Arial" w:hAnsi="Arial"/>
@@ -2000,7 +2000,7 @@
       <w:pPr>
         <w:spacing w:after="35"/>
       </w:pPr>
-      <w:hyperlink w:history="1" r:id="rIddf5derge9wtff2jchphdk">
+      <w:hyperlink w:history="1" r:id="rId9tk1yyebmuhamfbtetddu">
         <w:r>
           <w:rPr>
             <w:rFonts w:ascii="Arial" w:cs="Arial" w:eastAsia="Arial" w:hAnsi="Arial"/>
@@ -2049,7 +2049,7 @@
       <w:pPr>
         <w:spacing w:after="35"/>
       </w:pPr>
-      <w:hyperlink w:history="1" r:id="rIdlmrsw8ci6blvclppkwkhz">
+      <w:hyperlink w:history="1" r:id="rIdrqfg6ew18dc4yv-tnbmat">
         <w:r>
           <w:rPr>
             <w:rFonts w:ascii="Arial" w:cs="Arial" w:eastAsia="Arial" w:hAnsi="Arial"/>

</xml_diff>

<commit_message>
refactor: simplify skill popover data
</commit_message>
<xml_diff>
--- a/public/downloads/wyatt-walsh-resume-full.docx
+++ b/public/downloads/wyatt-walsh-resume-full.docx
@@ -7,7 +7,7 @@
         <w:pStyle w:val="Title"/>
         <w:spacing w:after="75"/>
       </w:pPr>
-      <w:hyperlink w:history="1" r:id="rIdip-y2hujb_dnw9lv4yzmm">
+      <w:hyperlink w:history="1" r:id="rIdhotpoqgznpe0fjzaesj32">
         <w:r>
           <w:rPr>
             <w:rFonts w:ascii="Arial" w:cs="Arial" w:eastAsia="Arial" w:hAnsi="Arial"/>
@@ -40,7 +40,7 @@
       <w:pPr>
         <w:spacing w:after="100"/>
       </w:pPr>
-      <w:hyperlink w:history="1" r:id="rIdhtpypzsvyunf8awovsyrp">
+      <w:hyperlink w:history="1" r:id="rId1pu81g4ot0xuvmvpkoqvh">
         <w:r>
           <w:rPr>
             <w:rFonts w:ascii="Arial" w:cs="Arial" w:eastAsia="Arial" w:hAnsi="Arial"/>
@@ -61,7 +61,7 @@
         </w:rPr>
         <w:t xml:space="preserve"> | </w:t>
       </w:r>
-      <w:hyperlink w:history="1" r:id="rIdz4v9fctlswodcfsgxaa2p">
+      <w:hyperlink w:history="1" r:id="rIdhujskvrtec4ngilfqsrmc">
         <w:r>
           <w:rPr>
             <w:rFonts w:ascii="Arial" w:cs="Arial" w:eastAsia="Arial" w:hAnsi="Arial"/>
@@ -100,7 +100,7 @@
         </w:rPr>
         <w:t xml:space="preserve"> | </w:t>
       </w:r>
-      <w:hyperlink w:history="1" r:id="rIdgrd66runx1vruev3gkpgh">
+      <w:hyperlink w:history="1" r:id="rIdrj1tjxxrjlmzbvk8vwrem">
         <w:r>
           <w:rPr>
             <w:rFonts w:ascii="Arial" w:cs="Arial" w:eastAsia="Arial" w:hAnsi="Arial"/>
@@ -121,7 +121,7 @@
         </w:rPr>
         <w:t xml:space="preserve"> | </w:t>
       </w:r>
-      <w:hyperlink w:history="1" r:id="rIdlrqexecc-1wmje396a0ar">
+      <w:hyperlink w:history="1" r:id="rIdkgdgccsm8imtuhazt8umr">
         <w:r>
           <w:rPr>
             <w:rFonts w:ascii="Arial" w:cs="Arial" w:eastAsia="Arial" w:hAnsi="Arial"/>
@@ -189,7 +189,7 @@
         </w:rPr>
         <w:t xml:space="preserve"> | </w:t>
       </w:r>
-      <w:hyperlink w:history="1" r:id="rIdnkakuglcdvdfflrpawpsb">
+      <w:hyperlink w:history="1" r:id="rIdvwxrua_0xmgpqcx0tso5i">
         <w:r>
           <w:rPr>
             <w:rFonts w:ascii="Arial" w:cs="Arial" w:eastAsia="Arial" w:hAnsi="Arial"/>
@@ -352,7 +352,7 @@
         </w:rPr>
         <w:t xml:space="preserve"> | </w:t>
       </w:r>
-      <w:hyperlink w:history="1" r:id="rIdqwile8jllcwsvfodplrqg">
+      <w:hyperlink w:history="1" r:id="rIdv2z6g1djs0fdngtqaggof">
         <w:r>
           <w:rPr>
             <w:rFonts w:ascii="Arial" w:cs="Arial" w:eastAsia="Arial" w:hAnsi="Arial"/>
@@ -750,7 +750,7 @@
         </w:rPr>
         <w:t xml:space="preserve"> | </w:t>
       </w:r>
-      <w:hyperlink w:history="1" r:id="rIdruvaaaz8aezjxbo1eki7r">
+      <w:hyperlink w:history="1" r:id="rIdfm5fir9frw_4iov-sa4ak">
         <w:r>
           <w:rPr>
             <w:rFonts w:ascii="Arial" w:cs="Arial" w:eastAsia="Arial" w:hAnsi="Arial"/>
@@ -1021,7 +1021,7 @@
         </w:rPr>
         <w:t xml:space="preserve"> | </w:t>
       </w:r>
-      <w:hyperlink w:history="1" r:id="rIdxnprjylp6baq7mnham7hn">
+      <w:hyperlink w:history="1" r:id="rIdzwxfyjneedlrcnx5oau75">
         <w:r>
           <w:rPr>
             <w:rFonts w:ascii="Arial" w:cs="Arial" w:eastAsia="Arial" w:hAnsi="Arial"/>
@@ -1042,7 +1042,7 @@
         </w:rPr>
         <w:t xml:space="preserve"> | </w:t>
       </w:r>
-      <w:hyperlink w:history="1" r:id="rIdjbljqusl8beulmbeo-rdk">
+      <w:hyperlink w:history="1" r:id="rIdmlsbosj2mklwtazeqybst">
         <w:r>
           <w:rPr>
             <w:rFonts w:ascii="Arial" w:cs="Arial" w:eastAsia="Arial" w:hAnsi="Arial"/>
@@ -1164,7 +1164,7 @@
         </w:rPr>
         <w:t xml:space="preserve"> | </w:t>
       </w:r>
-      <w:hyperlink w:history="1" r:id="rIdti7f1ghnwvkhwzft5sagy">
+      <w:hyperlink w:history="1" r:id="rIdscws-aonzrfykkazixun4">
         <w:r>
           <w:rPr>
             <w:rFonts w:ascii="Arial" w:cs="Arial" w:eastAsia="Arial" w:hAnsi="Arial"/>
@@ -1185,7 +1185,7 @@
         </w:rPr>
         <w:t xml:space="preserve"> | </w:t>
       </w:r>
-      <w:hyperlink w:history="1" r:id="rIdv_qxtqliopasp12t3m5sh">
+      <w:hyperlink w:history="1" r:id="rIdpxfssb9gbzh6stydgcp6f">
         <w:r>
           <w:rPr>
             <w:rFonts w:ascii="Arial" w:cs="Arial" w:eastAsia="Arial" w:hAnsi="Arial"/>
@@ -1206,7 +1206,7 @@
         </w:rPr>
         <w:t xml:space="preserve"> | </w:t>
       </w:r>
-      <w:hyperlink w:history="1" r:id="rIddpg1j8avwccvtjuut98tm">
+      <w:hyperlink w:history="1" r:id="rIdbldpvvv5xqcv98hia50nj">
         <w:r>
           <w:rPr>
             <w:rFonts w:ascii="Arial" w:cs="Arial" w:eastAsia="Arial" w:hAnsi="Arial"/>
@@ -1328,7 +1328,7 @@
         </w:rPr>
         <w:t xml:space="preserve"> | </w:t>
       </w:r>
-      <w:hyperlink w:history="1" r:id="rIdbiehsxo-i_3a8chp3e7so">
+      <w:hyperlink w:history="1" r:id="rIdvj4k-ttaqu3rnzenpq0zf">
         <w:r>
           <w:rPr>
             <w:rFonts w:ascii="Arial" w:cs="Arial" w:eastAsia="Arial" w:hAnsi="Arial"/>
@@ -1349,7 +1349,7 @@
         </w:rPr>
         <w:t xml:space="preserve"> | </w:t>
       </w:r>
-      <w:hyperlink w:history="1" r:id="rIdzsa2aowdxnamddxlqiwfu">
+      <w:hyperlink w:history="1" r:id="rIdzgu4thay4qhf-smhb1nfx">
         <w:r>
           <w:rPr>
             <w:rFonts w:ascii="Arial" w:cs="Arial" w:eastAsia="Arial" w:hAnsi="Arial"/>
@@ -1471,7 +1471,7 @@
         </w:rPr>
         <w:t xml:space="preserve"> | </w:t>
       </w:r>
-      <w:hyperlink w:history="1" r:id="rId9t30rf_ttavbsntlw7o89">
+      <w:hyperlink w:history="1" r:id="rId5rihfrvjc44ggwrxclsky">
         <w:r>
           <w:rPr>
             <w:rFonts w:ascii="Arial" w:cs="Arial" w:eastAsia="Arial" w:hAnsi="Arial"/>
@@ -1492,7 +1492,7 @@
         </w:rPr>
         <w:t xml:space="preserve"> | </w:t>
       </w:r>
-      <w:hyperlink w:history="1" r:id="rIdafzpw6wo3jen90whdvlw_">
+      <w:hyperlink w:history="1" r:id="rIdyoxfvakbztqtjuhgb-ujc">
         <w:r>
           <w:rPr>
             <w:rFonts w:ascii="Arial" w:cs="Arial" w:eastAsia="Arial" w:hAnsi="Arial"/>
@@ -1614,7 +1614,7 @@
         </w:rPr>
         <w:t xml:space="preserve"> | </w:t>
       </w:r>
-      <w:hyperlink w:history="1" r:id="rIddqc6r25xhhsh51ed2vk7m">
+      <w:hyperlink w:history="1" r:id="rIdkveysoqgs1mpah-7co8wp">
         <w:r>
           <w:rPr>
             <w:rFonts w:ascii="Arial" w:cs="Arial" w:eastAsia="Arial" w:hAnsi="Arial"/>
@@ -1635,7 +1635,7 @@
         </w:rPr>
         <w:t xml:space="preserve"> | </w:t>
       </w:r>
-      <w:hyperlink w:history="1" r:id="rIdi5udihgay-hwj_gqvwnnu">
+      <w:hyperlink w:history="1" r:id="rIdstdhbisetvineivacoj_b">
         <w:r>
           <w:rPr>
             <w:rFonts w:ascii="Arial" w:cs="Arial" w:eastAsia="Arial" w:hAnsi="Arial"/>
@@ -1757,7 +1757,7 @@
         </w:rPr>
         <w:t xml:space="preserve"> | </w:t>
       </w:r>
-      <w:hyperlink w:history="1" r:id="rIdxm-vdr1nhigubiidjsldl">
+      <w:hyperlink w:history="1" r:id="rIds0ixubg-kmi9cjkwbm-3y">
         <w:r>
           <w:rPr>
             <w:rFonts w:ascii="Arial" w:cs="Arial" w:eastAsia="Arial" w:hAnsi="Arial"/>
@@ -1778,7 +1778,7 @@
         </w:rPr>
         <w:t xml:space="preserve"> | </w:t>
       </w:r>
-      <w:hyperlink w:history="1" r:id="rIdclvlm5cnwt13di2hidkku">
+      <w:hyperlink w:history="1" r:id="rId5pneqxffzwygryqg29dkj">
         <w:r>
           <w:rPr>
             <w:rFonts w:ascii="Arial" w:cs="Arial" w:eastAsia="Arial" w:hAnsi="Arial"/>
@@ -1913,7 +1913,7 @@
       <w:pPr>
         <w:spacing w:after="25"/>
       </w:pPr>
-      <w:hyperlink w:history="1" r:id="rIdnqovqwo2ewg1u65ute37v">
+      <w:hyperlink w:history="1" r:id="rIdwf4yyuecnlwbsoqdr_j6h">
         <w:r>
           <w:rPr>
             <w:rFonts w:ascii="Arial" w:cs="Arial" w:eastAsia="Arial" w:hAnsi="Arial"/>
@@ -1969,7 +1969,7 @@
       <w:pPr>
         <w:spacing w:after="25"/>
       </w:pPr>
-      <w:hyperlink w:history="1" r:id="rIdzvzg8910fb8bpvygsz9qn">
+      <w:hyperlink w:history="1" r:id="rIdouvl7abelkjz9qkexbknz">
         <w:r>
           <w:rPr>
             <w:rFonts w:ascii="Arial" w:cs="Arial" w:eastAsia="Arial" w:hAnsi="Arial"/>
@@ -2000,7 +2000,7 @@
       <w:pPr>
         <w:spacing w:after="35"/>
       </w:pPr>
-      <w:hyperlink w:history="1" r:id="rId9tk1yyebmuhamfbtetddu">
+      <w:hyperlink w:history="1" r:id="rIdcrvohoz17hwza_s5g_49u">
         <w:r>
           <w:rPr>
             <w:rFonts w:ascii="Arial" w:cs="Arial" w:eastAsia="Arial" w:hAnsi="Arial"/>
@@ -2049,7 +2049,7 @@
       <w:pPr>
         <w:spacing w:after="35"/>
       </w:pPr>
-      <w:hyperlink w:history="1" r:id="rIdrqfg6ew18dc4yv-tnbmat">
+      <w:hyperlink w:history="1" r:id="rIdigr14ih-yzzio1sveey_5">
         <w:r>
           <w:rPr>
             <w:rFonts w:ascii="Arial" w:cs="Arial" w:eastAsia="Arial" w:hAnsi="Arial"/>

</xml_diff>

<commit_message>
refactor: harden skill detail contract
</commit_message>
<xml_diff>
--- a/public/downloads/wyatt-walsh-resume-full.docx
+++ b/public/downloads/wyatt-walsh-resume-full.docx
@@ -7,7 +7,7 @@
         <w:pStyle w:val="Title"/>
         <w:spacing w:after="75"/>
       </w:pPr>
-      <w:hyperlink w:history="1" r:id="rIdhotpoqgznpe0fjzaesj32">
+      <w:hyperlink w:history="1" r:id="rIdwwejcqepa-1toy8mp6tlo">
         <w:r>
           <w:rPr>
             <w:rFonts w:ascii="Arial" w:cs="Arial" w:eastAsia="Arial" w:hAnsi="Arial"/>
@@ -40,7 +40,7 @@
       <w:pPr>
         <w:spacing w:after="100"/>
       </w:pPr>
-      <w:hyperlink w:history="1" r:id="rId1pu81g4ot0xuvmvpkoqvh">
+      <w:hyperlink w:history="1" r:id="rId2iagsuwx3rq0qxqeryize">
         <w:r>
           <w:rPr>
             <w:rFonts w:ascii="Arial" w:cs="Arial" w:eastAsia="Arial" w:hAnsi="Arial"/>
@@ -61,7 +61,7 @@
         </w:rPr>
         <w:t xml:space="preserve"> | </w:t>
       </w:r>
-      <w:hyperlink w:history="1" r:id="rIdhujskvrtec4ngilfqsrmc">
+      <w:hyperlink w:history="1" r:id="rIdjtlvj2jjreyr9qk7n47pd">
         <w:r>
           <w:rPr>
             <w:rFonts w:ascii="Arial" w:cs="Arial" w:eastAsia="Arial" w:hAnsi="Arial"/>
@@ -100,7 +100,7 @@
         </w:rPr>
         <w:t xml:space="preserve"> | </w:t>
       </w:r>
-      <w:hyperlink w:history="1" r:id="rIdrj1tjxxrjlmzbvk8vwrem">
+      <w:hyperlink w:history="1" r:id="rIdzltjxeo-fixzjqwy1a5rx">
         <w:r>
           <w:rPr>
             <w:rFonts w:ascii="Arial" w:cs="Arial" w:eastAsia="Arial" w:hAnsi="Arial"/>
@@ -121,7 +121,7 @@
         </w:rPr>
         <w:t xml:space="preserve"> | </w:t>
       </w:r>
-      <w:hyperlink w:history="1" r:id="rIdkgdgccsm8imtuhazt8umr">
+      <w:hyperlink w:history="1" r:id="rIdqmpn0wcilsytx-bvyiwp0">
         <w:r>
           <w:rPr>
             <w:rFonts w:ascii="Arial" w:cs="Arial" w:eastAsia="Arial" w:hAnsi="Arial"/>
@@ -189,7 +189,7 @@
         </w:rPr>
         <w:t xml:space="preserve"> | </w:t>
       </w:r>
-      <w:hyperlink w:history="1" r:id="rIdvwxrua_0xmgpqcx0tso5i">
+      <w:hyperlink w:history="1" r:id="rIdlqwyk1rji7rut7qclo1wb">
         <w:r>
           <w:rPr>
             <w:rFonts w:ascii="Arial" w:cs="Arial" w:eastAsia="Arial" w:hAnsi="Arial"/>
@@ -352,7 +352,7 @@
         </w:rPr>
         <w:t xml:space="preserve"> | </w:t>
       </w:r>
-      <w:hyperlink w:history="1" r:id="rIdv2z6g1djs0fdngtqaggof">
+      <w:hyperlink w:history="1" r:id="rIdvommjx7tyfonh1n3rzwrq">
         <w:r>
           <w:rPr>
             <w:rFonts w:ascii="Arial" w:cs="Arial" w:eastAsia="Arial" w:hAnsi="Arial"/>
@@ -750,7 +750,7 @@
         </w:rPr>
         <w:t xml:space="preserve"> | </w:t>
       </w:r>
-      <w:hyperlink w:history="1" r:id="rIdfm5fir9frw_4iov-sa4ak">
+      <w:hyperlink w:history="1" r:id="rIdlqa8ouqhnmm8l1tt94tm4">
         <w:r>
           <w:rPr>
             <w:rFonts w:ascii="Arial" w:cs="Arial" w:eastAsia="Arial" w:hAnsi="Arial"/>
@@ -1021,7 +1021,7 @@
         </w:rPr>
         <w:t xml:space="preserve"> | </w:t>
       </w:r>
-      <w:hyperlink w:history="1" r:id="rIdzwxfyjneedlrcnx5oau75">
+      <w:hyperlink w:history="1" r:id="rId8pvtlacv5bcrgcelyqgyq">
         <w:r>
           <w:rPr>
             <w:rFonts w:ascii="Arial" w:cs="Arial" w:eastAsia="Arial" w:hAnsi="Arial"/>
@@ -1042,7 +1042,7 @@
         </w:rPr>
         <w:t xml:space="preserve"> | </w:t>
       </w:r>
-      <w:hyperlink w:history="1" r:id="rIdmlsbosj2mklwtazeqybst">
+      <w:hyperlink w:history="1" r:id="rIduyru__gwdyzuji5wdmiru">
         <w:r>
           <w:rPr>
             <w:rFonts w:ascii="Arial" w:cs="Arial" w:eastAsia="Arial" w:hAnsi="Arial"/>
@@ -1164,7 +1164,7 @@
         </w:rPr>
         <w:t xml:space="preserve"> | </w:t>
       </w:r>
-      <w:hyperlink w:history="1" r:id="rIdscws-aonzrfykkazixun4">
+      <w:hyperlink w:history="1" r:id="rIdb-9ce6a4cjwowzpssam_j">
         <w:r>
           <w:rPr>
             <w:rFonts w:ascii="Arial" w:cs="Arial" w:eastAsia="Arial" w:hAnsi="Arial"/>
@@ -1185,7 +1185,7 @@
         </w:rPr>
         <w:t xml:space="preserve"> | </w:t>
       </w:r>
-      <w:hyperlink w:history="1" r:id="rIdpxfssb9gbzh6stydgcp6f">
+      <w:hyperlink w:history="1" r:id="rIdjqqqjasxrwykgoypapqkp">
         <w:r>
           <w:rPr>
             <w:rFonts w:ascii="Arial" w:cs="Arial" w:eastAsia="Arial" w:hAnsi="Arial"/>
@@ -1206,7 +1206,7 @@
         </w:rPr>
         <w:t xml:space="preserve"> | </w:t>
       </w:r>
-      <w:hyperlink w:history="1" r:id="rIdbldpvvv5xqcv98hia50nj">
+      <w:hyperlink w:history="1" r:id="rIdjccvt5-ha_4pi5hdbrxqk">
         <w:r>
           <w:rPr>
             <w:rFonts w:ascii="Arial" w:cs="Arial" w:eastAsia="Arial" w:hAnsi="Arial"/>
@@ -1328,7 +1328,7 @@
         </w:rPr>
         <w:t xml:space="preserve"> | </w:t>
       </w:r>
-      <w:hyperlink w:history="1" r:id="rIdvj4k-ttaqu3rnzenpq0zf">
+      <w:hyperlink w:history="1" r:id="rIdturrcronk6piab3bahwia">
         <w:r>
           <w:rPr>
             <w:rFonts w:ascii="Arial" w:cs="Arial" w:eastAsia="Arial" w:hAnsi="Arial"/>
@@ -1349,7 +1349,7 @@
         </w:rPr>
         <w:t xml:space="preserve"> | </w:t>
       </w:r>
-      <w:hyperlink w:history="1" r:id="rIdzgu4thay4qhf-smhb1nfx">
+      <w:hyperlink w:history="1" r:id="rId2w4xjde_t7fxmypi_0klm">
         <w:r>
           <w:rPr>
             <w:rFonts w:ascii="Arial" w:cs="Arial" w:eastAsia="Arial" w:hAnsi="Arial"/>
@@ -1471,7 +1471,7 @@
         </w:rPr>
         <w:t xml:space="preserve"> | </w:t>
       </w:r>
-      <w:hyperlink w:history="1" r:id="rId5rihfrvjc44ggwrxclsky">
+      <w:hyperlink w:history="1" r:id="rIdhqhqfaweodxpprghc0avr">
         <w:r>
           <w:rPr>
             <w:rFonts w:ascii="Arial" w:cs="Arial" w:eastAsia="Arial" w:hAnsi="Arial"/>
@@ -1492,7 +1492,7 @@
         </w:rPr>
         <w:t xml:space="preserve"> | </w:t>
       </w:r>
-      <w:hyperlink w:history="1" r:id="rIdyoxfvakbztqtjuhgb-ujc">
+      <w:hyperlink w:history="1" r:id="rIdkwjnmew7f1dr_g3m5m_a7">
         <w:r>
           <w:rPr>
             <w:rFonts w:ascii="Arial" w:cs="Arial" w:eastAsia="Arial" w:hAnsi="Arial"/>
@@ -1614,7 +1614,7 @@
         </w:rPr>
         <w:t xml:space="preserve"> | </w:t>
       </w:r>
-      <w:hyperlink w:history="1" r:id="rIdkveysoqgs1mpah-7co8wp">
+      <w:hyperlink w:history="1" r:id="rIdae0wc8fde8gho7tuhq12c">
         <w:r>
           <w:rPr>
             <w:rFonts w:ascii="Arial" w:cs="Arial" w:eastAsia="Arial" w:hAnsi="Arial"/>
@@ -1635,7 +1635,7 @@
         </w:rPr>
         <w:t xml:space="preserve"> | </w:t>
       </w:r>
-      <w:hyperlink w:history="1" r:id="rIdstdhbisetvineivacoj_b">
+      <w:hyperlink w:history="1" r:id="rIdhsq37xkvyejjcwjrclab-">
         <w:r>
           <w:rPr>
             <w:rFonts w:ascii="Arial" w:cs="Arial" w:eastAsia="Arial" w:hAnsi="Arial"/>
@@ -1757,7 +1757,7 @@
         </w:rPr>
         <w:t xml:space="preserve"> | </w:t>
       </w:r>
-      <w:hyperlink w:history="1" r:id="rIds0ixubg-kmi9cjkwbm-3y">
+      <w:hyperlink w:history="1" r:id="rIdixcmya3m7nc1cu7zvliji">
         <w:r>
           <w:rPr>
             <w:rFonts w:ascii="Arial" w:cs="Arial" w:eastAsia="Arial" w:hAnsi="Arial"/>
@@ -1778,7 +1778,7 @@
         </w:rPr>
         <w:t xml:space="preserve"> | </w:t>
       </w:r>
-      <w:hyperlink w:history="1" r:id="rId5pneqxffzwygryqg29dkj">
+      <w:hyperlink w:history="1" r:id="rIdcehu0iaaddfxrczukmzps">
         <w:r>
           <w:rPr>
             <w:rFonts w:ascii="Arial" w:cs="Arial" w:eastAsia="Arial" w:hAnsi="Arial"/>
@@ -1913,7 +1913,7 @@
       <w:pPr>
         <w:spacing w:after="25"/>
       </w:pPr>
-      <w:hyperlink w:history="1" r:id="rIdwf4yyuecnlwbsoqdr_j6h">
+      <w:hyperlink w:history="1" r:id="rIdow2ewjv5u7glh-5zfn1rq">
         <w:r>
           <w:rPr>
             <w:rFonts w:ascii="Arial" w:cs="Arial" w:eastAsia="Arial" w:hAnsi="Arial"/>
@@ -1969,7 +1969,7 @@
       <w:pPr>
         <w:spacing w:after="25"/>
       </w:pPr>
-      <w:hyperlink w:history="1" r:id="rIdouvl7abelkjz9qkexbknz">
+      <w:hyperlink w:history="1" r:id="rId2pgpnof8_xln5smgfxoea">
         <w:r>
           <w:rPr>
             <w:rFonts w:ascii="Arial" w:cs="Arial" w:eastAsia="Arial" w:hAnsi="Arial"/>
@@ -2000,7 +2000,7 @@
       <w:pPr>
         <w:spacing w:after="35"/>
       </w:pPr>
-      <w:hyperlink w:history="1" r:id="rIdcrvohoz17hwza_s5g_49u">
+      <w:hyperlink w:history="1" r:id="rIdsc2wrdh021lhi-l0kyath">
         <w:r>
           <w:rPr>
             <w:rFonts w:ascii="Arial" w:cs="Arial" w:eastAsia="Arial" w:hAnsi="Arial"/>
@@ -2049,7 +2049,7 @@
       <w:pPr>
         <w:spacing w:after="35"/>
       </w:pPr>
-      <w:hyperlink w:history="1" r:id="rIdigr14ih-yzzio1sveey_5">
+      <w:hyperlink w:history="1" r:id="rIddy6aeomyk1b0cr6bnq4y4">
         <w:r>
           <w:rPr>
             <w:rFonts w:ascii="Arial" w:cs="Arial" w:eastAsia="Arial" w:hAnsi="Arial"/>

</xml_diff>

<commit_message>
feat: enrich skill detail references
</commit_message>
<xml_diff>
--- a/public/downloads/wyatt-walsh-resume-full.docx
+++ b/public/downloads/wyatt-walsh-resume-full.docx
@@ -7,7 +7,7 @@
         <w:pStyle w:val="Title"/>
         <w:spacing w:after="75"/>
       </w:pPr>
-      <w:hyperlink w:history="1" r:id="rIdwwejcqepa-1toy8mp6tlo">
+      <w:hyperlink w:history="1" r:id="rIdho8dtf8fo_c5jj_7h0k5q">
         <w:r>
           <w:rPr>
             <w:rFonts w:ascii="Arial" w:cs="Arial" w:eastAsia="Arial" w:hAnsi="Arial"/>
@@ -40,7 +40,7 @@
       <w:pPr>
         <w:spacing w:after="100"/>
       </w:pPr>
-      <w:hyperlink w:history="1" r:id="rId2iagsuwx3rq0qxqeryize">
+      <w:hyperlink w:history="1" r:id="rId2d-k1oe24oidzco8pgs80">
         <w:r>
           <w:rPr>
             <w:rFonts w:ascii="Arial" w:cs="Arial" w:eastAsia="Arial" w:hAnsi="Arial"/>
@@ -61,7 +61,7 @@
         </w:rPr>
         <w:t xml:space="preserve"> | </w:t>
       </w:r>
-      <w:hyperlink w:history="1" r:id="rIdjtlvj2jjreyr9qk7n47pd">
+      <w:hyperlink w:history="1" r:id="rId-jo1u2jrifejmi4zmzkhe">
         <w:r>
           <w:rPr>
             <w:rFonts w:ascii="Arial" w:cs="Arial" w:eastAsia="Arial" w:hAnsi="Arial"/>
@@ -100,7 +100,7 @@
         </w:rPr>
         <w:t xml:space="preserve"> | </w:t>
       </w:r>
-      <w:hyperlink w:history="1" r:id="rIdzltjxeo-fixzjqwy1a5rx">
+      <w:hyperlink w:history="1" r:id="rIdjmqthx3kdhxe2zdgnloiy">
         <w:r>
           <w:rPr>
             <w:rFonts w:ascii="Arial" w:cs="Arial" w:eastAsia="Arial" w:hAnsi="Arial"/>
@@ -121,7 +121,7 @@
         </w:rPr>
         <w:t xml:space="preserve"> | </w:t>
       </w:r>
-      <w:hyperlink w:history="1" r:id="rIdqmpn0wcilsytx-bvyiwp0">
+      <w:hyperlink w:history="1" r:id="rIdikf8bvtyqgv_re6nf6y8d">
         <w:r>
           <w:rPr>
             <w:rFonts w:ascii="Arial" w:cs="Arial" w:eastAsia="Arial" w:hAnsi="Arial"/>
@@ -189,7 +189,7 @@
         </w:rPr>
         <w:t xml:space="preserve"> | </w:t>
       </w:r>
-      <w:hyperlink w:history="1" r:id="rIdlqwyk1rji7rut7qclo1wb">
+      <w:hyperlink w:history="1" r:id="rIdrxwdd9pqwfnbjcpqb_eru">
         <w:r>
           <w:rPr>
             <w:rFonts w:ascii="Arial" w:cs="Arial" w:eastAsia="Arial" w:hAnsi="Arial"/>
@@ -352,7 +352,7 @@
         </w:rPr>
         <w:t xml:space="preserve"> | </w:t>
       </w:r>
-      <w:hyperlink w:history="1" r:id="rIdvommjx7tyfonh1n3rzwrq">
+      <w:hyperlink w:history="1" r:id="rId03r6lppt0ycnzvqq0jo8y">
         <w:r>
           <w:rPr>
             <w:rFonts w:ascii="Arial" w:cs="Arial" w:eastAsia="Arial" w:hAnsi="Arial"/>
@@ -750,7 +750,7 @@
         </w:rPr>
         <w:t xml:space="preserve"> | </w:t>
       </w:r>
-      <w:hyperlink w:history="1" r:id="rIdlqa8ouqhnmm8l1tt94tm4">
+      <w:hyperlink w:history="1" r:id="rId-gsky3yvuloneq3i0smt4">
         <w:r>
           <w:rPr>
             <w:rFonts w:ascii="Arial" w:cs="Arial" w:eastAsia="Arial" w:hAnsi="Arial"/>
@@ -1021,7 +1021,7 @@
         </w:rPr>
         <w:t xml:space="preserve"> | </w:t>
       </w:r>
-      <w:hyperlink w:history="1" r:id="rId8pvtlacv5bcrgcelyqgyq">
+      <w:hyperlink w:history="1" r:id="rIdboimixnn5ntgk0_dbvg-w">
         <w:r>
           <w:rPr>
             <w:rFonts w:ascii="Arial" w:cs="Arial" w:eastAsia="Arial" w:hAnsi="Arial"/>
@@ -1042,7 +1042,7 @@
         </w:rPr>
         <w:t xml:space="preserve"> | </w:t>
       </w:r>
-      <w:hyperlink w:history="1" r:id="rIduyru__gwdyzuji5wdmiru">
+      <w:hyperlink w:history="1" r:id="rIdcpnerjnmzfrscdsvx2bzv">
         <w:r>
           <w:rPr>
             <w:rFonts w:ascii="Arial" w:cs="Arial" w:eastAsia="Arial" w:hAnsi="Arial"/>
@@ -1164,7 +1164,7 @@
         </w:rPr>
         <w:t xml:space="preserve"> | </w:t>
       </w:r>
-      <w:hyperlink w:history="1" r:id="rIdb-9ce6a4cjwowzpssam_j">
+      <w:hyperlink w:history="1" r:id="rIdt9garga_ejzbbfnnb3amt">
         <w:r>
           <w:rPr>
             <w:rFonts w:ascii="Arial" w:cs="Arial" w:eastAsia="Arial" w:hAnsi="Arial"/>
@@ -1185,7 +1185,7 @@
         </w:rPr>
         <w:t xml:space="preserve"> | </w:t>
       </w:r>
-      <w:hyperlink w:history="1" r:id="rIdjqqqjasxrwykgoypapqkp">
+      <w:hyperlink w:history="1" r:id="rIdtux6zn6esseghokljimus">
         <w:r>
           <w:rPr>
             <w:rFonts w:ascii="Arial" w:cs="Arial" w:eastAsia="Arial" w:hAnsi="Arial"/>
@@ -1206,7 +1206,7 @@
         </w:rPr>
         <w:t xml:space="preserve"> | </w:t>
       </w:r>
-      <w:hyperlink w:history="1" r:id="rIdjccvt5-ha_4pi5hdbrxqk">
+      <w:hyperlink w:history="1" r:id="rId3oo0duwklacoivho1flg0">
         <w:r>
           <w:rPr>
             <w:rFonts w:ascii="Arial" w:cs="Arial" w:eastAsia="Arial" w:hAnsi="Arial"/>
@@ -1328,7 +1328,7 @@
         </w:rPr>
         <w:t xml:space="preserve"> | </w:t>
       </w:r>
-      <w:hyperlink w:history="1" r:id="rIdturrcronk6piab3bahwia">
+      <w:hyperlink w:history="1" r:id="rIde9s1unsx0t8rktdcsvesb">
         <w:r>
           <w:rPr>
             <w:rFonts w:ascii="Arial" w:cs="Arial" w:eastAsia="Arial" w:hAnsi="Arial"/>
@@ -1349,7 +1349,7 @@
         </w:rPr>
         <w:t xml:space="preserve"> | </w:t>
       </w:r>
-      <w:hyperlink w:history="1" r:id="rId2w4xjde_t7fxmypi_0klm">
+      <w:hyperlink w:history="1" r:id="rIddokzdudslpmieyqlrprdw">
         <w:r>
           <w:rPr>
             <w:rFonts w:ascii="Arial" w:cs="Arial" w:eastAsia="Arial" w:hAnsi="Arial"/>
@@ -1471,7 +1471,7 @@
         </w:rPr>
         <w:t xml:space="preserve"> | </w:t>
       </w:r>
-      <w:hyperlink w:history="1" r:id="rIdhqhqfaweodxpprghc0avr">
+      <w:hyperlink w:history="1" r:id="rIdg444unp-ly6ezbtv4pfqm">
         <w:r>
           <w:rPr>
             <w:rFonts w:ascii="Arial" w:cs="Arial" w:eastAsia="Arial" w:hAnsi="Arial"/>
@@ -1492,7 +1492,7 @@
         </w:rPr>
         <w:t xml:space="preserve"> | </w:t>
       </w:r>
-      <w:hyperlink w:history="1" r:id="rIdkwjnmew7f1dr_g3m5m_a7">
+      <w:hyperlink w:history="1" r:id="rIdehgl74kcfsm2kg8izi9v1">
         <w:r>
           <w:rPr>
             <w:rFonts w:ascii="Arial" w:cs="Arial" w:eastAsia="Arial" w:hAnsi="Arial"/>
@@ -1614,7 +1614,7 @@
         </w:rPr>
         <w:t xml:space="preserve"> | </w:t>
       </w:r>
-      <w:hyperlink w:history="1" r:id="rIdae0wc8fde8gho7tuhq12c">
+      <w:hyperlink w:history="1" r:id="rIdsr2mi1prd-wwrpfzp_-y5">
         <w:r>
           <w:rPr>
             <w:rFonts w:ascii="Arial" w:cs="Arial" w:eastAsia="Arial" w:hAnsi="Arial"/>
@@ -1635,7 +1635,7 @@
         </w:rPr>
         <w:t xml:space="preserve"> | </w:t>
       </w:r>
-      <w:hyperlink w:history="1" r:id="rIdhsq37xkvyejjcwjrclab-">
+      <w:hyperlink w:history="1" r:id="rIdyuneupoue67nqnfom_vqh">
         <w:r>
           <w:rPr>
             <w:rFonts w:ascii="Arial" w:cs="Arial" w:eastAsia="Arial" w:hAnsi="Arial"/>
@@ -1757,7 +1757,7 @@
         </w:rPr>
         <w:t xml:space="preserve"> | </w:t>
       </w:r>
-      <w:hyperlink w:history="1" r:id="rIdixcmya3m7nc1cu7zvliji">
+      <w:hyperlink w:history="1" r:id="rIdxztp3biqtn4skmxgtme-9">
         <w:r>
           <w:rPr>
             <w:rFonts w:ascii="Arial" w:cs="Arial" w:eastAsia="Arial" w:hAnsi="Arial"/>
@@ -1778,7 +1778,7 @@
         </w:rPr>
         <w:t xml:space="preserve"> | </w:t>
       </w:r>
-      <w:hyperlink w:history="1" r:id="rIdcehu0iaaddfxrczukmzps">
+      <w:hyperlink w:history="1" r:id="rIdt6qt0yjxa0ia6e7edlflh">
         <w:r>
           <w:rPr>
             <w:rFonts w:ascii="Arial" w:cs="Arial" w:eastAsia="Arial" w:hAnsi="Arial"/>
@@ -1913,7 +1913,7 @@
       <w:pPr>
         <w:spacing w:after="25"/>
       </w:pPr>
-      <w:hyperlink w:history="1" r:id="rIdow2ewjv5u7glh-5zfn1rq">
+      <w:hyperlink w:history="1" r:id="rIddf1dg2huwaamhxzmvlsnj">
         <w:r>
           <w:rPr>
             <w:rFonts w:ascii="Arial" w:cs="Arial" w:eastAsia="Arial" w:hAnsi="Arial"/>
@@ -1969,7 +1969,7 @@
       <w:pPr>
         <w:spacing w:after="25"/>
       </w:pPr>
-      <w:hyperlink w:history="1" r:id="rId2pgpnof8_xln5smgfxoea">
+      <w:hyperlink w:history="1" r:id="rIdvaxoaim-7hvppdxk8luwd">
         <w:r>
           <w:rPr>
             <w:rFonts w:ascii="Arial" w:cs="Arial" w:eastAsia="Arial" w:hAnsi="Arial"/>
@@ -2000,7 +2000,7 @@
       <w:pPr>
         <w:spacing w:after="35"/>
       </w:pPr>
-      <w:hyperlink w:history="1" r:id="rIdsc2wrdh021lhi-l0kyath">
+      <w:hyperlink w:history="1" r:id="rIdctpcwtwy3memauxjavs8b">
         <w:r>
           <w:rPr>
             <w:rFonts w:ascii="Arial" w:cs="Arial" w:eastAsia="Arial" w:hAnsi="Arial"/>
@@ -2049,7 +2049,7 @@
       <w:pPr>
         <w:spacing w:after="35"/>
       </w:pPr>
-      <w:hyperlink w:history="1" r:id="rIddy6aeomyk1b0cr6bnq4y4">
+      <w:hyperlink w:history="1" r:id="rId5eqww5i3onwrttk65wsgn">
         <w:r>
           <w:rPr>
             <w:rFonts w:ascii="Arial" w:cs="Arial" w:eastAsia="Arial" w:hAnsi="Arial"/>

</xml_diff>

<commit_message>
fix: diversify skill detail references
</commit_message>
<xml_diff>
--- a/public/downloads/wyatt-walsh-resume-full.docx
+++ b/public/downloads/wyatt-walsh-resume-full.docx
@@ -7,7 +7,7 @@
         <w:pStyle w:val="Title"/>
         <w:spacing w:after="75"/>
       </w:pPr>
-      <w:hyperlink w:history="1" r:id="rIdho8dtf8fo_c5jj_7h0k5q">
+      <w:hyperlink w:history="1" r:id="rIdhalld_quwxsom7qmd0utq">
         <w:r>
           <w:rPr>
             <w:rFonts w:ascii="Arial" w:cs="Arial" w:eastAsia="Arial" w:hAnsi="Arial"/>
@@ -40,7 +40,7 @@
       <w:pPr>
         <w:spacing w:after="100"/>
       </w:pPr>
-      <w:hyperlink w:history="1" r:id="rId2d-k1oe24oidzco8pgs80">
+      <w:hyperlink w:history="1" r:id="rIdqbuhisu-9-m-pcvpgjqdy">
         <w:r>
           <w:rPr>
             <w:rFonts w:ascii="Arial" w:cs="Arial" w:eastAsia="Arial" w:hAnsi="Arial"/>
@@ -61,7 +61,7 @@
         </w:rPr>
         <w:t xml:space="preserve"> | </w:t>
       </w:r>
-      <w:hyperlink w:history="1" r:id="rId-jo1u2jrifejmi4zmzkhe">
+      <w:hyperlink w:history="1" r:id="rIdoqkdv5x6r9cy4ia6vb7ps">
         <w:r>
           <w:rPr>
             <w:rFonts w:ascii="Arial" w:cs="Arial" w:eastAsia="Arial" w:hAnsi="Arial"/>
@@ -100,7 +100,7 @@
         </w:rPr>
         <w:t xml:space="preserve"> | </w:t>
       </w:r>
-      <w:hyperlink w:history="1" r:id="rIdjmqthx3kdhxe2zdgnloiy">
+      <w:hyperlink w:history="1" r:id="rIdjfva2-luzvcg60vh5ouf2">
         <w:r>
           <w:rPr>
             <w:rFonts w:ascii="Arial" w:cs="Arial" w:eastAsia="Arial" w:hAnsi="Arial"/>
@@ -121,7 +121,7 @@
         </w:rPr>
         <w:t xml:space="preserve"> | </w:t>
       </w:r>
-      <w:hyperlink w:history="1" r:id="rIdikf8bvtyqgv_re6nf6y8d">
+      <w:hyperlink w:history="1" r:id="rIdaspfd0cr4q7ktlxgwpr0y">
         <w:r>
           <w:rPr>
             <w:rFonts w:ascii="Arial" w:cs="Arial" w:eastAsia="Arial" w:hAnsi="Arial"/>
@@ -189,7 +189,7 @@
         </w:rPr>
         <w:t xml:space="preserve"> | </w:t>
       </w:r>
-      <w:hyperlink w:history="1" r:id="rIdrxwdd9pqwfnbjcpqb_eru">
+      <w:hyperlink w:history="1" r:id="rId1utr3itnr_cy6vkydr_81">
         <w:r>
           <w:rPr>
             <w:rFonts w:ascii="Arial" w:cs="Arial" w:eastAsia="Arial" w:hAnsi="Arial"/>
@@ -352,7 +352,7 @@
         </w:rPr>
         <w:t xml:space="preserve"> | </w:t>
       </w:r>
-      <w:hyperlink w:history="1" r:id="rId03r6lppt0ycnzvqq0jo8y">
+      <w:hyperlink w:history="1" r:id="rId1c9wcfz0xuqkp3-2_hrhb">
         <w:r>
           <w:rPr>
             <w:rFonts w:ascii="Arial" w:cs="Arial" w:eastAsia="Arial" w:hAnsi="Arial"/>
@@ -750,7 +750,7 @@
         </w:rPr>
         <w:t xml:space="preserve"> | </w:t>
       </w:r>
-      <w:hyperlink w:history="1" r:id="rId-gsky3yvuloneq3i0smt4">
+      <w:hyperlink w:history="1" r:id="rIdqrm4lad9l2rsdubtotcqc">
         <w:r>
           <w:rPr>
             <w:rFonts w:ascii="Arial" w:cs="Arial" w:eastAsia="Arial" w:hAnsi="Arial"/>
@@ -1021,7 +1021,7 @@
         </w:rPr>
         <w:t xml:space="preserve"> | </w:t>
       </w:r>
-      <w:hyperlink w:history="1" r:id="rIdboimixnn5ntgk0_dbvg-w">
+      <w:hyperlink w:history="1" r:id="rIdujmt9uncazh5yuyoerbzt">
         <w:r>
           <w:rPr>
             <w:rFonts w:ascii="Arial" w:cs="Arial" w:eastAsia="Arial" w:hAnsi="Arial"/>
@@ -1042,7 +1042,7 @@
         </w:rPr>
         <w:t xml:space="preserve"> | </w:t>
       </w:r>
-      <w:hyperlink w:history="1" r:id="rIdcpnerjnmzfrscdsvx2bzv">
+      <w:hyperlink w:history="1" r:id="rIdxvzzfydiikqx4r5hgfqvl">
         <w:r>
           <w:rPr>
             <w:rFonts w:ascii="Arial" w:cs="Arial" w:eastAsia="Arial" w:hAnsi="Arial"/>
@@ -1164,7 +1164,7 @@
         </w:rPr>
         <w:t xml:space="preserve"> | </w:t>
       </w:r>
-      <w:hyperlink w:history="1" r:id="rIdt9garga_ejzbbfnnb3amt">
+      <w:hyperlink w:history="1" r:id="rIdfawkybs6tgn1g7ccwcyrq">
         <w:r>
           <w:rPr>
             <w:rFonts w:ascii="Arial" w:cs="Arial" w:eastAsia="Arial" w:hAnsi="Arial"/>
@@ -1185,7 +1185,7 @@
         </w:rPr>
         <w:t xml:space="preserve"> | </w:t>
       </w:r>
-      <w:hyperlink w:history="1" r:id="rIdtux6zn6esseghokljimus">
+      <w:hyperlink w:history="1" r:id="rIdnucr_1leuz-ckdz2-wxr6">
         <w:r>
           <w:rPr>
             <w:rFonts w:ascii="Arial" w:cs="Arial" w:eastAsia="Arial" w:hAnsi="Arial"/>
@@ -1206,7 +1206,7 @@
         </w:rPr>
         <w:t xml:space="preserve"> | </w:t>
       </w:r>
-      <w:hyperlink w:history="1" r:id="rId3oo0duwklacoivho1flg0">
+      <w:hyperlink w:history="1" r:id="rIdyxc2tluouszipu7wnwngy">
         <w:r>
           <w:rPr>
             <w:rFonts w:ascii="Arial" w:cs="Arial" w:eastAsia="Arial" w:hAnsi="Arial"/>
@@ -1328,7 +1328,7 @@
         </w:rPr>
         <w:t xml:space="preserve"> | </w:t>
       </w:r>
-      <w:hyperlink w:history="1" r:id="rIde9s1unsx0t8rktdcsvesb">
+      <w:hyperlink w:history="1" r:id="rIdclpaglej55pa96tqh4tmw">
         <w:r>
           <w:rPr>
             <w:rFonts w:ascii="Arial" w:cs="Arial" w:eastAsia="Arial" w:hAnsi="Arial"/>
@@ -1349,7 +1349,7 @@
         </w:rPr>
         <w:t xml:space="preserve"> | </w:t>
       </w:r>
-      <w:hyperlink w:history="1" r:id="rIddokzdudslpmieyqlrprdw">
+      <w:hyperlink w:history="1" r:id="rIdg-w2wbauu627knm-ms6xk">
         <w:r>
           <w:rPr>
             <w:rFonts w:ascii="Arial" w:cs="Arial" w:eastAsia="Arial" w:hAnsi="Arial"/>
@@ -1471,7 +1471,7 @@
         </w:rPr>
         <w:t xml:space="preserve"> | </w:t>
       </w:r>
-      <w:hyperlink w:history="1" r:id="rIdg444unp-ly6ezbtv4pfqm">
+      <w:hyperlink w:history="1" r:id="rIdi9qv7bm9u6xfvefuqb1bn">
         <w:r>
           <w:rPr>
             <w:rFonts w:ascii="Arial" w:cs="Arial" w:eastAsia="Arial" w:hAnsi="Arial"/>
@@ -1492,7 +1492,7 @@
         </w:rPr>
         <w:t xml:space="preserve"> | </w:t>
       </w:r>
-      <w:hyperlink w:history="1" r:id="rIdehgl74kcfsm2kg8izi9v1">
+      <w:hyperlink w:history="1" r:id="rIdd8xqhedqwv80nprgppe4z">
         <w:r>
           <w:rPr>
             <w:rFonts w:ascii="Arial" w:cs="Arial" w:eastAsia="Arial" w:hAnsi="Arial"/>
@@ -1614,7 +1614,7 @@
         </w:rPr>
         <w:t xml:space="preserve"> | </w:t>
       </w:r>
-      <w:hyperlink w:history="1" r:id="rIdsr2mi1prd-wwrpfzp_-y5">
+      <w:hyperlink w:history="1" r:id="rId_mjfvb5gn9yir_epvkfqo">
         <w:r>
           <w:rPr>
             <w:rFonts w:ascii="Arial" w:cs="Arial" w:eastAsia="Arial" w:hAnsi="Arial"/>
@@ -1635,7 +1635,7 @@
         </w:rPr>
         <w:t xml:space="preserve"> | </w:t>
       </w:r>
-      <w:hyperlink w:history="1" r:id="rIdyuneupoue67nqnfom_vqh">
+      <w:hyperlink w:history="1" r:id="rId8qcq7ztvrtbsltxkv_61w">
         <w:r>
           <w:rPr>
             <w:rFonts w:ascii="Arial" w:cs="Arial" w:eastAsia="Arial" w:hAnsi="Arial"/>
@@ -1757,7 +1757,7 @@
         </w:rPr>
         <w:t xml:space="preserve"> | </w:t>
       </w:r>
-      <w:hyperlink w:history="1" r:id="rIdxztp3biqtn4skmxgtme-9">
+      <w:hyperlink w:history="1" r:id="rIdrahctqw5xpk-p9mzh-cvb">
         <w:r>
           <w:rPr>
             <w:rFonts w:ascii="Arial" w:cs="Arial" w:eastAsia="Arial" w:hAnsi="Arial"/>
@@ -1778,7 +1778,7 @@
         </w:rPr>
         <w:t xml:space="preserve"> | </w:t>
       </w:r>
-      <w:hyperlink w:history="1" r:id="rIdt6qt0yjxa0ia6e7edlflh">
+      <w:hyperlink w:history="1" r:id="rIdsowgnd48irrz9epgtx9n1">
         <w:r>
           <w:rPr>
             <w:rFonts w:ascii="Arial" w:cs="Arial" w:eastAsia="Arial" w:hAnsi="Arial"/>
@@ -1913,7 +1913,7 @@
       <w:pPr>
         <w:spacing w:after="25"/>
       </w:pPr>
-      <w:hyperlink w:history="1" r:id="rIddf1dg2huwaamhxzmvlsnj">
+      <w:hyperlink w:history="1" r:id="rIdsnwnuas1sj5e-8lnql95g">
         <w:r>
           <w:rPr>
             <w:rFonts w:ascii="Arial" w:cs="Arial" w:eastAsia="Arial" w:hAnsi="Arial"/>
@@ -1969,7 +1969,7 @@
       <w:pPr>
         <w:spacing w:after="25"/>
       </w:pPr>
-      <w:hyperlink w:history="1" r:id="rIdvaxoaim-7hvppdxk8luwd">
+      <w:hyperlink w:history="1" r:id="rIdjjp0xmuuiodwahmmb7nde">
         <w:r>
           <w:rPr>
             <w:rFonts w:ascii="Arial" w:cs="Arial" w:eastAsia="Arial" w:hAnsi="Arial"/>
@@ -2000,7 +2000,7 @@
       <w:pPr>
         <w:spacing w:after="35"/>
       </w:pPr>
-      <w:hyperlink w:history="1" r:id="rIdctpcwtwy3memauxjavs8b">
+      <w:hyperlink w:history="1" r:id="rId3xdlwb8-d7kybkhryal2i">
         <w:r>
           <w:rPr>
             <w:rFonts w:ascii="Arial" w:cs="Arial" w:eastAsia="Arial" w:hAnsi="Arial"/>
@@ -2049,7 +2049,7 @@
       <w:pPr>
         <w:spacing w:after="35"/>
       </w:pPr>
-      <w:hyperlink w:history="1" r:id="rId5eqww5i3onwrttk65wsgn">
+      <w:hyperlink w:history="1" r:id="rIdgwmei4wg6085nlvvideuq">
         <w:r>
           <w:rPr>
             <w:rFonts w:ascii="Arial" w:cs="Arial" w:eastAsia="Arial" w:hAnsi="Arial"/>

</xml_diff>

<commit_message>
fix: keep skill descriptions standalone
</commit_message>
<xml_diff>
--- a/public/downloads/wyatt-walsh-resume-full.docx
+++ b/public/downloads/wyatt-walsh-resume-full.docx
@@ -7,7 +7,7 @@
         <w:pStyle w:val="Title"/>
         <w:spacing w:after="75"/>
       </w:pPr>
-      <w:hyperlink w:history="1" r:id="rIdhalld_quwxsom7qmd0utq">
+      <w:hyperlink w:history="1" r:id="rIdm_froj99uwl5oykgc68yl">
         <w:r>
           <w:rPr>
             <w:rFonts w:ascii="Arial" w:cs="Arial" w:eastAsia="Arial" w:hAnsi="Arial"/>
@@ -40,7 +40,7 @@
       <w:pPr>
         <w:spacing w:after="100"/>
       </w:pPr>
-      <w:hyperlink w:history="1" r:id="rIdqbuhisu-9-m-pcvpgjqdy">
+      <w:hyperlink w:history="1" r:id="rIdwxmw-i4kmekdq582unvqf">
         <w:r>
           <w:rPr>
             <w:rFonts w:ascii="Arial" w:cs="Arial" w:eastAsia="Arial" w:hAnsi="Arial"/>
@@ -61,7 +61,7 @@
         </w:rPr>
         <w:t xml:space="preserve"> | </w:t>
       </w:r>
-      <w:hyperlink w:history="1" r:id="rIdoqkdv5x6r9cy4ia6vb7ps">
+      <w:hyperlink w:history="1" r:id="rIdjztstmkgt-umqsobmlm77">
         <w:r>
           <w:rPr>
             <w:rFonts w:ascii="Arial" w:cs="Arial" w:eastAsia="Arial" w:hAnsi="Arial"/>
@@ -100,7 +100,7 @@
         </w:rPr>
         <w:t xml:space="preserve"> | </w:t>
       </w:r>
-      <w:hyperlink w:history="1" r:id="rIdjfva2-luzvcg60vh5ouf2">
+      <w:hyperlink w:history="1" r:id="rId-h7bnsaftudcsjlglcity">
         <w:r>
           <w:rPr>
             <w:rFonts w:ascii="Arial" w:cs="Arial" w:eastAsia="Arial" w:hAnsi="Arial"/>
@@ -121,7 +121,7 @@
         </w:rPr>
         <w:t xml:space="preserve"> | </w:t>
       </w:r>
-      <w:hyperlink w:history="1" r:id="rIdaspfd0cr4q7ktlxgwpr0y">
+      <w:hyperlink w:history="1" r:id="rIdarxrzmpbg0fvaaxidlw1r">
         <w:r>
           <w:rPr>
             <w:rFonts w:ascii="Arial" w:cs="Arial" w:eastAsia="Arial" w:hAnsi="Arial"/>
@@ -189,7 +189,7 @@
         </w:rPr>
         <w:t xml:space="preserve"> | </w:t>
       </w:r>
-      <w:hyperlink w:history="1" r:id="rId1utr3itnr_cy6vkydr_81">
+      <w:hyperlink w:history="1" r:id="rIdnj5amuxvimxxvf2k303lr">
         <w:r>
           <w:rPr>
             <w:rFonts w:ascii="Arial" w:cs="Arial" w:eastAsia="Arial" w:hAnsi="Arial"/>
@@ -352,7 +352,7 @@
         </w:rPr>
         <w:t xml:space="preserve"> | </w:t>
       </w:r>
-      <w:hyperlink w:history="1" r:id="rId1c9wcfz0xuqkp3-2_hrhb">
+      <w:hyperlink w:history="1" r:id="rIdiu0pknxs2s9lx0qpfif-_">
         <w:r>
           <w:rPr>
             <w:rFonts w:ascii="Arial" w:cs="Arial" w:eastAsia="Arial" w:hAnsi="Arial"/>
@@ -750,7 +750,7 @@
         </w:rPr>
         <w:t xml:space="preserve"> | </w:t>
       </w:r>
-      <w:hyperlink w:history="1" r:id="rIdqrm4lad9l2rsdubtotcqc">
+      <w:hyperlink w:history="1" r:id="rId9xtyc06gg-xfxsoxrk0i9">
         <w:r>
           <w:rPr>
             <w:rFonts w:ascii="Arial" w:cs="Arial" w:eastAsia="Arial" w:hAnsi="Arial"/>
@@ -1021,7 +1021,7 @@
         </w:rPr>
         <w:t xml:space="preserve"> | </w:t>
       </w:r>
-      <w:hyperlink w:history="1" r:id="rIdujmt9uncazh5yuyoerbzt">
+      <w:hyperlink w:history="1" r:id="rIduzu7i2tcuutpykamyokda">
         <w:r>
           <w:rPr>
             <w:rFonts w:ascii="Arial" w:cs="Arial" w:eastAsia="Arial" w:hAnsi="Arial"/>
@@ -1042,7 +1042,7 @@
         </w:rPr>
         <w:t xml:space="preserve"> | </w:t>
       </w:r>
-      <w:hyperlink w:history="1" r:id="rIdxvzzfydiikqx4r5hgfqvl">
+      <w:hyperlink w:history="1" r:id="rIdo7knpicmnostum7l5jpm0">
         <w:r>
           <w:rPr>
             <w:rFonts w:ascii="Arial" w:cs="Arial" w:eastAsia="Arial" w:hAnsi="Arial"/>
@@ -1164,7 +1164,7 @@
         </w:rPr>
         <w:t xml:space="preserve"> | </w:t>
       </w:r>
-      <w:hyperlink w:history="1" r:id="rIdfawkybs6tgn1g7ccwcyrq">
+      <w:hyperlink w:history="1" r:id="rIdltgennjmfcyifoilb_a5j">
         <w:r>
           <w:rPr>
             <w:rFonts w:ascii="Arial" w:cs="Arial" w:eastAsia="Arial" w:hAnsi="Arial"/>
@@ -1185,7 +1185,7 @@
         </w:rPr>
         <w:t xml:space="preserve"> | </w:t>
       </w:r>
-      <w:hyperlink w:history="1" r:id="rIdnucr_1leuz-ckdz2-wxr6">
+      <w:hyperlink w:history="1" r:id="rIdmsnkpuicyduotu82ntxji">
         <w:r>
           <w:rPr>
             <w:rFonts w:ascii="Arial" w:cs="Arial" w:eastAsia="Arial" w:hAnsi="Arial"/>
@@ -1206,7 +1206,7 @@
         </w:rPr>
         <w:t xml:space="preserve"> | </w:t>
       </w:r>
-      <w:hyperlink w:history="1" r:id="rIdyxc2tluouszipu7wnwngy">
+      <w:hyperlink w:history="1" r:id="rIdgufdqi54leutrgzvss2xw">
         <w:r>
           <w:rPr>
             <w:rFonts w:ascii="Arial" w:cs="Arial" w:eastAsia="Arial" w:hAnsi="Arial"/>
@@ -1328,7 +1328,7 @@
         </w:rPr>
         <w:t xml:space="preserve"> | </w:t>
       </w:r>
-      <w:hyperlink w:history="1" r:id="rIdclpaglej55pa96tqh4tmw">
+      <w:hyperlink w:history="1" r:id="rIdx8yyddxldsaoot6nk2pi_">
         <w:r>
           <w:rPr>
             <w:rFonts w:ascii="Arial" w:cs="Arial" w:eastAsia="Arial" w:hAnsi="Arial"/>
@@ -1349,7 +1349,7 @@
         </w:rPr>
         <w:t xml:space="preserve"> | </w:t>
       </w:r>
-      <w:hyperlink w:history="1" r:id="rIdg-w2wbauu627knm-ms6xk">
+      <w:hyperlink w:history="1" r:id="rIdsbo-_dfzxapatool9ejm9">
         <w:r>
           <w:rPr>
             <w:rFonts w:ascii="Arial" w:cs="Arial" w:eastAsia="Arial" w:hAnsi="Arial"/>
@@ -1471,7 +1471,7 @@
         </w:rPr>
         <w:t xml:space="preserve"> | </w:t>
       </w:r>
-      <w:hyperlink w:history="1" r:id="rIdi9qv7bm9u6xfvefuqb1bn">
+      <w:hyperlink w:history="1" r:id="rIdchupgc0czvyqcvl-dfqhf">
         <w:r>
           <w:rPr>
             <w:rFonts w:ascii="Arial" w:cs="Arial" w:eastAsia="Arial" w:hAnsi="Arial"/>
@@ -1492,7 +1492,7 @@
         </w:rPr>
         <w:t xml:space="preserve"> | </w:t>
       </w:r>
-      <w:hyperlink w:history="1" r:id="rIdd8xqhedqwv80nprgppe4z">
+      <w:hyperlink w:history="1" r:id="rIdxzjsnat3-nwcvnt015zv5">
         <w:r>
           <w:rPr>
             <w:rFonts w:ascii="Arial" w:cs="Arial" w:eastAsia="Arial" w:hAnsi="Arial"/>
@@ -1614,7 +1614,7 @@
         </w:rPr>
         <w:t xml:space="preserve"> | </w:t>
       </w:r>
-      <w:hyperlink w:history="1" r:id="rId_mjfvb5gn9yir_epvkfqo">
+      <w:hyperlink w:history="1" r:id="rIdrl91alpxviaskcjpdsg1o">
         <w:r>
           <w:rPr>
             <w:rFonts w:ascii="Arial" w:cs="Arial" w:eastAsia="Arial" w:hAnsi="Arial"/>
@@ -1635,7 +1635,7 @@
         </w:rPr>
         <w:t xml:space="preserve"> | </w:t>
       </w:r>
-      <w:hyperlink w:history="1" r:id="rId8qcq7ztvrtbsltxkv_61w">
+      <w:hyperlink w:history="1" r:id="rIdotc6703-ap-mfyhaeinrw">
         <w:r>
           <w:rPr>
             <w:rFonts w:ascii="Arial" w:cs="Arial" w:eastAsia="Arial" w:hAnsi="Arial"/>
@@ -1757,7 +1757,7 @@
         </w:rPr>
         <w:t xml:space="preserve"> | </w:t>
       </w:r>
-      <w:hyperlink w:history="1" r:id="rIdrahctqw5xpk-p9mzh-cvb">
+      <w:hyperlink w:history="1" r:id="rId5yaxoa32e9jxym2lxlxbg">
         <w:r>
           <w:rPr>
             <w:rFonts w:ascii="Arial" w:cs="Arial" w:eastAsia="Arial" w:hAnsi="Arial"/>
@@ -1778,7 +1778,7 @@
         </w:rPr>
         <w:t xml:space="preserve"> | </w:t>
       </w:r>
-      <w:hyperlink w:history="1" r:id="rIdsowgnd48irrz9epgtx9n1">
+      <w:hyperlink w:history="1" r:id="rIdibedy_bgcxrkk_3xi7gph">
         <w:r>
           <w:rPr>
             <w:rFonts w:ascii="Arial" w:cs="Arial" w:eastAsia="Arial" w:hAnsi="Arial"/>
@@ -1913,7 +1913,7 @@
       <w:pPr>
         <w:spacing w:after="25"/>
       </w:pPr>
-      <w:hyperlink w:history="1" r:id="rIdsnwnuas1sj5e-8lnql95g">
+      <w:hyperlink w:history="1" r:id="rIdo4mcbz__bssxzqimdkc_v">
         <w:r>
           <w:rPr>
             <w:rFonts w:ascii="Arial" w:cs="Arial" w:eastAsia="Arial" w:hAnsi="Arial"/>
@@ -1969,7 +1969,7 @@
       <w:pPr>
         <w:spacing w:after="25"/>
       </w:pPr>
-      <w:hyperlink w:history="1" r:id="rIdjjp0xmuuiodwahmmb7nde">
+      <w:hyperlink w:history="1" r:id="rIdlyfcrcqfieblyojyysbpp">
         <w:r>
           <w:rPr>
             <w:rFonts w:ascii="Arial" w:cs="Arial" w:eastAsia="Arial" w:hAnsi="Arial"/>
@@ -2000,7 +2000,7 @@
       <w:pPr>
         <w:spacing w:after="35"/>
       </w:pPr>
-      <w:hyperlink w:history="1" r:id="rId3xdlwb8-d7kybkhryal2i">
+      <w:hyperlink w:history="1" r:id="rIdg17sb4eebotw4ittorsxg">
         <w:r>
           <w:rPr>
             <w:rFonts w:ascii="Arial" w:cs="Arial" w:eastAsia="Arial" w:hAnsi="Arial"/>
@@ -2049,7 +2049,7 @@
       <w:pPr>
         <w:spacing w:after="35"/>
       </w:pPr>
-      <w:hyperlink w:history="1" r:id="rIdgwmei4wg6085nlvvideuq">
+      <w:hyperlink w:history="1" r:id="rIdvpl6agubi1uazelk4ik7n">
         <w:r>
           <w:rPr>
             <w:rFonts w:ascii="Arial" w:cs="Arial" w:eastAsia="Arial" w:hAnsi="Arial"/>

</xml_diff>

<commit_message>
fix: distill skill descriptions
</commit_message>
<xml_diff>
--- a/public/downloads/wyatt-walsh-resume-full.docx
+++ b/public/downloads/wyatt-walsh-resume-full.docx
@@ -7,7 +7,7 @@
         <w:pStyle w:val="Title"/>
         <w:spacing w:after="75"/>
       </w:pPr>
-      <w:hyperlink w:history="1" r:id="rIdm_froj99uwl5oykgc68yl">
+      <w:hyperlink w:history="1" r:id="rId6_fcwsozz2y_raqr_cbgs">
         <w:r>
           <w:rPr>
             <w:rFonts w:ascii="Arial" w:cs="Arial" w:eastAsia="Arial" w:hAnsi="Arial"/>
@@ -40,7 +40,7 @@
       <w:pPr>
         <w:spacing w:after="100"/>
       </w:pPr>
-      <w:hyperlink w:history="1" r:id="rIdwxmw-i4kmekdq582unvqf">
+      <w:hyperlink w:history="1" r:id="rIdur93ew58a7tjqksvpoa7s">
         <w:r>
           <w:rPr>
             <w:rFonts w:ascii="Arial" w:cs="Arial" w:eastAsia="Arial" w:hAnsi="Arial"/>
@@ -61,7 +61,7 @@
         </w:rPr>
         <w:t xml:space="preserve"> | </w:t>
       </w:r>
-      <w:hyperlink w:history="1" r:id="rIdjztstmkgt-umqsobmlm77">
+      <w:hyperlink w:history="1" r:id="rIdbvw5f2gykmjkyzzblcczr">
         <w:r>
           <w:rPr>
             <w:rFonts w:ascii="Arial" w:cs="Arial" w:eastAsia="Arial" w:hAnsi="Arial"/>
@@ -100,7 +100,7 @@
         </w:rPr>
         <w:t xml:space="preserve"> | </w:t>
       </w:r>
-      <w:hyperlink w:history="1" r:id="rId-h7bnsaftudcsjlglcity">
+      <w:hyperlink w:history="1" r:id="rId7nskbiswkvgx9x3ujw9vp">
         <w:r>
           <w:rPr>
             <w:rFonts w:ascii="Arial" w:cs="Arial" w:eastAsia="Arial" w:hAnsi="Arial"/>
@@ -121,7 +121,7 @@
         </w:rPr>
         <w:t xml:space="preserve"> | </w:t>
       </w:r>
-      <w:hyperlink w:history="1" r:id="rIdarxrzmpbg0fvaaxidlw1r">
+      <w:hyperlink w:history="1" r:id="rId27nsf45ujcvfw0mxbusjm">
         <w:r>
           <w:rPr>
             <w:rFonts w:ascii="Arial" w:cs="Arial" w:eastAsia="Arial" w:hAnsi="Arial"/>
@@ -189,7 +189,7 @@
         </w:rPr>
         <w:t xml:space="preserve"> | </w:t>
       </w:r>
-      <w:hyperlink w:history="1" r:id="rIdnj5amuxvimxxvf2k303lr">
+      <w:hyperlink w:history="1" r:id="rIdxeh3iq2wrqpquw_ibhqfx">
         <w:r>
           <w:rPr>
             <w:rFonts w:ascii="Arial" w:cs="Arial" w:eastAsia="Arial" w:hAnsi="Arial"/>
@@ -352,7 +352,7 @@
         </w:rPr>
         <w:t xml:space="preserve"> | </w:t>
       </w:r>
-      <w:hyperlink w:history="1" r:id="rIdiu0pknxs2s9lx0qpfif-_">
+      <w:hyperlink w:history="1" r:id="rIdixwnw0dlygsffxsr4xrgg">
         <w:r>
           <w:rPr>
             <w:rFonts w:ascii="Arial" w:cs="Arial" w:eastAsia="Arial" w:hAnsi="Arial"/>
@@ -750,7 +750,7 @@
         </w:rPr>
         <w:t xml:space="preserve"> | </w:t>
       </w:r>
-      <w:hyperlink w:history="1" r:id="rId9xtyc06gg-xfxsoxrk0i9">
+      <w:hyperlink w:history="1" r:id="rIdnvrwt9n5omr7j9fs9l3x7">
         <w:r>
           <w:rPr>
             <w:rFonts w:ascii="Arial" w:cs="Arial" w:eastAsia="Arial" w:hAnsi="Arial"/>
@@ -1021,7 +1021,7 @@
         </w:rPr>
         <w:t xml:space="preserve"> | </w:t>
       </w:r>
-      <w:hyperlink w:history="1" r:id="rIduzu7i2tcuutpykamyokda">
+      <w:hyperlink w:history="1" r:id="rIduy4gso69jv026xm3mjjes">
         <w:r>
           <w:rPr>
             <w:rFonts w:ascii="Arial" w:cs="Arial" w:eastAsia="Arial" w:hAnsi="Arial"/>
@@ -1042,7 +1042,7 @@
         </w:rPr>
         <w:t xml:space="preserve"> | </w:t>
       </w:r>
-      <w:hyperlink w:history="1" r:id="rIdo7knpicmnostum7l5jpm0">
+      <w:hyperlink w:history="1" r:id="rIdkyuzt8mwg3k0e8pjfysxe">
         <w:r>
           <w:rPr>
             <w:rFonts w:ascii="Arial" w:cs="Arial" w:eastAsia="Arial" w:hAnsi="Arial"/>
@@ -1164,7 +1164,7 @@
         </w:rPr>
         <w:t xml:space="preserve"> | </w:t>
       </w:r>
-      <w:hyperlink w:history="1" r:id="rIdltgennjmfcyifoilb_a5j">
+      <w:hyperlink w:history="1" r:id="rIdyrn2no13fu0vcn4andqdf">
         <w:r>
           <w:rPr>
             <w:rFonts w:ascii="Arial" w:cs="Arial" w:eastAsia="Arial" w:hAnsi="Arial"/>
@@ -1185,7 +1185,7 @@
         </w:rPr>
         <w:t xml:space="preserve"> | </w:t>
       </w:r>
-      <w:hyperlink w:history="1" r:id="rIdmsnkpuicyduotu82ntxji">
+      <w:hyperlink w:history="1" r:id="rIdrva7gqzf2ihzf3-ytmkvz">
         <w:r>
           <w:rPr>
             <w:rFonts w:ascii="Arial" w:cs="Arial" w:eastAsia="Arial" w:hAnsi="Arial"/>
@@ -1206,7 +1206,7 @@
         </w:rPr>
         <w:t xml:space="preserve"> | </w:t>
       </w:r>
-      <w:hyperlink w:history="1" r:id="rIdgufdqi54leutrgzvss2xw">
+      <w:hyperlink w:history="1" r:id="rIdznbxcyg91-hq4so2efbsu">
         <w:r>
           <w:rPr>
             <w:rFonts w:ascii="Arial" w:cs="Arial" w:eastAsia="Arial" w:hAnsi="Arial"/>
@@ -1328,7 +1328,7 @@
         </w:rPr>
         <w:t xml:space="preserve"> | </w:t>
       </w:r>
-      <w:hyperlink w:history="1" r:id="rIdx8yyddxldsaoot6nk2pi_">
+      <w:hyperlink w:history="1" r:id="rId-2pqvfyrj8ddmtfxe10sz">
         <w:r>
           <w:rPr>
             <w:rFonts w:ascii="Arial" w:cs="Arial" w:eastAsia="Arial" w:hAnsi="Arial"/>
@@ -1349,7 +1349,7 @@
         </w:rPr>
         <w:t xml:space="preserve"> | </w:t>
       </w:r>
-      <w:hyperlink w:history="1" r:id="rIdsbo-_dfzxapatool9ejm9">
+      <w:hyperlink w:history="1" r:id="rIdalbl6kbvqlhzdsx1zv6tx">
         <w:r>
           <w:rPr>
             <w:rFonts w:ascii="Arial" w:cs="Arial" w:eastAsia="Arial" w:hAnsi="Arial"/>
@@ -1471,7 +1471,7 @@
         </w:rPr>
         <w:t xml:space="preserve"> | </w:t>
       </w:r>
-      <w:hyperlink w:history="1" r:id="rIdchupgc0czvyqcvl-dfqhf">
+      <w:hyperlink w:history="1" r:id="rIdby4vygbk7-92c4eppimnn">
         <w:r>
           <w:rPr>
             <w:rFonts w:ascii="Arial" w:cs="Arial" w:eastAsia="Arial" w:hAnsi="Arial"/>
@@ -1492,7 +1492,7 @@
         </w:rPr>
         <w:t xml:space="preserve"> | </w:t>
       </w:r>
-      <w:hyperlink w:history="1" r:id="rIdxzjsnat3-nwcvnt015zv5">
+      <w:hyperlink w:history="1" r:id="rIdbacn_gsllseq8vx3ez7x-">
         <w:r>
           <w:rPr>
             <w:rFonts w:ascii="Arial" w:cs="Arial" w:eastAsia="Arial" w:hAnsi="Arial"/>
@@ -1614,7 +1614,7 @@
         </w:rPr>
         <w:t xml:space="preserve"> | </w:t>
       </w:r>
-      <w:hyperlink w:history="1" r:id="rIdrl91alpxviaskcjpdsg1o">
+      <w:hyperlink w:history="1" r:id="rIdfki0wfwvffqf6fa12nxtp">
         <w:r>
           <w:rPr>
             <w:rFonts w:ascii="Arial" w:cs="Arial" w:eastAsia="Arial" w:hAnsi="Arial"/>
@@ -1635,7 +1635,7 @@
         </w:rPr>
         <w:t xml:space="preserve"> | </w:t>
       </w:r>
-      <w:hyperlink w:history="1" r:id="rIdotc6703-ap-mfyhaeinrw">
+      <w:hyperlink w:history="1" r:id="rIdlwkuxezjzo2p-13mek7w_">
         <w:r>
           <w:rPr>
             <w:rFonts w:ascii="Arial" w:cs="Arial" w:eastAsia="Arial" w:hAnsi="Arial"/>
@@ -1757,7 +1757,7 @@
         </w:rPr>
         <w:t xml:space="preserve"> | </w:t>
       </w:r>
-      <w:hyperlink w:history="1" r:id="rId5yaxoa32e9jxym2lxlxbg">
+      <w:hyperlink w:history="1" r:id="rIdotrgfvquphwdq2jsmatg_">
         <w:r>
           <w:rPr>
             <w:rFonts w:ascii="Arial" w:cs="Arial" w:eastAsia="Arial" w:hAnsi="Arial"/>
@@ -1778,7 +1778,7 @@
         </w:rPr>
         <w:t xml:space="preserve"> | </w:t>
       </w:r>
-      <w:hyperlink w:history="1" r:id="rIdibedy_bgcxrkk_3xi7gph">
+      <w:hyperlink w:history="1" r:id="rIdriqkm5-olq1u0a_tjuklz">
         <w:r>
           <w:rPr>
             <w:rFonts w:ascii="Arial" w:cs="Arial" w:eastAsia="Arial" w:hAnsi="Arial"/>
@@ -1913,7 +1913,7 @@
       <w:pPr>
         <w:spacing w:after="25"/>
       </w:pPr>
-      <w:hyperlink w:history="1" r:id="rIdo4mcbz__bssxzqimdkc_v">
+      <w:hyperlink w:history="1" r:id="rId_8xh7uuah_yfbs7ojdsu8">
         <w:r>
           <w:rPr>
             <w:rFonts w:ascii="Arial" w:cs="Arial" w:eastAsia="Arial" w:hAnsi="Arial"/>
@@ -1969,7 +1969,7 @@
       <w:pPr>
         <w:spacing w:after="25"/>
       </w:pPr>
-      <w:hyperlink w:history="1" r:id="rIdlyfcrcqfieblyojyysbpp">
+      <w:hyperlink w:history="1" r:id="rId2zy_ahvq82iqu4uplm6zg">
         <w:r>
           <w:rPr>
             <w:rFonts w:ascii="Arial" w:cs="Arial" w:eastAsia="Arial" w:hAnsi="Arial"/>
@@ -2000,7 +2000,7 @@
       <w:pPr>
         <w:spacing w:after="35"/>
       </w:pPr>
-      <w:hyperlink w:history="1" r:id="rIdg17sb4eebotw4ittorsxg">
+      <w:hyperlink w:history="1" r:id="rIdpfh7ykyavzv8n0axymqzw">
         <w:r>
           <w:rPr>
             <w:rFonts w:ascii="Arial" w:cs="Arial" w:eastAsia="Arial" w:hAnsi="Arial"/>
@@ -2049,7 +2049,7 @@
       <w:pPr>
         <w:spacing w:after="35"/>
       </w:pPr>
-      <w:hyperlink w:history="1" r:id="rIdvpl6agubi1uazelk4ik7n">
+      <w:hyperlink w:history="1" r:id="rIdqdkucn_nsvm_k8o8cfykx">
         <w:r>
           <w:rPr>
             <w:rFonts w:ascii="Arial" w:cs="Arial" w:eastAsia="Arial" w:hAnsi="Arial"/>

</xml_diff>

<commit_message>
fix: allow curated variable skill links
</commit_message>
<xml_diff>
--- a/public/downloads/wyatt-walsh-resume-full.docx
+++ b/public/downloads/wyatt-walsh-resume-full.docx
@@ -7,7 +7,7 @@
         <w:pStyle w:val="Title"/>
         <w:spacing w:after="75"/>
       </w:pPr>
-      <w:hyperlink w:history="1" r:id="rId6_fcwsozz2y_raqr_cbgs">
+      <w:hyperlink w:history="1" r:id="rId88xu1uodfz0rnj0nv3ggs">
         <w:r>
           <w:rPr>
             <w:rFonts w:ascii="Arial" w:cs="Arial" w:eastAsia="Arial" w:hAnsi="Arial"/>
@@ -40,7 +40,7 @@
       <w:pPr>
         <w:spacing w:after="100"/>
       </w:pPr>
-      <w:hyperlink w:history="1" r:id="rIdur93ew58a7tjqksvpoa7s">
+      <w:hyperlink w:history="1" r:id="rIdonmqpr1jbqwsussbpf-sx">
         <w:r>
           <w:rPr>
             <w:rFonts w:ascii="Arial" w:cs="Arial" w:eastAsia="Arial" w:hAnsi="Arial"/>
@@ -61,7 +61,7 @@
         </w:rPr>
         <w:t xml:space="preserve"> | </w:t>
       </w:r>
-      <w:hyperlink w:history="1" r:id="rIdbvw5f2gykmjkyzzblcczr">
+      <w:hyperlink w:history="1" r:id="rId4joz2lktnmsidk_cjvmtk">
         <w:r>
           <w:rPr>
             <w:rFonts w:ascii="Arial" w:cs="Arial" w:eastAsia="Arial" w:hAnsi="Arial"/>
@@ -100,7 +100,7 @@
         </w:rPr>
         <w:t xml:space="preserve"> | </w:t>
       </w:r>
-      <w:hyperlink w:history="1" r:id="rId7nskbiswkvgx9x3ujw9vp">
+      <w:hyperlink w:history="1" r:id="rIdk_ico6hx2soyitaaij89g">
         <w:r>
           <w:rPr>
             <w:rFonts w:ascii="Arial" w:cs="Arial" w:eastAsia="Arial" w:hAnsi="Arial"/>
@@ -121,7 +121,7 @@
         </w:rPr>
         <w:t xml:space="preserve"> | </w:t>
       </w:r>
-      <w:hyperlink w:history="1" r:id="rId27nsf45ujcvfw0mxbusjm">
+      <w:hyperlink w:history="1" r:id="rIdxxbjdczh2dl0rvmj3lzzf">
         <w:r>
           <w:rPr>
             <w:rFonts w:ascii="Arial" w:cs="Arial" w:eastAsia="Arial" w:hAnsi="Arial"/>
@@ -189,7 +189,7 @@
         </w:rPr>
         <w:t xml:space="preserve"> | </w:t>
       </w:r>
-      <w:hyperlink w:history="1" r:id="rIdxeh3iq2wrqpquw_ibhqfx">
+      <w:hyperlink w:history="1" r:id="rIdxfgn9qb8ranhzlz5xr8rj">
         <w:r>
           <w:rPr>
             <w:rFonts w:ascii="Arial" w:cs="Arial" w:eastAsia="Arial" w:hAnsi="Arial"/>
@@ -352,7 +352,7 @@
         </w:rPr>
         <w:t xml:space="preserve"> | </w:t>
       </w:r>
-      <w:hyperlink w:history="1" r:id="rIdixwnw0dlygsffxsr4xrgg">
+      <w:hyperlink w:history="1" r:id="rIdwtyecah7awj6rmwtt_elq">
         <w:r>
           <w:rPr>
             <w:rFonts w:ascii="Arial" w:cs="Arial" w:eastAsia="Arial" w:hAnsi="Arial"/>
@@ -750,7 +750,7 @@
         </w:rPr>
         <w:t xml:space="preserve"> | </w:t>
       </w:r>
-      <w:hyperlink w:history="1" r:id="rIdnvrwt9n5omr7j9fs9l3x7">
+      <w:hyperlink w:history="1" r:id="rIdviaq9nxfxdjxnyxzy2vgf">
         <w:r>
           <w:rPr>
             <w:rFonts w:ascii="Arial" w:cs="Arial" w:eastAsia="Arial" w:hAnsi="Arial"/>
@@ -1021,7 +1021,7 @@
         </w:rPr>
         <w:t xml:space="preserve"> | </w:t>
       </w:r>
-      <w:hyperlink w:history="1" r:id="rIduy4gso69jv026xm3mjjes">
+      <w:hyperlink w:history="1" r:id="rId_rkgt49clo_c4qpqmbvtd">
         <w:r>
           <w:rPr>
             <w:rFonts w:ascii="Arial" w:cs="Arial" w:eastAsia="Arial" w:hAnsi="Arial"/>
@@ -1042,7 +1042,7 @@
         </w:rPr>
         <w:t xml:space="preserve"> | </w:t>
       </w:r>
-      <w:hyperlink w:history="1" r:id="rIdkyuzt8mwg3k0e8pjfysxe">
+      <w:hyperlink w:history="1" r:id="rIdnc2i6o1lewue8nivgnjid">
         <w:r>
           <w:rPr>
             <w:rFonts w:ascii="Arial" w:cs="Arial" w:eastAsia="Arial" w:hAnsi="Arial"/>
@@ -1164,7 +1164,7 @@
         </w:rPr>
         <w:t xml:space="preserve"> | </w:t>
       </w:r>
-      <w:hyperlink w:history="1" r:id="rIdyrn2no13fu0vcn4andqdf">
+      <w:hyperlink w:history="1" r:id="rIdsyxsuitwf8yo1qtuq_pi5">
         <w:r>
           <w:rPr>
             <w:rFonts w:ascii="Arial" w:cs="Arial" w:eastAsia="Arial" w:hAnsi="Arial"/>
@@ -1185,7 +1185,7 @@
         </w:rPr>
         <w:t xml:space="preserve"> | </w:t>
       </w:r>
-      <w:hyperlink w:history="1" r:id="rIdrva7gqzf2ihzf3-ytmkvz">
+      <w:hyperlink w:history="1" r:id="rIdwviuxkuua-uotxo0hsqke">
         <w:r>
           <w:rPr>
             <w:rFonts w:ascii="Arial" w:cs="Arial" w:eastAsia="Arial" w:hAnsi="Arial"/>
@@ -1206,7 +1206,7 @@
         </w:rPr>
         <w:t xml:space="preserve"> | </w:t>
       </w:r>
-      <w:hyperlink w:history="1" r:id="rIdznbxcyg91-hq4so2efbsu">
+      <w:hyperlink w:history="1" r:id="rIdyzpslpm8_dbzpdgor3ugp">
         <w:r>
           <w:rPr>
             <w:rFonts w:ascii="Arial" w:cs="Arial" w:eastAsia="Arial" w:hAnsi="Arial"/>
@@ -1328,7 +1328,7 @@
         </w:rPr>
         <w:t xml:space="preserve"> | </w:t>
       </w:r>
-      <w:hyperlink w:history="1" r:id="rId-2pqvfyrj8ddmtfxe10sz">
+      <w:hyperlink w:history="1" r:id="rId0x0xm3eloroqdvuw3xgja">
         <w:r>
           <w:rPr>
             <w:rFonts w:ascii="Arial" w:cs="Arial" w:eastAsia="Arial" w:hAnsi="Arial"/>
@@ -1349,7 +1349,7 @@
         </w:rPr>
         <w:t xml:space="preserve"> | </w:t>
       </w:r>
-      <w:hyperlink w:history="1" r:id="rIdalbl6kbvqlhzdsx1zv6tx">
+      <w:hyperlink w:history="1" r:id="rIdng-xhm7xzeqf-mblzowpq">
         <w:r>
           <w:rPr>
             <w:rFonts w:ascii="Arial" w:cs="Arial" w:eastAsia="Arial" w:hAnsi="Arial"/>
@@ -1471,7 +1471,7 @@
         </w:rPr>
         <w:t xml:space="preserve"> | </w:t>
       </w:r>
-      <w:hyperlink w:history="1" r:id="rIdby4vygbk7-92c4eppimnn">
+      <w:hyperlink w:history="1" r:id="rId7uounll4ogmk5top1j9xy">
         <w:r>
           <w:rPr>
             <w:rFonts w:ascii="Arial" w:cs="Arial" w:eastAsia="Arial" w:hAnsi="Arial"/>
@@ -1492,7 +1492,7 @@
         </w:rPr>
         <w:t xml:space="preserve"> | </w:t>
       </w:r>
-      <w:hyperlink w:history="1" r:id="rIdbacn_gsllseq8vx3ez7x-">
+      <w:hyperlink w:history="1" r:id="rIddu9r6cpixlch3-7gfbrey">
         <w:r>
           <w:rPr>
             <w:rFonts w:ascii="Arial" w:cs="Arial" w:eastAsia="Arial" w:hAnsi="Arial"/>
@@ -1614,7 +1614,7 @@
         </w:rPr>
         <w:t xml:space="preserve"> | </w:t>
       </w:r>
-      <w:hyperlink w:history="1" r:id="rIdfki0wfwvffqf6fa12nxtp">
+      <w:hyperlink w:history="1" r:id="rId8ypg7gp748wsaxvg282sx">
         <w:r>
           <w:rPr>
             <w:rFonts w:ascii="Arial" w:cs="Arial" w:eastAsia="Arial" w:hAnsi="Arial"/>
@@ -1635,7 +1635,7 @@
         </w:rPr>
         <w:t xml:space="preserve"> | </w:t>
       </w:r>
-      <w:hyperlink w:history="1" r:id="rIdlwkuxezjzo2p-13mek7w_">
+      <w:hyperlink w:history="1" r:id="rIdqxb4llxfxdufakvqpux2h">
         <w:r>
           <w:rPr>
             <w:rFonts w:ascii="Arial" w:cs="Arial" w:eastAsia="Arial" w:hAnsi="Arial"/>
@@ -1757,7 +1757,7 @@
         </w:rPr>
         <w:t xml:space="preserve"> | </w:t>
       </w:r>
-      <w:hyperlink w:history="1" r:id="rIdotrgfvquphwdq2jsmatg_">
+      <w:hyperlink w:history="1" r:id="rIdnfueaqzjtneyrnpzxdxiu">
         <w:r>
           <w:rPr>
             <w:rFonts w:ascii="Arial" w:cs="Arial" w:eastAsia="Arial" w:hAnsi="Arial"/>
@@ -1778,7 +1778,7 @@
         </w:rPr>
         <w:t xml:space="preserve"> | </w:t>
       </w:r>
-      <w:hyperlink w:history="1" r:id="rIdriqkm5-olq1u0a_tjuklz">
+      <w:hyperlink w:history="1" r:id="rIdbyfmsgr-vy9j_x_a0hu6w">
         <w:r>
           <w:rPr>
             <w:rFonts w:ascii="Arial" w:cs="Arial" w:eastAsia="Arial" w:hAnsi="Arial"/>
@@ -1913,7 +1913,7 @@
       <w:pPr>
         <w:spacing w:after="25"/>
       </w:pPr>
-      <w:hyperlink w:history="1" r:id="rId_8xh7uuah_yfbs7ojdsu8">
+      <w:hyperlink w:history="1" r:id="rIdhvynwofugxw5--vhkyzzu">
         <w:r>
           <w:rPr>
             <w:rFonts w:ascii="Arial" w:cs="Arial" w:eastAsia="Arial" w:hAnsi="Arial"/>
@@ -1969,7 +1969,7 @@
       <w:pPr>
         <w:spacing w:after="25"/>
       </w:pPr>
-      <w:hyperlink w:history="1" r:id="rId2zy_ahvq82iqu4uplm6zg">
+      <w:hyperlink w:history="1" r:id="rIdo7pvfn51wgfraj74ptbhr">
         <w:r>
           <w:rPr>
             <w:rFonts w:ascii="Arial" w:cs="Arial" w:eastAsia="Arial" w:hAnsi="Arial"/>
@@ -2000,7 +2000,7 @@
       <w:pPr>
         <w:spacing w:after="35"/>
       </w:pPr>
-      <w:hyperlink w:history="1" r:id="rIdpfh7ykyavzv8n0axymqzw">
+      <w:hyperlink w:history="1" r:id="rIdfwgkcur_9w6dkd1gj_fbe">
         <w:r>
           <w:rPr>
             <w:rFonts w:ascii="Arial" w:cs="Arial" w:eastAsia="Arial" w:hAnsi="Arial"/>
@@ -2049,7 +2049,7 @@
       <w:pPr>
         <w:spacing w:after="35"/>
       </w:pPr>
-      <w:hyperlink w:history="1" r:id="rIdqdkucn_nsvm_k8o8cfykx">
+      <w:hyperlink w:history="1" r:id="rIdhjiumtdqwdgn3kpzokra1">
         <w:r>
           <w:rPr>
             <w:rFonts w:ascii="Arial" w:cs="Arial" w:eastAsia="Arial" w:hAnsi="Arial"/>

</xml_diff>

<commit_message>
chore: soften resume project metrics
</commit_message>
<xml_diff>
--- a/public/downloads/wyatt-walsh-resume-full.docx
+++ b/public/downloads/wyatt-walsh-resume-full.docx
@@ -7,7 +7,7 @@
         <w:pStyle w:val="Title"/>
         <w:spacing w:after="75"/>
       </w:pPr>
-      <w:hyperlink w:history="1" r:id="rId88xu1uodfz0rnj0nv3ggs">
+      <w:hyperlink w:history="1" r:id="rIdnejz0hpnlpczxwl6le56o">
         <w:r>
           <w:rPr>
             <w:rFonts w:ascii="Arial" w:cs="Arial" w:eastAsia="Arial" w:hAnsi="Arial"/>
@@ -40,7 +40,7 @@
       <w:pPr>
         <w:spacing w:after="100"/>
       </w:pPr>
-      <w:hyperlink w:history="1" r:id="rIdonmqpr1jbqwsussbpf-sx">
+      <w:hyperlink w:history="1" r:id="rIdpyqdk2hjewicywmvexnxp">
         <w:r>
           <w:rPr>
             <w:rFonts w:ascii="Arial" w:cs="Arial" w:eastAsia="Arial" w:hAnsi="Arial"/>
@@ -61,7 +61,7 @@
         </w:rPr>
         <w:t xml:space="preserve"> | </w:t>
       </w:r>
-      <w:hyperlink w:history="1" r:id="rId4joz2lktnmsidk_cjvmtk">
+      <w:hyperlink w:history="1" r:id="rIdazxrppgqs7jck3egnoic_">
         <w:r>
           <w:rPr>
             <w:rFonts w:ascii="Arial" w:cs="Arial" w:eastAsia="Arial" w:hAnsi="Arial"/>
@@ -100,7 +100,7 @@
         </w:rPr>
         <w:t xml:space="preserve"> | </w:t>
       </w:r>
-      <w:hyperlink w:history="1" r:id="rIdk_ico6hx2soyitaaij89g">
+      <w:hyperlink w:history="1" r:id="rIdfnvtbmghc_w80nqviftme">
         <w:r>
           <w:rPr>
             <w:rFonts w:ascii="Arial" w:cs="Arial" w:eastAsia="Arial" w:hAnsi="Arial"/>
@@ -121,7 +121,7 @@
         </w:rPr>
         <w:t xml:space="preserve"> | </w:t>
       </w:r>
-      <w:hyperlink w:history="1" r:id="rIdxxbjdczh2dl0rvmj3lzzf">
+      <w:hyperlink w:history="1" r:id="rIdzxdhks4uxroyfrsijrn2k">
         <w:r>
           <w:rPr>
             <w:rFonts w:ascii="Arial" w:cs="Arial" w:eastAsia="Arial" w:hAnsi="Arial"/>
@@ -189,7 +189,7 @@
         </w:rPr>
         <w:t xml:space="preserve"> | </w:t>
       </w:r>
-      <w:hyperlink w:history="1" r:id="rIdxfgn9qb8ranhzlz5xr8rj">
+      <w:hyperlink w:history="1" r:id="rIdfcwej59oei-1oe_vingqi">
         <w:r>
           <w:rPr>
             <w:rFonts w:ascii="Arial" w:cs="Arial" w:eastAsia="Arial" w:hAnsi="Arial"/>
@@ -352,7 +352,7 @@
         </w:rPr>
         <w:t xml:space="preserve"> | </w:t>
       </w:r>
-      <w:hyperlink w:history="1" r:id="rIdwtyecah7awj6rmwtt_elq">
+      <w:hyperlink w:history="1" r:id="rIdxgzpzvbf9znrvszwu9jqg">
         <w:r>
           <w:rPr>
             <w:rFonts w:ascii="Arial" w:cs="Arial" w:eastAsia="Arial" w:hAnsi="Arial"/>
@@ -750,7 +750,7 @@
         </w:rPr>
         <w:t xml:space="preserve"> | </w:t>
       </w:r>
-      <w:hyperlink w:history="1" r:id="rIdviaq9nxfxdjxnyxzy2vgf">
+      <w:hyperlink w:history="1" r:id="rIdzoqdshccrpgt7ktyiglkv">
         <w:r>
           <w:rPr>
             <w:rFonts w:ascii="Arial" w:cs="Arial" w:eastAsia="Arial" w:hAnsi="Arial"/>
@@ -1021,7 +1021,7 @@
         </w:rPr>
         <w:t xml:space="preserve"> | </w:t>
       </w:r>
-      <w:hyperlink w:history="1" r:id="rId_rkgt49clo_c4qpqmbvtd">
+      <w:hyperlink w:history="1" r:id="rIds60dmqyrl0okdj0hka-vf">
         <w:r>
           <w:rPr>
             <w:rFonts w:ascii="Arial" w:cs="Arial" w:eastAsia="Arial" w:hAnsi="Arial"/>
@@ -1042,7 +1042,7 @@
         </w:rPr>
         <w:t xml:space="preserve"> | </w:t>
       </w:r>
-      <w:hyperlink w:history="1" r:id="rIdnc2i6o1lewue8nivgnjid">
+      <w:hyperlink w:history="1" r:id="rIdv3s_knzw87vxzu0xf8xsp">
         <w:r>
           <w:rPr>
             <w:rFonts w:ascii="Arial" w:cs="Arial" w:eastAsia="Arial" w:hAnsi="Arial"/>
@@ -1066,7 +1066,7 @@
           <w:sz w:val="20"/>
           <w:szCs w:val="20"/>
         </w:rPr>
-        <w:t xml:space="preserve">Open-source agent tooling catalog and docs portal packaging 112 portable skills, 8 reusable agents, 30 MCP tools, and cross-runtime workflows for Claude Code, Codex, Copilot, Cursor, and related coding assistants.</w:t>
+        <w:t xml:space="preserve">Open-source agent tooling catalog and docs portal packaging portable skills, reusable agents, MCP tool presets, and cross-runtime workflows for Claude Code, Codex, Copilot, Cursor, and related coding assistants.</w:t>
       </w:r>
     </w:p>
     <w:p>
@@ -1118,26 +1118,26 @@
           <w:sz w:val="20"/>
           <w:szCs w:val="20"/>
         </w:rPr>
-        <w:t xml:space="preserve">Shipped generated docs, install flows, and 30 MCP-ready tool presets spanning code review, security, infrastructure, research, and workflow automation.</w:t>
-      </w:r>
-    </w:p>
-    <w:p>
-      <w:pPr>
-        <w:pStyle w:val="ListParagraph"/>
-        <w:numPr>
-          <w:ilvl w:val="0"/>
-          <w:numId w:val="1"/>
-        </w:numPr>
-        <w:spacing w:after="35"/>
-      </w:pPr>
-      <w:r>
-        <w:rPr>
-          <w:rFonts w:ascii="Arial" w:cs="Arial" w:eastAsia="Arial" w:hAnsi="Arial"/>
-          <w:color w:val="0F172A"/>
-          <w:sz w:val="20"/>
-          <w:szCs w:val="20"/>
-        </w:rPr>
-        <w:t xml:space="preserve">Packaged 112 portable skills and 8 reusable agents into a cross-runtime workflow system for AI-assisted software development.</w:t>
+        <w:t xml:space="preserve">Shipped generated docs, install flows, and MCP-ready tool presets spanning code review, security, infrastructure, research, and workflow automation.</w:t>
+      </w:r>
+    </w:p>
+    <w:p>
+      <w:pPr>
+        <w:pStyle w:val="ListParagraph"/>
+        <w:numPr>
+          <w:ilvl w:val="0"/>
+          <w:numId w:val="1"/>
+        </w:numPr>
+        <w:spacing w:after="35"/>
+      </w:pPr>
+      <w:r>
+        <w:rPr>
+          <w:rFonts w:ascii="Arial" w:cs="Arial" w:eastAsia="Arial" w:hAnsi="Arial"/>
+          <w:color w:val="0F172A"/>
+          <w:sz w:val="20"/>
+          <w:szCs w:val="20"/>
+        </w:rPr>
+        <w:t xml:space="preserve">Packaged portable skills and reusable agent definitions into a cross-runtime workflow system for AI-assisted software development.</w:t>
       </w:r>
     </w:p>
     <w:p>
@@ -1164,7 +1164,7 @@
         </w:rPr>
         <w:t xml:space="preserve"> | </w:t>
       </w:r>
-      <w:hyperlink w:history="1" r:id="rIdsyxsuitwf8yo1qtuq_pi5">
+      <w:hyperlink w:history="1" r:id="rIdm97ssx7_cvq7z1vub1t3p">
         <w:r>
           <w:rPr>
             <w:rFonts w:ascii="Arial" w:cs="Arial" w:eastAsia="Arial" w:hAnsi="Arial"/>
@@ -1185,7 +1185,7 @@
         </w:rPr>
         <w:t xml:space="preserve"> | </w:t>
       </w:r>
-      <w:hyperlink w:history="1" r:id="rIdwviuxkuua-uotxo0hsqke">
+      <w:hyperlink w:history="1" r:id="rId37qsyoxbnoimwecp-gwgx">
         <w:r>
           <w:rPr>
             <w:rFonts w:ascii="Arial" w:cs="Arial" w:eastAsia="Arial" w:hAnsi="Arial"/>
@@ -1206,7 +1206,7 @@
         </w:rPr>
         <w:t xml:space="preserve"> | </w:t>
       </w:r>
-      <w:hyperlink w:history="1" r:id="rIdyzpslpm8_dbzpdgor3ugp">
+      <w:hyperlink w:history="1" r:id="rIdfsk3daplbzm2_rph9rw1n">
         <w:r>
           <w:rPr>
             <w:rFonts w:ascii="Arial" w:cs="Arial" w:eastAsia="Arial" w:hAnsi="Arial"/>
@@ -1230,7 +1230,7 @@
           <w:sz w:val="20"/>
           <w:szCs w:val="20"/>
         </w:rPr>
-        <w:t xml:space="preserve">Public NBA Kaggle dataset and repo covering 65K+ games and 13M+ plays; reached 425K+ views and 60K+ downloads before freezing at the 2023-07-06 update for reproducible sports analytics workflows.</w:t>
+        <w:t xml:space="preserve">Public NBA Kaggle dataset and repo covering full-season game and play-by-play history across DuckDB, SQLite, Parquet, and CSV exports for reproducible sports analytics workflows.</w:t>
       </w:r>
     </w:p>
     <w:p>
@@ -1282,26 +1282,26 @@
           <w:sz w:val="20"/>
           <w:szCs w:val="20"/>
         </w:rPr>
-        <w:t xml:space="preserve">Building the next-generation nbadb rebuild with 152 extractor wrappers and 204 generated public star-schema outputs across docs, schema references, and release workflows.</w:t>
-      </w:r>
-    </w:p>
-    <w:p>
-      <w:pPr>
-        <w:pStyle w:val="ListParagraph"/>
-        <w:numPr>
-          <w:ilvl w:val="0"/>
-          <w:numId w:val="1"/>
-        </w:numPr>
-        <w:spacing w:after="35"/>
-      </w:pPr>
-      <w:r>
-        <w:rPr>
-          <w:rFonts w:ascii="Arial" w:cs="Arial" w:eastAsia="Arial" w:hAnsi="Arial"/>
-          <w:color w:val="0F172A"/>
-          <w:sz w:val="20"/>
-          <w:szCs w:val="20"/>
-        </w:rPr>
-        <w:t xml:space="preserve">Published a public sports analytics dataset with 65K+ games and 13M+ play-by-play events across multiple warehouse formats.</w:t>
+        <w:t xml:space="preserve">Building the next-generation nbadb rebuild with broad extractor coverage and generated public star-schema outputs across docs, schema references, and release workflows.</w:t>
+      </w:r>
+    </w:p>
+    <w:p>
+      <w:pPr>
+        <w:pStyle w:val="ListParagraph"/>
+        <w:numPr>
+          <w:ilvl w:val="0"/>
+          <w:numId w:val="1"/>
+        </w:numPr>
+        <w:spacing w:after="35"/>
+      </w:pPr>
+      <w:r>
+        <w:rPr>
+          <w:rFonts w:ascii="Arial" w:cs="Arial" w:eastAsia="Arial" w:hAnsi="Arial"/>
+          <w:color w:val="0F172A"/>
+          <w:sz w:val="20"/>
+          <w:szCs w:val="20"/>
+        </w:rPr>
+        <w:t xml:space="preserve">Published a public sports analytics dataset covering NBA game and play-by-play history across multiple warehouse formats.</w:t>
       </w:r>
     </w:p>
     <w:p>
@@ -1328,7 +1328,7 @@
         </w:rPr>
         <w:t xml:space="preserve"> | </w:t>
       </w:r>
-      <w:hyperlink w:history="1" r:id="rId0x0xm3eloroqdvuw3xgja">
+      <w:hyperlink w:history="1" r:id="rIdrifeq2pxzxh2rvwrfaoez">
         <w:r>
           <w:rPr>
             <w:rFonts w:ascii="Arial" w:cs="Arial" w:eastAsia="Arial" w:hAnsi="Arial"/>
@@ -1349,7 +1349,7 @@
         </w:rPr>
         <w:t xml:space="preserve"> | </w:t>
       </w:r>
-      <w:hyperlink w:history="1" r:id="rIdng-xhm7xzeqf-mblzowpq">
+      <w:hyperlink w:history="1" r:id="rId3yz71nhu88-_3amevydv0">
         <w:r>
           <w:rPr>
             <w:rFonts w:ascii="Arial" w:cs="Arial" w:eastAsia="Arial" w:hAnsi="Arial"/>
@@ -1471,7 +1471,7 @@
         </w:rPr>
         <w:t xml:space="preserve"> | </w:t>
       </w:r>
-      <w:hyperlink w:history="1" r:id="rId7uounll4ogmk5top1j9xy">
+      <w:hyperlink w:history="1" r:id="rIdvzoqyuvnsyt7cqja8zzbw">
         <w:r>
           <w:rPr>
             <w:rFonts w:ascii="Arial" w:cs="Arial" w:eastAsia="Arial" w:hAnsi="Arial"/>
@@ -1492,7 +1492,7 @@
         </w:rPr>
         <w:t xml:space="preserve"> | </w:t>
       </w:r>
-      <w:hyperlink w:history="1" r:id="rIddu9r6cpixlch3-7gfbrey">
+      <w:hyperlink w:history="1" r:id="rIdsz3r9etvkg1phgf4mp9n2">
         <w:r>
           <w:rPr>
             <w:rFonts w:ascii="Arial" w:cs="Arial" w:eastAsia="Arial" w:hAnsi="Arial"/>
@@ -1614,7 +1614,7 @@
         </w:rPr>
         <w:t xml:space="preserve"> | </w:t>
       </w:r>
-      <w:hyperlink w:history="1" r:id="rId8ypg7gp748wsaxvg282sx">
+      <w:hyperlink w:history="1" r:id="rId_kwly8n9zmfrv5rzcsgfn">
         <w:r>
           <w:rPr>
             <w:rFonts w:ascii="Arial" w:cs="Arial" w:eastAsia="Arial" w:hAnsi="Arial"/>
@@ -1635,7 +1635,7 @@
         </w:rPr>
         <w:t xml:space="preserve"> | </w:t>
       </w:r>
-      <w:hyperlink w:history="1" r:id="rIdqxb4llxfxdufakvqpux2h">
+      <w:hyperlink w:history="1" r:id="rIdz9yevoldpd2rm4zi4upi6">
         <w:r>
           <w:rPr>
             <w:rFonts w:ascii="Arial" w:cs="Arial" w:eastAsia="Arial" w:hAnsi="Arial"/>
@@ -1757,7 +1757,7 @@
         </w:rPr>
         <w:t xml:space="preserve"> | </w:t>
       </w:r>
-      <w:hyperlink w:history="1" r:id="rIdnfueaqzjtneyrnpzxdxiu">
+      <w:hyperlink w:history="1" r:id="rIdj7nuwjayex4umwriv_jyb">
         <w:r>
           <w:rPr>
             <w:rFonts w:ascii="Arial" w:cs="Arial" w:eastAsia="Arial" w:hAnsi="Arial"/>
@@ -1778,7 +1778,7 @@
         </w:rPr>
         <w:t xml:space="preserve"> | </w:t>
       </w:r>
-      <w:hyperlink w:history="1" r:id="rIdbyfmsgr-vy9j_x_a0hu6w">
+      <w:hyperlink w:history="1" r:id="rIdibaooggp8opnxzb4v6jms">
         <w:r>
           <w:rPr>
             <w:rFonts w:ascii="Arial" w:cs="Arial" w:eastAsia="Arial" w:hAnsi="Arial"/>
@@ -1913,7 +1913,7 @@
       <w:pPr>
         <w:spacing w:after="25"/>
       </w:pPr>
-      <w:hyperlink w:history="1" r:id="rIdhvynwofugxw5--vhkyzzu">
+      <w:hyperlink w:history="1" r:id="rIdfiylbhxw50uzsreqgw92b">
         <w:r>
           <w:rPr>
             <w:rFonts w:ascii="Arial" w:cs="Arial" w:eastAsia="Arial" w:hAnsi="Arial"/>
@@ -1969,7 +1969,7 @@
       <w:pPr>
         <w:spacing w:after="25"/>
       </w:pPr>
-      <w:hyperlink w:history="1" r:id="rIdo7pvfn51wgfraj74ptbhr">
+      <w:hyperlink w:history="1" r:id="rIdfh1mc5ctona6iaqnzov-e">
         <w:r>
           <w:rPr>
             <w:rFonts w:ascii="Arial" w:cs="Arial" w:eastAsia="Arial" w:hAnsi="Arial"/>
@@ -2000,7 +2000,7 @@
       <w:pPr>
         <w:spacing w:after="35"/>
       </w:pPr>
-      <w:hyperlink w:history="1" r:id="rIdfwgkcur_9w6dkd1gj_fbe">
+      <w:hyperlink w:history="1" r:id="rIdg0311lvm-u4yjcigjn07n">
         <w:r>
           <w:rPr>
             <w:rFonts w:ascii="Arial" w:cs="Arial" w:eastAsia="Arial" w:hAnsi="Arial"/>
@@ -2049,7 +2049,7 @@
       <w:pPr>
         <w:spacing w:after="35"/>
       </w:pPr>
-      <w:hyperlink w:history="1" r:id="rIdhjiumtdqwdgn3kpzokra1">
+      <w:hyperlink w:history="1" r:id="rIdmyibopfrf7gdml_mx7lk6">
         <w:r>
           <w:rPr>
             <w:rFonts w:ascii="Arial" w:cs="Arial" w:eastAsia="Arial" w:hAnsi="Arial"/>

</xml_diff>

<commit_message>
fix: restore rounded resume project metrics
</commit_message>
<xml_diff>
--- a/public/downloads/wyatt-walsh-resume-full.docx
+++ b/public/downloads/wyatt-walsh-resume-full.docx
@@ -7,7 +7,7 @@
         <w:pStyle w:val="Title"/>
         <w:spacing w:after="75"/>
       </w:pPr>
-      <w:hyperlink w:history="1" r:id="rIdnejz0hpnlpczxwl6le56o">
+      <w:hyperlink w:history="1" r:id="rId9tub2w-npbnmryw7akuea">
         <w:r>
           <w:rPr>
             <w:rFonts w:ascii="Arial" w:cs="Arial" w:eastAsia="Arial" w:hAnsi="Arial"/>
@@ -40,7 +40,7 @@
       <w:pPr>
         <w:spacing w:after="100"/>
       </w:pPr>
-      <w:hyperlink w:history="1" r:id="rIdpyqdk2hjewicywmvexnxp">
+      <w:hyperlink w:history="1" r:id="rIdpljf5txiyli7rjgbop6-c">
         <w:r>
           <w:rPr>
             <w:rFonts w:ascii="Arial" w:cs="Arial" w:eastAsia="Arial" w:hAnsi="Arial"/>
@@ -61,7 +61,7 @@
         </w:rPr>
         <w:t xml:space="preserve"> | </w:t>
       </w:r>
-      <w:hyperlink w:history="1" r:id="rIdazxrppgqs7jck3egnoic_">
+      <w:hyperlink w:history="1" r:id="rIdhawn30yp4xxdi2zx3s9nw">
         <w:r>
           <w:rPr>
             <w:rFonts w:ascii="Arial" w:cs="Arial" w:eastAsia="Arial" w:hAnsi="Arial"/>
@@ -100,7 +100,7 @@
         </w:rPr>
         <w:t xml:space="preserve"> | </w:t>
       </w:r>
-      <w:hyperlink w:history="1" r:id="rIdfnvtbmghc_w80nqviftme">
+      <w:hyperlink w:history="1" r:id="rId7e9oqw759puyzwhslaivk">
         <w:r>
           <w:rPr>
             <w:rFonts w:ascii="Arial" w:cs="Arial" w:eastAsia="Arial" w:hAnsi="Arial"/>
@@ -121,7 +121,7 @@
         </w:rPr>
         <w:t xml:space="preserve"> | </w:t>
       </w:r>
-      <w:hyperlink w:history="1" r:id="rIdzxdhks4uxroyfrsijrn2k">
+      <w:hyperlink w:history="1" r:id="rId-yhifthktctravzsbxiqp">
         <w:r>
           <w:rPr>
             <w:rFonts w:ascii="Arial" w:cs="Arial" w:eastAsia="Arial" w:hAnsi="Arial"/>
@@ -189,7 +189,7 @@
         </w:rPr>
         <w:t xml:space="preserve"> | </w:t>
       </w:r>
-      <w:hyperlink w:history="1" r:id="rIdfcwej59oei-1oe_vingqi">
+      <w:hyperlink w:history="1" r:id="rIdri7bqzrjijixkdiqjysg0">
         <w:r>
           <w:rPr>
             <w:rFonts w:ascii="Arial" w:cs="Arial" w:eastAsia="Arial" w:hAnsi="Arial"/>
@@ -352,7 +352,7 @@
         </w:rPr>
         <w:t xml:space="preserve"> | </w:t>
       </w:r>
-      <w:hyperlink w:history="1" r:id="rIdxgzpzvbf9znrvszwu9jqg">
+      <w:hyperlink w:history="1" r:id="rId2ayknmhk7j0vm-trc3g3a">
         <w:r>
           <w:rPr>
             <w:rFonts w:ascii="Arial" w:cs="Arial" w:eastAsia="Arial" w:hAnsi="Arial"/>
@@ -750,7 +750,7 @@
         </w:rPr>
         <w:t xml:space="preserve"> | </w:t>
       </w:r>
-      <w:hyperlink w:history="1" r:id="rIdzoqdshccrpgt7ktyiglkv">
+      <w:hyperlink w:history="1" r:id="rIdlfeyrhu4blkg7uurlud-a">
         <w:r>
           <w:rPr>
             <w:rFonts w:ascii="Arial" w:cs="Arial" w:eastAsia="Arial" w:hAnsi="Arial"/>
@@ -1021,7 +1021,7 @@
         </w:rPr>
         <w:t xml:space="preserve"> | </w:t>
       </w:r>
-      <w:hyperlink w:history="1" r:id="rIds60dmqyrl0okdj0hka-vf">
+      <w:hyperlink w:history="1" r:id="rIdv9pht9mjhzmkrepjvkapa">
         <w:r>
           <w:rPr>
             <w:rFonts w:ascii="Arial" w:cs="Arial" w:eastAsia="Arial" w:hAnsi="Arial"/>
@@ -1042,7 +1042,7 @@
         </w:rPr>
         <w:t xml:space="preserve"> | </w:t>
       </w:r>
-      <w:hyperlink w:history="1" r:id="rIdv3s_knzw87vxzu0xf8xsp">
+      <w:hyperlink w:history="1" r:id="rIdyuwtougdi-7keezl4aof5">
         <w:r>
           <w:rPr>
             <w:rFonts w:ascii="Arial" w:cs="Arial" w:eastAsia="Arial" w:hAnsi="Arial"/>
@@ -1066,7 +1066,7 @@
           <w:sz w:val="20"/>
           <w:szCs w:val="20"/>
         </w:rPr>
-        <w:t xml:space="preserve">Open-source agent tooling catalog and docs portal packaging portable skills, reusable agents, MCP tool presets, and cross-runtime workflows for Claude Code, Codex, Copilot, Cursor, and related coding assistants.</w:t>
+        <w:t xml:space="preserve">Open-source agent tooling catalog and docs portal packaging 100+ portable skills, reusable agents, dozens of MCP tool presets, and cross-runtime workflows for Claude Code, Codex, Copilot, Cursor, and related coding assistants.</w:t>
       </w:r>
     </w:p>
     <w:p>
@@ -1118,26 +1118,26 @@
           <w:sz w:val="20"/>
           <w:szCs w:val="20"/>
         </w:rPr>
-        <w:t xml:space="preserve">Shipped generated docs, install flows, and MCP-ready tool presets spanning code review, security, infrastructure, research, and workflow automation.</w:t>
-      </w:r>
-    </w:p>
-    <w:p>
-      <w:pPr>
-        <w:pStyle w:val="ListParagraph"/>
-        <w:numPr>
-          <w:ilvl w:val="0"/>
-          <w:numId w:val="1"/>
-        </w:numPr>
-        <w:spacing w:after="35"/>
-      </w:pPr>
-      <w:r>
-        <w:rPr>
-          <w:rFonts w:ascii="Arial" w:cs="Arial" w:eastAsia="Arial" w:hAnsi="Arial"/>
-          <w:color w:val="0F172A"/>
-          <w:sz w:val="20"/>
-          <w:szCs w:val="20"/>
-        </w:rPr>
-        <w:t xml:space="preserve">Packaged portable skills and reusable agent definitions into a cross-runtime workflow system for AI-assisted software development.</w:t>
+        <w:t xml:space="preserve">Shipped generated docs, install flows, and dozens of MCP-ready tool presets spanning code review, security, infrastructure, research, and workflow automation.</w:t>
+      </w:r>
+    </w:p>
+    <w:p>
+      <w:pPr>
+        <w:pStyle w:val="ListParagraph"/>
+        <w:numPr>
+          <w:ilvl w:val="0"/>
+          <w:numId w:val="1"/>
+        </w:numPr>
+        <w:spacing w:after="35"/>
+      </w:pPr>
+      <w:r>
+        <w:rPr>
+          <w:rFonts w:ascii="Arial" w:cs="Arial" w:eastAsia="Arial" w:hAnsi="Arial"/>
+          <w:color w:val="0F172A"/>
+          <w:sz w:val="20"/>
+          <w:szCs w:val="20"/>
+        </w:rPr>
+        <w:t xml:space="preserve">Packaged 100+ portable skills and reusable agent definitions into a cross-runtime workflow system for AI-assisted software development.</w:t>
       </w:r>
     </w:p>
     <w:p>
@@ -1164,7 +1164,7 @@
         </w:rPr>
         <w:t xml:space="preserve"> | </w:t>
       </w:r>
-      <w:hyperlink w:history="1" r:id="rIdm97ssx7_cvq7z1vub1t3p">
+      <w:hyperlink w:history="1" r:id="rIdccjz2vffv0bv-0r1ofj8-">
         <w:r>
           <w:rPr>
             <w:rFonts w:ascii="Arial" w:cs="Arial" w:eastAsia="Arial" w:hAnsi="Arial"/>
@@ -1185,7 +1185,7 @@
         </w:rPr>
         <w:t xml:space="preserve"> | </w:t>
       </w:r>
-      <w:hyperlink w:history="1" r:id="rId37qsyoxbnoimwecp-gwgx">
+      <w:hyperlink w:history="1" r:id="rIdsgknil8jbcclfimxgldpe">
         <w:r>
           <w:rPr>
             <w:rFonts w:ascii="Arial" w:cs="Arial" w:eastAsia="Arial" w:hAnsi="Arial"/>
@@ -1206,7 +1206,7 @@
         </w:rPr>
         <w:t xml:space="preserve"> | </w:t>
       </w:r>
-      <w:hyperlink w:history="1" r:id="rIdfsk3daplbzm2_rph9rw1n">
+      <w:hyperlink w:history="1" r:id="rId4gpgbe6ptxhomlct0s3jb">
         <w:r>
           <w:rPr>
             <w:rFonts w:ascii="Arial" w:cs="Arial" w:eastAsia="Arial" w:hAnsi="Arial"/>
@@ -1230,7 +1230,7 @@
           <w:sz w:val="20"/>
           <w:szCs w:val="20"/>
         </w:rPr>
-        <w:t xml:space="preserve">Public NBA Kaggle dataset and repo covering full-season game and play-by-play history across DuckDB, SQLite, Parquet, and CSV exports for reproducible sports analytics workflows.</w:t>
+        <w:t xml:space="preserve">Public NBA Kaggle dataset and repo covering 65K+ games and 13M+ plays across DuckDB, SQLite, Parquet, and CSV exports; drew 400K+ views and 60K+ downloads for reproducible sports analytics workflows.</w:t>
       </w:r>
     </w:p>
     <w:p>
@@ -1282,26 +1282,26 @@
           <w:sz w:val="20"/>
           <w:szCs w:val="20"/>
         </w:rPr>
-        <w:t xml:space="preserve">Building the next-generation nbadb rebuild with broad extractor coverage and generated public star-schema outputs across docs, schema references, and release workflows.</w:t>
-      </w:r>
-    </w:p>
-    <w:p>
-      <w:pPr>
-        <w:pStyle w:val="ListParagraph"/>
-        <w:numPr>
-          <w:ilvl w:val="0"/>
-          <w:numId w:val="1"/>
-        </w:numPr>
-        <w:spacing w:after="35"/>
-      </w:pPr>
-      <w:r>
-        <w:rPr>
-          <w:rFonts w:ascii="Arial" w:cs="Arial" w:eastAsia="Arial" w:hAnsi="Arial"/>
-          <w:color w:val="0F172A"/>
-          <w:sz w:val="20"/>
-          <w:szCs w:val="20"/>
-        </w:rPr>
-        <w:t xml:space="preserve">Published a public sports analytics dataset covering NBA game and play-by-play history across multiple warehouse formats.</w:t>
+        <w:t xml:space="preserve">Rebuilding nbadb with 150+ extractor wrappers and 200+ generated public star-schema outputs.</w:t>
+      </w:r>
+    </w:p>
+    <w:p>
+      <w:pPr>
+        <w:pStyle w:val="ListParagraph"/>
+        <w:numPr>
+          <w:ilvl w:val="0"/>
+          <w:numId w:val="1"/>
+        </w:numPr>
+        <w:spacing w:after="35"/>
+      </w:pPr>
+      <w:r>
+        <w:rPr>
+          <w:rFonts w:ascii="Arial" w:cs="Arial" w:eastAsia="Arial" w:hAnsi="Arial"/>
+          <w:color w:val="0F172A"/>
+          <w:sz w:val="20"/>
+          <w:szCs w:val="20"/>
+        </w:rPr>
+        <w:t xml:space="preserve">Published a public sports analytics dataset covering 65K+ NBA games and 13M+ play-by-play events across multiple warehouse formats.</w:t>
       </w:r>
     </w:p>
     <w:p>
@@ -1328,7 +1328,7 @@
         </w:rPr>
         <w:t xml:space="preserve"> | </w:t>
       </w:r>
-      <w:hyperlink w:history="1" r:id="rIdrifeq2pxzxh2rvwrfaoez">
+      <w:hyperlink w:history="1" r:id="rIdrtt6r6ojqyuqfpulcildt">
         <w:r>
           <w:rPr>
             <w:rFonts w:ascii="Arial" w:cs="Arial" w:eastAsia="Arial" w:hAnsi="Arial"/>
@@ -1349,7 +1349,7 @@
         </w:rPr>
         <w:t xml:space="preserve"> | </w:t>
       </w:r>
-      <w:hyperlink w:history="1" r:id="rId3yz71nhu88-_3amevydv0">
+      <w:hyperlink w:history="1" r:id="rId-wytxtjcuuurn9ehaejg-">
         <w:r>
           <w:rPr>
             <w:rFonts w:ascii="Arial" w:cs="Arial" w:eastAsia="Arial" w:hAnsi="Arial"/>
@@ -1471,7 +1471,7 @@
         </w:rPr>
         <w:t xml:space="preserve"> | </w:t>
       </w:r>
-      <w:hyperlink w:history="1" r:id="rIdvzoqyuvnsyt7cqja8zzbw">
+      <w:hyperlink w:history="1" r:id="rIduns51ax_qhlhbpmbi2jy4">
         <w:r>
           <w:rPr>
             <w:rFonts w:ascii="Arial" w:cs="Arial" w:eastAsia="Arial" w:hAnsi="Arial"/>
@@ -1492,7 +1492,7 @@
         </w:rPr>
         <w:t xml:space="preserve"> | </w:t>
       </w:r>
-      <w:hyperlink w:history="1" r:id="rIdsz3r9etvkg1phgf4mp9n2">
+      <w:hyperlink w:history="1" r:id="rIdntwa2rhurkcvwixbpwlp8">
         <w:r>
           <w:rPr>
             <w:rFonts w:ascii="Arial" w:cs="Arial" w:eastAsia="Arial" w:hAnsi="Arial"/>
@@ -1614,7 +1614,7 @@
         </w:rPr>
         <w:t xml:space="preserve"> | </w:t>
       </w:r>
-      <w:hyperlink w:history="1" r:id="rId_kwly8n9zmfrv5rzcsgfn">
+      <w:hyperlink w:history="1" r:id="rIdkd0d_-s8gvovus1ro1wn-">
         <w:r>
           <w:rPr>
             <w:rFonts w:ascii="Arial" w:cs="Arial" w:eastAsia="Arial" w:hAnsi="Arial"/>
@@ -1635,7 +1635,7 @@
         </w:rPr>
         <w:t xml:space="preserve"> | </w:t>
       </w:r>
-      <w:hyperlink w:history="1" r:id="rIdz9yevoldpd2rm4zi4upi6">
+      <w:hyperlink w:history="1" r:id="rIdfz8h8vwpratzwndj8ji7n">
         <w:r>
           <w:rPr>
             <w:rFonts w:ascii="Arial" w:cs="Arial" w:eastAsia="Arial" w:hAnsi="Arial"/>
@@ -1757,7 +1757,7 @@
         </w:rPr>
         <w:t xml:space="preserve"> | </w:t>
       </w:r>
-      <w:hyperlink w:history="1" r:id="rIdj7nuwjayex4umwriv_jyb">
+      <w:hyperlink w:history="1" r:id="rIdzh5qaq4plrsiguflh282q">
         <w:r>
           <w:rPr>
             <w:rFonts w:ascii="Arial" w:cs="Arial" w:eastAsia="Arial" w:hAnsi="Arial"/>
@@ -1778,7 +1778,7 @@
         </w:rPr>
         <w:t xml:space="preserve"> | </w:t>
       </w:r>
-      <w:hyperlink w:history="1" r:id="rIdibaooggp8opnxzb4v6jms">
+      <w:hyperlink w:history="1" r:id="rId6fj2z1vgp90prqoicf0c2">
         <w:r>
           <w:rPr>
             <w:rFonts w:ascii="Arial" w:cs="Arial" w:eastAsia="Arial" w:hAnsi="Arial"/>
@@ -1913,7 +1913,7 @@
       <w:pPr>
         <w:spacing w:after="25"/>
       </w:pPr>
-      <w:hyperlink w:history="1" r:id="rIdfiylbhxw50uzsreqgw92b">
+      <w:hyperlink w:history="1" r:id="rIdqjm9qho1fczbrilumph_p">
         <w:r>
           <w:rPr>
             <w:rFonts w:ascii="Arial" w:cs="Arial" w:eastAsia="Arial" w:hAnsi="Arial"/>
@@ -1969,7 +1969,7 @@
       <w:pPr>
         <w:spacing w:after="25"/>
       </w:pPr>
-      <w:hyperlink w:history="1" r:id="rIdfh1mc5ctona6iaqnzov-e">
+      <w:hyperlink w:history="1" r:id="rId4o5lvzm5gqpkrwkcqvrhd">
         <w:r>
           <w:rPr>
             <w:rFonts w:ascii="Arial" w:cs="Arial" w:eastAsia="Arial" w:hAnsi="Arial"/>
@@ -2000,7 +2000,7 @@
       <w:pPr>
         <w:spacing w:after="35"/>
       </w:pPr>
-      <w:hyperlink w:history="1" r:id="rIdg0311lvm-u4yjcigjn07n">
+      <w:hyperlink w:history="1" r:id="rIdlbasjusdvb4llzq1kf5e-">
         <w:r>
           <w:rPr>
             <w:rFonts w:ascii="Arial" w:cs="Arial" w:eastAsia="Arial" w:hAnsi="Arial"/>
@@ -2049,7 +2049,7 @@
       <w:pPr>
         <w:spacing w:after="35"/>
       </w:pPr>
-      <w:hyperlink w:history="1" r:id="rIdmyibopfrf7gdml_mx7lk6">
+      <w:hyperlink w:history="1" r:id="rId4fdgeoismxeld2rswjgt7">
         <w:r>
           <w:rPr>
             <w:rFonts w:ascii="Arial" w:cs="Arial" w:eastAsia="Arial" w:hAnsi="Arial"/>

</xml_diff>